<commit_message>
docs: established Sprint 1 backlog, user stories, and acceptance criteria
</commit_message>
<xml_diff>
--- a/docs/Sprint 1.docx
+++ b/docs/Sprint 1.docx
@@ -5,14 +5,180 @@
     <w:p>
       <w:pPr>
         <w:pStyle w:val="Heading2"/>
-      </w:pPr>
-      <w:r>
-        <w:t>Product Backlog</w:t>
+        <w:rPr>
+          <w:rFonts w:ascii="Calibri" w:hAnsi="Calibri" w:cs="Calibri"/>
+        </w:rPr>
+      </w:pPr>
+      <w:r>
+        <w:rPr>
+          <w:rFonts w:ascii="Calibri" w:hAnsi="Calibri" w:cs="Calibri"/>
+        </w:rPr>
+        <w:t>Team Roles</w:t>
       </w:r>
     </w:p>
     <w:p>
-      <w:r>
-        <w:t>(This should contain ALL remaining work, work completed in previous sprints should have been removed from the product backlog)</w:t>
+      <w:pPr>
+        <w:rPr>
+          <w:rFonts w:ascii="Calibri" w:hAnsi="Calibri" w:cs="Calibri"/>
+          <w:lang w:val="en-US" w:eastAsia="en-US"/>
+        </w:rPr>
+      </w:pPr>
+      <w:r>
+        <w:rPr>
+          <w:rFonts w:ascii="Calibri" w:hAnsi="Calibri" w:cs="Calibri"/>
+          <w:lang w:val="en-US" w:eastAsia="en-US"/>
+        </w:rPr>
+        <w:t xml:space="preserve">Roles have been set, and due to the team comprising of a single individual, </w:t>
+      </w:r>
+      <w:r>
+        <w:rPr>
+          <w:rFonts w:ascii="Calibri" w:hAnsi="Calibri" w:cs="Calibri"/>
+          <w:lang w:val="en-US" w:eastAsia="en-US"/>
+        </w:rPr>
+        <w:t xml:space="preserve">said individual </w:t>
+      </w:r>
+      <w:r>
+        <w:rPr>
+          <w:rFonts w:ascii="Calibri" w:hAnsi="Calibri" w:cs="Calibri"/>
+          <w:lang w:val="en-US" w:eastAsia="en-US"/>
+        </w:rPr>
+        <w:t>will act as</w:t>
+      </w:r>
+      <w:r>
+        <w:rPr>
+          <w:rFonts w:ascii="Calibri" w:hAnsi="Calibri" w:cs="Calibri"/>
+          <w:lang w:val="en-US" w:eastAsia="en-US"/>
+        </w:rPr>
+        <w:t xml:space="preserve"> all three roles</w:t>
+      </w:r>
+      <w:r>
+        <w:rPr>
+          <w:rFonts w:ascii="Calibri" w:hAnsi="Calibri" w:cs="Calibri"/>
+          <w:lang w:val="en-US" w:eastAsia="en-US"/>
+        </w:rPr>
+        <w:t>:</w:t>
+      </w:r>
+    </w:p>
+    <w:p>
+      <w:pPr>
+        <w:ind w:firstLine="0"/>
+        <w:rPr>
+          <w:rFonts w:ascii="Calibri" w:hAnsi="Calibri" w:cs="Calibri"/>
+          <w:lang w:val="en-US" w:eastAsia="en-US"/>
+        </w:rPr>
+      </w:pPr>
+      <w:r>
+        <w:rPr>
+          <w:rFonts w:ascii="Calibri" w:hAnsi="Calibri" w:cs="Calibri"/>
+          <w:b/>
+          <w:bCs/>
+          <w:lang w:val="en-US" w:eastAsia="en-US"/>
+        </w:rPr>
+        <w:t>Scrum Master:</w:t>
+      </w:r>
+      <w:r>
+        <w:rPr>
+          <w:rFonts w:ascii="Calibri" w:hAnsi="Calibri" w:cs="Calibri"/>
+          <w:b/>
+          <w:bCs/>
+          <w:lang w:val="en-US" w:eastAsia="en-US"/>
+        </w:rPr>
+        <w:t xml:space="preserve"> </w:t>
+      </w:r>
+      <w:r>
+        <w:rPr>
+          <w:rFonts w:ascii="Calibri" w:hAnsi="Calibri" w:cs="Calibri"/>
+          <w:lang w:val="en-US" w:eastAsia="en-US"/>
+        </w:rPr>
+        <w:t>Managed the backlog and sprint timelines.</w:t>
+      </w:r>
+    </w:p>
+    <w:p>
+      <w:pPr>
+        <w:ind w:firstLine="0"/>
+        <w:rPr>
+          <w:rFonts w:ascii="Calibri" w:hAnsi="Calibri" w:cs="Calibri"/>
+          <w:lang w:val="en-US" w:eastAsia="en-US"/>
+        </w:rPr>
+      </w:pPr>
+      <w:r>
+        <w:rPr>
+          <w:rFonts w:ascii="Calibri" w:hAnsi="Calibri" w:cs="Calibri"/>
+          <w:b/>
+          <w:bCs/>
+          <w:lang w:val="en-US" w:eastAsia="en-US"/>
+        </w:rPr>
+        <w:t>Product Owner:</w:t>
+      </w:r>
+      <w:r>
+        <w:rPr>
+          <w:rFonts w:ascii="Calibri" w:hAnsi="Calibri" w:cs="Calibri"/>
+          <w:lang w:val="en-US" w:eastAsia="en-US"/>
+        </w:rPr>
+        <w:t xml:space="preserve"> Defined user stories and project value.</w:t>
+      </w:r>
+    </w:p>
+    <w:p>
+      <w:pPr>
+        <w:rPr>
+          <w:rFonts w:ascii="Calibri" w:hAnsi="Calibri" w:cs="Calibri"/>
+          <w:lang w:val="en-US" w:eastAsia="en-US"/>
+        </w:rPr>
+      </w:pPr>
+      <w:r>
+        <w:rPr>
+          <w:rFonts w:ascii="Calibri" w:hAnsi="Calibri" w:cs="Calibri"/>
+          <w:b/>
+          <w:bCs/>
+          <w:lang w:val="en-US" w:eastAsia="en-US"/>
+        </w:rPr>
+        <w:t>Developer:</w:t>
+      </w:r>
+      <w:r>
+        <w:rPr>
+          <w:rFonts w:ascii="Calibri" w:hAnsi="Calibri" w:cs="Calibri"/>
+          <w:lang w:val="en-US" w:eastAsia="en-US"/>
+        </w:rPr>
+        <w:t xml:space="preserve"> Responsible for </w:t>
+      </w:r>
+      <w:proofErr w:type="spellStart"/>
+      <w:r>
+        <w:rPr>
+          <w:rFonts w:ascii="Calibri" w:hAnsi="Calibri" w:cs="Calibri"/>
+          <w:lang w:val="en-US" w:eastAsia="en-US"/>
+        </w:rPr>
+        <w:t>SvelteKit</w:t>
+      </w:r>
+      <w:proofErr w:type="spellEnd"/>
+      <w:r>
+        <w:rPr>
+          <w:rFonts w:ascii="Calibri" w:hAnsi="Calibri" w:cs="Calibri"/>
+          <w:lang w:val="en-US" w:eastAsia="en-US"/>
+        </w:rPr>
+        <w:t xml:space="preserve"> implementation.</w:t>
+      </w:r>
+    </w:p>
+    <w:p>
+      <w:pPr>
+        <w:ind w:left="0" w:firstLine="0"/>
+        <w:rPr>
+          <w:rFonts w:ascii="Calibri" w:hAnsi="Calibri" w:cs="Calibri"/>
+          <w:lang w:val="en-US" w:eastAsia="en-US"/>
+        </w:rPr>
+      </w:pPr>
+    </w:p>
+    <w:p>
+      <w:pPr>
+        <w:pStyle w:val="Heading2"/>
+        <w:rPr>
+          <w:rFonts w:ascii="Calibri" w:hAnsi="Calibri" w:cs="Calibri"/>
+        </w:rPr>
+      </w:pPr>
+      <w:r>
+        <w:rPr>
+          <w:rFonts w:ascii="Calibri" w:hAnsi="Calibri" w:cs="Calibri"/>
+        </w:rPr>
+        <w:t>Product Backlog</w:t>
       </w:r>
     </w:p>
     <w:tbl>
@@ -34,13 +200,19 @@
         <w:tc>
           <w:tcPr>
             <w:cnfStyle w:val="001000000100" w:firstRow="0" w:lastRow="0" w:firstColumn="1" w:lastColumn="0" w:oddVBand="0" w:evenVBand="0" w:oddHBand="0" w:evenHBand="0" w:firstRowFirstColumn="1" w:firstRowLastColumn="0" w:lastRowFirstColumn="0" w:lastRowLastColumn="0"/>
-            <w:tcW w:w="1023" w:type="dxa"/>
+            <w:tcW w:w="1076" w:type="dxa"/>
           </w:tcPr>
           <w:p>
             <w:pPr>
               <w:jc w:val="left"/>
-            </w:pPr>
-            <w:r>
+              <w:rPr>
+                <w:rFonts w:ascii="Calibri" w:hAnsi="Calibri" w:cs="Calibri"/>
+              </w:rPr>
+            </w:pPr>
+            <w:r>
+              <w:rPr>
+                <w:rFonts w:ascii="Calibri" w:hAnsi="Calibri" w:cs="Calibri"/>
+              </w:rPr>
               <w:t>Number</w:t>
             </w:r>
           </w:p>
@@ -53,8 +225,14 @@
             <w:pPr>
               <w:jc w:val="center"/>
               <w:cnfStyle w:val="100000000000" w:firstRow="1" w:lastRow="0" w:firstColumn="0" w:lastColumn="0" w:oddVBand="0" w:evenVBand="0" w:oddHBand="0" w:evenHBand="0" w:firstRowFirstColumn="0" w:firstRowLastColumn="0" w:lastRowFirstColumn="0" w:lastRowLastColumn="0"/>
-            </w:pPr>
-            <w:r>
+              <w:rPr>
+                <w:rFonts w:ascii="Calibri" w:hAnsi="Calibri" w:cs="Calibri"/>
+              </w:rPr>
+            </w:pPr>
+            <w:r>
+              <w:rPr>
+                <w:rFonts w:ascii="Calibri" w:hAnsi="Calibri" w:cs="Calibri"/>
+              </w:rPr>
               <w:t>User story</w:t>
             </w:r>
           </w:p>
@@ -66,8 +244,14 @@
           <w:p>
             <w:pPr>
               <w:cnfStyle w:val="100000000000" w:firstRow="1" w:lastRow="0" w:firstColumn="0" w:lastColumn="0" w:oddVBand="0" w:evenVBand="0" w:oddHBand="0" w:evenHBand="0" w:firstRowFirstColumn="0" w:firstRowLastColumn="0" w:lastRowFirstColumn="0" w:lastRowLastColumn="0"/>
-            </w:pPr>
-            <w:r>
+              <w:rPr>
+                <w:rFonts w:ascii="Calibri" w:hAnsi="Calibri" w:cs="Calibri"/>
+              </w:rPr>
+            </w:pPr>
+            <w:r>
+              <w:rPr>
+                <w:rFonts w:ascii="Calibri" w:hAnsi="Calibri" w:cs="Calibri"/>
+              </w:rPr>
               <w:t>Estimate</w:t>
             </w:r>
           </w:p>
@@ -80,14 +264,20 @@
         <w:tc>
           <w:tcPr>
             <w:cnfStyle w:val="001000000000" w:firstRow="0" w:lastRow="0" w:firstColumn="1" w:lastColumn="0" w:oddVBand="0" w:evenVBand="0" w:oddHBand="0" w:evenHBand="0" w:firstRowFirstColumn="0" w:firstRowLastColumn="0" w:lastRowFirstColumn="0" w:lastRowLastColumn="0"/>
-            <w:tcW w:w="1023" w:type="dxa"/>
+            <w:tcW w:w="1076" w:type="dxa"/>
             <w:shd w:val="clear" w:color="auto" w:fill="F2CEED" w:themeFill="accent5" w:themeFillTint="33"/>
           </w:tcPr>
           <w:p>
             <w:pPr>
               <w:jc w:val="center"/>
-            </w:pPr>
-            <w:r>
+              <w:rPr>
+                <w:rFonts w:ascii="Calibri" w:hAnsi="Calibri" w:cs="Calibri"/>
+              </w:rPr>
+            </w:pPr>
+            <w:r>
+              <w:rPr>
+                <w:rFonts w:ascii="Calibri" w:hAnsi="Calibri" w:cs="Calibri"/>
+              </w:rPr>
               <w:t>1</w:t>
             </w:r>
           </w:p>
@@ -100,9 +290,26 @@
             <w:pPr>
               <w:jc w:val="center"/>
               <w:cnfStyle w:val="000000100000" w:firstRow="0" w:lastRow="0" w:firstColumn="0" w:lastColumn="0" w:oddVBand="0" w:evenVBand="0" w:oddHBand="1" w:evenHBand="0" w:firstRowFirstColumn="0" w:firstRowLastColumn="0" w:lastRowFirstColumn="0" w:lastRowLastColumn="0"/>
-            </w:pPr>
-            <w:r>
-              <w:t>user story 1</w:t>
+              <w:rPr>
+                <w:rFonts w:ascii="Calibri" w:hAnsi="Calibri" w:cs="Calibri"/>
+                <w:lang w:val="en-US"/>
+              </w:rPr>
+            </w:pPr>
+            <w:r>
+              <w:rPr>
+                <w:rFonts w:ascii="Calibri" w:hAnsi="Calibri" w:cs="Calibri"/>
+                <w:b/>
+                <w:bCs/>
+                <w:lang w:val="en-US"/>
+              </w:rPr>
+              <w:t>As a Patient,</w:t>
+            </w:r>
+            <w:r>
+              <w:rPr>
+                <w:rFonts w:ascii="Calibri" w:hAnsi="Calibri" w:cs="Calibri"/>
+                <w:lang w:val="en-US"/>
+              </w:rPr>
+              <w:t xml:space="preserve"> I want to log in securely so that I can access my private medical data.</w:t>
             </w:r>
           </w:p>
         </w:tc>
@@ -113,9 +320,15 @@
           <w:p>
             <w:pPr>
               <w:cnfStyle w:val="000000100000" w:firstRow="0" w:lastRow="0" w:firstColumn="0" w:lastColumn="0" w:oddVBand="0" w:evenVBand="0" w:oddHBand="1" w:evenHBand="0" w:firstRowFirstColumn="0" w:firstRowLastColumn="0" w:lastRowFirstColumn="0" w:lastRowLastColumn="0"/>
-            </w:pPr>
-            <w:r>
-              <w:t>Story points</w:t>
+              <w:rPr>
+                <w:rFonts w:ascii="Calibri" w:hAnsi="Calibri" w:cs="Calibri"/>
+              </w:rPr>
+            </w:pPr>
+            <w:r>
+              <w:rPr>
+                <w:rFonts w:ascii="Calibri" w:hAnsi="Calibri" w:cs="Calibri"/>
+              </w:rPr>
+              <w:t>3</w:t>
             </w:r>
           </w:p>
         </w:tc>
@@ -124,13 +337,19 @@
         <w:tc>
           <w:tcPr>
             <w:cnfStyle w:val="001000000000" w:firstRow="0" w:lastRow="0" w:firstColumn="1" w:lastColumn="0" w:oddVBand="0" w:evenVBand="0" w:oddHBand="0" w:evenHBand="0" w:firstRowFirstColumn="0" w:firstRowLastColumn="0" w:lastRowFirstColumn="0" w:lastRowLastColumn="0"/>
-            <w:tcW w:w="1023" w:type="dxa"/>
+            <w:tcW w:w="1076" w:type="dxa"/>
           </w:tcPr>
           <w:p>
             <w:pPr>
               <w:jc w:val="center"/>
-            </w:pPr>
-            <w:r>
+              <w:rPr>
+                <w:rFonts w:ascii="Calibri" w:hAnsi="Calibri" w:cs="Calibri"/>
+              </w:rPr>
+            </w:pPr>
+            <w:r>
+              <w:rPr>
+                <w:rFonts w:ascii="Calibri" w:hAnsi="Calibri" w:cs="Calibri"/>
+              </w:rPr>
               <w:t>2</w:t>
             </w:r>
           </w:p>
@@ -143,9 +362,26 @@
             <w:pPr>
               <w:jc w:val="center"/>
               <w:cnfStyle w:val="000000000000" w:firstRow="0" w:lastRow="0" w:firstColumn="0" w:lastColumn="0" w:oddVBand="0" w:evenVBand="0" w:oddHBand="0" w:evenHBand="0" w:firstRowFirstColumn="0" w:firstRowLastColumn="0" w:lastRowFirstColumn="0" w:lastRowLastColumn="0"/>
-            </w:pPr>
-            <w:r>
-              <w:t>user story 2</w:t>
+              <w:rPr>
+                <w:rFonts w:ascii="Calibri" w:hAnsi="Calibri" w:cs="Calibri"/>
+                <w:lang w:val="en-US"/>
+              </w:rPr>
+            </w:pPr>
+            <w:r>
+              <w:rPr>
+                <w:rFonts w:ascii="Calibri" w:hAnsi="Calibri" w:cs="Calibri"/>
+                <w:b/>
+                <w:bCs/>
+                <w:lang w:val="en-US"/>
+              </w:rPr>
+              <w:t>As a Patient,</w:t>
+            </w:r>
+            <w:r>
+              <w:rPr>
+                <w:rFonts w:ascii="Calibri" w:hAnsi="Calibri" w:cs="Calibri"/>
+                <w:lang w:val="en-US"/>
+              </w:rPr>
+              <w:t xml:space="preserve"> I want to view a real-time calendar of doctor availability so I can find an open slot.</w:t>
             </w:r>
           </w:p>
         </w:tc>
@@ -156,9 +392,15 @@
           <w:p>
             <w:pPr>
               <w:cnfStyle w:val="000000000000" w:firstRow="0" w:lastRow="0" w:firstColumn="0" w:lastColumn="0" w:oddVBand="0" w:evenVBand="0" w:oddHBand="0" w:evenHBand="0" w:firstRowFirstColumn="0" w:firstRowLastColumn="0" w:lastRowFirstColumn="0" w:lastRowLastColumn="0"/>
-            </w:pPr>
-            <w:r>
-              <w:t>Story points</w:t>
+              <w:rPr>
+                <w:rFonts w:ascii="Calibri" w:hAnsi="Calibri" w:cs="Calibri"/>
+              </w:rPr>
+            </w:pPr>
+            <w:r>
+              <w:rPr>
+                <w:rFonts w:ascii="Calibri" w:hAnsi="Calibri" w:cs="Calibri"/>
+              </w:rPr>
+              <w:t>5</w:t>
             </w:r>
           </w:p>
         </w:tc>
@@ -170,14 +412,20 @@
         <w:tc>
           <w:tcPr>
             <w:cnfStyle w:val="001000000000" w:firstRow="0" w:lastRow="0" w:firstColumn="1" w:lastColumn="0" w:oddVBand="0" w:evenVBand="0" w:oddHBand="0" w:evenHBand="0" w:firstRowFirstColumn="0" w:firstRowLastColumn="0" w:lastRowFirstColumn="0" w:lastRowLastColumn="0"/>
-            <w:tcW w:w="1023" w:type="dxa"/>
+            <w:tcW w:w="1076" w:type="dxa"/>
             <w:shd w:val="clear" w:color="auto" w:fill="F2CEED" w:themeFill="accent5" w:themeFillTint="33"/>
           </w:tcPr>
           <w:p>
             <w:pPr>
               <w:jc w:val="center"/>
-            </w:pPr>
-            <w:r>
+              <w:rPr>
+                <w:rFonts w:ascii="Calibri" w:hAnsi="Calibri" w:cs="Calibri"/>
+              </w:rPr>
+            </w:pPr>
+            <w:r>
+              <w:rPr>
+                <w:rFonts w:ascii="Calibri" w:hAnsi="Calibri" w:cs="Calibri"/>
+              </w:rPr>
               <w:t>3</w:t>
             </w:r>
           </w:p>
@@ -190,9 +438,43 @@
             <w:pPr>
               <w:jc w:val="center"/>
               <w:cnfStyle w:val="000000100000" w:firstRow="0" w:lastRow="0" w:firstColumn="0" w:lastColumn="0" w:oddVBand="0" w:evenVBand="0" w:oddHBand="1" w:evenHBand="0" w:firstRowFirstColumn="0" w:firstRowLastColumn="0" w:lastRowFirstColumn="0" w:lastRowLastColumn="0"/>
-            </w:pPr>
-            <w:r>
-              <w:t>user story 3</w:t>
+              <w:rPr>
+                <w:rFonts w:ascii="Calibri" w:hAnsi="Calibri" w:cs="Calibri"/>
+              </w:rPr>
+            </w:pPr>
+            <w:r>
+              <w:rPr>
+                <w:rFonts w:ascii="Calibri" w:hAnsi="Calibri" w:cs="Calibri"/>
+                <w:b/>
+                <w:bCs/>
+              </w:rPr>
+              <w:t>As a Patient,</w:t>
+            </w:r>
+            <w:r>
+              <w:rPr>
+                <w:rFonts w:ascii="Calibri" w:hAnsi="Calibri" w:cs="Calibri"/>
+              </w:rPr>
+              <w:t xml:space="preserve"> I want to book an appointment </w:t>
+            </w:r>
+            <w:proofErr w:type="gramStart"/>
+            <w:r>
+              <w:rPr>
+                <w:rFonts w:ascii="Calibri" w:hAnsi="Calibri" w:cs="Calibri"/>
+              </w:rPr>
+              <w:t>online</w:t>
+            </w:r>
+            <w:proofErr w:type="gramEnd"/>
+            <w:r>
+              <w:rPr>
+                <w:rFonts w:ascii="Calibri" w:hAnsi="Calibri" w:cs="Calibri"/>
+              </w:rPr>
+              <w:t xml:space="preserve"> so I don't have to call the clinic</w:t>
+            </w:r>
+            <w:r>
+              <w:rPr>
+                <w:rFonts w:ascii="Calibri" w:hAnsi="Calibri" w:cs="Calibri"/>
+              </w:rPr>
+              <w:t>.</w:t>
             </w:r>
           </w:p>
         </w:tc>
@@ -203,9 +485,15 @@
           <w:p>
             <w:pPr>
               <w:cnfStyle w:val="000000100000" w:firstRow="0" w:lastRow="0" w:firstColumn="0" w:lastColumn="0" w:oddVBand="0" w:evenVBand="0" w:oddHBand="1" w:evenHBand="0" w:firstRowFirstColumn="0" w:firstRowLastColumn="0" w:lastRowFirstColumn="0" w:lastRowLastColumn="0"/>
-            </w:pPr>
-            <w:r>
-              <w:t>Story points</w:t>
+              <w:rPr>
+                <w:rFonts w:ascii="Calibri" w:hAnsi="Calibri" w:cs="Calibri"/>
+              </w:rPr>
+            </w:pPr>
+            <w:r>
+              <w:rPr>
+                <w:rFonts w:ascii="Calibri" w:hAnsi="Calibri" w:cs="Calibri"/>
+              </w:rPr>
+              <w:t>8</w:t>
             </w:r>
           </w:p>
         </w:tc>
@@ -214,13 +502,19 @@
         <w:tc>
           <w:tcPr>
             <w:cnfStyle w:val="001000000000" w:firstRow="0" w:lastRow="0" w:firstColumn="1" w:lastColumn="0" w:oddVBand="0" w:evenVBand="0" w:oddHBand="0" w:evenHBand="0" w:firstRowFirstColumn="0" w:firstRowLastColumn="0" w:lastRowFirstColumn="0" w:lastRowLastColumn="0"/>
-            <w:tcW w:w="1023" w:type="dxa"/>
+            <w:tcW w:w="1076" w:type="dxa"/>
           </w:tcPr>
           <w:p>
             <w:pPr>
               <w:jc w:val="center"/>
-            </w:pPr>
-            <w:r>
+              <w:rPr>
+                <w:rFonts w:ascii="Calibri" w:hAnsi="Calibri" w:cs="Calibri"/>
+              </w:rPr>
+            </w:pPr>
+            <w:r>
+              <w:rPr>
+                <w:rFonts w:ascii="Calibri" w:hAnsi="Calibri" w:cs="Calibri"/>
+              </w:rPr>
               <w:t>4</w:t>
             </w:r>
           </w:p>
@@ -233,9 +527,26 @@
             <w:pPr>
               <w:jc w:val="center"/>
               <w:cnfStyle w:val="000000000000" w:firstRow="0" w:lastRow="0" w:firstColumn="0" w:lastColumn="0" w:oddVBand="0" w:evenVBand="0" w:oddHBand="0" w:evenHBand="0" w:firstRowFirstColumn="0" w:firstRowLastColumn="0" w:lastRowFirstColumn="0" w:lastRowLastColumn="0"/>
-            </w:pPr>
-            <w:r>
-              <w:t>user story 4</w:t>
+              <w:rPr>
+                <w:rFonts w:ascii="Calibri" w:hAnsi="Calibri" w:cs="Calibri"/>
+                <w:lang w:val="en-US"/>
+              </w:rPr>
+            </w:pPr>
+            <w:r>
+              <w:rPr>
+                <w:rFonts w:ascii="Calibri" w:hAnsi="Calibri" w:cs="Calibri"/>
+                <w:b/>
+                <w:bCs/>
+                <w:lang w:val="en-US"/>
+              </w:rPr>
+              <w:t>As a Patient,</w:t>
+            </w:r>
+            <w:r>
+              <w:rPr>
+                <w:rFonts w:ascii="Calibri" w:hAnsi="Calibri" w:cs="Calibri"/>
+                <w:lang w:val="en-US"/>
+              </w:rPr>
+              <w:t xml:space="preserve"> I want to view my medical records portal so I can track my treatment history.</w:t>
             </w:r>
           </w:p>
         </w:tc>
@@ -246,9 +557,15 @@
           <w:p>
             <w:pPr>
               <w:cnfStyle w:val="000000000000" w:firstRow="0" w:lastRow="0" w:firstColumn="0" w:lastColumn="0" w:oddVBand="0" w:evenVBand="0" w:oddHBand="0" w:evenHBand="0" w:firstRowFirstColumn="0" w:firstRowLastColumn="0" w:lastRowFirstColumn="0" w:lastRowLastColumn="0"/>
-            </w:pPr>
-            <w:r>
-              <w:t>Story points</w:t>
+              <w:rPr>
+                <w:rFonts w:ascii="Calibri" w:hAnsi="Calibri" w:cs="Calibri"/>
+              </w:rPr>
+            </w:pPr>
+            <w:r>
+              <w:rPr>
+                <w:rFonts w:ascii="Calibri" w:hAnsi="Calibri" w:cs="Calibri"/>
+              </w:rPr>
+              <w:t>5</w:t>
             </w:r>
           </w:p>
         </w:tc>
@@ -260,14 +577,20 @@
         <w:tc>
           <w:tcPr>
             <w:cnfStyle w:val="001000000000" w:firstRow="0" w:lastRow="0" w:firstColumn="1" w:lastColumn="0" w:oddVBand="0" w:evenVBand="0" w:oddHBand="0" w:evenHBand="0" w:firstRowFirstColumn="0" w:firstRowLastColumn="0" w:lastRowFirstColumn="0" w:lastRowLastColumn="0"/>
-            <w:tcW w:w="1023" w:type="dxa"/>
+            <w:tcW w:w="1076" w:type="dxa"/>
             <w:shd w:val="clear" w:color="auto" w:fill="F2CEED" w:themeFill="accent5" w:themeFillTint="33"/>
           </w:tcPr>
           <w:p>
             <w:pPr>
               <w:jc w:val="center"/>
-            </w:pPr>
-            <w:r>
+              <w:rPr>
+                <w:rFonts w:ascii="Calibri" w:hAnsi="Calibri" w:cs="Calibri"/>
+              </w:rPr>
+            </w:pPr>
+            <w:r>
+              <w:rPr>
+                <w:rFonts w:ascii="Calibri" w:hAnsi="Calibri" w:cs="Calibri"/>
+              </w:rPr>
               <w:t>5</w:t>
             </w:r>
           </w:p>
@@ -280,9 +603,26 @@
             <w:pPr>
               <w:jc w:val="center"/>
               <w:cnfStyle w:val="000000100000" w:firstRow="0" w:lastRow="0" w:firstColumn="0" w:lastColumn="0" w:oddVBand="0" w:evenVBand="0" w:oddHBand="1" w:evenHBand="0" w:firstRowFirstColumn="0" w:firstRowLastColumn="0" w:lastRowFirstColumn="0" w:lastRowLastColumn="0"/>
-            </w:pPr>
-            <w:r>
-              <w:t>user story 5</w:t>
+              <w:rPr>
+                <w:rFonts w:ascii="Calibri" w:hAnsi="Calibri" w:cs="Calibri"/>
+                <w:lang w:val="en-US"/>
+              </w:rPr>
+            </w:pPr>
+            <w:r>
+              <w:rPr>
+                <w:rFonts w:ascii="Calibri" w:hAnsi="Calibri" w:cs="Calibri"/>
+                <w:b/>
+                <w:bCs/>
+                <w:lang w:val="en-US"/>
+              </w:rPr>
+              <w:t>As a Doctor,</w:t>
+            </w:r>
+            <w:r>
+              <w:rPr>
+                <w:rFonts w:ascii="Calibri" w:hAnsi="Calibri" w:cs="Calibri"/>
+                <w:lang w:val="en-US"/>
+              </w:rPr>
+              <w:t xml:space="preserve"> I want to view my daily bookings so I can see which patients I am seeing.</w:t>
             </w:r>
           </w:p>
         </w:tc>
@@ -293,9 +633,15 @@
           <w:p>
             <w:pPr>
               <w:cnfStyle w:val="000000100000" w:firstRow="0" w:lastRow="0" w:firstColumn="0" w:lastColumn="0" w:oddVBand="0" w:evenVBand="0" w:oddHBand="1" w:evenHBand="0" w:firstRowFirstColumn="0" w:firstRowLastColumn="0" w:lastRowFirstColumn="0" w:lastRowLastColumn="0"/>
-            </w:pPr>
-            <w:r>
-              <w:t>Story points</w:t>
+              <w:rPr>
+                <w:rFonts w:ascii="Calibri" w:hAnsi="Calibri" w:cs="Calibri"/>
+              </w:rPr>
+            </w:pPr>
+            <w:r>
+              <w:rPr>
+                <w:rFonts w:ascii="Calibri" w:hAnsi="Calibri" w:cs="Calibri"/>
+              </w:rPr>
+              <w:t>3</w:t>
             </w:r>
           </w:p>
         </w:tc>
@@ -304,12 +650,22 @@
         <w:tc>
           <w:tcPr>
             <w:cnfStyle w:val="001000000000" w:firstRow="0" w:lastRow="0" w:firstColumn="1" w:lastColumn="0" w:oddVBand="0" w:evenVBand="0" w:oddHBand="0" w:evenHBand="0" w:firstRowFirstColumn="0" w:firstRowLastColumn="0" w:lastRowFirstColumn="0" w:lastRowLastColumn="0"/>
-            <w:tcW w:w="1023" w:type="dxa"/>
+            <w:tcW w:w="1076" w:type="dxa"/>
+            <w:shd w:val="clear" w:color="auto" w:fill="auto"/>
           </w:tcPr>
           <w:p>
             <w:pPr>
               <w:jc w:val="center"/>
-            </w:pPr>
+              <w:rPr>
+                <w:rFonts w:ascii="Calibri" w:hAnsi="Calibri" w:cs="Calibri"/>
+              </w:rPr>
+            </w:pPr>
+            <w:r>
+              <w:rPr>
+                <w:rFonts w:ascii="Calibri" w:hAnsi="Calibri" w:cs="Calibri"/>
+              </w:rPr>
+              <w:t>6</w:t>
+            </w:r>
           </w:p>
         </w:tc>
         <w:tc>
@@ -320,9 +676,38 @@
             <w:pPr>
               <w:jc w:val="center"/>
               <w:cnfStyle w:val="000000000000" w:firstRow="0" w:lastRow="0" w:firstColumn="0" w:lastColumn="0" w:oddVBand="0" w:evenVBand="0" w:oddHBand="0" w:evenHBand="0" w:firstRowFirstColumn="0" w:firstRowLastColumn="0" w:lastRowFirstColumn="0" w:lastRowLastColumn="0"/>
-            </w:pPr>
-            <w:r>
-              <w:t>Add rows as necessary…</w:t>
+              <w:rPr>
+                <w:rFonts w:ascii="Calibri" w:hAnsi="Calibri" w:cs="Calibri"/>
+                <w:b/>
+                <w:bCs/>
+                <w:lang w:val="en-US"/>
+              </w:rPr>
+            </w:pPr>
+            <w:r>
+              <w:rPr>
+                <w:rFonts w:ascii="Calibri" w:hAnsi="Calibri" w:cs="Calibri"/>
+                <w:b/>
+                <w:bCs/>
+              </w:rPr>
+              <w:t xml:space="preserve">As a Patient, I want to receive an appointment </w:t>
+            </w:r>
+            <w:proofErr w:type="gramStart"/>
+            <w:r>
+              <w:rPr>
+                <w:rFonts w:ascii="Calibri" w:hAnsi="Calibri" w:cs="Calibri"/>
+                <w:b/>
+                <w:bCs/>
+              </w:rPr>
+              <w:t>confirmation</w:t>
+            </w:r>
+            <w:proofErr w:type="gramEnd"/>
+            <w:r>
+              <w:rPr>
+                <w:rFonts w:ascii="Calibri" w:hAnsi="Calibri" w:cs="Calibri"/>
+                <w:b/>
+                <w:bCs/>
+              </w:rPr>
+              <w:t xml:space="preserve"> so I know my booking was successful.</w:t>
             </w:r>
           </w:p>
         </w:tc>
@@ -333,65 +718,732 @@
           <w:p>
             <w:pPr>
               <w:cnfStyle w:val="000000000000" w:firstRow="0" w:lastRow="0" w:firstColumn="0" w:lastColumn="0" w:oddVBand="0" w:evenVBand="0" w:oddHBand="0" w:evenHBand="0" w:firstRowFirstColumn="0" w:firstRowLastColumn="0" w:lastRowFirstColumn="0" w:lastRowLastColumn="0"/>
-            </w:pPr>
+              <w:rPr>
+                <w:rFonts w:ascii="Calibri" w:hAnsi="Calibri" w:cs="Calibri"/>
+              </w:rPr>
+            </w:pPr>
+            <w:r>
+              <w:rPr>
+                <w:rFonts w:ascii="Calibri" w:hAnsi="Calibri" w:cs="Calibri"/>
+              </w:rPr>
+              <w:t>2</w:t>
+            </w:r>
+          </w:p>
+        </w:tc>
+      </w:tr>
+      <w:tr>
+        <w:trPr>
+          <w:cnfStyle w:val="000000100000" w:firstRow="0" w:lastRow="0" w:firstColumn="0" w:lastColumn="0" w:oddVBand="0" w:evenVBand="0" w:oddHBand="1" w:evenHBand="0" w:firstRowFirstColumn="0" w:firstRowLastColumn="0" w:lastRowFirstColumn="0" w:lastRowLastColumn="0"/>
+        </w:trPr>
+        <w:tc>
+          <w:tcPr>
+            <w:cnfStyle w:val="001000000000" w:firstRow="0" w:lastRow="0" w:firstColumn="1" w:lastColumn="0" w:oddVBand="0" w:evenVBand="0" w:oddHBand="0" w:evenHBand="0" w:firstRowFirstColumn="0" w:firstRowLastColumn="0" w:lastRowFirstColumn="0" w:lastRowLastColumn="0"/>
+            <w:tcW w:w="1076" w:type="dxa"/>
+            <w:shd w:val="clear" w:color="auto" w:fill="F2CEED" w:themeFill="accent5" w:themeFillTint="33"/>
+          </w:tcPr>
+          <w:p>
+            <w:pPr>
+              <w:jc w:val="center"/>
+              <w:rPr>
+                <w:rFonts w:ascii="Calibri" w:hAnsi="Calibri" w:cs="Calibri"/>
+              </w:rPr>
+            </w:pPr>
+            <w:r>
+              <w:rPr>
+                <w:rFonts w:ascii="Calibri" w:hAnsi="Calibri" w:cs="Calibri"/>
+              </w:rPr>
+              <w:t>7</w:t>
+            </w:r>
+          </w:p>
+        </w:tc>
+        <w:tc>
+          <w:tcPr>
+            <w:tcW w:w="6671" w:type="dxa"/>
+          </w:tcPr>
+          <w:p>
+            <w:pPr>
+              <w:jc w:val="center"/>
+              <w:cnfStyle w:val="000000100000" w:firstRow="0" w:lastRow="0" w:firstColumn="0" w:lastColumn="0" w:oddVBand="0" w:evenVBand="0" w:oddHBand="1" w:evenHBand="0" w:firstRowFirstColumn="0" w:firstRowLastColumn="0" w:lastRowFirstColumn="0" w:lastRowLastColumn="0"/>
+              <w:rPr>
+                <w:rFonts w:ascii="Calibri" w:hAnsi="Calibri" w:cs="Calibri"/>
+                <w:b/>
+                <w:bCs/>
+                <w:lang w:val="en-US"/>
+              </w:rPr>
+            </w:pPr>
+            <w:r>
+              <w:rPr>
+                <w:rFonts w:ascii="Calibri" w:hAnsi="Calibri" w:cs="Calibri"/>
+                <w:b/>
+                <w:bCs/>
+              </w:rPr>
+              <w:t xml:space="preserve">As an Admin, I want to register a new patient with their name and </w:t>
+            </w:r>
+            <w:proofErr w:type="gramStart"/>
+            <w:r>
+              <w:rPr>
+                <w:rFonts w:ascii="Calibri" w:hAnsi="Calibri" w:cs="Calibri"/>
+                <w:b/>
+                <w:bCs/>
+              </w:rPr>
+              <w:t>DOB</w:t>
+            </w:r>
+            <w:proofErr w:type="gramEnd"/>
+            <w:r>
+              <w:rPr>
+                <w:rFonts w:ascii="Calibri" w:hAnsi="Calibri" w:cs="Calibri"/>
+                <w:b/>
+                <w:bCs/>
+              </w:rPr>
+              <w:t xml:space="preserve"> so their record is created.</w:t>
+            </w:r>
+          </w:p>
+        </w:tc>
+        <w:tc>
+          <w:tcPr>
+            <w:tcW w:w="1327" w:type="dxa"/>
+          </w:tcPr>
+          <w:p>
+            <w:pPr>
+              <w:cnfStyle w:val="000000100000" w:firstRow="0" w:lastRow="0" w:firstColumn="0" w:lastColumn="0" w:oddVBand="0" w:evenVBand="0" w:oddHBand="1" w:evenHBand="0" w:firstRowFirstColumn="0" w:firstRowLastColumn="0" w:lastRowFirstColumn="0" w:lastRowLastColumn="0"/>
+              <w:rPr>
+                <w:rFonts w:ascii="Calibri" w:hAnsi="Calibri" w:cs="Calibri"/>
+              </w:rPr>
+            </w:pPr>
+            <w:r>
+              <w:rPr>
+                <w:rFonts w:ascii="Calibri" w:hAnsi="Calibri" w:cs="Calibri"/>
+              </w:rPr>
+              <w:t>3</w:t>
+            </w:r>
+          </w:p>
+        </w:tc>
+      </w:tr>
+      <w:tr>
+        <w:tc>
+          <w:tcPr>
+            <w:cnfStyle w:val="001000000000" w:firstRow="0" w:lastRow="0" w:firstColumn="1" w:lastColumn="0" w:oddVBand="0" w:evenVBand="0" w:oddHBand="0" w:evenHBand="0" w:firstRowFirstColumn="0" w:firstRowLastColumn="0" w:lastRowFirstColumn="0" w:lastRowLastColumn="0"/>
+            <w:tcW w:w="1076" w:type="dxa"/>
+            <w:shd w:val="clear" w:color="auto" w:fill="auto"/>
+          </w:tcPr>
+          <w:p>
+            <w:pPr>
+              <w:jc w:val="center"/>
+              <w:rPr>
+                <w:rFonts w:ascii="Calibri" w:hAnsi="Calibri" w:cs="Calibri"/>
+              </w:rPr>
+            </w:pPr>
+            <w:r>
+              <w:rPr>
+                <w:rFonts w:ascii="Calibri" w:hAnsi="Calibri" w:cs="Calibri"/>
+              </w:rPr>
+              <w:t>8</w:t>
+            </w:r>
+          </w:p>
+        </w:tc>
+        <w:tc>
+          <w:tcPr>
+            <w:tcW w:w="6671" w:type="dxa"/>
+          </w:tcPr>
+          <w:p>
+            <w:pPr>
+              <w:jc w:val="center"/>
+              <w:cnfStyle w:val="000000000000" w:firstRow="0" w:lastRow="0" w:firstColumn="0" w:lastColumn="0" w:oddVBand="0" w:evenVBand="0" w:oddHBand="0" w:evenHBand="0" w:firstRowFirstColumn="0" w:firstRowLastColumn="0" w:lastRowFirstColumn="0" w:lastRowLastColumn="0"/>
+              <w:rPr>
+                <w:rFonts w:ascii="Calibri" w:hAnsi="Calibri" w:cs="Calibri"/>
+                <w:b/>
+                <w:bCs/>
+                <w:lang w:val="en-US"/>
+              </w:rPr>
+            </w:pPr>
+            <w:r>
+              <w:rPr>
+                <w:rFonts w:ascii="Calibri" w:hAnsi="Calibri" w:cs="Calibri"/>
+                <w:b/>
+                <w:bCs/>
+              </w:rPr>
+              <w:t>As a Patient, I want to choose a specific doctor for my booking to ensure continuity of care.</w:t>
+            </w:r>
+          </w:p>
+        </w:tc>
+        <w:tc>
+          <w:tcPr>
+            <w:tcW w:w="1327" w:type="dxa"/>
+          </w:tcPr>
+          <w:p>
+            <w:pPr>
+              <w:cnfStyle w:val="000000000000" w:firstRow="0" w:lastRow="0" w:firstColumn="0" w:lastColumn="0" w:oddVBand="0" w:evenVBand="0" w:oddHBand="0" w:evenHBand="0" w:firstRowFirstColumn="0" w:firstRowLastColumn="0" w:lastRowFirstColumn="0" w:lastRowLastColumn="0"/>
+              <w:rPr>
+                <w:rFonts w:ascii="Calibri" w:hAnsi="Calibri" w:cs="Calibri"/>
+              </w:rPr>
+            </w:pPr>
+            <w:r>
+              <w:rPr>
+                <w:rFonts w:ascii="Calibri" w:hAnsi="Calibri" w:cs="Calibri"/>
+              </w:rPr>
+              <w:t>5</w:t>
+            </w:r>
+          </w:p>
+        </w:tc>
+      </w:tr>
+      <w:tr>
+        <w:trPr>
+          <w:cnfStyle w:val="000000100000" w:firstRow="0" w:lastRow="0" w:firstColumn="0" w:lastColumn="0" w:oddVBand="0" w:evenVBand="0" w:oddHBand="1" w:evenHBand="0" w:firstRowFirstColumn="0" w:firstRowLastColumn="0" w:lastRowFirstColumn="0" w:lastRowLastColumn="0"/>
+        </w:trPr>
+        <w:tc>
+          <w:tcPr>
+            <w:cnfStyle w:val="001000000000" w:firstRow="0" w:lastRow="0" w:firstColumn="1" w:lastColumn="0" w:oddVBand="0" w:evenVBand="0" w:oddHBand="0" w:evenHBand="0" w:firstRowFirstColumn="0" w:firstRowLastColumn="0" w:lastRowFirstColumn="0" w:lastRowLastColumn="0"/>
+            <w:tcW w:w="1076" w:type="dxa"/>
+            <w:shd w:val="clear" w:color="auto" w:fill="F2CEED" w:themeFill="accent5" w:themeFillTint="33"/>
+          </w:tcPr>
+          <w:p>
+            <w:pPr>
+              <w:jc w:val="center"/>
+              <w:rPr>
+                <w:rFonts w:ascii="Calibri" w:hAnsi="Calibri" w:cs="Calibri"/>
+              </w:rPr>
+            </w:pPr>
+            <w:r>
+              <w:rPr>
+                <w:rFonts w:ascii="Calibri" w:hAnsi="Calibri" w:cs="Calibri"/>
+              </w:rPr>
+              <w:t>9</w:t>
+            </w:r>
+          </w:p>
+        </w:tc>
+        <w:tc>
+          <w:tcPr>
+            <w:tcW w:w="6671" w:type="dxa"/>
+          </w:tcPr>
+          <w:p>
+            <w:pPr>
+              <w:jc w:val="center"/>
+              <w:cnfStyle w:val="000000100000" w:firstRow="0" w:lastRow="0" w:firstColumn="0" w:lastColumn="0" w:oddVBand="0" w:evenVBand="0" w:oddHBand="1" w:evenHBand="0" w:firstRowFirstColumn="0" w:firstRowLastColumn="0" w:lastRowFirstColumn="0" w:lastRowLastColumn="0"/>
+              <w:rPr>
+                <w:rFonts w:ascii="Calibri" w:hAnsi="Calibri" w:cs="Calibri"/>
+                <w:b/>
+                <w:bCs/>
+                <w:lang w:val="en-US"/>
+              </w:rPr>
+            </w:pPr>
+            <w:r>
+              <w:rPr>
+                <w:rFonts w:ascii="Calibri" w:hAnsi="Calibri" w:cs="Calibri"/>
+                <w:b/>
+                <w:bCs/>
+              </w:rPr>
+              <w:t xml:space="preserve">As a Doctor, I want to update a patient's </w:t>
+            </w:r>
+            <w:proofErr w:type="gramStart"/>
+            <w:r>
+              <w:rPr>
+                <w:rFonts w:ascii="Calibri" w:hAnsi="Calibri" w:cs="Calibri"/>
+                <w:b/>
+                <w:bCs/>
+              </w:rPr>
+              <w:t>records</w:t>
+            </w:r>
+            <w:proofErr w:type="gramEnd"/>
+            <w:r>
+              <w:rPr>
+                <w:rFonts w:ascii="Calibri" w:hAnsi="Calibri" w:cs="Calibri"/>
+                <w:b/>
+                <w:bCs/>
+              </w:rPr>
+              <w:t xml:space="preserve"> so their medical history remains accurate.</w:t>
+            </w:r>
+          </w:p>
+        </w:tc>
+        <w:tc>
+          <w:tcPr>
+            <w:tcW w:w="1327" w:type="dxa"/>
+          </w:tcPr>
+          <w:p>
+            <w:pPr>
+              <w:cnfStyle w:val="000000100000" w:firstRow="0" w:lastRow="0" w:firstColumn="0" w:lastColumn="0" w:oddVBand="0" w:evenVBand="0" w:oddHBand="1" w:evenHBand="0" w:firstRowFirstColumn="0" w:firstRowLastColumn="0" w:lastRowFirstColumn="0" w:lastRowLastColumn="0"/>
+              <w:rPr>
+                <w:rFonts w:ascii="Calibri" w:hAnsi="Calibri" w:cs="Calibri"/>
+              </w:rPr>
+            </w:pPr>
+            <w:r>
+              <w:rPr>
+                <w:rFonts w:ascii="Calibri" w:hAnsi="Calibri" w:cs="Calibri"/>
+              </w:rPr>
+              <w:t>8</w:t>
+            </w:r>
+          </w:p>
+        </w:tc>
+      </w:tr>
+      <w:tr>
+        <w:tc>
+          <w:tcPr>
+            <w:cnfStyle w:val="001000000000" w:firstRow="0" w:lastRow="0" w:firstColumn="1" w:lastColumn="0" w:oddVBand="0" w:evenVBand="0" w:oddHBand="0" w:evenHBand="0" w:firstRowFirstColumn="0" w:firstRowLastColumn="0" w:lastRowFirstColumn="0" w:lastRowLastColumn="0"/>
+            <w:tcW w:w="1076" w:type="dxa"/>
+            <w:shd w:val="clear" w:color="auto" w:fill="auto"/>
+          </w:tcPr>
+          <w:p>
+            <w:pPr>
+              <w:jc w:val="center"/>
+              <w:rPr>
+                <w:rFonts w:ascii="Calibri" w:hAnsi="Calibri" w:cs="Calibri"/>
+              </w:rPr>
+            </w:pPr>
+            <w:r>
+              <w:rPr>
+                <w:rFonts w:ascii="Calibri" w:hAnsi="Calibri" w:cs="Calibri"/>
+              </w:rPr>
+              <w:t>10</w:t>
+            </w:r>
+          </w:p>
+        </w:tc>
+        <w:tc>
+          <w:tcPr>
+            <w:tcW w:w="6671" w:type="dxa"/>
+          </w:tcPr>
+          <w:p>
+            <w:pPr>
+              <w:jc w:val="center"/>
+              <w:cnfStyle w:val="000000000000" w:firstRow="0" w:lastRow="0" w:firstColumn="0" w:lastColumn="0" w:oddVBand="0" w:evenVBand="0" w:oddHBand="0" w:evenHBand="0" w:firstRowFirstColumn="0" w:firstRowLastColumn="0" w:lastRowFirstColumn="0" w:lastRowLastColumn="0"/>
+              <w:rPr>
+                <w:rFonts w:ascii="Calibri" w:hAnsi="Calibri" w:cs="Calibri"/>
+                <w:b/>
+                <w:bCs/>
+                <w:lang w:val="en-US"/>
+              </w:rPr>
+            </w:pPr>
+            <w:r>
+              <w:rPr>
+                <w:rFonts w:ascii="Calibri" w:hAnsi="Calibri" w:cs="Calibri"/>
+                <w:b/>
+                <w:bCs/>
+              </w:rPr>
+              <w:t>As an Admin, I want to cancel or reschedule appointments to keep the calendar accurate.</w:t>
+            </w:r>
+          </w:p>
+        </w:tc>
+        <w:tc>
+          <w:tcPr>
+            <w:tcW w:w="1327" w:type="dxa"/>
+          </w:tcPr>
+          <w:p>
+            <w:pPr>
+              <w:cnfStyle w:val="000000000000" w:firstRow="0" w:lastRow="0" w:firstColumn="0" w:lastColumn="0" w:oddVBand="0" w:evenVBand="0" w:oddHBand="0" w:evenHBand="0" w:firstRowFirstColumn="0" w:firstRowLastColumn="0" w:lastRowFirstColumn="0" w:lastRowLastColumn="0"/>
+              <w:rPr>
+                <w:rFonts w:ascii="Calibri" w:hAnsi="Calibri" w:cs="Calibri"/>
+              </w:rPr>
+            </w:pPr>
+            <w:r>
+              <w:rPr>
+                <w:rFonts w:ascii="Calibri" w:hAnsi="Calibri" w:cs="Calibri"/>
+              </w:rPr>
+              <w:t>3</w:t>
+            </w:r>
           </w:p>
         </w:tc>
       </w:tr>
     </w:tbl>
-    <w:p/>
     <w:p>
       <w:pPr>
-        <w:pStyle w:val="Heading2"/>
-      </w:pPr>
-      <w:r>
-        <w:t>User Conversation</w:t>
-      </w:r>
+        <w:rPr>
+          <w:rFonts w:ascii="Calibri" w:hAnsi="Calibri" w:cs="Calibri"/>
+        </w:rPr>
+      </w:pPr>
     </w:p>
     <w:p>
-      <w:r>
-        <w:t>&lt;Write a commentary on the user discussions&gt;</w:t>
-      </w:r>
-    </w:p>
-    <w:p/>
-    <w:p>
       <w:pPr>
         <w:pStyle w:val="Heading2"/>
-      </w:pPr>
-      <w:r>
-        <w:t>Acceptance Criteria</w:t>
+        <w:rPr>
+          <w:rFonts w:ascii="Calibri" w:hAnsi="Calibri" w:cs="Calibri"/>
+        </w:rPr>
+      </w:pPr>
+      <w:r>
+        <w:rPr>
+          <w:rFonts w:ascii="Calibri" w:hAnsi="Calibri" w:cs="Calibri"/>
+        </w:rPr>
+        <w:t>User Conversation</w:t>
       </w:r>
     </w:p>
     <w:p>
-      <w:r>
-        <w:t>(Example: “</w:t>
-      </w:r>
-      <w:r>
-        <w:t>User can only submit a form by filling in all required field</w:t>
-      </w:r>
-      <w:r>
-        <w:t>”)</w:t>
-      </w:r>
-    </w:p>
-    <w:p/>
-    <w:p>
-      <w:pPr>
-        <w:pStyle w:val="Heading2"/>
-      </w:pPr>
-      <w:r>
-        <w:t>Sprint summary</w:t>
+      <w:pPr>
+        <w:ind w:left="0" w:firstLine="0"/>
+        <w:rPr>
+          <w:rFonts w:ascii="Calibri" w:hAnsi="Calibri" w:cs="Calibri"/>
+          <w:lang w:val="en-US" w:eastAsia="en-US"/>
+        </w:rPr>
+      </w:pPr>
+      <w:r>
+        <w:rPr>
+          <w:rFonts w:ascii="Calibri" w:hAnsi="Calibri" w:cs="Calibri"/>
+          <w:lang w:val="en-US" w:eastAsia="en-US"/>
+        </w:rPr>
+        <w:t>Conversation 1:</w:t>
       </w:r>
     </w:p>
     <w:p>
-      <w:r>
-        <w:t>(A short description of what features were focused on during the sprint and why they were valuable to the user)</w:t>
+      <w:pPr>
+        <w:pStyle w:val="ListParagraph"/>
+        <w:numPr>
+          <w:ilvl w:val="0"/>
+          <w:numId w:val="2"/>
+        </w:numPr>
+        <w:rPr>
+          <w:rFonts w:ascii="Calibri" w:hAnsi="Calibri" w:cs="Calibri"/>
+        </w:rPr>
+      </w:pPr>
+      <w:r>
+        <w:rPr>
+          <w:rFonts w:ascii="Calibri" w:hAnsi="Calibri" w:cs="Calibri"/>
+          <w:b/>
+          <w:bCs/>
+        </w:rPr>
+        <w:t>Developer (Me):</w:t>
+      </w:r>
+      <w:r>
+        <w:rPr>
+          <w:rFonts w:ascii="Calibri" w:hAnsi="Calibri" w:cs="Calibri"/>
+        </w:rPr>
+        <w:t xml:space="preserve"> "What is the biggest frustration with current booking systems?"</w:t>
       </w:r>
     </w:p>
-    <w:p/>
     <w:p>
       <w:pPr>
+        <w:pStyle w:val="ListParagraph"/>
+        <w:numPr>
+          <w:ilvl w:val="0"/>
+          <w:numId w:val="2"/>
+        </w:numPr>
+        <w:rPr>
+          <w:rFonts w:ascii="Calibri" w:hAnsi="Calibri" w:cs="Calibri"/>
+        </w:rPr>
+      </w:pPr>
+      <w:r>
+        <w:rPr>
+          <w:rFonts w:ascii="Calibri" w:hAnsi="Calibri" w:cs="Calibri"/>
+          <w:b/>
+          <w:bCs/>
+        </w:rPr>
+        <w:t>Patient:</w:t>
+      </w:r>
+      <w:r>
+        <w:rPr>
+          <w:rFonts w:ascii="Calibri" w:hAnsi="Calibri" w:cs="Calibri"/>
+        </w:rPr>
+        <w:t xml:space="preserve"> "Waiting on hold. I want to see a calendar and book a slot instantly."</w:t>
+      </w:r>
+    </w:p>
+    <w:p>
+      <w:pPr>
+        <w:pStyle w:val="ListParagraph"/>
+        <w:numPr>
+          <w:ilvl w:val="0"/>
+          <w:numId w:val="2"/>
+        </w:numPr>
+        <w:rPr>
+          <w:rFonts w:ascii="Calibri" w:hAnsi="Calibri" w:cs="Calibri"/>
+        </w:rPr>
+      </w:pPr>
+      <w:r>
+        <w:rPr>
+          <w:rFonts w:ascii="Calibri" w:hAnsi="Calibri" w:cs="Calibri"/>
+          <w:b/>
+          <w:bCs/>
+        </w:rPr>
+        <w:t>Developer (Me):</w:t>
+      </w:r>
+      <w:r>
+        <w:rPr>
+          <w:rFonts w:ascii="Calibri" w:hAnsi="Calibri" w:cs="Calibri"/>
+        </w:rPr>
+        <w:t xml:space="preserve"> "Understood. I will prioritize a real-time availability calendar in Sprint 2."</w:t>
+      </w:r>
+    </w:p>
+    <w:p>
+      <w:pPr>
+        <w:rPr>
+          <w:rFonts w:ascii="Calibri" w:hAnsi="Calibri" w:cs="Calibri"/>
+        </w:rPr>
+      </w:pPr>
+    </w:p>
+    <w:p>
+      <w:pPr>
+        <w:rPr>
+          <w:rFonts w:ascii="Calibri" w:hAnsi="Calibri" w:cs="Calibri"/>
+        </w:rPr>
+      </w:pPr>
+      <w:r>
+        <w:rPr>
+          <w:rFonts w:ascii="Calibri" w:hAnsi="Calibri" w:cs="Calibri"/>
+        </w:rPr>
+        <w:lastRenderedPageBreak/>
+        <w:t>Conversation 2:</w:t>
+      </w:r>
+    </w:p>
+    <w:p>
+      <w:pPr>
+        <w:pStyle w:val="ListParagraph"/>
+        <w:numPr>
+          <w:ilvl w:val="0"/>
+          <w:numId w:val="3"/>
+        </w:numPr>
+        <w:rPr>
+          <w:rFonts w:ascii="Calibri" w:hAnsi="Calibri" w:cs="Calibri"/>
+        </w:rPr>
+      </w:pPr>
+      <w:r>
+        <w:rPr>
+          <w:rFonts w:ascii="Calibri" w:hAnsi="Calibri" w:cs="Calibri"/>
+          <w:b/>
+          <w:bCs/>
+        </w:rPr>
+        <w:t>Developer (Me):</w:t>
+      </w:r>
+      <w:r>
+        <w:rPr>
+          <w:rFonts w:ascii="Calibri" w:hAnsi="Calibri" w:cs="Calibri"/>
+        </w:rPr>
+        <w:t xml:space="preserve"> "When booking, what information is essential for the system to consider the appointment valid?" </w:t>
+      </w:r>
+    </w:p>
+    <w:p>
+      <w:pPr>
+        <w:pStyle w:val="ListParagraph"/>
+        <w:numPr>
+          <w:ilvl w:val="0"/>
+          <w:numId w:val="3"/>
+        </w:numPr>
+        <w:rPr>
+          <w:rFonts w:ascii="Calibri" w:hAnsi="Calibri" w:cs="Calibri"/>
+        </w:rPr>
+      </w:pPr>
+      <w:r>
+        <w:rPr>
+          <w:rFonts w:ascii="Calibri" w:hAnsi="Calibri" w:cs="Calibri"/>
+          <w:b/>
+          <w:bCs/>
+        </w:rPr>
+        <w:t>Stakeholder (Patient/Admin):</w:t>
+      </w:r>
+      <w:r>
+        <w:rPr>
+          <w:rFonts w:ascii="Calibri" w:hAnsi="Calibri" w:cs="Calibri"/>
+        </w:rPr>
+        <w:t xml:space="preserve"> "At a minimum, we need the patient's name, address, and date of birth. It would also be great if they could select a specific doctor rather than just a time slot".</w:t>
+      </w:r>
+    </w:p>
+    <w:p>
+      <w:pPr>
+        <w:pStyle w:val="ListParagraph"/>
+        <w:numPr>
+          <w:ilvl w:val="0"/>
+          <w:numId w:val="3"/>
+        </w:numPr>
+        <w:rPr>
+          <w:rFonts w:ascii="Calibri" w:hAnsi="Calibri" w:cs="Calibri"/>
+        </w:rPr>
+      </w:pPr>
+      <w:r>
+        <w:rPr>
+          <w:rFonts w:ascii="Calibri" w:hAnsi="Calibri" w:cs="Calibri"/>
+          <w:b/>
+          <w:bCs/>
+        </w:rPr>
+        <w:t>Developer (Me):</w:t>
+      </w:r>
+      <w:r>
+        <w:rPr>
+          <w:rFonts w:ascii="Calibri" w:hAnsi="Calibri" w:cs="Calibri"/>
+        </w:rPr>
+        <w:t xml:space="preserve"> "I will incorporate these requirements into the Acceptance Criteria for the booking interface."</w:t>
+      </w:r>
+    </w:p>
+    <w:p>
+      <w:pPr>
+        <w:rPr>
+          <w:rFonts w:ascii="Calibri" w:hAnsi="Calibri" w:cs="Calibri"/>
+        </w:rPr>
+      </w:pPr>
+    </w:p>
+    <w:p>
+      <w:pPr>
+        <w:rPr>
+          <w:rFonts w:ascii="Calibri" w:hAnsi="Calibri" w:cs="Calibri"/>
+        </w:rPr>
+      </w:pPr>
+    </w:p>
+    <w:p>
+      <w:pPr>
         <w:pStyle w:val="Heading2"/>
-      </w:pPr>
-      <w:r>
+        <w:rPr>
+          <w:rFonts w:ascii="Calibri" w:hAnsi="Calibri" w:cs="Calibri"/>
+        </w:rPr>
+      </w:pPr>
+      <w:r>
+        <w:rPr>
+          <w:rFonts w:ascii="Calibri" w:hAnsi="Calibri" w:cs="Calibri"/>
+        </w:rPr>
+        <w:t>Acceptance Criteria</w:t>
+      </w:r>
+    </w:p>
+    <w:p>
+      <w:pPr>
+        <w:rPr>
+          <w:rFonts w:ascii="Calibri" w:hAnsi="Calibri" w:cs="Calibri"/>
+          <w:lang w:val="en-US"/>
+        </w:rPr>
+      </w:pPr>
+      <w:r>
+        <w:rPr>
+          <w:rFonts w:ascii="Calibri" w:hAnsi="Calibri" w:cs="Calibri"/>
+          <w:lang w:val="en-US"/>
+        </w:rPr>
+        <w:t>For User Story 03 (Booking):</w:t>
+      </w:r>
+    </w:p>
+    <w:p>
+      <w:pPr>
+        <w:numPr>
+          <w:ilvl w:val="0"/>
+          <w:numId w:val="1"/>
+        </w:numPr>
+        <w:rPr>
+          <w:rFonts w:ascii="Calibri" w:hAnsi="Calibri" w:cs="Calibri"/>
+          <w:lang w:val="en-US"/>
+        </w:rPr>
+      </w:pPr>
+      <w:r>
+        <w:rPr>
+          <w:rFonts w:ascii="Calibri" w:hAnsi="Calibri" w:cs="Calibri"/>
+          <w:lang w:val="en-US"/>
+        </w:rPr>
+        <w:t xml:space="preserve">"User must be able to select a specific doctor and time slot." </w:t>
+      </w:r>
+    </w:p>
+    <w:p>
+      <w:pPr>
+        <w:numPr>
+          <w:ilvl w:val="0"/>
+          <w:numId w:val="1"/>
+        </w:numPr>
+        <w:rPr>
+          <w:rFonts w:ascii="Calibri" w:hAnsi="Calibri" w:cs="Calibri"/>
+          <w:lang w:val="en-US"/>
+        </w:rPr>
+      </w:pPr>
+      <w:r>
+        <w:rPr>
+          <w:rFonts w:ascii="Calibri" w:hAnsi="Calibri" w:cs="Calibri"/>
+          <w:lang w:val="en-US"/>
+        </w:rPr>
+        <w:t>"System must validate that all mandatory fields (Name, DOB) are filled before submission."</w:t>
+      </w:r>
+    </w:p>
+    <w:p>
+      <w:pPr>
+        <w:rPr>
+          <w:rFonts w:ascii="Calibri" w:hAnsi="Calibri" w:cs="Calibri"/>
+        </w:rPr>
+      </w:pPr>
+    </w:p>
+    <w:p>
+      <w:pPr>
+        <w:pStyle w:val="Heading2"/>
+        <w:rPr>
+          <w:rFonts w:ascii="Calibri" w:hAnsi="Calibri" w:cs="Calibri"/>
+        </w:rPr>
+      </w:pPr>
+      <w:r>
+        <w:rPr>
+          <w:rFonts w:ascii="Calibri" w:hAnsi="Calibri" w:cs="Calibri"/>
+        </w:rPr>
+        <w:t>Sprint summary</w:t>
+      </w:r>
+    </w:p>
+    <w:p>
+      <w:pPr>
+        <w:rPr>
+          <w:rFonts w:ascii="Calibri" w:hAnsi="Calibri" w:cs="Calibri"/>
+        </w:rPr>
+      </w:pPr>
+      <w:r>
+        <w:rPr>
+          <w:rFonts w:ascii="Calibri" w:hAnsi="Calibri" w:cs="Calibri"/>
+        </w:rPr>
+        <w:t xml:space="preserve">Sprint 1 focused on the </w:t>
+      </w:r>
+      <w:r>
+        <w:rPr>
+          <w:rFonts w:ascii="Calibri" w:hAnsi="Calibri" w:cs="Calibri"/>
+          <w:b/>
+          <w:bCs/>
+        </w:rPr>
+        <w:t>Discovery and Design</w:t>
+      </w:r>
+      <w:r>
+        <w:rPr>
+          <w:rFonts w:ascii="Calibri" w:hAnsi="Calibri" w:cs="Calibri"/>
+        </w:rPr>
+        <w:t xml:space="preserve"> phase. As a solo developer, I prioritized requirement engineering and architectural planning to ensure the 'Patient-Centric' goal is achievable. </w:t>
+      </w:r>
+    </w:p>
+    <w:p>
+      <w:pPr>
+        <w:rPr>
+          <w:rFonts w:ascii="Calibri" w:hAnsi="Calibri" w:cs="Calibri"/>
+        </w:rPr>
+      </w:pPr>
+      <w:r>
+        <w:rPr>
+          <w:rFonts w:ascii="Calibri" w:hAnsi="Calibri" w:cs="Calibri"/>
+        </w:rPr>
+        <w:t xml:space="preserve">We selected </w:t>
+      </w:r>
+      <w:r>
+        <w:rPr>
+          <w:rFonts w:ascii="Calibri" w:hAnsi="Calibri" w:cs="Calibri"/>
+          <w:b/>
+          <w:bCs/>
+        </w:rPr>
+        <w:t>Story 01 (Auth)</w:t>
+      </w:r>
+      <w:r>
+        <w:rPr>
+          <w:rFonts w:ascii="Calibri" w:hAnsi="Calibri" w:cs="Calibri"/>
+        </w:rPr>
+        <w:t xml:space="preserve"> and </w:t>
+      </w:r>
+      <w:r>
+        <w:rPr>
+          <w:rFonts w:ascii="Calibri" w:hAnsi="Calibri" w:cs="Calibri"/>
+          <w:b/>
+          <w:bCs/>
+        </w:rPr>
+        <w:t>Story 02 (Calendar)</w:t>
+      </w:r>
+      <w:r>
+        <w:rPr>
+          <w:rFonts w:ascii="Calibri" w:hAnsi="Calibri" w:cs="Calibri"/>
+        </w:rPr>
+        <w:t xml:space="preserve"> for the initial backlog because secure access and availability are the foundational pillars of the hospital system.</w:t>
+      </w:r>
+    </w:p>
+    <w:p>
+      <w:pPr>
+        <w:rPr>
+          <w:rFonts w:ascii="Calibri" w:hAnsi="Calibri" w:cs="Calibri"/>
+        </w:rPr>
+      </w:pPr>
+    </w:p>
+    <w:p>
+      <w:pPr>
+        <w:pStyle w:val="Heading2"/>
+        <w:rPr>
+          <w:rFonts w:ascii="Calibri" w:hAnsi="Calibri" w:cs="Calibri"/>
+        </w:rPr>
+      </w:pPr>
+      <w:r>
+        <w:rPr>
+          <w:rFonts w:ascii="Calibri" w:hAnsi="Calibri" w:cs="Calibri"/>
+        </w:rPr>
         <w:t>Sprint Backlog</w:t>
       </w:r>
     </w:p>
@@ -403,7 +1455,7 @@
         <w:tblLook w:val="04A0" w:firstRow="1" w:lastRow="0" w:firstColumn="1" w:lastColumn="0" w:noHBand="0" w:noVBand="1"/>
       </w:tblPr>
       <w:tblGrid>
-        <w:gridCol w:w="432"/>
+        <w:gridCol w:w="425"/>
         <w:gridCol w:w="7064"/>
         <w:gridCol w:w="1253"/>
       </w:tblGrid>
@@ -419,6 +1471,9 @@
           <w:p>
             <w:pPr>
               <w:jc w:val="center"/>
+              <w:rPr>
+                <w:rFonts w:ascii="Calibri" w:hAnsi="Calibri" w:cs="Calibri"/>
+              </w:rPr>
             </w:pPr>
           </w:p>
         </w:tc>
@@ -430,10 +1485,30 @@
             <w:pPr>
               <w:jc w:val="center"/>
               <w:cnfStyle w:val="100000000000" w:firstRow="1" w:lastRow="0" w:firstColumn="0" w:lastColumn="0" w:oddVBand="0" w:evenVBand="0" w:oddHBand="0" w:evenHBand="0" w:firstRowFirstColumn="0" w:firstRowLastColumn="0" w:lastRowFirstColumn="0" w:lastRowLastColumn="0"/>
-            </w:pPr>
-            <w:r>
+              <w:rPr>
+                <w:rFonts w:ascii="Calibri" w:hAnsi="Calibri" w:cs="Calibri"/>
+              </w:rPr>
+            </w:pPr>
+            <w:r>
+              <w:rPr>
+                <w:rFonts w:ascii="Calibri" w:hAnsi="Calibri" w:cs="Calibri"/>
+              </w:rPr>
               <w:t>User story</w:t>
             </w:r>
+            <w:r>
+              <w:rPr>
+                <w:rFonts w:ascii="Calibri" w:hAnsi="Calibri" w:cs="Calibri"/>
+              </w:rPr>
+              <w:t xml:space="preserve"> </w:t>
+            </w:r>
+            <w:proofErr w:type="gramStart"/>
+            <w:r>
+              <w:rPr>
+                <w:rFonts w:ascii="Calibri" w:hAnsi="Calibri" w:cs="Calibri"/>
+              </w:rPr>
+              <w:t>/  Task</w:t>
+            </w:r>
+            <w:proofErr w:type="gramEnd"/>
           </w:p>
         </w:tc>
         <w:tc>
@@ -443,8 +1518,14 @@
           <w:p>
             <w:pPr>
               <w:cnfStyle w:val="100000000000" w:firstRow="1" w:lastRow="0" w:firstColumn="0" w:lastColumn="0" w:oddVBand="0" w:evenVBand="0" w:oddHBand="0" w:evenHBand="0" w:firstRowFirstColumn="0" w:firstRowLastColumn="0" w:lastRowFirstColumn="0" w:lastRowLastColumn="0"/>
-            </w:pPr>
-            <w:r>
+              <w:rPr>
+                <w:rFonts w:ascii="Calibri" w:hAnsi="Calibri" w:cs="Calibri"/>
+              </w:rPr>
+            </w:pPr>
+            <w:r>
+              <w:rPr>
+                <w:rFonts w:ascii="Calibri" w:hAnsi="Calibri" w:cs="Calibri"/>
+              </w:rPr>
               <w:t>Estimate</w:t>
             </w:r>
           </w:p>
@@ -462,8 +1543,14 @@
           <w:p>
             <w:pPr>
               <w:jc w:val="center"/>
-            </w:pPr>
-            <w:r>
+              <w:rPr>
+                <w:rFonts w:ascii="Calibri" w:hAnsi="Calibri" w:cs="Calibri"/>
+              </w:rPr>
+            </w:pPr>
+            <w:r>
+              <w:rPr>
+                <w:rFonts w:ascii="Calibri" w:hAnsi="Calibri" w:cs="Calibri"/>
+              </w:rPr>
               <w:t>1</w:t>
             </w:r>
           </w:p>
@@ -476,9 +1563,23 @@
             <w:pPr>
               <w:jc w:val="center"/>
               <w:cnfStyle w:val="000000100000" w:firstRow="0" w:lastRow="0" w:firstColumn="0" w:lastColumn="0" w:oddVBand="0" w:evenVBand="0" w:oddHBand="1" w:evenHBand="0" w:firstRowFirstColumn="0" w:firstRowLastColumn="0" w:lastRowFirstColumn="0" w:lastRowLastColumn="0"/>
-            </w:pPr>
-            <w:r>
-              <w:t>user story 1</w:t>
+              <w:rPr>
+                <w:rFonts w:ascii="Calibri" w:hAnsi="Calibri" w:cs="Calibri"/>
+              </w:rPr>
+            </w:pPr>
+            <w:r>
+              <w:rPr>
+                <w:rFonts w:ascii="Calibri" w:hAnsi="Calibri" w:cs="Calibri"/>
+                <w:b/>
+                <w:bCs/>
+              </w:rPr>
+              <w:t>Planning:</w:t>
+            </w:r>
+            <w:r>
+              <w:rPr>
+                <w:rFonts w:ascii="Calibri" w:hAnsi="Calibri" w:cs="Calibri"/>
+              </w:rPr>
+              <w:t xml:space="preserve"> Finalize Product Backlog and sizing.</w:t>
             </w:r>
           </w:p>
         </w:tc>
@@ -489,9 +1590,15 @@
           <w:p>
             <w:pPr>
               <w:cnfStyle w:val="000000100000" w:firstRow="0" w:lastRow="0" w:firstColumn="0" w:lastColumn="0" w:oddVBand="0" w:evenVBand="0" w:oddHBand="1" w:evenHBand="0" w:firstRowFirstColumn="0" w:firstRowLastColumn="0" w:lastRowFirstColumn="0" w:lastRowLastColumn="0"/>
-            </w:pPr>
-            <w:r>
-              <w:t>Story points</w:t>
+              <w:rPr>
+                <w:rFonts w:ascii="Calibri" w:hAnsi="Calibri" w:cs="Calibri"/>
+              </w:rPr>
+            </w:pPr>
+            <w:r>
+              <w:rPr>
+                <w:rFonts w:ascii="Calibri" w:hAnsi="Calibri" w:cs="Calibri"/>
+              </w:rPr>
+              <w:t>2</w:t>
             </w:r>
           </w:p>
         </w:tc>
@@ -505,8 +1612,14 @@
           <w:p>
             <w:pPr>
               <w:jc w:val="center"/>
-            </w:pPr>
-            <w:r>
+              <w:rPr>
+                <w:rFonts w:ascii="Calibri" w:hAnsi="Calibri" w:cs="Calibri"/>
+              </w:rPr>
+            </w:pPr>
+            <w:r>
+              <w:rPr>
+                <w:rFonts w:ascii="Calibri" w:hAnsi="Calibri" w:cs="Calibri"/>
+              </w:rPr>
               <w:t>2</w:t>
             </w:r>
           </w:p>
@@ -519,9 +1632,26 @@
             <w:pPr>
               <w:jc w:val="center"/>
               <w:cnfStyle w:val="000000000000" w:firstRow="0" w:lastRow="0" w:firstColumn="0" w:lastColumn="0" w:oddVBand="0" w:evenVBand="0" w:oddHBand="0" w:evenHBand="0" w:firstRowFirstColumn="0" w:firstRowLastColumn="0" w:lastRowFirstColumn="0" w:lastRowLastColumn="0"/>
-            </w:pPr>
-            <w:r>
-              <w:t>user story 2</w:t>
+              <w:rPr>
+                <w:rFonts w:ascii="Calibri" w:hAnsi="Calibri" w:cs="Calibri"/>
+                <w:lang w:val="en-US"/>
+              </w:rPr>
+            </w:pPr>
+            <w:r>
+              <w:rPr>
+                <w:rFonts w:ascii="Calibri" w:hAnsi="Calibri" w:cs="Calibri"/>
+                <w:b/>
+                <w:bCs/>
+                <w:lang w:val="en-US"/>
+              </w:rPr>
+              <w:t>Design:</w:t>
+            </w:r>
+            <w:r>
+              <w:rPr>
+                <w:rFonts w:ascii="Calibri" w:hAnsi="Calibri" w:cs="Calibri"/>
+                <w:lang w:val="en-US"/>
+              </w:rPr>
+              <w:t xml:space="preserve"> Create UML Use Case diagrams for Patient and Doctor roles.</w:t>
             </w:r>
           </w:p>
         </w:tc>
@@ -532,9 +1662,15 @@
           <w:p>
             <w:pPr>
               <w:cnfStyle w:val="000000000000" w:firstRow="0" w:lastRow="0" w:firstColumn="0" w:lastColumn="0" w:oddVBand="0" w:evenVBand="0" w:oddHBand="0" w:evenHBand="0" w:firstRowFirstColumn="0" w:firstRowLastColumn="0" w:lastRowFirstColumn="0" w:lastRowLastColumn="0"/>
-            </w:pPr>
-            <w:r>
-              <w:t>Story points</w:t>
+              <w:rPr>
+                <w:rFonts w:ascii="Calibri" w:hAnsi="Calibri" w:cs="Calibri"/>
+              </w:rPr>
+            </w:pPr>
+            <w:r>
+              <w:rPr>
+                <w:rFonts w:ascii="Calibri" w:hAnsi="Calibri" w:cs="Calibri"/>
+              </w:rPr>
+              <w:t>3</w:t>
             </w:r>
           </w:p>
         </w:tc>
@@ -551,8 +1687,14 @@
           <w:p>
             <w:pPr>
               <w:jc w:val="center"/>
-            </w:pPr>
-            <w:r>
+              <w:rPr>
+                <w:rFonts w:ascii="Calibri" w:hAnsi="Calibri" w:cs="Calibri"/>
+              </w:rPr>
+            </w:pPr>
+            <w:r>
+              <w:rPr>
+                <w:rFonts w:ascii="Calibri" w:hAnsi="Calibri" w:cs="Calibri"/>
+              </w:rPr>
               <w:t>3</w:t>
             </w:r>
           </w:p>
@@ -565,9 +1707,23 @@
             <w:pPr>
               <w:jc w:val="center"/>
               <w:cnfStyle w:val="000000100000" w:firstRow="0" w:lastRow="0" w:firstColumn="0" w:lastColumn="0" w:oddVBand="0" w:evenVBand="0" w:oddHBand="1" w:evenHBand="0" w:firstRowFirstColumn="0" w:firstRowLastColumn="0" w:lastRowFirstColumn="0" w:lastRowLastColumn="0"/>
-            </w:pPr>
-            <w:r>
-              <w:t>user story 3</w:t>
+              <w:rPr>
+                <w:rFonts w:ascii="Calibri" w:hAnsi="Calibri" w:cs="Calibri"/>
+              </w:rPr>
+            </w:pPr>
+            <w:r>
+              <w:rPr>
+                <w:rFonts w:ascii="Calibri" w:hAnsi="Calibri" w:cs="Calibri"/>
+                <w:b/>
+                <w:bCs/>
+              </w:rPr>
+              <w:t>UX:</w:t>
+            </w:r>
+            <w:r>
+              <w:rPr>
+                <w:rFonts w:ascii="Calibri" w:hAnsi="Calibri" w:cs="Calibri"/>
+              </w:rPr>
+              <w:t xml:space="preserve"> Design low-fidelity wireframes for the Booking Interface.</w:t>
             </w:r>
           </w:p>
         </w:tc>
@@ -578,9 +1734,15 @@
           <w:p>
             <w:pPr>
               <w:cnfStyle w:val="000000100000" w:firstRow="0" w:lastRow="0" w:firstColumn="0" w:lastColumn="0" w:oddVBand="0" w:evenVBand="0" w:oddHBand="1" w:evenHBand="0" w:firstRowFirstColumn="0" w:firstRowLastColumn="0" w:lastRowFirstColumn="0" w:lastRowLastColumn="0"/>
-            </w:pPr>
-            <w:r>
-              <w:t>Story points</w:t>
+              <w:rPr>
+                <w:rFonts w:ascii="Calibri" w:hAnsi="Calibri" w:cs="Calibri"/>
+              </w:rPr>
+            </w:pPr>
+            <w:r>
+              <w:rPr>
+                <w:rFonts w:ascii="Calibri" w:hAnsi="Calibri" w:cs="Calibri"/>
+              </w:rPr>
+              <w:t>3</w:t>
             </w:r>
           </w:p>
         </w:tc>
@@ -594,8 +1756,14 @@
           <w:p>
             <w:pPr>
               <w:jc w:val="center"/>
-            </w:pPr>
-            <w:r>
+              <w:rPr>
+                <w:rFonts w:ascii="Calibri" w:hAnsi="Calibri" w:cs="Calibri"/>
+              </w:rPr>
+            </w:pPr>
+            <w:r>
+              <w:rPr>
+                <w:rFonts w:ascii="Calibri" w:hAnsi="Calibri" w:cs="Calibri"/>
+              </w:rPr>
               <w:t>4</w:t>
             </w:r>
           </w:p>
@@ -608,9 +1776,37 @@
             <w:pPr>
               <w:jc w:val="center"/>
               <w:cnfStyle w:val="000000000000" w:firstRow="0" w:lastRow="0" w:firstColumn="0" w:lastColumn="0" w:oddVBand="0" w:evenVBand="0" w:oddHBand="0" w:evenHBand="0" w:firstRowFirstColumn="0" w:firstRowLastColumn="0" w:lastRowFirstColumn="0" w:lastRowLastColumn="0"/>
-            </w:pPr>
-            <w:r>
-              <w:t>user story 4</w:t>
+              <w:rPr>
+                <w:rFonts w:ascii="Calibri" w:hAnsi="Calibri" w:cs="Calibri"/>
+              </w:rPr>
+            </w:pPr>
+            <w:r>
+              <w:rPr>
+                <w:rFonts w:ascii="Calibri" w:hAnsi="Calibri" w:cs="Calibri"/>
+                <w:b/>
+                <w:bCs/>
+              </w:rPr>
+              <w:t>Setup:</w:t>
+            </w:r>
+            <w:r>
+              <w:rPr>
+                <w:rFonts w:ascii="Calibri" w:hAnsi="Calibri" w:cs="Calibri"/>
+              </w:rPr>
+              <w:t xml:space="preserve"> Initialize </w:t>
+            </w:r>
+            <w:proofErr w:type="spellStart"/>
+            <w:r>
+              <w:rPr>
+                <w:rFonts w:ascii="Calibri" w:hAnsi="Calibri" w:cs="Calibri"/>
+              </w:rPr>
+              <w:t>SvelteKit</w:t>
+            </w:r>
+            <w:proofErr w:type="spellEnd"/>
+            <w:r>
+              <w:rPr>
+                <w:rFonts w:ascii="Calibri" w:hAnsi="Calibri" w:cs="Calibri"/>
+              </w:rPr>
+              <w:t xml:space="preserve"> repository and GitHub environment.</w:t>
             </w:r>
           </w:p>
         </w:tc>
@@ -621,94 +1817,16 @@
           <w:p>
             <w:pPr>
               <w:cnfStyle w:val="000000000000" w:firstRow="0" w:lastRow="0" w:firstColumn="0" w:lastColumn="0" w:oddVBand="0" w:evenVBand="0" w:oddHBand="0" w:evenHBand="0" w:firstRowFirstColumn="0" w:firstRowLastColumn="0" w:lastRowFirstColumn="0" w:lastRowLastColumn="0"/>
-            </w:pPr>
-            <w:r>
-              <w:t>Story points</w:t>
-            </w:r>
-          </w:p>
-        </w:tc>
-      </w:tr>
-      <w:tr>
-        <w:trPr>
-          <w:cnfStyle w:val="000000100000" w:firstRow="0" w:lastRow="0" w:firstColumn="0" w:lastColumn="0" w:oddVBand="0" w:evenVBand="0" w:oddHBand="1" w:evenHBand="0" w:firstRowFirstColumn="0" w:firstRowLastColumn="0" w:lastRowFirstColumn="0" w:lastRowLastColumn="0"/>
-        </w:trPr>
-        <w:tc>
-          <w:tcPr>
-            <w:cnfStyle w:val="001000000000" w:firstRow="0" w:lastRow="0" w:firstColumn="1" w:lastColumn="0" w:oddVBand="0" w:evenVBand="0" w:oddHBand="0" w:evenHBand="0" w:firstRowFirstColumn="0" w:firstRowLastColumn="0" w:lastRowFirstColumn="0" w:lastRowLastColumn="0"/>
-            <w:tcW w:w="425" w:type="dxa"/>
-          </w:tcPr>
-          <w:p>
-            <w:pPr>
-              <w:jc w:val="center"/>
-            </w:pPr>
-            <w:r>
-              <w:lastRenderedPageBreak/>
-              <w:t>5</w:t>
-            </w:r>
-          </w:p>
-        </w:tc>
-        <w:tc>
-          <w:tcPr>
-            <w:tcW w:w="7064" w:type="dxa"/>
-          </w:tcPr>
-          <w:p>
-            <w:pPr>
-              <w:jc w:val="center"/>
-              <w:cnfStyle w:val="000000100000" w:firstRow="0" w:lastRow="0" w:firstColumn="0" w:lastColumn="0" w:oddVBand="0" w:evenVBand="0" w:oddHBand="1" w:evenHBand="0" w:firstRowFirstColumn="0" w:firstRowLastColumn="0" w:lastRowFirstColumn="0" w:lastRowLastColumn="0"/>
-            </w:pPr>
-            <w:r>
-              <w:t>user story 5</w:t>
-            </w:r>
-          </w:p>
-        </w:tc>
-        <w:tc>
-          <w:tcPr>
-            <w:tcW w:w="1253" w:type="dxa"/>
-          </w:tcPr>
-          <w:p>
-            <w:pPr>
-              <w:cnfStyle w:val="000000100000" w:firstRow="0" w:lastRow="0" w:firstColumn="0" w:lastColumn="0" w:oddVBand="0" w:evenVBand="0" w:oddHBand="1" w:evenHBand="0" w:firstRowFirstColumn="0" w:firstRowLastColumn="0" w:lastRowFirstColumn="0" w:lastRowLastColumn="0"/>
-            </w:pPr>
-            <w:r>
-              <w:t>Story points</w:t>
-            </w:r>
-          </w:p>
-        </w:tc>
-      </w:tr>
-      <w:tr>
-        <w:tc>
-          <w:tcPr>
-            <w:cnfStyle w:val="001000000000" w:firstRow="0" w:lastRow="0" w:firstColumn="1" w:lastColumn="0" w:oddVBand="0" w:evenVBand="0" w:oddHBand="0" w:evenHBand="0" w:firstRowFirstColumn="0" w:firstRowLastColumn="0" w:lastRowFirstColumn="0" w:lastRowLastColumn="0"/>
-            <w:tcW w:w="425" w:type="dxa"/>
-          </w:tcPr>
-          <w:p>
-            <w:pPr>
-              <w:jc w:val="center"/>
-            </w:pPr>
-          </w:p>
-        </w:tc>
-        <w:tc>
-          <w:tcPr>
-            <w:tcW w:w="7064" w:type="dxa"/>
-          </w:tcPr>
-          <w:p>
-            <w:pPr>
-              <w:jc w:val="center"/>
-              <w:cnfStyle w:val="000000000000" w:firstRow="0" w:lastRow="0" w:firstColumn="0" w:lastColumn="0" w:oddVBand="0" w:evenVBand="0" w:oddHBand="0" w:evenHBand="0" w:firstRowFirstColumn="0" w:firstRowLastColumn="0" w:lastRowFirstColumn="0" w:lastRowLastColumn="0"/>
-            </w:pPr>
-            <w:r>
-              <w:t>Add rows as necessary…</w:t>
-            </w:r>
-          </w:p>
-        </w:tc>
-        <w:tc>
-          <w:tcPr>
-            <w:tcW w:w="1253" w:type="dxa"/>
-          </w:tcPr>
-          <w:p>
-            <w:pPr>
-              <w:cnfStyle w:val="000000000000" w:firstRow="0" w:lastRow="0" w:firstColumn="0" w:lastColumn="0" w:oddVBand="0" w:evenVBand="0" w:oddHBand="0" w:evenHBand="0" w:firstRowFirstColumn="0" w:firstRowLastColumn="0" w:lastRowFirstColumn="0" w:lastRowLastColumn="0"/>
-            </w:pPr>
+              <w:rPr>
+                <w:rFonts w:ascii="Calibri" w:hAnsi="Calibri" w:cs="Calibri"/>
+              </w:rPr>
+            </w:pPr>
+            <w:r>
+              <w:rPr>
+                <w:rFonts w:ascii="Calibri" w:hAnsi="Calibri" w:cs="Calibri"/>
+              </w:rPr>
+              <w:t>1</w:t>
+            </w:r>
           </w:p>
         </w:tc>
       </w:tr>
@@ -716,6 +1834,7 @@
     <w:p>
       <w:pPr>
         <w:rPr>
+          <w:rFonts w:ascii="Calibri" w:hAnsi="Calibri" w:cs="Calibri"/>
           <w:lang w:eastAsia="en-US"/>
         </w:rPr>
       </w:pPr>
@@ -726,16 +1845,26 @@
         <w:ind w:left="0" w:firstLine="0"/>
         <w:jc w:val="left"/>
         <w:rPr>
+          <w:rFonts w:ascii="Calibri" w:hAnsi="Calibri" w:cs="Calibri"/>
           <w:b/>
           <w:color w:val="D81E05"/>
           <w:sz w:val="28"/>
         </w:rPr>
       </w:pPr>
       <w:r>
+        <w:rPr>
+          <w:rFonts w:ascii="Calibri" w:hAnsi="Calibri" w:cs="Calibri"/>
+        </w:rPr>
         <w:br w:type="page"/>
       </w:r>
     </w:p>
-    <w:p/>
+    <w:p>
+      <w:pPr>
+        <w:rPr>
+          <w:rFonts w:ascii="Calibri" w:hAnsi="Calibri" w:cs="Calibri"/>
+        </w:rPr>
+      </w:pPr>
+    </w:p>
     <w:sectPr>
       <w:pgSz w:w="12240" w:h="15840"/>
       <w:pgMar w:top="1440" w:right="1440" w:bottom="1440" w:left="1440" w:header="720" w:footer="720" w:gutter="0"/>
@@ -744,6 +1873,349 @@
     </w:sectPr>
   </w:body>
 </w:document>
+</file>
+
+<file path=word/numbering.xml><?xml version="1.0" encoding="utf-8"?>
+<w:numbering xmlns:wpc="http://schemas.microsoft.com/office/word/2010/wordprocessingCanvas" xmlns:cx="http://schemas.microsoft.com/office/drawing/2014/chartex" xmlns:cx1="http://schemas.microsoft.com/office/drawing/2015/9/8/chartex" xmlns:cx2="http://schemas.microsoft.com/office/drawing/2015/10/21/chartex" xmlns:cx3="http://schemas.microsoft.com/office/drawing/2016/5/9/chartex" xmlns:cx4="http://schemas.microsoft.com/office/drawing/2016/5/10/chartex" xmlns:cx5="http://schemas.microsoft.com/office/drawing/2016/5/11/chartex" xmlns:cx6="http://schemas.microsoft.com/office/drawing/2016/5/12/chartex" xmlns:cx7="http://schemas.microsoft.com/office/drawing/2016/5/13/chartex" xmlns:cx8="http://schemas.microsoft.com/office/drawing/2016/5/14/chartex" xmlns:mc="http://schemas.openxmlformats.org/markup-compatibility/2006" xmlns:aink="http://schemas.microsoft.com/office/drawing/2016/ink" xmlns:am3d="http://schemas.microsoft.com/office/drawing/2017/model3d" xmlns:o="urn:schemas-microsoft-com:office:office" xmlns:oel="http://schemas.microsoft.com/office/2019/extlst" xmlns:r="http://schemas.openxmlformats.org/officeDocument/2006/relationships" xmlns:m="http://schemas.openxmlformats.org/officeDocument/2006/math" xmlns:v="urn:schemas-microsoft-com:vml" xmlns:wp14="http://schemas.microsoft.com/office/word/2010/wordprocessingDrawing" xmlns:wp="http://schemas.openxmlformats.org/drawingml/2006/wordprocessingDrawing" xmlns:w10="urn:schemas-microsoft-com:office:word" xmlns:w="http://schemas.openxmlformats.org/wordprocessingml/2006/main" xmlns:w14="http://schemas.microsoft.com/office/word/2010/wordml" xmlns:w15="http://schemas.microsoft.com/office/word/2012/wordml" xmlns:w16cex="http://schemas.microsoft.com/office/word/2018/wordml/cex" xmlns:w16cid="http://schemas.microsoft.com/office/word/2016/wordml/cid" xmlns:w16="http://schemas.microsoft.com/office/word/2018/wordml" xmlns:w16du="http://schemas.microsoft.com/office/word/2023/wordml/word16du" xmlns:w16sdtdh="http://schemas.microsoft.com/office/word/2020/wordml/sdtdatahash" xmlns:w16sdtfl="http://schemas.microsoft.com/office/word/2024/wordml/sdtformatlock" xmlns:w16se="http://schemas.microsoft.com/office/word/2015/wordml/symex" xmlns:wpg="http://schemas.microsoft.com/office/word/2010/wordprocessingGroup" xmlns:wpi="http://schemas.microsoft.com/office/word/2010/wordprocessingInk" xmlns:wne="http://schemas.microsoft.com/office/word/2006/wordml" xmlns:wps="http://schemas.microsoft.com/office/word/2010/wordprocessingShape" mc:Ignorable="w14 w15 w16se w16cid w16 w16cex w16sdtdh w16sdtfl w16du wp14">
+  <w:abstractNum w:abstractNumId="0" w15:restartNumberingAfterBreak="0">
+    <w:nsid w:val="283373EB"/>
+    <w:multiLevelType w:val="hybridMultilevel"/>
+    <w:tmpl w:val="D834C6F8"/>
+    <w:lvl w:ilvl="0" w:tplc="867A615E">
+      <w:start w:val="1"/>
+      <w:numFmt w:val="decimal"/>
+      <w:lvlText w:val="%1."/>
+      <w:lvlJc w:val="left"/>
+      <w:pPr>
+        <w:ind w:left="720" w:hanging="360"/>
+      </w:pPr>
+      <w:rPr>
+        <w:rFonts w:hint="default"/>
+        <w:b/>
+      </w:rPr>
+    </w:lvl>
+    <w:lvl w:ilvl="1" w:tplc="04090019" w:tentative="1">
+      <w:start w:val="1"/>
+      <w:numFmt w:val="lowerLetter"/>
+      <w:lvlText w:val="%2."/>
+      <w:lvlJc w:val="left"/>
+      <w:pPr>
+        <w:ind w:left="1440" w:hanging="360"/>
+      </w:pPr>
+    </w:lvl>
+    <w:lvl w:ilvl="2" w:tplc="0409001B" w:tentative="1">
+      <w:start w:val="1"/>
+      <w:numFmt w:val="lowerRoman"/>
+      <w:lvlText w:val="%3."/>
+      <w:lvlJc w:val="right"/>
+      <w:pPr>
+        <w:ind w:left="2160" w:hanging="180"/>
+      </w:pPr>
+    </w:lvl>
+    <w:lvl w:ilvl="3" w:tplc="0409000F" w:tentative="1">
+      <w:start w:val="1"/>
+      <w:numFmt w:val="decimal"/>
+      <w:lvlText w:val="%4."/>
+      <w:lvlJc w:val="left"/>
+      <w:pPr>
+        <w:ind w:left="2880" w:hanging="360"/>
+      </w:pPr>
+    </w:lvl>
+    <w:lvl w:ilvl="4" w:tplc="04090019" w:tentative="1">
+      <w:start w:val="1"/>
+      <w:numFmt w:val="lowerLetter"/>
+      <w:lvlText w:val="%5."/>
+      <w:lvlJc w:val="left"/>
+      <w:pPr>
+        <w:ind w:left="3600" w:hanging="360"/>
+      </w:pPr>
+    </w:lvl>
+    <w:lvl w:ilvl="5" w:tplc="0409001B" w:tentative="1">
+      <w:start w:val="1"/>
+      <w:numFmt w:val="lowerRoman"/>
+      <w:lvlText w:val="%6."/>
+      <w:lvlJc w:val="right"/>
+      <w:pPr>
+        <w:ind w:left="4320" w:hanging="180"/>
+      </w:pPr>
+    </w:lvl>
+    <w:lvl w:ilvl="6" w:tplc="0409000F" w:tentative="1">
+      <w:start w:val="1"/>
+      <w:numFmt w:val="decimal"/>
+      <w:lvlText w:val="%7."/>
+      <w:lvlJc w:val="left"/>
+      <w:pPr>
+        <w:ind w:left="5040" w:hanging="360"/>
+      </w:pPr>
+    </w:lvl>
+    <w:lvl w:ilvl="7" w:tplc="04090019" w:tentative="1">
+      <w:start w:val="1"/>
+      <w:numFmt w:val="lowerLetter"/>
+      <w:lvlText w:val="%8."/>
+      <w:lvlJc w:val="left"/>
+      <w:pPr>
+        <w:ind w:left="5760" w:hanging="360"/>
+      </w:pPr>
+    </w:lvl>
+    <w:lvl w:ilvl="8" w:tplc="0409001B" w:tentative="1">
+      <w:start w:val="1"/>
+      <w:numFmt w:val="lowerRoman"/>
+      <w:lvlText w:val="%9."/>
+      <w:lvlJc w:val="right"/>
+      <w:pPr>
+        <w:ind w:left="6480" w:hanging="180"/>
+      </w:pPr>
+    </w:lvl>
+  </w:abstractNum>
+  <w:abstractNum w:abstractNumId="1" w15:restartNumberingAfterBreak="0">
+    <w:nsid w:val="5CC81DD8"/>
+    <w:multiLevelType w:val="hybridMultilevel"/>
+    <w:tmpl w:val="035C2C6E"/>
+    <w:lvl w:ilvl="0" w:tplc="D4AEC2B4">
+      <w:start w:val="1"/>
+      <w:numFmt w:val="decimal"/>
+      <w:lvlText w:val="%1."/>
+      <w:lvlJc w:val="left"/>
+      <w:pPr>
+        <w:ind w:left="464" w:hanging="360"/>
+      </w:pPr>
+      <w:rPr>
+        <w:rFonts w:hint="default"/>
+        <w:b/>
+      </w:rPr>
+    </w:lvl>
+    <w:lvl w:ilvl="1" w:tplc="04090019" w:tentative="1">
+      <w:start w:val="1"/>
+      <w:numFmt w:val="lowerLetter"/>
+      <w:lvlText w:val="%2."/>
+      <w:lvlJc w:val="left"/>
+      <w:pPr>
+        <w:ind w:left="1184" w:hanging="360"/>
+      </w:pPr>
+    </w:lvl>
+    <w:lvl w:ilvl="2" w:tplc="0409001B" w:tentative="1">
+      <w:start w:val="1"/>
+      <w:numFmt w:val="lowerRoman"/>
+      <w:lvlText w:val="%3."/>
+      <w:lvlJc w:val="right"/>
+      <w:pPr>
+        <w:ind w:left="1904" w:hanging="180"/>
+      </w:pPr>
+    </w:lvl>
+    <w:lvl w:ilvl="3" w:tplc="0409000F" w:tentative="1">
+      <w:start w:val="1"/>
+      <w:numFmt w:val="decimal"/>
+      <w:lvlText w:val="%4."/>
+      <w:lvlJc w:val="left"/>
+      <w:pPr>
+        <w:ind w:left="2624" w:hanging="360"/>
+      </w:pPr>
+    </w:lvl>
+    <w:lvl w:ilvl="4" w:tplc="04090019" w:tentative="1">
+      <w:start w:val="1"/>
+      <w:numFmt w:val="lowerLetter"/>
+      <w:lvlText w:val="%5."/>
+      <w:lvlJc w:val="left"/>
+      <w:pPr>
+        <w:ind w:left="3344" w:hanging="360"/>
+      </w:pPr>
+    </w:lvl>
+    <w:lvl w:ilvl="5" w:tplc="0409001B" w:tentative="1">
+      <w:start w:val="1"/>
+      <w:numFmt w:val="lowerRoman"/>
+      <w:lvlText w:val="%6."/>
+      <w:lvlJc w:val="right"/>
+      <w:pPr>
+        <w:ind w:left="4064" w:hanging="180"/>
+      </w:pPr>
+    </w:lvl>
+    <w:lvl w:ilvl="6" w:tplc="0409000F" w:tentative="1">
+      <w:start w:val="1"/>
+      <w:numFmt w:val="decimal"/>
+      <w:lvlText w:val="%7."/>
+      <w:lvlJc w:val="left"/>
+      <w:pPr>
+        <w:ind w:left="4784" w:hanging="360"/>
+      </w:pPr>
+    </w:lvl>
+    <w:lvl w:ilvl="7" w:tplc="04090019" w:tentative="1">
+      <w:start w:val="1"/>
+      <w:numFmt w:val="lowerLetter"/>
+      <w:lvlText w:val="%8."/>
+      <w:lvlJc w:val="left"/>
+      <w:pPr>
+        <w:ind w:left="5504" w:hanging="360"/>
+      </w:pPr>
+    </w:lvl>
+    <w:lvl w:ilvl="8" w:tplc="0409001B" w:tentative="1">
+      <w:start w:val="1"/>
+      <w:numFmt w:val="lowerRoman"/>
+      <w:lvlText w:val="%9."/>
+      <w:lvlJc w:val="right"/>
+      <w:pPr>
+        <w:ind w:left="6224" w:hanging="180"/>
+      </w:pPr>
+    </w:lvl>
+  </w:abstractNum>
+  <w:abstractNum w:abstractNumId="2" w15:restartNumberingAfterBreak="0">
+    <w:nsid w:val="5D3B65D9"/>
+    <w:multiLevelType w:val="multilevel"/>
+    <w:tmpl w:val="E086F058"/>
+    <w:lvl w:ilvl="0">
+      <w:start w:val="1"/>
+      <w:numFmt w:val="bullet"/>
+      <w:lvlText w:val=""/>
+      <w:lvlJc w:val="left"/>
+      <w:pPr>
+        <w:tabs>
+          <w:tab w:val="num" w:pos="720"/>
+        </w:tabs>
+        <w:ind w:left="720" w:hanging="360"/>
+      </w:pPr>
+      <w:rPr>
+        <w:rFonts w:ascii="Symbol" w:hAnsi="Symbol" w:hint="default"/>
+        <w:sz w:val="20"/>
+      </w:rPr>
+    </w:lvl>
+    <w:lvl w:ilvl="1" w:tentative="1">
+      <w:start w:val="1"/>
+      <w:numFmt w:val="bullet"/>
+      <w:lvlText w:val="o"/>
+      <w:lvlJc w:val="left"/>
+      <w:pPr>
+        <w:tabs>
+          <w:tab w:val="num" w:pos="1440"/>
+        </w:tabs>
+        <w:ind w:left="1440" w:hanging="360"/>
+      </w:pPr>
+      <w:rPr>
+        <w:rFonts w:ascii="Courier New" w:hAnsi="Courier New" w:hint="default"/>
+        <w:sz w:val="20"/>
+      </w:rPr>
+    </w:lvl>
+    <w:lvl w:ilvl="2" w:tentative="1">
+      <w:start w:val="1"/>
+      <w:numFmt w:val="bullet"/>
+      <w:lvlText w:val=""/>
+      <w:lvlJc w:val="left"/>
+      <w:pPr>
+        <w:tabs>
+          <w:tab w:val="num" w:pos="2160"/>
+        </w:tabs>
+        <w:ind w:left="2160" w:hanging="360"/>
+      </w:pPr>
+      <w:rPr>
+        <w:rFonts w:ascii="Wingdings" w:hAnsi="Wingdings" w:hint="default"/>
+        <w:sz w:val="20"/>
+      </w:rPr>
+    </w:lvl>
+    <w:lvl w:ilvl="3" w:tentative="1">
+      <w:start w:val="1"/>
+      <w:numFmt w:val="bullet"/>
+      <w:lvlText w:val=""/>
+      <w:lvlJc w:val="left"/>
+      <w:pPr>
+        <w:tabs>
+          <w:tab w:val="num" w:pos="2880"/>
+        </w:tabs>
+        <w:ind w:left="2880" w:hanging="360"/>
+      </w:pPr>
+      <w:rPr>
+        <w:rFonts w:ascii="Wingdings" w:hAnsi="Wingdings" w:hint="default"/>
+        <w:sz w:val="20"/>
+      </w:rPr>
+    </w:lvl>
+    <w:lvl w:ilvl="4" w:tentative="1">
+      <w:start w:val="1"/>
+      <w:numFmt w:val="bullet"/>
+      <w:lvlText w:val=""/>
+      <w:lvlJc w:val="left"/>
+      <w:pPr>
+        <w:tabs>
+          <w:tab w:val="num" w:pos="3600"/>
+        </w:tabs>
+        <w:ind w:left="3600" w:hanging="360"/>
+      </w:pPr>
+      <w:rPr>
+        <w:rFonts w:ascii="Wingdings" w:hAnsi="Wingdings" w:hint="default"/>
+        <w:sz w:val="20"/>
+      </w:rPr>
+    </w:lvl>
+    <w:lvl w:ilvl="5" w:tentative="1">
+      <w:start w:val="1"/>
+      <w:numFmt w:val="bullet"/>
+      <w:lvlText w:val=""/>
+      <w:lvlJc w:val="left"/>
+      <w:pPr>
+        <w:tabs>
+          <w:tab w:val="num" w:pos="4320"/>
+        </w:tabs>
+        <w:ind w:left="4320" w:hanging="360"/>
+      </w:pPr>
+      <w:rPr>
+        <w:rFonts w:ascii="Wingdings" w:hAnsi="Wingdings" w:hint="default"/>
+        <w:sz w:val="20"/>
+      </w:rPr>
+    </w:lvl>
+    <w:lvl w:ilvl="6" w:tentative="1">
+      <w:start w:val="1"/>
+      <w:numFmt w:val="bullet"/>
+      <w:lvlText w:val=""/>
+      <w:lvlJc w:val="left"/>
+      <w:pPr>
+        <w:tabs>
+          <w:tab w:val="num" w:pos="5040"/>
+        </w:tabs>
+        <w:ind w:left="5040" w:hanging="360"/>
+      </w:pPr>
+      <w:rPr>
+        <w:rFonts w:ascii="Wingdings" w:hAnsi="Wingdings" w:hint="default"/>
+        <w:sz w:val="20"/>
+      </w:rPr>
+    </w:lvl>
+    <w:lvl w:ilvl="7" w:tentative="1">
+      <w:start w:val="1"/>
+      <w:numFmt w:val="bullet"/>
+      <w:lvlText w:val=""/>
+      <w:lvlJc w:val="left"/>
+      <w:pPr>
+        <w:tabs>
+          <w:tab w:val="num" w:pos="5760"/>
+        </w:tabs>
+        <w:ind w:left="5760" w:hanging="360"/>
+      </w:pPr>
+      <w:rPr>
+        <w:rFonts w:ascii="Wingdings" w:hAnsi="Wingdings" w:hint="default"/>
+        <w:sz w:val="20"/>
+      </w:rPr>
+    </w:lvl>
+    <w:lvl w:ilvl="8" w:tentative="1">
+      <w:start w:val="1"/>
+      <w:numFmt w:val="bullet"/>
+      <w:lvlText w:val=""/>
+      <w:lvlJc w:val="left"/>
+      <w:pPr>
+        <w:tabs>
+          <w:tab w:val="num" w:pos="6480"/>
+        </w:tabs>
+        <w:ind w:left="6480" w:hanging="360"/>
+      </w:pPr>
+      <w:rPr>
+        <w:rFonts w:ascii="Wingdings" w:hAnsi="Wingdings" w:hint="default"/>
+        <w:sz w:val="20"/>
+      </w:rPr>
+    </w:lvl>
+  </w:abstractNum>
+  <w:num w:numId="1" w16cid:durableId="2145349621">
+    <w:abstractNumId w:val="2"/>
+  </w:num>
+  <w:num w:numId="2" w16cid:durableId="419520449">
+    <w:abstractNumId w:val="0"/>
+  </w:num>
+  <w:num w:numId="3" w16cid:durableId="441152855">
+    <w:abstractNumId w:val="1"/>
+  </w:num>
+</w:numbering>
 </file>
 
 <file path=word/styles.xml><?xml version="1.0" encoding="utf-8"?>
@@ -1583,6 +3055,7 @@
         <w:ilvl w:val="1"/>
       </w:numPr>
       <w:spacing w:after="160" w:line="278" w:lineRule="auto"/>
+      <w:ind w:left="114" w:hanging="10"/>
       <w:jc w:val="left"/>
     </w:pPr>
     <w:rPr>

</xml_diff>

<commit_message>
docs: establish formal Requirement Engineering (FR/NFR) and MoSCoW prioritization
</commit_message>
<xml_diff>
--- a/docs/Sprint 1.docx
+++ b/docs/Sprint 1.docx
@@ -139,23 +139,7 @@
           <w:rFonts w:ascii="Calibri" w:hAnsi="Calibri" w:cs="Calibri"/>
           <w:lang w:val="en-US" w:eastAsia="en-US"/>
         </w:rPr>
-        <w:t xml:space="preserve"> Responsible for </w:t>
-      </w:r>
-      <w:proofErr w:type="spellStart"/>
-      <w:r>
-        <w:rPr>
-          <w:rFonts w:ascii="Calibri" w:hAnsi="Calibri" w:cs="Calibri"/>
-          <w:lang w:val="en-US" w:eastAsia="en-US"/>
-        </w:rPr>
-        <w:t>SvelteKit</w:t>
-      </w:r>
-      <w:proofErr w:type="spellEnd"/>
-      <w:r>
-        <w:rPr>
-          <w:rFonts w:ascii="Calibri" w:hAnsi="Calibri" w:cs="Calibri"/>
-          <w:lang w:val="en-US" w:eastAsia="en-US"/>
-        </w:rPr>
-        <w:t xml:space="preserve"> implementation.</w:t>
+        <w:t xml:space="preserve"> Responsible for SvelteKit implementation.</w:t>
       </w:r>
     </w:p>
     <w:p>
@@ -454,21 +438,7 @@
               <w:rPr>
                 <w:rFonts w:ascii="Calibri" w:hAnsi="Calibri" w:cs="Calibri"/>
               </w:rPr>
-              <w:t xml:space="preserve"> I want to book an appointment </w:t>
-            </w:r>
-            <w:proofErr w:type="gramStart"/>
-            <w:r>
-              <w:rPr>
-                <w:rFonts w:ascii="Calibri" w:hAnsi="Calibri" w:cs="Calibri"/>
-              </w:rPr>
-              <w:t>online</w:t>
-            </w:r>
-            <w:proofErr w:type="gramEnd"/>
-            <w:r>
-              <w:rPr>
-                <w:rFonts w:ascii="Calibri" w:hAnsi="Calibri" w:cs="Calibri"/>
-              </w:rPr>
-              <w:t xml:space="preserve"> so I don't have to call the clinic</w:t>
+              <w:t xml:space="preserve"> I want to book an appointment online so I don't have to call the clinic</w:t>
             </w:r>
             <w:r>
               <w:rPr>
@@ -689,25 +659,7 @@
                 <w:b/>
                 <w:bCs/>
               </w:rPr>
-              <w:t xml:space="preserve">As a Patient, I want to receive an appointment </w:t>
-            </w:r>
-            <w:proofErr w:type="gramStart"/>
-            <w:r>
-              <w:rPr>
-                <w:rFonts w:ascii="Calibri" w:hAnsi="Calibri" w:cs="Calibri"/>
-                <w:b/>
-                <w:bCs/>
-              </w:rPr>
-              <w:t>confirmation</w:t>
-            </w:r>
-            <w:proofErr w:type="gramEnd"/>
-            <w:r>
-              <w:rPr>
-                <w:rFonts w:ascii="Calibri" w:hAnsi="Calibri" w:cs="Calibri"/>
-                <w:b/>
-                <w:bCs/>
-              </w:rPr>
-              <w:t xml:space="preserve"> so I know my booking was successful.</w:t>
+              <w:t>As a Patient, I want to receive an appointment confirmation so I know my booking was successful.</w:t>
             </w:r>
           </w:p>
         </w:tc>
@@ -777,25 +729,7 @@
                 <w:b/>
                 <w:bCs/>
               </w:rPr>
-              <w:t xml:space="preserve">As an Admin, I want to register a new patient with their name and </w:t>
-            </w:r>
-            <w:proofErr w:type="gramStart"/>
-            <w:r>
-              <w:rPr>
-                <w:rFonts w:ascii="Calibri" w:hAnsi="Calibri" w:cs="Calibri"/>
-                <w:b/>
-                <w:bCs/>
-              </w:rPr>
-              <w:t>DOB</w:t>
-            </w:r>
-            <w:proofErr w:type="gramEnd"/>
-            <w:r>
-              <w:rPr>
-                <w:rFonts w:ascii="Calibri" w:hAnsi="Calibri" w:cs="Calibri"/>
-                <w:b/>
-                <w:bCs/>
-              </w:rPr>
-              <w:t xml:space="preserve"> so their record is created.</w:t>
+              <w:t>As an Admin, I want to register a new patient with their name and DOB so their record is created.</w:t>
             </w:r>
           </w:p>
         </w:tc>
@@ -932,25 +866,7 @@
                 <w:b/>
                 <w:bCs/>
               </w:rPr>
-              <w:t xml:space="preserve">As a Doctor, I want to update a patient's </w:t>
-            </w:r>
-            <w:proofErr w:type="gramStart"/>
-            <w:r>
-              <w:rPr>
-                <w:rFonts w:ascii="Calibri" w:hAnsi="Calibri" w:cs="Calibri"/>
-                <w:b/>
-                <w:bCs/>
-              </w:rPr>
-              <w:t>records</w:t>
-            </w:r>
-            <w:proofErr w:type="gramEnd"/>
-            <w:r>
-              <w:rPr>
-                <w:rFonts w:ascii="Calibri" w:hAnsi="Calibri" w:cs="Calibri"/>
-                <w:b/>
-                <w:bCs/>
-              </w:rPr>
-              <w:t xml:space="preserve"> so their medical history remains accurate.</w:t>
+              <w:t>As a Doctor, I want to update a patient's records so their medical history remains accurate.</w:t>
             </w:r>
           </w:p>
         </w:tc>
@@ -1046,6 +962,666 @@
       <w:pPr>
         <w:rPr>
           <w:rFonts w:ascii="Calibri" w:hAnsi="Calibri" w:cs="Calibri"/>
+        </w:rPr>
+      </w:pPr>
+    </w:p>
+    <w:p>
+      <w:pPr>
+        <w:pStyle w:val="Heading2"/>
+        <w:rPr>
+          <w:rFonts w:ascii="Calibri" w:hAnsi="Calibri" w:cs="Calibri"/>
+          <w:lang w:val="en-GB"/>
+        </w:rPr>
+      </w:pPr>
+      <w:r>
+        <w:rPr>
+          <w:rFonts w:ascii="Calibri" w:hAnsi="Calibri" w:cs="Calibri"/>
+          <w:lang w:val="en-GB"/>
+        </w:rPr>
+        <w:t>Requirement Analysis &amp; Prioritization</w:t>
+      </w:r>
+    </w:p>
+    <w:p>
+      <w:pPr>
+        <w:pStyle w:val="Heading3"/>
+        <w:rPr>
+          <w:rFonts w:ascii="Calibri" w:hAnsi="Calibri" w:cs="Calibri"/>
+        </w:rPr>
+      </w:pPr>
+      <w:r>
+        <w:rPr>
+          <w:rFonts w:ascii="Calibri" w:hAnsi="Calibri" w:cs="Calibri"/>
+        </w:rPr>
+        <w:t xml:space="preserve">A. </w:t>
+      </w:r>
+      <w:r>
+        <w:rPr>
+          <w:rFonts w:ascii="Calibri" w:hAnsi="Calibri" w:cs="Calibri"/>
+        </w:rPr>
+        <w:t xml:space="preserve">Master </w:t>
+      </w:r>
+      <w:r>
+        <w:rPr>
+          <w:rFonts w:ascii="Calibri" w:hAnsi="Calibri" w:cs="Calibri"/>
+        </w:rPr>
+        <w:t>Requirements</w:t>
+      </w:r>
+    </w:p>
+    <w:p>
+      <w:pPr>
+        <w:rPr>
+          <w:rFonts w:ascii="Calibri" w:hAnsi="Calibri" w:cs="Calibri"/>
+          <w:b/>
+          <w:bCs/>
+          <w:sz w:val="24"/>
+          <w:u w:val="single"/>
+          <w:lang w:val="en-US" w:eastAsia="en-US"/>
+        </w:rPr>
+      </w:pPr>
+      <w:r>
+        <w:rPr>
+          <w:rFonts w:ascii="Calibri" w:hAnsi="Calibri" w:cs="Calibri"/>
+          <w:b/>
+          <w:bCs/>
+          <w:sz w:val="24"/>
+          <w:u w:val="single"/>
+          <w:lang w:val="en-US" w:eastAsia="en-US"/>
+        </w:rPr>
+        <w:t>Functional Requirements (FR)</w:t>
+      </w:r>
+    </w:p>
+    <w:p>
+      <w:pPr>
+        <w:pStyle w:val="ListParagraph"/>
+        <w:numPr>
+          <w:ilvl w:val="0"/>
+          <w:numId w:val="6"/>
+        </w:numPr>
+        <w:rPr>
+          <w:rFonts w:ascii="Calibri" w:hAnsi="Calibri" w:cs="Calibri"/>
+          <w:b/>
+          <w:bCs/>
+        </w:rPr>
+      </w:pPr>
+      <w:r>
+        <w:rPr>
+          <w:rFonts w:ascii="Calibri" w:hAnsi="Calibri" w:cs="Calibri"/>
+          <w:b/>
+          <w:bCs/>
+        </w:rPr>
+        <w:t xml:space="preserve">FR1 (Authentication): </w:t>
+      </w:r>
+      <w:r>
+        <w:rPr>
+          <w:rFonts w:ascii="Calibri" w:hAnsi="Calibri" w:cs="Calibri"/>
+        </w:rPr>
+        <w:t>The system shall provide secure login for Patients and Doctors using server-side session validation.</w:t>
+      </w:r>
+    </w:p>
+    <w:p>
+      <w:pPr>
+        <w:pStyle w:val="ListParagraph"/>
+        <w:numPr>
+          <w:ilvl w:val="0"/>
+          <w:numId w:val="6"/>
+        </w:numPr>
+        <w:rPr>
+          <w:rFonts w:ascii="Calibri" w:hAnsi="Calibri" w:cs="Calibri"/>
+        </w:rPr>
+      </w:pPr>
+      <w:r>
+        <w:rPr>
+          <w:rFonts w:ascii="Calibri" w:hAnsi="Calibri" w:cs="Calibri"/>
+          <w:b/>
+          <w:bCs/>
+        </w:rPr>
+        <w:lastRenderedPageBreak/>
+        <w:t xml:space="preserve">FR2 (Scheduling): </w:t>
+      </w:r>
+      <w:r>
+        <w:rPr>
+          <w:rFonts w:ascii="Calibri" w:hAnsi="Calibri" w:cs="Calibri"/>
+        </w:rPr>
+        <w:t>The system shall display a real-time, reactive calendar of doctor availability.</w:t>
+      </w:r>
+    </w:p>
+    <w:p>
+      <w:pPr>
+        <w:pStyle w:val="ListParagraph"/>
+        <w:numPr>
+          <w:ilvl w:val="0"/>
+          <w:numId w:val="6"/>
+        </w:numPr>
+        <w:rPr>
+          <w:rFonts w:ascii="Calibri" w:hAnsi="Calibri" w:cs="Calibri"/>
+        </w:rPr>
+      </w:pPr>
+      <w:r>
+        <w:rPr>
+          <w:rFonts w:ascii="Calibri" w:hAnsi="Calibri" w:cs="Calibri"/>
+          <w:b/>
+          <w:bCs/>
+        </w:rPr>
+        <w:t xml:space="preserve">FR3 (Self-Service): </w:t>
+      </w:r>
+      <w:r>
+        <w:rPr>
+          <w:rFonts w:ascii="Calibri" w:hAnsi="Calibri" w:cs="Calibri"/>
+        </w:rPr>
+        <w:t>Patients shall be able to book and manage appointments via a dynamic interface.</w:t>
+      </w:r>
+    </w:p>
+    <w:p>
+      <w:pPr>
+        <w:pStyle w:val="ListParagraph"/>
+        <w:numPr>
+          <w:ilvl w:val="0"/>
+          <w:numId w:val="6"/>
+        </w:numPr>
+        <w:rPr>
+          <w:rFonts w:ascii="Calibri" w:hAnsi="Calibri" w:cs="Calibri"/>
+        </w:rPr>
+      </w:pPr>
+      <w:r>
+        <w:rPr>
+          <w:rFonts w:ascii="Calibri" w:hAnsi="Calibri" w:cs="Calibri"/>
+          <w:b/>
+          <w:bCs/>
+        </w:rPr>
+        <w:t xml:space="preserve">FR4 (Data Retrieval): </w:t>
+      </w:r>
+      <w:r>
+        <w:rPr>
+          <w:rFonts w:ascii="Calibri" w:hAnsi="Calibri" w:cs="Calibri"/>
+        </w:rPr>
+        <w:t>The system shall allow patients to retrieve and view their medical records securely .</w:t>
+      </w:r>
+    </w:p>
+    <w:p>
+      <w:pPr>
+        <w:rPr>
+          <w:rFonts w:ascii="Calibri" w:hAnsi="Calibri" w:cs="Calibri"/>
+          <w:b/>
+          <w:bCs/>
+          <w:lang w:val="en-US" w:eastAsia="en-US"/>
+        </w:rPr>
+      </w:pPr>
+    </w:p>
+    <w:p>
+      <w:pPr>
+        <w:rPr>
+          <w:rFonts w:ascii="Calibri" w:hAnsi="Calibri" w:cs="Calibri"/>
+          <w:b/>
+          <w:bCs/>
+          <w:sz w:val="24"/>
+          <w:u w:val="single"/>
+          <w:lang w:val="en-US" w:eastAsia="en-US"/>
+        </w:rPr>
+      </w:pPr>
+      <w:r>
+        <w:rPr>
+          <w:rFonts w:ascii="Calibri" w:hAnsi="Calibri" w:cs="Calibri"/>
+          <w:b/>
+          <w:bCs/>
+          <w:sz w:val="24"/>
+          <w:u w:val="single"/>
+          <w:lang w:val="en-US" w:eastAsia="en-US"/>
+        </w:rPr>
+        <w:t>Non-Functional Requirements (NFR)</w:t>
+      </w:r>
+    </w:p>
+    <w:p>
+      <w:pPr>
+        <w:pStyle w:val="ListParagraph"/>
+        <w:numPr>
+          <w:ilvl w:val="0"/>
+          <w:numId w:val="7"/>
+        </w:numPr>
+        <w:rPr>
+          <w:rFonts w:ascii="Calibri" w:hAnsi="Calibri" w:cs="Calibri"/>
+        </w:rPr>
+      </w:pPr>
+      <w:r>
+        <w:rPr>
+          <w:rFonts w:ascii="Calibri" w:hAnsi="Calibri" w:cs="Calibri"/>
+          <w:b/>
+          <w:bCs/>
+        </w:rPr>
+        <w:t>NFR1 (Security):</w:t>
+      </w:r>
+      <w:r>
+        <w:rPr>
+          <w:rFonts w:ascii="Calibri" w:hAnsi="Calibri" w:cs="Calibri"/>
+        </w:rPr>
+        <w:t xml:space="preserve"> All medical data retrieval must be seamless and protected by server-side hooks to prevent unauthorized access.</w:t>
+      </w:r>
+    </w:p>
+    <w:p>
+      <w:pPr>
+        <w:pStyle w:val="ListParagraph"/>
+        <w:numPr>
+          <w:ilvl w:val="0"/>
+          <w:numId w:val="7"/>
+        </w:numPr>
+        <w:rPr>
+          <w:rFonts w:ascii="Calibri" w:hAnsi="Calibri" w:cs="Calibri"/>
+        </w:rPr>
+      </w:pPr>
+      <w:r>
+        <w:rPr>
+          <w:rFonts w:ascii="Calibri" w:hAnsi="Calibri" w:cs="Calibri"/>
+          <w:b/>
+          <w:bCs/>
+        </w:rPr>
+        <w:t>NFR2 (Availability):</w:t>
+      </w:r>
+      <w:r>
+        <w:rPr>
+          <w:rFonts w:ascii="Calibri" w:hAnsi="Calibri" w:cs="Calibri"/>
+        </w:rPr>
+        <w:t xml:space="preserve"> The calendar dashboard must update reactively to ensure users see the most up-to-date information.</w:t>
+      </w:r>
+    </w:p>
+    <w:p>
+      <w:pPr>
+        <w:pStyle w:val="ListParagraph"/>
+        <w:numPr>
+          <w:ilvl w:val="0"/>
+          <w:numId w:val="7"/>
+        </w:numPr>
+        <w:rPr>
+          <w:rFonts w:ascii="Calibri" w:hAnsi="Calibri" w:cs="Calibri"/>
+        </w:rPr>
+      </w:pPr>
+      <w:r>
+        <w:rPr>
+          <w:rFonts w:ascii="Calibri" w:hAnsi="Calibri" w:cs="Calibri"/>
+          <w:b/>
+          <w:bCs/>
+        </w:rPr>
+        <w:t>NFR3 (Usability):</w:t>
+      </w:r>
+      <w:r>
+        <w:rPr>
+          <w:rFonts w:ascii="Calibri" w:hAnsi="Calibri" w:cs="Calibri"/>
+        </w:rPr>
+        <w:t xml:space="preserve"> The interface must prioritize a "self-service" model to reduce administrative burden</w:t>
+      </w:r>
+    </w:p>
+    <w:p>
+      <w:pPr>
+        <w:rPr>
+          <w:rFonts w:ascii="Calibri" w:hAnsi="Calibri" w:cs="Calibri"/>
+          <w:lang w:val="en-US" w:eastAsia="en-US"/>
+        </w:rPr>
+      </w:pPr>
+    </w:p>
+    <w:p>
+      <w:pPr>
+        <w:rPr>
+          <w:rFonts w:ascii="Calibri" w:hAnsi="Calibri" w:cs="Calibri"/>
+          <w:lang w:val="en-US" w:eastAsia="en-US"/>
+        </w:rPr>
+      </w:pPr>
+    </w:p>
+    <w:p>
+      <w:pPr>
+        <w:pStyle w:val="Heading3"/>
+        <w:rPr>
+          <w:rFonts w:ascii="Calibri" w:hAnsi="Calibri" w:cs="Calibri"/>
+        </w:rPr>
+      </w:pPr>
+      <w:r>
+        <w:rPr>
+          <w:rFonts w:ascii="Calibri" w:hAnsi="Calibri" w:cs="Calibri"/>
+        </w:rPr>
+        <w:t>B. MoSCoW Prioritization</w:t>
+      </w:r>
+    </w:p>
+    <w:tbl>
+      <w:tblPr>
+        <w:tblStyle w:val="TableGrid"/>
+        <w:tblW w:w="0" w:type="auto"/>
+        <w:tblLook w:val="04A0" w:firstRow="1" w:lastRow="0" w:firstColumn="1" w:lastColumn="0" w:noHBand="0" w:noVBand="1"/>
+      </w:tblPr>
+      <w:tblGrid>
+        <w:gridCol w:w="1354"/>
+        <w:gridCol w:w="6565"/>
+      </w:tblGrid>
+      <w:tr>
+        <w:tc>
+          <w:tcPr>
+            <w:tcW w:w="0" w:type="auto"/>
+            <w:hideMark/>
+          </w:tcPr>
+          <w:p>
+            <w:pPr>
+              <w:rPr>
+                <w:rFonts w:ascii="Calibri" w:hAnsi="Calibri" w:cs="Calibri"/>
+                <w:b/>
+                <w:bCs/>
+                <w:lang w:val="en-US" w:eastAsia="en-US"/>
+              </w:rPr>
+            </w:pPr>
+            <w:r>
+              <w:rPr>
+                <w:rFonts w:ascii="Calibri" w:hAnsi="Calibri" w:cs="Calibri"/>
+                <w:b/>
+                <w:bCs/>
+                <w:lang w:val="en-US" w:eastAsia="en-US"/>
+              </w:rPr>
+              <w:t>Category</w:t>
+            </w:r>
+          </w:p>
+        </w:tc>
+        <w:tc>
+          <w:tcPr>
+            <w:tcW w:w="0" w:type="auto"/>
+            <w:hideMark/>
+          </w:tcPr>
+          <w:p>
+            <w:pPr>
+              <w:rPr>
+                <w:rFonts w:ascii="Calibri" w:hAnsi="Calibri" w:cs="Calibri"/>
+                <w:b/>
+                <w:bCs/>
+                <w:lang w:val="en-US" w:eastAsia="en-US"/>
+              </w:rPr>
+            </w:pPr>
+            <w:r>
+              <w:rPr>
+                <w:rFonts w:ascii="Calibri" w:hAnsi="Calibri" w:cs="Calibri"/>
+                <w:b/>
+                <w:bCs/>
+                <w:lang w:val="en-US" w:eastAsia="en-US"/>
+              </w:rPr>
+              <w:t>Requirements</w:t>
+            </w:r>
+          </w:p>
+        </w:tc>
+      </w:tr>
+      <w:tr>
+        <w:tc>
+          <w:tcPr>
+            <w:tcW w:w="0" w:type="auto"/>
+            <w:hideMark/>
+          </w:tcPr>
+          <w:p>
+            <w:pPr>
+              <w:rPr>
+                <w:rFonts w:ascii="Calibri" w:hAnsi="Calibri" w:cs="Calibri"/>
+                <w:b/>
+                <w:bCs/>
+                <w:lang w:val="en-US" w:eastAsia="en-US"/>
+              </w:rPr>
+            </w:pPr>
+            <w:r>
+              <w:rPr>
+                <w:rFonts w:ascii="Calibri" w:hAnsi="Calibri" w:cs="Calibri"/>
+                <w:b/>
+                <w:bCs/>
+                <w:lang w:val="en-US" w:eastAsia="en-US"/>
+              </w:rPr>
+              <w:t>Must Have</w:t>
+            </w:r>
+          </w:p>
+        </w:tc>
+        <w:tc>
+          <w:tcPr>
+            <w:tcW w:w="0" w:type="auto"/>
+            <w:hideMark/>
+          </w:tcPr>
+          <w:p>
+            <w:pPr>
+              <w:rPr>
+                <w:rFonts w:ascii="Calibri" w:hAnsi="Calibri" w:cs="Calibri"/>
+                <w:lang w:val="en-US" w:eastAsia="en-US"/>
+              </w:rPr>
+            </w:pPr>
+            <w:r>
+              <w:rPr>
+                <w:rFonts w:ascii="Calibri" w:hAnsi="Calibri" w:cs="Calibri"/>
+                <w:lang w:val="en-US" w:eastAsia="en-US"/>
+              </w:rPr>
+              <w:t>Secure Authentication, Dynamic Booking, Real-time Calendar, Medical Portal.</w:t>
+            </w:r>
+          </w:p>
+        </w:tc>
+      </w:tr>
+      <w:tr>
+        <w:tc>
+          <w:tcPr>
+            <w:tcW w:w="0" w:type="auto"/>
+            <w:hideMark/>
+          </w:tcPr>
+          <w:p>
+            <w:pPr>
+              <w:rPr>
+                <w:rFonts w:ascii="Calibri" w:hAnsi="Calibri" w:cs="Calibri"/>
+                <w:b/>
+                <w:bCs/>
+                <w:lang w:val="en-US" w:eastAsia="en-US"/>
+              </w:rPr>
+            </w:pPr>
+            <w:r>
+              <w:rPr>
+                <w:rFonts w:ascii="Calibri" w:hAnsi="Calibri" w:cs="Calibri"/>
+                <w:b/>
+                <w:bCs/>
+                <w:lang w:val="en-US" w:eastAsia="en-US"/>
+              </w:rPr>
+              <w:t>Should Have</w:t>
+            </w:r>
+          </w:p>
+        </w:tc>
+        <w:tc>
+          <w:tcPr>
+            <w:tcW w:w="0" w:type="auto"/>
+            <w:hideMark/>
+          </w:tcPr>
+          <w:p>
+            <w:pPr>
+              <w:rPr>
+                <w:rFonts w:ascii="Calibri" w:hAnsi="Calibri" w:cs="Calibri"/>
+                <w:lang w:val="en-US" w:eastAsia="en-US"/>
+              </w:rPr>
+            </w:pPr>
+            <w:r>
+              <w:rPr>
+                <w:rFonts w:ascii="Calibri" w:hAnsi="Calibri" w:cs="Calibri"/>
+                <w:lang w:val="en-US" w:eastAsia="en-US"/>
+              </w:rPr>
+              <w:t>Appointment confirmation messages, automated data validation.</w:t>
+            </w:r>
+          </w:p>
+        </w:tc>
+      </w:tr>
+      <w:tr>
+        <w:tc>
+          <w:tcPr>
+            <w:tcW w:w="0" w:type="auto"/>
+            <w:hideMark/>
+          </w:tcPr>
+          <w:p>
+            <w:pPr>
+              <w:rPr>
+                <w:rFonts w:ascii="Calibri" w:hAnsi="Calibri" w:cs="Calibri"/>
+                <w:b/>
+                <w:bCs/>
+                <w:lang w:val="en-US" w:eastAsia="en-US"/>
+              </w:rPr>
+            </w:pPr>
+            <w:r>
+              <w:rPr>
+                <w:rFonts w:ascii="Calibri" w:hAnsi="Calibri" w:cs="Calibri"/>
+                <w:b/>
+                <w:bCs/>
+                <w:lang w:val="en-US" w:eastAsia="en-US"/>
+              </w:rPr>
+              <w:t>Could Have</w:t>
+            </w:r>
+          </w:p>
+        </w:tc>
+        <w:tc>
+          <w:tcPr>
+            <w:tcW w:w="0" w:type="auto"/>
+            <w:hideMark/>
+          </w:tcPr>
+          <w:p>
+            <w:pPr>
+              <w:rPr>
+                <w:rFonts w:ascii="Calibri" w:hAnsi="Calibri" w:cs="Calibri"/>
+                <w:lang w:val="en-US" w:eastAsia="en-US"/>
+              </w:rPr>
+            </w:pPr>
+            <w:r>
+              <w:rPr>
+                <w:rFonts w:ascii="Calibri" w:hAnsi="Calibri" w:cs="Calibri"/>
+                <w:lang w:val="en-US" w:eastAsia="en-US"/>
+              </w:rPr>
+              <w:t>SMS reminders, medical history filtering/sorting.</w:t>
+            </w:r>
+          </w:p>
+        </w:tc>
+      </w:tr>
+      <w:tr>
+        <w:tc>
+          <w:tcPr>
+            <w:tcW w:w="0" w:type="auto"/>
+            <w:hideMark/>
+          </w:tcPr>
+          <w:p>
+            <w:pPr>
+              <w:rPr>
+                <w:rFonts w:ascii="Calibri" w:hAnsi="Calibri" w:cs="Calibri"/>
+                <w:b/>
+                <w:bCs/>
+                <w:lang w:val="en-US" w:eastAsia="en-US"/>
+              </w:rPr>
+            </w:pPr>
+            <w:r>
+              <w:rPr>
+                <w:rFonts w:ascii="Calibri" w:hAnsi="Calibri" w:cs="Calibri"/>
+                <w:b/>
+                <w:bCs/>
+                <w:lang w:val="en-US" w:eastAsia="en-US"/>
+              </w:rPr>
+              <w:t>Won't Have</w:t>
+            </w:r>
+          </w:p>
+        </w:tc>
+        <w:tc>
+          <w:tcPr>
+            <w:tcW w:w="0" w:type="auto"/>
+            <w:hideMark/>
+          </w:tcPr>
+          <w:p>
+            <w:pPr>
+              <w:rPr>
+                <w:rFonts w:ascii="Calibri" w:hAnsi="Calibri" w:cs="Calibri"/>
+                <w:lang w:val="en-US" w:eastAsia="en-US"/>
+              </w:rPr>
+            </w:pPr>
+            <w:r>
+              <w:rPr>
+                <w:rFonts w:ascii="Calibri" w:hAnsi="Calibri" w:cs="Calibri"/>
+                <w:lang w:val="en-US" w:eastAsia="en-US"/>
+              </w:rPr>
+              <w:t>Payment gateways, video consultations, staff payroll.</w:t>
+            </w:r>
+          </w:p>
+        </w:tc>
+      </w:tr>
+    </w:tbl>
+    <w:p>
+      <w:pPr>
+        <w:rPr>
+          <w:rFonts w:ascii="Calibri" w:hAnsi="Calibri" w:cs="Calibri"/>
+          <w:lang w:val="en-US" w:eastAsia="en-US"/>
+        </w:rPr>
+      </w:pPr>
+    </w:p>
+    <w:p>
+      <w:pPr>
+        <w:pStyle w:val="Heading3"/>
+        <w:rPr>
+          <w:rFonts w:ascii="Calibri" w:hAnsi="Calibri" w:cs="Calibri"/>
+        </w:rPr>
+      </w:pPr>
+      <w:r>
+        <w:rPr>
+          <w:rFonts w:ascii="Calibri" w:hAnsi="Calibri" w:cs="Calibri"/>
+        </w:rPr>
+        <w:t>C. Specification (UML)</w:t>
+      </w:r>
+    </w:p>
+    <w:p>
+      <w:pPr>
+        <w:rPr>
+          <w:rFonts w:ascii="Calibri" w:hAnsi="Calibri" w:cs="Calibri"/>
+          <w:lang w:eastAsia="en-US"/>
+        </w:rPr>
+      </w:pPr>
+      <w:r>
+        <w:rPr>
+          <w:rFonts w:ascii="Calibri" w:hAnsi="Calibri" w:cs="Calibri"/>
+          <w:lang w:eastAsia="en-US"/>
+        </w:rPr>
+        <w:t xml:space="preserve">This Use Case diagram specifies the system boundaries for the "CarePoint HMS." It identifies the </w:t>
+      </w:r>
+      <w:r>
+        <w:rPr>
+          <w:rFonts w:ascii="Calibri" w:hAnsi="Calibri" w:cs="Calibri"/>
+          <w:b/>
+          <w:bCs/>
+          <w:lang w:eastAsia="en-US"/>
+        </w:rPr>
+        <w:t>Patient</w:t>
+      </w:r>
+      <w:r>
+        <w:rPr>
+          <w:rFonts w:ascii="Calibri" w:hAnsi="Calibri" w:cs="Calibri"/>
+          <w:lang w:eastAsia="en-US"/>
+        </w:rPr>
+        <w:t xml:space="preserve"> and </w:t>
+      </w:r>
+      <w:r>
+        <w:rPr>
+          <w:rFonts w:ascii="Calibri" w:hAnsi="Calibri" w:cs="Calibri"/>
+          <w:b/>
+          <w:bCs/>
+          <w:lang w:eastAsia="en-US"/>
+        </w:rPr>
+        <w:t>Doctor</w:t>
+      </w:r>
+      <w:r>
+        <w:rPr>
+          <w:rFonts w:ascii="Calibri" w:hAnsi="Calibri" w:cs="Calibri"/>
+          <w:lang w:eastAsia="en-US"/>
+        </w:rPr>
+        <w:t xml:space="preserve"> as primary actors. The core use cases (Login, Book Appointment, View Records) are mapped to these actors to define the functional scope before implementation begins.</w:t>
+      </w:r>
+    </w:p>
+    <w:p>
+      <w:pPr>
+        <w:rPr>
+          <w:rFonts w:ascii="Calibri" w:hAnsi="Calibri" w:cs="Calibri"/>
+          <w:lang w:eastAsia="en-US"/>
+        </w:rPr>
+      </w:pPr>
+      <w:r>
+        <w:rPr>
+          <w:rFonts w:ascii="Calibri" w:hAnsi="Calibri" w:cs="Calibri"/>
+          <w:lang w:eastAsia="en-US"/>
+        </w:rPr>
+        <w:t>Add Draw.io diagram here.</w:t>
+      </w:r>
+    </w:p>
+    <w:p>
+      <w:pPr>
+        <w:rPr>
+          <w:rFonts w:ascii="Calibri" w:hAnsi="Calibri" w:cs="Calibri"/>
+          <w:lang w:eastAsia="en-US"/>
         </w:rPr>
       </w:pPr>
     </w:p>
@@ -1148,6 +1724,7 @@
           <w:b/>
           <w:bCs/>
         </w:rPr>
+        <w:lastRenderedPageBreak/>
         <w:t>Developer (Me):</w:t>
       </w:r>
       <w:r>
@@ -1174,7 +1751,6 @@
         <w:rPr>
           <w:rFonts w:ascii="Calibri" w:hAnsi="Calibri" w:cs="Calibri"/>
         </w:rPr>
-        <w:lastRenderedPageBreak/>
         <w:t>Conversation 2:</w:t>
       </w:r>
     </w:p>
@@ -1360,13 +1936,16 @@
     </w:p>
     <w:p>
       <w:pPr>
-        <w:rPr>
-          <w:rFonts w:ascii="Calibri" w:hAnsi="Calibri" w:cs="Calibri"/>
-        </w:rPr>
-      </w:pPr>
-      <w:r>
-        <w:rPr>
-          <w:rFonts w:ascii="Calibri" w:hAnsi="Calibri" w:cs="Calibri"/>
+        <w:ind w:left="104" w:firstLine="0"/>
+        <w:rPr>
+          <w:rFonts w:ascii="Calibri" w:hAnsi="Calibri" w:cs="Calibri"/>
+          <w:lang w:val="en-US"/>
+        </w:rPr>
+      </w:pPr>
+      <w:r>
+        <w:rPr>
+          <w:rFonts w:ascii="Calibri" w:hAnsi="Calibri" w:cs="Calibri"/>
+          <w:lang w:val="en-US"/>
         </w:rPr>
         <w:t xml:space="preserve">Sprint 1 focused on the </w:t>
       </w:r>
@@ -1375,55 +1954,164 @@
           <w:rFonts w:ascii="Calibri" w:hAnsi="Calibri" w:cs="Calibri"/>
           <w:b/>
           <w:bCs/>
+          <w:lang w:val="en-US"/>
         </w:rPr>
         <w:t>Discovery and Design</w:t>
       </w:r>
       <w:r>
         <w:rPr>
           <w:rFonts w:ascii="Calibri" w:hAnsi="Calibri" w:cs="Calibri"/>
-        </w:rPr>
-        <w:t xml:space="preserve"> phase. As a solo developer, I prioritized requirement engineering and architectural planning to ensure the 'Patient-Centric' goal is achievable. </w:t>
-      </w:r>
-    </w:p>
-    <w:p>
-      <w:pPr>
-        <w:rPr>
-          <w:rFonts w:ascii="Calibri" w:hAnsi="Calibri" w:cs="Calibri"/>
-        </w:rPr>
-      </w:pPr>
-      <w:r>
-        <w:rPr>
-          <w:rFonts w:ascii="Calibri" w:hAnsi="Calibri" w:cs="Calibri"/>
-        </w:rPr>
-        <w:t xml:space="preserve">We selected </w:t>
-      </w:r>
-      <w:r>
+          <w:lang w:val="en-US"/>
+        </w:rPr>
+        <w:t xml:space="preserve"> phase of the project. As a solo developer, I prioritized </w:t>
+      </w:r>
+      <w:r>
+        <w:rPr>
+          <w:rFonts w:ascii="Calibri" w:hAnsi="Calibri" w:cs="Calibri"/>
+          <w:lang w:val="en-US"/>
+        </w:rPr>
+        <w:t>engineering and architectural planning requirements</w:t>
+      </w:r>
+      <w:r>
+        <w:rPr>
+          <w:rFonts w:ascii="Calibri" w:hAnsi="Calibri" w:cs="Calibri"/>
+          <w:lang w:val="en-US"/>
+        </w:rPr>
+        <w:t xml:space="preserve"> to ensure the "Patient-Centric" goal is technically feasible and secure.</w:t>
+      </w:r>
+    </w:p>
+    <w:p>
+      <w:pPr>
         <w:rPr>
           <w:rFonts w:ascii="Calibri" w:hAnsi="Calibri" w:cs="Calibri"/>
           <w:b/>
           <w:bCs/>
-        </w:rPr>
-        <w:t>Story 01 (Auth)</w:t>
-      </w:r>
-      <w:r>
-        <w:rPr>
-          <w:rFonts w:ascii="Calibri" w:hAnsi="Calibri" w:cs="Calibri"/>
-        </w:rPr>
-        <w:t xml:space="preserve"> and </w:t>
-      </w:r>
-      <w:r>
+          <w:lang w:val="en-US"/>
+        </w:rPr>
+      </w:pPr>
+    </w:p>
+    <w:p>
+      <w:pPr>
         <w:rPr>
           <w:rFonts w:ascii="Calibri" w:hAnsi="Calibri" w:cs="Calibri"/>
           <w:b/>
           <w:bCs/>
-        </w:rPr>
-        <w:t>Story 02 (Calendar)</w:t>
-      </w:r>
-      <w:r>
-        <w:rPr>
-          <w:rFonts w:ascii="Calibri" w:hAnsi="Calibri" w:cs="Calibri"/>
-        </w:rPr>
-        <w:t xml:space="preserve"> for the initial backlog because secure access and availability are the foundational pillars of the hospital system.</w:t>
+          <w:lang w:val="en-US"/>
+        </w:rPr>
+      </w:pPr>
+      <w:r>
+        <w:rPr>
+          <w:rFonts w:ascii="Calibri" w:hAnsi="Calibri" w:cs="Calibri"/>
+          <w:b/>
+          <w:bCs/>
+          <w:lang w:val="en-US"/>
+        </w:rPr>
+        <w:t>Estimation Justification</w:t>
+      </w:r>
+    </w:p>
+    <w:p>
+      <w:pPr>
+        <w:rPr>
+          <w:rFonts w:ascii="Calibri" w:hAnsi="Calibri" w:cs="Calibri"/>
+          <w:lang w:val="en-US"/>
+        </w:rPr>
+      </w:pPr>
+      <w:r>
+        <w:rPr>
+          <w:rFonts w:ascii="Calibri" w:hAnsi="Calibri" w:cs="Calibri"/>
+          <w:lang w:val="en-US"/>
+        </w:rPr>
+        <w:t xml:space="preserve">The story points were derived using the </w:t>
+      </w:r>
+      <w:r>
+        <w:rPr>
+          <w:rFonts w:ascii="Calibri" w:hAnsi="Calibri" w:cs="Calibri"/>
+          <w:b/>
+          <w:bCs/>
+          <w:lang w:val="en-US"/>
+        </w:rPr>
+        <w:t>Fibonacci sequence</w:t>
+      </w:r>
+      <w:r>
+        <w:rPr>
+          <w:rFonts w:ascii="Calibri" w:hAnsi="Calibri" w:cs="Calibri"/>
+          <w:lang w:val="en-US"/>
+        </w:rPr>
+        <w:t xml:space="preserve"> (1, 2, 3, 5, 8). This methodology was chosen to reflect </w:t>
+      </w:r>
+      <w:r>
+        <w:rPr>
+          <w:rFonts w:ascii="Calibri" w:hAnsi="Calibri" w:cs="Calibri"/>
+          <w:b/>
+          <w:bCs/>
+          <w:lang w:val="en-US"/>
+        </w:rPr>
+        <w:t>technical complexity</w:t>
+      </w:r>
+      <w:r>
+        <w:rPr>
+          <w:rFonts w:ascii="Calibri" w:hAnsi="Calibri" w:cs="Calibri"/>
+          <w:lang w:val="en-US"/>
+        </w:rPr>
+        <w:t xml:space="preserve"> and uncertainty rather than just time. For example, Story 03 was assigned an '8' because it requires complex data validation and real-time state management in SvelteKit.</w:t>
+      </w:r>
+    </w:p>
+    <w:p>
+      <w:pPr>
+        <w:rPr>
+          <w:rFonts w:ascii="Calibri" w:hAnsi="Calibri" w:cs="Calibri"/>
+          <w:lang w:val="en-US"/>
+        </w:rPr>
+      </w:pPr>
+    </w:p>
+    <w:p>
+      <w:pPr>
+        <w:rPr>
+          <w:rFonts w:ascii="Calibri" w:hAnsi="Calibri" w:cs="Calibri"/>
+          <w:b/>
+          <w:bCs/>
+          <w:lang w:val="en-US"/>
+        </w:rPr>
+      </w:pPr>
+      <w:r>
+        <w:rPr>
+          <w:rFonts w:ascii="Calibri" w:hAnsi="Calibri" w:cs="Calibri"/>
+          <w:b/>
+          <w:bCs/>
+          <w:lang w:val="en-US"/>
+        </w:rPr>
+        <w:t>Prioritization Logic</w:t>
+      </w:r>
+    </w:p>
+    <w:p>
+      <w:pPr>
+        <w:rPr>
+          <w:rFonts w:ascii="Calibri" w:hAnsi="Calibri" w:cs="Calibri"/>
+          <w:lang w:val="en-US"/>
+        </w:rPr>
+      </w:pPr>
+      <w:r>
+        <w:rPr>
+          <w:rFonts w:ascii="Calibri" w:hAnsi="Calibri" w:cs="Calibri"/>
+          <w:lang w:val="en-US"/>
+        </w:rPr>
+        <w:t xml:space="preserve">The items in the current Sprint Backlog were prioritized based on their </w:t>
+      </w:r>
+      <w:r>
+        <w:rPr>
+          <w:rFonts w:ascii="Calibri" w:hAnsi="Calibri" w:cs="Calibri"/>
+          <w:b/>
+          <w:bCs/>
+          <w:lang w:val="en-US"/>
+        </w:rPr>
+        <w:t>foundational value</w:t>
+      </w:r>
+      <w:r>
+        <w:rPr>
+          <w:rFonts w:ascii="Calibri" w:hAnsi="Calibri" w:cs="Calibri"/>
+          <w:lang w:val="en-US"/>
+        </w:rPr>
+        <w:t>. Story 01 (Authentication) was selected as the first priority to establish a secure "Patient-Centric" environment. Story 02 (Real-time Calendar) was selected because it addresses the core user frustration—visibility of availability—which is a primary requirement of the project brief.</w:t>
       </w:r>
     </w:p>
     <w:p>
@@ -1499,16 +2187,8 @@
               <w:rPr>
                 <w:rFonts w:ascii="Calibri" w:hAnsi="Calibri" w:cs="Calibri"/>
               </w:rPr>
-              <w:t xml:space="preserve"> </w:t>
-            </w:r>
-            <w:proofErr w:type="gramStart"/>
-            <w:r>
-              <w:rPr>
-                <w:rFonts w:ascii="Calibri" w:hAnsi="Calibri" w:cs="Calibri"/>
-              </w:rPr>
-              <w:t>/  Task</w:t>
-            </w:r>
-            <w:proofErr w:type="gramEnd"/>
+              <w:t xml:space="preserve"> /  Task</w:t>
+            </w:r>
           </w:p>
         </w:tc>
         <w:tc>
@@ -1551,6 +2231,7 @@
               <w:rPr>
                 <w:rFonts w:ascii="Calibri" w:hAnsi="Calibri" w:cs="Calibri"/>
               </w:rPr>
+              <w:lastRenderedPageBreak/>
               <w:t>1</w:t>
             </w:r>
           </w:p>
@@ -1579,7 +2260,13 @@
               <w:rPr>
                 <w:rFonts w:ascii="Calibri" w:hAnsi="Calibri" w:cs="Calibri"/>
               </w:rPr>
-              <w:t xml:space="preserve"> Finalize Product Backlog and sizing.</w:t>
+              <w:t xml:space="preserve"> </w:t>
+            </w:r>
+            <w:r>
+              <w:rPr>
+                <w:rFonts w:ascii="Calibri" w:hAnsi="Calibri" w:cs="Calibri"/>
+              </w:rPr>
+              <w:t>Finalize Product Backlog and sizing using Fibonacci.</w:t>
             </w:r>
           </w:p>
         </w:tc>
@@ -1792,21 +2479,7 @@
               <w:rPr>
                 <w:rFonts w:ascii="Calibri" w:hAnsi="Calibri" w:cs="Calibri"/>
               </w:rPr>
-              <w:t xml:space="preserve"> Initialize </w:t>
-            </w:r>
-            <w:proofErr w:type="spellStart"/>
-            <w:r>
-              <w:rPr>
-                <w:rFonts w:ascii="Calibri" w:hAnsi="Calibri" w:cs="Calibri"/>
-              </w:rPr>
-              <w:t>SvelteKit</w:t>
-            </w:r>
-            <w:proofErr w:type="spellEnd"/>
-            <w:r>
-              <w:rPr>
-                <w:rFonts w:ascii="Calibri" w:hAnsi="Calibri" w:cs="Calibri"/>
-              </w:rPr>
-              <w:t xml:space="preserve"> repository and GitHub environment.</w:t>
+              <w:t xml:space="preserve"> Initialize SvelteKit repository and GitHub environment.</w:t>
             </w:r>
           </w:p>
         </w:tc>
@@ -1878,6 +2551,241 @@
 <file path=word/numbering.xml><?xml version="1.0" encoding="utf-8"?>
 <w:numbering xmlns:wpc="http://schemas.microsoft.com/office/word/2010/wordprocessingCanvas" xmlns:cx="http://schemas.microsoft.com/office/drawing/2014/chartex" xmlns:cx1="http://schemas.microsoft.com/office/drawing/2015/9/8/chartex" xmlns:cx2="http://schemas.microsoft.com/office/drawing/2015/10/21/chartex" xmlns:cx3="http://schemas.microsoft.com/office/drawing/2016/5/9/chartex" xmlns:cx4="http://schemas.microsoft.com/office/drawing/2016/5/10/chartex" xmlns:cx5="http://schemas.microsoft.com/office/drawing/2016/5/11/chartex" xmlns:cx6="http://schemas.microsoft.com/office/drawing/2016/5/12/chartex" xmlns:cx7="http://schemas.microsoft.com/office/drawing/2016/5/13/chartex" xmlns:cx8="http://schemas.microsoft.com/office/drawing/2016/5/14/chartex" xmlns:mc="http://schemas.openxmlformats.org/markup-compatibility/2006" xmlns:aink="http://schemas.microsoft.com/office/drawing/2016/ink" xmlns:am3d="http://schemas.microsoft.com/office/drawing/2017/model3d" xmlns:o="urn:schemas-microsoft-com:office:office" xmlns:oel="http://schemas.microsoft.com/office/2019/extlst" xmlns:r="http://schemas.openxmlformats.org/officeDocument/2006/relationships" xmlns:m="http://schemas.openxmlformats.org/officeDocument/2006/math" xmlns:v="urn:schemas-microsoft-com:vml" xmlns:wp14="http://schemas.microsoft.com/office/word/2010/wordprocessingDrawing" xmlns:wp="http://schemas.openxmlformats.org/drawingml/2006/wordprocessingDrawing" xmlns:w10="urn:schemas-microsoft-com:office:word" xmlns:w="http://schemas.openxmlformats.org/wordprocessingml/2006/main" xmlns:w14="http://schemas.microsoft.com/office/word/2010/wordml" xmlns:w15="http://schemas.microsoft.com/office/word/2012/wordml" xmlns:w16cex="http://schemas.microsoft.com/office/word/2018/wordml/cex" xmlns:w16cid="http://schemas.microsoft.com/office/word/2016/wordml/cid" xmlns:w16="http://schemas.microsoft.com/office/word/2018/wordml" xmlns:w16du="http://schemas.microsoft.com/office/word/2023/wordml/word16du" xmlns:w16sdtdh="http://schemas.microsoft.com/office/word/2020/wordml/sdtdatahash" xmlns:w16sdtfl="http://schemas.microsoft.com/office/word/2024/wordml/sdtformatlock" xmlns:w16se="http://schemas.microsoft.com/office/word/2015/wordml/symex" xmlns:wpg="http://schemas.microsoft.com/office/word/2010/wordprocessingGroup" xmlns:wpi="http://schemas.microsoft.com/office/word/2010/wordprocessingInk" xmlns:wne="http://schemas.microsoft.com/office/word/2006/wordml" xmlns:wps="http://schemas.microsoft.com/office/word/2010/wordprocessingShape" mc:Ignorable="w14 w15 w16se w16cid w16 w16cex w16sdtdh w16sdtfl w16du wp14">
   <w:abstractNum w:abstractNumId="0" w15:restartNumberingAfterBreak="0">
+    <w:nsid w:val="05BE7797"/>
+    <w:multiLevelType w:val="multilevel"/>
+    <w:tmpl w:val="62F60E1C"/>
+    <w:lvl w:ilvl="0">
+      <w:start w:val="1"/>
+      <w:numFmt w:val="bullet"/>
+      <w:lvlText w:val=""/>
+      <w:lvlJc w:val="left"/>
+      <w:pPr>
+        <w:tabs>
+          <w:tab w:val="num" w:pos="720"/>
+        </w:tabs>
+        <w:ind w:left="720" w:hanging="360"/>
+      </w:pPr>
+      <w:rPr>
+        <w:rFonts w:ascii="Symbol" w:hAnsi="Symbol" w:hint="default"/>
+        <w:sz w:val="20"/>
+      </w:rPr>
+    </w:lvl>
+    <w:lvl w:ilvl="1" w:tentative="1">
+      <w:start w:val="1"/>
+      <w:numFmt w:val="bullet"/>
+      <w:lvlText w:val="o"/>
+      <w:lvlJc w:val="left"/>
+      <w:pPr>
+        <w:tabs>
+          <w:tab w:val="num" w:pos="1440"/>
+        </w:tabs>
+        <w:ind w:left="1440" w:hanging="360"/>
+      </w:pPr>
+      <w:rPr>
+        <w:rFonts w:ascii="Courier New" w:hAnsi="Courier New" w:hint="default"/>
+        <w:sz w:val="20"/>
+      </w:rPr>
+    </w:lvl>
+    <w:lvl w:ilvl="2" w:tentative="1">
+      <w:start w:val="1"/>
+      <w:numFmt w:val="bullet"/>
+      <w:lvlText w:val=""/>
+      <w:lvlJc w:val="left"/>
+      <w:pPr>
+        <w:tabs>
+          <w:tab w:val="num" w:pos="2160"/>
+        </w:tabs>
+        <w:ind w:left="2160" w:hanging="360"/>
+      </w:pPr>
+      <w:rPr>
+        <w:rFonts w:ascii="Wingdings" w:hAnsi="Wingdings" w:hint="default"/>
+        <w:sz w:val="20"/>
+      </w:rPr>
+    </w:lvl>
+    <w:lvl w:ilvl="3" w:tentative="1">
+      <w:start w:val="1"/>
+      <w:numFmt w:val="bullet"/>
+      <w:lvlText w:val=""/>
+      <w:lvlJc w:val="left"/>
+      <w:pPr>
+        <w:tabs>
+          <w:tab w:val="num" w:pos="2880"/>
+        </w:tabs>
+        <w:ind w:left="2880" w:hanging="360"/>
+      </w:pPr>
+      <w:rPr>
+        <w:rFonts w:ascii="Wingdings" w:hAnsi="Wingdings" w:hint="default"/>
+        <w:sz w:val="20"/>
+      </w:rPr>
+    </w:lvl>
+    <w:lvl w:ilvl="4" w:tentative="1">
+      <w:start w:val="1"/>
+      <w:numFmt w:val="bullet"/>
+      <w:lvlText w:val=""/>
+      <w:lvlJc w:val="left"/>
+      <w:pPr>
+        <w:tabs>
+          <w:tab w:val="num" w:pos="3600"/>
+        </w:tabs>
+        <w:ind w:left="3600" w:hanging="360"/>
+      </w:pPr>
+      <w:rPr>
+        <w:rFonts w:ascii="Wingdings" w:hAnsi="Wingdings" w:hint="default"/>
+        <w:sz w:val="20"/>
+      </w:rPr>
+    </w:lvl>
+    <w:lvl w:ilvl="5" w:tentative="1">
+      <w:start w:val="1"/>
+      <w:numFmt w:val="bullet"/>
+      <w:lvlText w:val=""/>
+      <w:lvlJc w:val="left"/>
+      <w:pPr>
+        <w:tabs>
+          <w:tab w:val="num" w:pos="4320"/>
+        </w:tabs>
+        <w:ind w:left="4320" w:hanging="360"/>
+      </w:pPr>
+      <w:rPr>
+        <w:rFonts w:ascii="Wingdings" w:hAnsi="Wingdings" w:hint="default"/>
+        <w:sz w:val="20"/>
+      </w:rPr>
+    </w:lvl>
+    <w:lvl w:ilvl="6" w:tentative="1">
+      <w:start w:val="1"/>
+      <w:numFmt w:val="bullet"/>
+      <w:lvlText w:val=""/>
+      <w:lvlJc w:val="left"/>
+      <w:pPr>
+        <w:tabs>
+          <w:tab w:val="num" w:pos="5040"/>
+        </w:tabs>
+        <w:ind w:left="5040" w:hanging="360"/>
+      </w:pPr>
+      <w:rPr>
+        <w:rFonts w:ascii="Wingdings" w:hAnsi="Wingdings" w:hint="default"/>
+        <w:sz w:val="20"/>
+      </w:rPr>
+    </w:lvl>
+    <w:lvl w:ilvl="7" w:tentative="1">
+      <w:start w:val="1"/>
+      <w:numFmt w:val="bullet"/>
+      <w:lvlText w:val=""/>
+      <w:lvlJc w:val="left"/>
+      <w:pPr>
+        <w:tabs>
+          <w:tab w:val="num" w:pos="5760"/>
+        </w:tabs>
+        <w:ind w:left="5760" w:hanging="360"/>
+      </w:pPr>
+      <w:rPr>
+        <w:rFonts w:ascii="Wingdings" w:hAnsi="Wingdings" w:hint="default"/>
+        <w:sz w:val="20"/>
+      </w:rPr>
+    </w:lvl>
+    <w:lvl w:ilvl="8" w:tentative="1">
+      <w:start w:val="1"/>
+      <w:numFmt w:val="bullet"/>
+      <w:lvlText w:val=""/>
+      <w:lvlJc w:val="left"/>
+      <w:pPr>
+        <w:tabs>
+          <w:tab w:val="num" w:pos="6480"/>
+        </w:tabs>
+        <w:ind w:left="6480" w:hanging="360"/>
+      </w:pPr>
+      <w:rPr>
+        <w:rFonts w:ascii="Wingdings" w:hAnsi="Wingdings" w:hint="default"/>
+        <w:sz w:val="20"/>
+      </w:rPr>
+    </w:lvl>
+  </w:abstractNum>
+  <w:abstractNum w:abstractNumId="1" w15:restartNumberingAfterBreak="0">
+    <w:nsid w:val="128B15F8"/>
+    <w:multiLevelType w:val="hybridMultilevel"/>
+    <w:tmpl w:val="1DD60F18"/>
+    <w:lvl w:ilvl="0" w:tplc="0409000F">
+      <w:start w:val="1"/>
+      <w:numFmt w:val="decimal"/>
+      <w:lvlText w:val="%1."/>
+      <w:lvlJc w:val="left"/>
+      <w:pPr>
+        <w:ind w:left="824" w:hanging="360"/>
+      </w:pPr>
+    </w:lvl>
+    <w:lvl w:ilvl="1" w:tplc="04090019" w:tentative="1">
+      <w:start w:val="1"/>
+      <w:numFmt w:val="lowerLetter"/>
+      <w:lvlText w:val="%2."/>
+      <w:lvlJc w:val="left"/>
+      <w:pPr>
+        <w:ind w:left="1544" w:hanging="360"/>
+      </w:pPr>
+    </w:lvl>
+    <w:lvl w:ilvl="2" w:tplc="0409001B" w:tentative="1">
+      <w:start w:val="1"/>
+      <w:numFmt w:val="lowerRoman"/>
+      <w:lvlText w:val="%3."/>
+      <w:lvlJc w:val="right"/>
+      <w:pPr>
+        <w:ind w:left="2264" w:hanging="180"/>
+      </w:pPr>
+    </w:lvl>
+    <w:lvl w:ilvl="3" w:tplc="0409000F" w:tentative="1">
+      <w:start w:val="1"/>
+      <w:numFmt w:val="decimal"/>
+      <w:lvlText w:val="%4."/>
+      <w:lvlJc w:val="left"/>
+      <w:pPr>
+        <w:ind w:left="2984" w:hanging="360"/>
+      </w:pPr>
+    </w:lvl>
+    <w:lvl w:ilvl="4" w:tplc="04090019" w:tentative="1">
+      <w:start w:val="1"/>
+      <w:numFmt w:val="lowerLetter"/>
+      <w:lvlText w:val="%5."/>
+      <w:lvlJc w:val="left"/>
+      <w:pPr>
+        <w:ind w:left="3704" w:hanging="360"/>
+      </w:pPr>
+    </w:lvl>
+    <w:lvl w:ilvl="5" w:tplc="0409001B" w:tentative="1">
+      <w:start w:val="1"/>
+      <w:numFmt w:val="lowerRoman"/>
+      <w:lvlText w:val="%6."/>
+      <w:lvlJc w:val="right"/>
+      <w:pPr>
+        <w:ind w:left="4424" w:hanging="180"/>
+      </w:pPr>
+    </w:lvl>
+    <w:lvl w:ilvl="6" w:tplc="0409000F" w:tentative="1">
+      <w:start w:val="1"/>
+      <w:numFmt w:val="decimal"/>
+      <w:lvlText w:val="%7."/>
+      <w:lvlJc w:val="left"/>
+      <w:pPr>
+        <w:ind w:left="5144" w:hanging="360"/>
+      </w:pPr>
+    </w:lvl>
+    <w:lvl w:ilvl="7" w:tplc="04090019" w:tentative="1">
+      <w:start w:val="1"/>
+      <w:numFmt w:val="lowerLetter"/>
+      <w:lvlText w:val="%8."/>
+      <w:lvlJc w:val="left"/>
+      <w:pPr>
+        <w:ind w:left="5864" w:hanging="360"/>
+      </w:pPr>
+    </w:lvl>
+    <w:lvl w:ilvl="8" w:tplc="0409001B" w:tentative="1">
+      <w:start w:val="1"/>
+      <w:numFmt w:val="lowerRoman"/>
+      <w:lvlText w:val="%9."/>
+      <w:lvlJc w:val="right"/>
+      <w:pPr>
+        <w:ind w:left="6584" w:hanging="180"/>
+      </w:pPr>
+    </w:lvl>
+  </w:abstractNum>
+  <w:abstractNum w:abstractNumId="2" w15:restartNumberingAfterBreak="0">
     <w:nsid w:val="283373EB"/>
     <w:multiLevelType w:val="hybridMultilevel"/>
     <w:tmpl w:val="D834C6F8"/>
@@ -1967,7 +2875,93 @@
       </w:pPr>
     </w:lvl>
   </w:abstractNum>
-  <w:abstractNum w:abstractNumId="1" w15:restartNumberingAfterBreak="0">
+  <w:abstractNum w:abstractNumId="3" w15:restartNumberingAfterBreak="0">
+    <w:nsid w:val="321D3A3A"/>
+    <w:multiLevelType w:val="hybridMultilevel"/>
+    <w:tmpl w:val="E2DA8AE0"/>
+    <w:lvl w:ilvl="0" w:tplc="0409000F">
+      <w:start w:val="1"/>
+      <w:numFmt w:val="decimal"/>
+      <w:lvlText w:val="%1."/>
+      <w:lvlJc w:val="left"/>
+      <w:pPr>
+        <w:ind w:left="824" w:hanging="360"/>
+      </w:pPr>
+    </w:lvl>
+    <w:lvl w:ilvl="1" w:tplc="04090019" w:tentative="1">
+      <w:start w:val="1"/>
+      <w:numFmt w:val="lowerLetter"/>
+      <w:lvlText w:val="%2."/>
+      <w:lvlJc w:val="left"/>
+      <w:pPr>
+        <w:ind w:left="1544" w:hanging="360"/>
+      </w:pPr>
+    </w:lvl>
+    <w:lvl w:ilvl="2" w:tplc="0409001B" w:tentative="1">
+      <w:start w:val="1"/>
+      <w:numFmt w:val="lowerRoman"/>
+      <w:lvlText w:val="%3."/>
+      <w:lvlJc w:val="right"/>
+      <w:pPr>
+        <w:ind w:left="2264" w:hanging="180"/>
+      </w:pPr>
+    </w:lvl>
+    <w:lvl w:ilvl="3" w:tplc="0409000F" w:tentative="1">
+      <w:start w:val="1"/>
+      <w:numFmt w:val="decimal"/>
+      <w:lvlText w:val="%4."/>
+      <w:lvlJc w:val="left"/>
+      <w:pPr>
+        <w:ind w:left="2984" w:hanging="360"/>
+      </w:pPr>
+    </w:lvl>
+    <w:lvl w:ilvl="4" w:tplc="04090019" w:tentative="1">
+      <w:start w:val="1"/>
+      <w:numFmt w:val="lowerLetter"/>
+      <w:lvlText w:val="%5."/>
+      <w:lvlJc w:val="left"/>
+      <w:pPr>
+        <w:ind w:left="3704" w:hanging="360"/>
+      </w:pPr>
+    </w:lvl>
+    <w:lvl w:ilvl="5" w:tplc="0409001B" w:tentative="1">
+      <w:start w:val="1"/>
+      <w:numFmt w:val="lowerRoman"/>
+      <w:lvlText w:val="%6."/>
+      <w:lvlJc w:val="right"/>
+      <w:pPr>
+        <w:ind w:left="4424" w:hanging="180"/>
+      </w:pPr>
+    </w:lvl>
+    <w:lvl w:ilvl="6" w:tplc="0409000F" w:tentative="1">
+      <w:start w:val="1"/>
+      <w:numFmt w:val="decimal"/>
+      <w:lvlText w:val="%7."/>
+      <w:lvlJc w:val="left"/>
+      <w:pPr>
+        <w:ind w:left="5144" w:hanging="360"/>
+      </w:pPr>
+    </w:lvl>
+    <w:lvl w:ilvl="7" w:tplc="04090019" w:tentative="1">
+      <w:start w:val="1"/>
+      <w:numFmt w:val="lowerLetter"/>
+      <w:lvlText w:val="%8."/>
+      <w:lvlJc w:val="left"/>
+      <w:pPr>
+        <w:ind w:left="5864" w:hanging="360"/>
+      </w:pPr>
+    </w:lvl>
+    <w:lvl w:ilvl="8" w:tplc="0409001B" w:tentative="1">
+      <w:start w:val="1"/>
+      <w:numFmt w:val="lowerRoman"/>
+      <w:lvlText w:val="%9."/>
+      <w:lvlJc w:val="right"/>
+      <w:pPr>
+        <w:ind w:left="6584" w:hanging="180"/>
+      </w:pPr>
+    </w:lvl>
+  </w:abstractNum>
+  <w:abstractNum w:abstractNumId="4" w15:restartNumberingAfterBreak="0">
     <w:nsid w:val="5CC81DD8"/>
     <w:multiLevelType w:val="hybridMultilevel"/>
     <w:tmpl w:val="035C2C6E"/>
@@ -2057,7 +3051,7 @@
       </w:pPr>
     </w:lvl>
   </w:abstractNum>
-  <w:abstractNum w:abstractNumId="2" w15:restartNumberingAfterBreak="0">
+  <w:abstractNum w:abstractNumId="5" w15:restartNumberingAfterBreak="0">
     <w:nsid w:val="5D3B65D9"/>
     <w:multiLevelType w:val="multilevel"/>
     <w:tmpl w:val="E086F058"/>
@@ -2206,13 +3200,174 @@
       </w:rPr>
     </w:lvl>
   </w:abstractNum>
+  <w:abstractNum w:abstractNumId="6" w15:restartNumberingAfterBreak="0">
+    <w:nsid w:val="5E8A1386"/>
+    <w:multiLevelType w:val="multilevel"/>
+    <w:tmpl w:val="790ACF6A"/>
+    <w:lvl w:ilvl="0">
+      <w:start w:val="1"/>
+      <w:numFmt w:val="bullet"/>
+      <w:lvlText w:val=""/>
+      <w:lvlJc w:val="left"/>
+      <w:pPr>
+        <w:tabs>
+          <w:tab w:val="num" w:pos="720"/>
+        </w:tabs>
+        <w:ind w:left="720" w:hanging="360"/>
+      </w:pPr>
+      <w:rPr>
+        <w:rFonts w:ascii="Symbol" w:hAnsi="Symbol" w:hint="default"/>
+        <w:sz w:val="20"/>
+      </w:rPr>
+    </w:lvl>
+    <w:lvl w:ilvl="1" w:tentative="1">
+      <w:start w:val="1"/>
+      <w:numFmt w:val="bullet"/>
+      <w:lvlText w:val="o"/>
+      <w:lvlJc w:val="left"/>
+      <w:pPr>
+        <w:tabs>
+          <w:tab w:val="num" w:pos="1440"/>
+        </w:tabs>
+        <w:ind w:left="1440" w:hanging="360"/>
+      </w:pPr>
+      <w:rPr>
+        <w:rFonts w:ascii="Courier New" w:hAnsi="Courier New" w:hint="default"/>
+        <w:sz w:val="20"/>
+      </w:rPr>
+    </w:lvl>
+    <w:lvl w:ilvl="2" w:tentative="1">
+      <w:start w:val="1"/>
+      <w:numFmt w:val="bullet"/>
+      <w:lvlText w:val=""/>
+      <w:lvlJc w:val="left"/>
+      <w:pPr>
+        <w:tabs>
+          <w:tab w:val="num" w:pos="2160"/>
+        </w:tabs>
+        <w:ind w:left="2160" w:hanging="360"/>
+      </w:pPr>
+      <w:rPr>
+        <w:rFonts w:ascii="Wingdings" w:hAnsi="Wingdings" w:hint="default"/>
+        <w:sz w:val="20"/>
+      </w:rPr>
+    </w:lvl>
+    <w:lvl w:ilvl="3" w:tentative="1">
+      <w:start w:val="1"/>
+      <w:numFmt w:val="bullet"/>
+      <w:lvlText w:val=""/>
+      <w:lvlJc w:val="left"/>
+      <w:pPr>
+        <w:tabs>
+          <w:tab w:val="num" w:pos="2880"/>
+        </w:tabs>
+        <w:ind w:left="2880" w:hanging="360"/>
+      </w:pPr>
+      <w:rPr>
+        <w:rFonts w:ascii="Wingdings" w:hAnsi="Wingdings" w:hint="default"/>
+        <w:sz w:val="20"/>
+      </w:rPr>
+    </w:lvl>
+    <w:lvl w:ilvl="4" w:tentative="1">
+      <w:start w:val="1"/>
+      <w:numFmt w:val="bullet"/>
+      <w:lvlText w:val=""/>
+      <w:lvlJc w:val="left"/>
+      <w:pPr>
+        <w:tabs>
+          <w:tab w:val="num" w:pos="3600"/>
+        </w:tabs>
+        <w:ind w:left="3600" w:hanging="360"/>
+      </w:pPr>
+      <w:rPr>
+        <w:rFonts w:ascii="Wingdings" w:hAnsi="Wingdings" w:hint="default"/>
+        <w:sz w:val="20"/>
+      </w:rPr>
+    </w:lvl>
+    <w:lvl w:ilvl="5" w:tentative="1">
+      <w:start w:val="1"/>
+      <w:numFmt w:val="bullet"/>
+      <w:lvlText w:val=""/>
+      <w:lvlJc w:val="left"/>
+      <w:pPr>
+        <w:tabs>
+          <w:tab w:val="num" w:pos="4320"/>
+        </w:tabs>
+        <w:ind w:left="4320" w:hanging="360"/>
+      </w:pPr>
+      <w:rPr>
+        <w:rFonts w:ascii="Wingdings" w:hAnsi="Wingdings" w:hint="default"/>
+        <w:sz w:val="20"/>
+      </w:rPr>
+    </w:lvl>
+    <w:lvl w:ilvl="6" w:tentative="1">
+      <w:start w:val="1"/>
+      <w:numFmt w:val="bullet"/>
+      <w:lvlText w:val=""/>
+      <w:lvlJc w:val="left"/>
+      <w:pPr>
+        <w:tabs>
+          <w:tab w:val="num" w:pos="5040"/>
+        </w:tabs>
+        <w:ind w:left="5040" w:hanging="360"/>
+      </w:pPr>
+      <w:rPr>
+        <w:rFonts w:ascii="Wingdings" w:hAnsi="Wingdings" w:hint="default"/>
+        <w:sz w:val="20"/>
+      </w:rPr>
+    </w:lvl>
+    <w:lvl w:ilvl="7" w:tentative="1">
+      <w:start w:val="1"/>
+      <w:numFmt w:val="bullet"/>
+      <w:lvlText w:val=""/>
+      <w:lvlJc w:val="left"/>
+      <w:pPr>
+        <w:tabs>
+          <w:tab w:val="num" w:pos="5760"/>
+        </w:tabs>
+        <w:ind w:left="5760" w:hanging="360"/>
+      </w:pPr>
+      <w:rPr>
+        <w:rFonts w:ascii="Wingdings" w:hAnsi="Wingdings" w:hint="default"/>
+        <w:sz w:val="20"/>
+      </w:rPr>
+    </w:lvl>
+    <w:lvl w:ilvl="8" w:tentative="1">
+      <w:start w:val="1"/>
+      <w:numFmt w:val="bullet"/>
+      <w:lvlText w:val=""/>
+      <w:lvlJc w:val="left"/>
+      <w:pPr>
+        <w:tabs>
+          <w:tab w:val="num" w:pos="6480"/>
+        </w:tabs>
+        <w:ind w:left="6480" w:hanging="360"/>
+      </w:pPr>
+      <w:rPr>
+        <w:rFonts w:ascii="Wingdings" w:hAnsi="Wingdings" w:hint="default"/>
+        <w:sz w:val="20"/>
+      </w:rPr>
+    </w:lvl>
+  </w:abstractNum>
   <w:num w:numId="1" w16cid:durableId="2145349621">
+    <w:abstractNumId w:val="5"/>
+  </w:num>
+  <w:num w:numId="2" w16cid:durableId="419520449">
     <w:abstractNumId w:val="2"/>
   </w:num>
-  <w:num w:numId="2" w16cid:durableId="419520449">
+  <w:num w:numId="3" w16cid:durableId="441152855">
+    <w:abstractNumId w:val="4"/>
+  </w:num>
+  <w:num w:numId="4" w16cid:durableId="1685745848">
+    <w:abstractNumId w:val="6"/>
+  </w:num>
+  <w:num w:numId="5" w16cid:durableId="1229606327">
     <w:abstractNumId w:val="0"/>
   </w:num>
-  <w:num w:numId="3" w16cid:durableId="441152855">
+  <w:num w:numId="6" w16cid:durableId="1352535655">
+    <w:abstractNumId w:val="3"/>
+  </w:num>
+  <w:num w:numId="7" w16cid:durableId="2098599637">
     <w:abstractNumId w:val="1"/>
   </w:num>
 </w:numbering>
@@ -2864,7 +4019,6 @@
   <w:style w:type="character" w:default="1" w:styleId="DefaultParagraphFont">
     <w:name w:val="Default Paragraph Font"/>
     <w:uiPriority w:val="1"/>
-    <w:semiHidden/>
     <w:unhideWhenUsed/>
   </w:style>
   <w:style w:type="table" w:default="1" w:styleId="TableNormal">
@@ -3339,6 +4493,36 @@
       </w:tcPr>
     </w:tblStylePr>
   </w:style>
+  <w:style w:type="table" w:styleId="TableGrid">
+    <w:name w:val="Table Grid"/>
+    <w:basedOn w:val="TableNormal"/>
+    <w:uiPriority w:val="39"/>
+    <w:rsid w:val="00487C22"/>
+    <w:pPr>
+      <w:spacing w:after="0" w:line="240" w:lineRule="auto"/>
+    </w:pPr>
+    <w:tblPr>
+      <w:tblBorders>
+        <w:top w:val="single" w:sz="4" w:space="0" w:color="auto"/>
+        <w:left w:val="single" w:sz="4" w:space="0" w:color="auto"/>
+        <w:bottom w:val="single" w:sz="4" w:space="0" w:color="auto"/>
+        <w:right w:val="single" w:sz="4" w:space="0" w:color="auto"/>
+        <w:insideH w:val="single" w:sz="4" w:space="0" w:color="auto"/>
+        <w:insideV w:val="single" w:sz="4" w:space="0" w:color="auto"/>
+      </w:tblBorders>
+    </w:tblPr>
+  </w:style>
+  <w:style w:type="character" w:styleId="Strong">
+    <w:name w:val="Strong"/>
+    <w:basedOn w:val="DefaultParagraphFont"/>
+    <w:uiPriority w:val="22"/>
+    <w:qFormat/>
+    <w:rsid w:val="00487C22"/>
+    <w:rPr>
+      <w:b/>
+      <w:bCs/>
+    </w:rPr>
+  </w:style>
 </w:styles>
 </file>
 

</xml_diff>

<commit_message>
docs: add ERD diagram and update acceptance criteria for user stories
</commit_message>
<xml_diff>
--- a/docs/Sprint 1.docx
+++ b/docs/Sprint 1.docx
@@ -139,7 +139,23 @@
           <w:rFonts w:ascii="Calibri" w:hAnsi="Calibri" w:cs="Calibri"/>
           <w:lang w:val="en-US" w:eastAsia="en-US"/>
         </w:rPr>
-        <w:t xml:space="preserve"> Responsible for SvelteKit implementation.</w:t>
+        <w:t xml:space="preserve"> Responsible for </w:t>
+      </w:r>
+      <w:proofErr w:type="spellStart"/>
+      <w:r>
+        <w:rPr>
+          <w:rFonts w:ascii="Calibri" w:hAnsi="Calibri" w:cs="Calibri"/>
+          <w:lang w:val="en-US" w:eastAsia="en-US"/>
+        </w:rPr>
+        <w:t>SvelteKit</w:t>
+      </w:r>
+      <w:proofErr w:type="spellEnd"/>
+      <w:r>
+        <w:rPr>
+          <w:rFonts w:ascii="Calibri" w:hAnsi="Calibri" w:cs="Calibri"/>
+          <w:lang w:val="en-US" w:eastAsia="en-US"/>
+        </w:rPr>
+        <w:t xml:space="preserve"> implementation.</w:t>
       </w:r>
     </w:p>
     <w:p>
@@ -438,7 +454,21 @@
               <w:rPr>
                 <w:rFonts w:ascii="Calibri" w:hAnsi="Calibri" w:cs="Calibri"/>
               </w:rPr>
-              <w:t xml:space="preserve"> I want to book an appointment online so I don't have to call the clinic</w:t>
+              <w:t xml:space="preserve"> I want to book an appointment </w:t>
+            </w:r>
+            <w:proofErr w:type="gramStart"/>
+            <w:r>
+              <w:rPr>
+                <w:rFonts w:ascii="Calibri" w:hAnsi="Calibri" w:cs="Calibri"/>
+              </w:rPr>
+              <w:t>online</w:t>
+            </w:r>
+            <w:proofErr w:type="gramEnd"/>
+            <w:r>
+              <w:rPr>
+                <w:rFonts w:ascii="Calibri" w:hAnsi="Calibri" w:cs="Calibri"/>
+              </w:rPr>
+              <w:t xml:space="preserve"> so I don't have to call the clinic</w:t>
             </w:r>
             <w:r>
               <w:rPr>
@@ -659,7 +689,25 @@
                 <w:b/>
                 <w:bCs/>
               </w:rPr>
-              <w:t>As a Patient, I want to receive an appointment confirmation so I know my booking was successful.</w:t>
+              <w:t xml:space="preserve">As a Patient, I want to receive an appointment </w:t>
+            </w:r>
+            <w:proofErr w:type="gramStart"/>
+            <w:r>
+              <w:rPr>
+                <w:rFonts w:ascii="Calibri" w:hAnsi="Calibri" w:cs="Calibri"/>
+                <w:b/>
+                <w:bCs/>
+              </w:rPr>
+              <w:t>confirmation</w:t>
+            </w:r>
+            <w:proofErr w:type="gramEnd"/>
+            <w:r>
+              <w:rPr>
+                <w:rFonts w:ascii="Calibri" w:hAnsi="Calibri" w:cs="Calibri"/>
+                <w:b/>
+                <w:bCs/>
+              </w:rPr>
+              <w:t xml:space="preserve"> so I know my booking was successful.</w:t>
             </w:r>
           </w:p>
         </w:tc>
@@ -729,7 +777,25 @@
                 <w:b/>
                 <w:bCs/>
               </w:rPr>
-              <w:t>As an Admin, I want to register a new patient with their name and DOB so their record is created.</w:t>
+              <w:t xml:space="preserve">As an Admin, I want to register a new patient with their name and </w:t>
+            </w:r>
+            <w:proofErr w:type="gramStart"/>
+            <w:r>
+              <w:rPr>
+                <w:rFonts w:ascii="Calibri" w:hAnsi="Calibri" w:cs="Calibri"/>
+                <w:b/>
+                <w:bCs/>
+              </w:rPr>
+              <w:t>DOB</w:t>
+            </w:r>
+            <w:proofErr w:type="gramEnd"/>
+            <w:r>
+              <w:rPr>
+                <w:rFonts w:ascii="Calibri" w:hAnsi="Calibri" w:cs="Calibri"/>
+                <w:b/>
+                <w:bCs/>
+              </w:rPr>
+              <w:t xml:space="preserve"> so their record is created.</w:t>
             </w:r>
           </w:p>
         </w:tc>
@@ -866,7 +932,25 @@
                 <w:b/>
                 <w:bCs/>
               </w:rPr>
-              <w:t>As a Doctor, I want to update a patient's records so their medical history remains accurate.</w:t>
+              <w:t xml:space="preserve">As a Doctor, I want to update a patient's </w:t>
+            </w:r>
+            <w:proofErr w:type="gramStart"/>
+            <w:r>
+              <w:rPr>
+                <w:rFonts w:ascii="Calibri" w:hAnsi="Calibri" w:cs="Calibri"/>
+                <w:b/>
+                <w:bCs/>
+              </w:rPr>
+              <w:t>records</w:t>
+            </w:r>
+            <w:proofErr w:type="gramEnd"/>
+            <w:r>
+              <w:rPr>
+                <w:rFonts w:ascii="Calibri" w:hAnsi="Calibri" w:cs="Calibri"/>
+                <w:b/>
+                <w:bCs/>
+              </w:rPr>
+              <w:t xml:space="preserve"> so their medical history remains accurate.</w:t>
             </w:r>
           </w:p>
         </w:tc>
@@ -1219,7 +1303,21 @@
         <w:rPr>
           <w:rFonts w:ascii="Calibri" w:hAnsi="Calibri" w:cs="Calibri"/>
         </w:rPr>
-        <w:t xml:space="preserve"> The calendar dashboard must update reactively to ensure users see the most up-to-date information.</w:t>
+        <w:t xml:space="preserve"> </w:t>
+      </w:r>
+      <w:proofErr w:type="gramStart"/>
+      <w:r>
+        <w:rPr>
+          <w:rFonts w:ascii="Calibri" w:hAnsi="Calibri" w:cs="Calibri"/>
+        </w:rPr>
+        <w:t>The calendar</w:t>
+      </w:r>
+      <w:proofErr w:type="gramEnd"/>
+      <w:r>
+        <w:rPr>
+          <w:rFonts w:ascii="Calibri" w:hAnsi="Calibri" w:cs="Calibri"/>
+        </w:rPr>
+        <w:t xml:space="preserve"> dashboard must update reactively to ensure users see the most up-to-date information.</w:t>
       </w:r>
     </w:p>
     <w:p>
@@ -1275,7 +1373,21 @@
         <w:rPr>
           <w:rFonts w:ascii="Calibri" w:hAnsi="Calibri" w:cs="Calibri"/>
         </w:rPr>
-        <w:t>B. MoSCoW Prioritization</w:t>
+        <w:t xml:space="preserve">B. </w:t>
+      </w:r>
+      <w:proofErr w:type="spellStart"/>
+      <w:r>
+        <w:rPr>
+          <w:rFonts w:ascii="Calibri" w:hAnsi="Calibri" w:cs="Calibri"/>
+        </w:rPr>
+        <w:t>MoSCoW</w:t>
+      </w:r>
+      <w:proofErr w:type="spellEnd"/>
+      <w:r>
+        <w:rPr>
+          <w:rFonts w:ascii="Calibri" w:hAnsi="Calibri" w:cs="Calibri"/>
+        </w:rPr>
+        <w:t xml:space="preserve"> Prioritization</w:t>
       </w:r>
     </w:p>
     <w:tbl>
@@ -1864,12 +1976,142 @@
       <w:pPr>
         <w:rPr>
           <w:rFonts w:ascii="Calibri" w:hAnsi="Calibri" w:cs="Calibri"/>
+          <w:lang w:val="en-US" w:eastAsia="en-US"/>
+        </w:rPr>
+      </w:pPr>
+      <w:r>
+        <w:rPr>
+          <w:rFonts w:ascii="Calibri" w:hAnsi="Calibri" w:cs="Calibri"/>
+          <w:b/>
+          <w:bCs/>
+          <w:lang w:val="en-US" w:eastAsia="en-US"/>
+        </w:rPr>
+        <w:t>For Story 01 (Secure Login):</w:t>
+      </w:r>
+    </w:p>
+    <w:p>
+      <w:pPr>
+        <w:numPr>
+          <w:ilvl w:val="0"/>
+          <w:numId w:val="8"/>
+        </w:numPr>
+        <w:rPr>
+          <w:rFonts w:ascii="Calibri" w:hAnsi="Calibri" w:cs="Calibri"/>
+          <w:lang w:val="en-US" w:eastAsia="en-US"/>
+        </w:rPr>
+      </w:pPr>
+      <w:r>
+        <w:rPr>
+          <w:rFonts w:ascii="Calibri" w:hAnsi="Calibri" w:cs="Calibri"/>
+          <w:lang w:val="en-US" w:eastAsia="en-US"/>
+        </w:rPr>
+        <w:t>System must reject unauthorized credentials with a clear error message.</w:t>
+      </w:r>
+    </w:p>
+    <w:p>
+      <w:pPr>
+        <w:numPr>
+          <w:ilvl w:val="0"/>
+          <w:numId w:val="8"/>
+        </w:numPr>
+        <w:rPr>
+          <w:rFonts w:ascii="Calibri" w:hAnsi="Calibri" w:cs="Calibri"/>
+          <w:lang w:val="en-US" w:eastAsia="en-US"/>
+        </w:rPr>
+      </w:pPr>
+      <w:r>
+        <w:rPr>
+          <w:rFonts w:ascii="Calibri" w:hAnsi="Calibri" w:cs="Calibri"/>
+          <w:lang w:val="en-US" w:eastAsia="en-US"/>
+        </w:rPr>
+        <w:t xml:space="preserve">Successful login must </w:t>
+      </w:r>
+      <w:proofErr w:type="gramStart"/>
+      <w:r>
+        <w:rPr>
+          <w:rFonts w:ascii="Calibri" w:hAnsi="Calibri" w:cs="Calibri"/>
+          <w:lang w:val="en-US" w:eastAsia="en-US"/>
+        </w:rPr>
+        <w:t>redirect</w:t>
+      </w:r>
+      <w:proofErr w:type="gramEnd"/>
+      <w:r>
+        <w:rPr>
+          <w:rFonts w:ascii="Calibri" w:hAnsi="Calibri" w:cs="Calibri"/>
+          <w:lang w:val="en-US" w:eastAsia="en-US"/>
+        </w:rPr>
+        <w:t xml:space="preserve"> to the correct role-based dashboard (Patient or Doctor).</w:t>
+      </w:r>
+    </w:p>
+    <w:p>
+      <w:pPr>
+        <w:rPr>
+          <w:rFonts w:ascii="Calibri" w:hAnsi="Calibri" w:cs="Calibri"/>
+          <w:lang w:val="en-US" w:eastAsia="en-US"/>
+        </w:rPr>
+      </w:pPr>
+      <w:r>
+        <w:rPr>
+          <w:rFonts w:ascii="Calibri" w:hAnsi="Calibri" w:cs="Calibri"/>
+          <w:b/>
+          <w:bCs/>
+          <w:lang w:val="en-US" w:eastAsia="en-US"/>
+        </w:rPr>
+        <w:t>For Story 02 (Real-time Calendar):</w:t>
+      </w:r>
+    </w:p>
+    <w:p>
+      <w:pPr>
+        <w:numPr>
+          <w:ilvl w:val="0"/>
+          <w:numId w:val="9"/>
+        </w:numPr>
+        <w:rPr>
+          <w:rFonts w:ascii="Calibri" w:hAnsi="Calibri" w:cs="Calibri"/>
+          <w:lang w:val="en-US" w:eastAsia="en-US"/>
+        </w:rPr>
+      </w:pPr>
+      <w:r>
+        <w:rPr>
+          <w:rFonts w:ascii="Calibri" w:hAnsi="Calibri" w:cs="Calibri"/>
+          <w:lang w:val="en-US" w:eastAsia="en-US"/>
+        </w:rPr>
+        <w:t>The calendar must display only "Future" dates.</w:t>
+      </w:r>
+    </w:p>
+    <w:p>
+      <w:pPr>
+        <w:numPr>
+          <w:ilvl w:val="0"/>
+          <w:numId w:val="9"/>
+        </w:numPr>
+        <w:rPr>
+          <w:rFonts w:ascii="Calibri" w:hAnsi="Calibri" w:cs="Calibri"/>
+          <w:lang w:val="en-US" w:eastAsia="en-US"/>
+        </w:rPr>
+      </w:pPr>
+      <w:r>
+        <w:rPr>
+          <w:rFonts w:ascii="Calibri" w:hAnsi="Calibri" w:cs="Calibri"/>
+          <w:lang w:val="en-US" w:eastAsia="en-US"/>
+        </w:rPr>
+        <w:t>Available slots must be visually distinct from "Booked" slots.</w:t>
+      </w:r>
+    </w:p>
+    <w:p>
+      <w:pPr>
+        <w:rPr>
+          <w:rFonts w:ascii="Calibri" w:hAnsi="Calibri" w:cs="Calibri"/>
+          <w:b/>
+          <w:bCs/>
           <w:lang w:val="en-US"/>
         </w:rPr>
       </w:pPr>
       <w:r>
         <w:rPr>
           <w:rFonts w:ascii="Calibri" w:hAnsi="Calibri" w:cs="Calibri"/>
+          <w:b/>
+          <w:bCs/>
           <w:lang w:val="en-US"/>
         </w:rPr>
         <w:t>For User Story 03 (Booking):</w:t>
@@ -2053,7 +2295,23 @@
           <w:rFonts w:ascii="Calibri" w:hAnsi="Calibri" w:cs="Calibri"/>
           <w:lang w:val="en-US"/>
         </w:rPr>
-        <w:t xml:space="preserve"> and uncertainty rather than just time. For example, Story 03 was assigned an '8' because it requires complex data validation and real-time state management in SvelteKit.</w:t>
+        <w:t xml:space="preserve"> and uncertainty rather than just time. For example, Story 03 was assigned an '8' because it requires complex data validation and real-time state management in </w:t>
+      </w:r>
+      <w:proofErr w:type="spellStart"/>
+      <w:r>
+        <w:rPr>
+          <w:rFonts w:ascii="Calibri" w:hAnsi="Calibri" w:cs="Calibri"/>
+          <w:lang w:val="en-US"/>
+        </w:rPr>
+        <w:t>SvelteKit</w:t>
+      </w:r>
+      <w:proofErr w:type="spellEnd"/>
+      <w:r>
+        <w:rPr>
+          <w:rFonts w:ascii="Calibri" w:hAnsi="Calibri" w:cs="Calibri"/>
+          <w:lang w:val="en-US"/>
+        </w:rPr>
+        <w:t>.</w:t>
       </w:r>
     </w:p>
     <w:p>
@@ -2095,6 +2353,7 @@
           <w:rFonts w:ascii="Calibri" w:hAnsi="Calibri" w:cs="Calibri"/>
           <w:lang w:val="en-US"/>
         </w:rPr>
+        <w:lastRenderedPageBreak/>
         <w:t xml:space="preserve">The items in the current Sprint Backlog were prioritized based on their </w:t>
       </w:r>
       <w:r>
@@ -2111,7 +2370,23 @@
           <w:rFonts w:ascii="Calibri" w:hAnsi="Calibri" w:cs="Calibri"/>
           <w:lang w:val="en-US"/>
         </w:rPr>
-        <w:t>. Story 01 (Authentication) was selected as the first priority to establish a secure "Patient-Centric" environment. Story 02 (Real-time Calendar) was selected because it addresses the core user frustration—visibility of availability—which is a primary requirement of the project brief.</w:t>
+        <w:t xml:space="preserve">. Story 01 (Authentication) was selected as the </w:t>
+      </w:r>
+      <w:proofErr w:type="gramStart"/>
+      <w:r>
+        <w:rPr>
+          <w:rFonts w:ascii="Calibri" w:hAnsi="Calibri" w:cs="Calibri"/>
+          <w:lang w:val="en-US"/>
+        </w:rPr>
+        <w:t>first priority</w:t>
+      </w:r>
+      <w:proofErr w:type="gramEnd"/>
+      <w:r>
+        <w:rPr>
+          <w:rFonts w:ascii="Calibri" w:hAnsi="Calibri" w:cs="Calibri"/>
+          <w:lang w:val="en-US"/>
+        </w:rPr>
+        <w:t xml:space="preserve"> to establish a secure "Patient-Centric" environment. Story 02 (Real-time Calendar) was selected because it addresses the core user frustration—visibility of availability—which is a primary requirement of the project brief.</w:t>
       </w:r>
     </w:p>
     <w:p>
@@ -2187,8 +2462,16 @@
               <w:rPr>
                 <w:rFonts w:ascii="Calibri" w:hAnsi="Calibri" w:cs="Calibri"/>
               </w:rPr>
-              <w:t xml:space="preserve"> /  Task</w:t>
-            </w:r>
+              <w:t xml:space="preserve"> </w:t>
+            </w:r>
+            <w:proofErr w:type="gramStart"/>
+            <w:r>
+              <w:rPr>
+                <w:rFonts w:ascii="Calibri" w:hAnsi="Calibri" w:cs="Calibri"/>
+              </w:rPr>
+              <w:t>/  Task</w:t>
+            </w:r>
+            <w:proofErr w:type="gramEnd"/>
           </w:p>
         </w:tc>
         <w:tc>
@@ -2231,7 +2514,6 @@
               <w:rPr>
                 <w:rFonts w:ascii="Calibri" w:hAnsi="Calibri" w:cs="Calibri"/>
               </w:rPr>
-              <w:lastRenderedPageBreak/>
               <w:t>1</w:t>
             </w:r>
           </w:p>
@@ -2479,7 +2761,21 @@
               <w:rPr>
                 <w:rFonts w:ascii="Calibri" w:hAnsi="Calibri" w:cs="Calibri"/>
               </w:rPr>
-              <w:t xml:space="preserve"> Initialize SvelteKit repository and GitHub environment.</w:t>
+              <w:t xml:space="preserve"> Initialize </w:t>
+            </w:r>
+            <w:proofErr w:type="spellStart"/>
+            <w:r>
+              <w:rPr>
+                <w:rFonts w:ascii="Calibri" w:hAnsi="Calibri" w:cs="Calibri"/>
+              </w:rPr>
+              <w:t>SvelteKit</w:t>
+            </w:r>
+            <w:proofErr w:type="spellEnd"/>
+            <w:r>
+              <w:rPr>
+                <w:rFonts w:ascii="Calibri" w:hAnsi="Calibri" w:cs="Calibri"/>
+              </w:rPr>
+              <w:t xml:space="preserve"> repository and GitHub environment.</w:t>
             </w:r>
           </w:p>
         </w:tc>
@@ -2962,6 +3258,155 @@
     </w:lvl>
   </w:abstractNum>
   <w:abstractNum w:abstractNumId="4" w15:restartNumberingAfterBreak="0">
+    <w:nsid w:val="54A32E67"/>
+    <w:multiLevelType w:val="multilevel"/>
+    <w:tmpl w:val="D6E0EB9E"/>
+    <w:lvl w:ilvl="0">
+      <w:start w:val="1"/>
+      <w:numFmt w:val="bullet"/>
+      <w:lvlText w:val=""/>
+      <w:lvlJc w:val="left"/>
+      <w:pPr>
+        <w:tabs>
+          <w:tab w:val="num" w:pos="720"/>
+        </w:tabs>
+        <w:ind w:left="720" w:hanging="360"/>
+      </w:pPr>
+      <w:rPr>
+        <w:rFonts w:ascii="Symbol" w:hAnsi="Symbol" w:hint="default"/>
+        <w:sz w:val="20"/>
+      </w:rPr>
+    </w:lvl>
+    <w:lvl w:ilvl="1" w:tentative="1">
+      <w:start w:val="1"/>
+      <w:numFmt w:val="bullet"/>
+      <w:lvlText w:val="o"/>
+      <w:lvlJc w:val="left"/>
+      <w:pPr>
+        <w:tabs>
+          <w:tab w:val="num" w:pos="1440"/>
+        </w:tabs>
+        <w:ind w:left="1440" w:hanging="360"/>
+      </w:pPr>
+      <w:rPr>
+        <w:rFonts w:ascii="Courier New" w:hAnsi="Courier New" w:hint="default"/>
+        <w:sz w:val="20"/>
+      </w:rPr>
+    </w:lvl>
+    <w:lvl w:ilvl="2" w:tentative="1">
+      <w:start w:val="1"/>
+      <w:numFmt w:val="bullet"/>
+      <w:lvlText w:val=""/>
+      <w:lvlJc w:val="left"/>
+      <w:pPr>
+        <w:tabs>
+          <w:tab w:val="num" w:pos="2160"/>
+        </w:tabs>
+        <w:ind w:left="2160" w:hanging="360"/>
+      </w:pPr>
+      <w:rPr>
+        <w:rFonts w:ascii="Wingdings" w:hAnsi="Wingdings" w:hint="default"/>
+        <w:sz w:val="20"/>
+      </w:rPr>
+    </w:lvl>
+    <w:lvl w:ilvl="3" w:tentative="1">
+      <w:start w:val="1"/>
+      <w:numFmt w:val="bullet"/>
+      <w:lvlText w:val=""/>
+      <w:lvlJc w:val="left"/>
+      <w:pPr>
+        <w:tabs>
+          <w:tab w:val="num" w:pos="2880"/>
+        </w:tabs>
+        <w:ind w:left="2880" w:hanging="360"/>
+      </w:pPr>
+      <w:rPr>
+        <w:rFonts w:ascii="Wingdings" w:hAnsi="Wingdings" w:hint="default"/>
+        <w:sz w:val="20"/>
+      </w:rPr>
+    </w:lvl>
+    <w:lvl w:ilvl="4" w:tentative="1">
+      <w:start w:val="1"/>
+      <w:numFmt w:val="bullet"/>
+      <w:lvlText w:val=""/>
+      <w:lvlJc w:val="left"/>
+      <w:pPr>
+        <w:tabs>
+          <w:tab w:val="num" w:pos="3600"/>
+        </w:tabs>
+        <w:ind w:left="3600" w:hanging="360"/>
+      </w:pPr>
+      <w:rPr>
+        <w:rFonts w:ascii="Wingdings" w:hAnsi="Wingdings" w:hint="default"/>
+        <w:sz w:val="20"/>
+      </w:rPr>
+    </w:lvl>
+    <w:lvl w:ilvl="5" w:tentative="1">
+      <w:start w:val="1"/>
+      <w:numFmt w:val="bullet"/>
+      <w:lvlText w:val=""/>
+      <w:lvlJc w:val="left"/>
+      <w:pPr>
+        <w:tabs>
+          <w:tab w:val="num" w:pos="4320"/>
+        </w:tabs>
+        <w:ind w:left="4320" w:hanging="360"/>
+      </w:pPr>
+      <w:rPr>
+        <w:rFonts w:ascii="Wingdings" w:hAnsi="Wingdings" w:hint="default"/>
+        <w:sz w:val="20"/>
+      </w:rPr>
+    </w:lvl>
+    <w:lvl w:ilvl="6" w:tentative="1">
+      <w:start w:val="1"/>
+      <w:numFmt w:val="bullet"/>
+      <w:lvlText w:val=""/>
+      <w:lvlJc w:val="left"/>
+      <w:pPr>
+        <w:tabs>
+          <w:tab w:val="num" w:pos="5040"/>
+        </w:tabs>
+        <w:ind w:left="5040" w:hanging="360"/>
+      </w:pPr>
+      <w:rPr>
+        <w:rFonts w:ascii="Wingdings" w:hAnsi="Wingdings" w:hint="default"/>
+        <w:sz w:val="20"/>
+      </w:rPr>
+    </w:lvl>
+    <w:lvl w:ilvl="7" w:tentative="1">
+      <w:start w:val="1"/>
+      <w:numFmt w:val="bullet"/>
+      <w:lvlText w:val=""/>
+      <w:lvlJc w:val="left"/>
+      <w:pPr>
+        <w:tabs>
+          <w:tab w:val="num" w:pos="5760"/>
+        </w:tabs>
+        <w:ind w:left="5760" w:hanging="360"/>
+      </w:pPr>
+      <w:rPr>
+        <w:rFonts w:ascii="Wingdings" w:hAnsi="Wingdings" w:hint="default"/>
+        <w:sz w:val="20"/>
+      </w:rPr>
+    </w:lvl>
+    <w:lvl w:ilvl="8" w:tentative="1">
+      <w:start w:val="1"/>
+      <w:numFmt w:val="bullet"/>
+      <w:lvlText w:val=""/>
+      <w:lvlJc w:val="left"/>
+      <w:pPr>
+        <w:tabs>
+          <w:tab w:val="num" w:pos="6480"/>
+        </w:tabs>
+        <w:ind w:left="6480" w:hanging="360"/>
+      </w:pPr>
+      <w:rPr>
+        <w:rFonts w:ascii="Wingdings" w:hAnsi="Wingdings" w:hint="default"/>
+        <w:sz w:val="20"/>
+      </w:rPr>
+    </w:lvl>
+  </w:abstractNum>
+  <w:abstractNum w:abstractNumId="5" w15:restartNumberingAfterBreak="0">
     <w:nsid w:val="5CC81DD8"/>
     <w:multiLevelType w:val="hybridMultilevel"/>
     <w:tmpl w:val="035C2C6E"/>
@@ -3051,7 +3496,7 @@
       </w:pPr>
     </w:lvl>
   </w:abstractNum>
-  <w:abstractNum w:abstractNumId="5" w15:restartNumberingAfterBreak="0">
+  <w:abstractNum w:abstractNumId="6" w15:restartNumberingAfterBreak="0">
     <w:nsid w:val="5D3B65D9"/>
     <w:multiLevelType w:val="multilevel"/>
     <w:tmpl w:val="E086F058"/>
@@ -3200,7 +3645,7 @@
       </w:rPr>
     </w:lvl>
   </w:abstractNum>
-  <w:abstractNum w:abstractNumId="6" w15:restartNumberingAfterBreak="0">
+  <w:abstractNum w:abstractNumId="7" w15:restartNumberingAfterBreak="0">
     <w:nsid w:val="5E8A1386"/>
     <w:multiLevelType w:val="multilevel"/>
     <w:tmpl w:val="790ACF6A"/>
@@ -3349,17 +3794,166 @@
       </w:rPr>
     </w:lvl>
   </w:abstractNum>
+  <w:abstractNum w:abstractNumId="8" w15:restartNumberingAfterBreak="0">
+    <w:nsid w:val="7F7860E5"/>
+    <w:multiLevelType w:val="multilevel"/>
+    <w:tmpl w:val="D4CE6238"/>
+    <w:lvl w:ilvl="0">
+      <w:start w:val="1"/>
+      <w:numFmt w:val="bullet"/>
+      <w:lvlText w:val=""/>
+      <w:lvlJc w:val="left"/>
+      <w:pPr>
+        <w:tabs>
+          <w:tab w:val="num" w:pos="720"/>
+        </w:tabs>
+        <w:ind w:left="720" w:hanging="360"/>
+      </w:pPr>
+      <w:rPr>
+        <w:rFonts w:ascii="Symbol" w:hAnsi="Symbol" w:hint="default"/>
+        <w:sz w:val="20"/>
+      </w:rPr>
+    </w:lvl>
+    <w:lvl w:ilvl="1" w:tentative="1">
+      <w:start w:val="1"/>
+      <w:numFmt w:val="bullet"/>
+      <w:lvlText w:val="o"/>
+      <w:lvlJc w:val="left"/>
+      <w:pPr>
+        <w:tabs>
+          <w:tab w:val="num" w:pos="1440"/>
+        </w:tabs>
+        <w:ind w:left="1440" w:hanging="360"/>
+      </w:pPr>
+      <w:rPr>
+        <w:rFonts w:ascii="Courier New" w:hAnsi="Courier New" w:hint="default"/>
+        <w:sz w:val="20"/>
+      </w:rPr>
+    </w:lvl>
+    <w:lvl w:ilvl="2" w:tentative="1">
+      <w:start w:val="1"/>
+      <w:numFmt w:val="bullet"/>
+      <w:lvlText w:val=""/>
+      <w:lvlJc w:val="left"/>
+      <w:pPr>
+        <w:tabs>
+          <w:tab w:val="num" w:pos="2160"/>
+        </w:tabs>
+        <w:ind w:left="2160" w:hanging="360"/>
+      </w:pPr>
+      <w:rPr>
+        <w:rFonts w:ascii="Wingdings" w:hAnsi="Wingdings" w:hint="default"/>
+        <w:sz w:val="20"/>
+      </w:rPr>
+    </w:lvl>
+    <w:lvl w:ilvl="3" w:tentative="1">
+      <w:start w:val="1"/>
+      <w:numFmt w:val="bullet"/>
+      <w:lvlText w:val=""/>
+      <w:lvlJc w:val="left"/>
+      <w:pPr>
+        <w:tabs>
+          <w:tab w:val="num" w:pos="2880"/>
+        </w:tabs>
+        <w:ind w:left="2880" w:hanging="360"/>
+      </w:pPr>
+      <w:rPr>
+        <w:rFonts w:ascii="Wingdings" w:hAnsi="Wingdings" w:hint="default"/>
+        <w:sz w:val="20"/>
+      </w:rPr>
+    </w:lvl>
+    <w:lvl w:ilvl="4" w:tentative="1">
+      <w:start w:val="1"/>
+      <w:numFmt w:val="bullet"/>
+      <w:lvlText w:val=""/>
+      <w:lvlJc w:val="left"/>
+      <w:pPr>
+        <w:tabs>
+          <w:tab w:val="num" w:pos="3600"/>
+        </w:tabs>
+        <w:ind w:left="3600" w:hanging="360"/>
+      </w:pPr>
+      <w:rPr>
+        <w:rFonts w:ascii="Wingdings" w:hAnsi="Wingdings" w:hint="default"/>
+        <w:sz w:val="20"/>
+      </w:rPr>
+    </w:lvl>
+    <w:lvl w:ilvl="5" w:tentative="1">
+      <w:start w:val="1"/>
+      <w:numFmt w:val="bullet"/>
+      <w:lvlText w:val=""/>
+      <w:lvlJc w:val="left"/>
+      <w:pPr>
+        <w:tabs>
+          <w:tab w:val="num" w:pos="4320"/>
+        </w:tabs>
+        <w:ind w:left="4320" w:hanging="360"/>
+      </w:pPr>
+      <w:rPr>
+        <w:rFonts w:ascii="Wingdings" w:hAnsi="Wingdings" w:hint="default"/>
+        <w:sz w:val="20"/>
+      </w:rPr>
+    </w:lvl>
+    <w:lvl w:ilvl="6" w:tentative="1">
+      <w:start w:val="1"/>
+      <w:numFmt w:val="bullet"/>
+      <w:lvlText w:val=""/>
+      <w:lvlJc w:val="left"/>
+      <w:pPr>
+        <w:tabs>
+          <w:tab w:val="num" w:pos="5040"/>
+        </w:tabs>
+        <w:ind w:left="5040" w:hanging="360"/>
+      </w:pPr>
+      <w:rPr>
+        <w:rFonts w:ascii="Wingdings" w:hAnsi="Wingdings" w:hint="default"/>
+        <w:sz w:val="20"/>
+      </w:rPr>
+    </w:lvl>
+    <w:lvl w:ilvl="7" w:tentative="1">
+      <w:start w:val="1"/>
+      <w:numFmt w:val="bullet"/>
+      <w:lvlText w:val=""/>
+      <w:lvlJc w:val="left"/>
+      <w:pPr>
+        <w:tabs>
+          <w:tab w:val="num" w:pos="5760"/>
+        </w:tabs>
+        <w:ind w:left="5760" w:hanging="360"/>
+      </w:pPr>
+      <w:rPr>
+        <w:rFonts w:ascii="Wingdings" w:hAnsi="Wingdings" w:hint="default"/>
+        <w:sz w:val="20"/>
+      </w:rPr>
+    </w:lvl>
+    <w:lvl w:ilvl="8" w:tentative="1">
+      <w:start w:val="1"/>
+      <w:numFmt w:val="bullet"/>
+      <w:lvlText w:val=""/>
+      <w:lvlJc w:val="left"/>
+      <w:pPr>
+        <w:tabs>
+          <w:tab w:val="num" w:pos="6480"/>
+        </w:tabs>
+        <w:ind w:left="6480" w:hanging="360"/>
+      </w:pPr>
+      <w:rPr>
+        <w:rFonts w:ascii="Wingdings" w:hAnsi="Wingdings" w:hint="default"/>
+        <w:sz w:val="20"/>
+      </w:rPr>
+    </w:lvl>
+  </w:abstractNum>
   <w:num w:numId="1" w16cid:durableId="2145349621">
-    <w:abstractNumId w:val="5"/>
+    <w:abstractNumId w:val="6"/>
   </w:num>
   <w:num w:numId="2" w16cid:durableId="419520449">
     <w:abstractNumId w:val="2"/>
   </w:num>
   <w:num w:numId="3" w16cid:durableId="441152855">
-    <w:abstractNumId w:val="4"/>
+    <w:abstractNumId w:val="5"/>
   </w:num>
   <w:num w:numId="4" w16cid:durableId="1685745848">
-    <w:abstractNumId w:val="6"/>
+    <w:abstractNumId w:val="7"/>
   </w:num>
   <w:num w:numId="5" w16cid:durableId="1229606327">
     <w:abstractNumId w:val="0"/>
@@ -3369,6 +3963,12 @@
   </w:num>
   <w:num w:numId="7" w16cid:durableId="2098599637">
     <w:abstractNumId w:val="1"/>
+  </w:num>
+  <w:num w:numId="8" w16cid:durableId="796795107">
+    <w:abstractNumId w:val="8"/>
+  </w:num>
+  <w:num w:numId="9" w16cid:durableId="1598171581">
+    <w:abstractNumId w:val="4"/>
   </w:num>
 </w:numbering>
 </file>

</xml_diff>

<commit_message>
docs: ERD -> LDM, improve LDM, add LDM and Data Dictionary to sprint 1 doc
</commit_message>
<xml_diff>
--- a/docs/Sprint 1.docx
+++ b/docs/Sprint 1.docx
@@ -1739,6 +1739,1324 @@
     </w:p>
     <w:p>
       <w:pPr>
+        <w:pStyle w:val="Heading3"/>
+      </w:pPr>
+      <w:r>
+        <w:t>D. Visual Evidence (Wireframes)</w:t>
+      </w:r>
+    </w:p>
+    <w:p>
+      <w:pPr>
+        <w:ind w:left="0" w:firstLine="0"/>
+        <w:rPr>
+          <w:rFonts w:ascii="Calibri" w:hAnsi="Calibri" w:cs="Calibri"/>
+          <w:lang w:eastAsia="en-US"/>
+        </w:rPr>
+      </w:pPr>
+    </w:p>
+    <w:p>
+      <w:pPr>
+        <w:pStyle w:val="Heading3"/>
+      </w:pPr>
+      <w:r>
+        <w:t xml:space="preserve">E. </w:t>
+      </w:r>
+      <w:r>
+        <w:rPr>
+          <w:lang w:val="en-GB"/>
+        </w:rPr>
+        <w:t>Logical Data Model (LDM)</w:t>
+      </w:r>
+    </w:p>
+    <w:tbl>
+      <w:tblPr>
+        <w:tblStyle w:val="TableGrid"/>
+        <w:tblW w:w="0" w:type="auto"/>
+        <w:tblLook w:val="04A0" w:firstRow="1" w:lastRow="0" w:firstColumn="1" w:lastColumn="0" w:noHBand="0" w:noVBand="1"/>
+      </w:tblPr>
+      <w:tblGrid>
+        <w:gridCol w:w="1766"/>
+        <w:gridCol w:w="1524"/>
+        <w:gridCol w:w="1133"/>
+        <w:gridCol w:w="1804"/>
+        <w:gridCol w:w="3123"/>
+      </w:tblGrid>
+      <w:tr>
+        <w:tc>
+          <w:tcPr>
+            <w:tcW w:w="0" w:type="auto"/>
+            <w:hideMark/>
+          </w:tcPr>
+          <w:p>
+            <w:pPr>
+              <w:ind w:left="0" w:firstLine="0"/>
+              <w:rPr>
+                <w:rFonts w:ascii="Calibri" w:hAnsi="Calibri" w:cs="Calibri"/>
+                <w:u w:val="single"/>
+                <w:lang w:val="en-US" w:eastAsia="en-US"/>
+              </w:rPr>
+            </w:pPr>
+            <w:r>
+              <w:rPr>
+                <w:rFonts w:ascii="Calibri" w:hAnsi="Calibri" w:cs="Calibri"/>
+                <w:b/>
+                <w:bCs/>
+                <w:u w:val="single"/>
+                <w:lang w:val="en-US" w:eastAsia="en-US"/>
+              </w:rPr>
+              <w:t>Entity</w:t>
+            </w:r>
+          </w:p>
+        </w:tc>
+        <w:tc>
+          <w:tcPr>
+            <w:tcW w:w="0" w:type="auto"/>
+            <w:hideMark/>
+          </w:tcPr>
+          <w:p>
+            <w:pPr>
+              <w:ind w:left="0" w:firstLine="0"/>
+              <w:rPr>
+                <w:rFonts w:ascii="Calibri" w:hAnsi="Calibri" w:cs="Calibri"/>
+                <w:u w:val="single"/>
+                <w:lang w:val="en-US" w:eastAsia="en-US"/>
+              </w:rPr>
+            </w:pPr>
+            <w:r>
+              <w:rPr>
+                <w:rFonts w:ascii="Calibri" w:hAnsi="Calibri" w:cs="Calibri"/>
+                <w:b/>
+                <w:bCs/>
+                <w:u w:val="single"/>
+                <w:lang w:val="en-US" w:eastAsia="en-US"/>
+              </w:rPr>
+              <w:t>Attribute</w:t>
+            </w:r>
+          </w:p>
+        </w:tc>
+        <w:tc>
+          <w:tcPr>
+            <w:tcW w:w="0" w:type="auto"/>
+            <w:hideMark/>
+          </w:tcPr>
+          <w:p>
+            <w:pPr>
+              <w:ind w:left="0" w:firstLine="0"/>
+              <w:rPr>
+                <w:rFonts w:ascii="Calibri" w:hAnsi="Calibri" w:cs="Calibri"/>
+                <w:u w:val="single"/>
+                <w:lang w:val="en-US" w:eastAsia="en-US"/>
+              </w:rPr>
+            </w:pPr>
+            <w:r>
+              <w:rPr>
+                <w:rFonts w:ascii="Calibri" w:hAnsi="Calibri" w:cs="Calibri"/>
+                <w:b/>
+                <w:bCs/>
+                <w:u w:val="single"/>
+                <w:lang w:val="en-US" w:eastAsia="en-US"/>
+              </w:rPr>
+              <w:t>Data Type</w:t>
+            </w:r>
+          </w:p>
+        </w:tc>
+        <w:tc>
+          <w:tcPr>
+            <w:tcW w:w="0" w:type="auto"/>
+            <w:hideMark/>
+          </w:tcPr>
+          <w:p>
+            <w:pPr>
+              <w:ind w:left="0" w:firstLine="0"/>
+              <w:rPr>
+                <w:rFonts w:ascii="Calibri" w:hAnsi="Calibri" w:cs="Calibri"/>
+                <w:u w:val="single"/>
+                <w:lang w:val="en-US" w:eastAsia="en-US"/>
+              </w:rPr>
+            </w:pPr>
+            <w:r>
+              <w:rPr>
+                <w:rFonts w:ascii="Calibri" w:hAnsi="Calibri" w:cs="Calibri"/>
+                <w:b/>
+                <w:bCs/>
+                <w:u w:val="single"/>
+                <w:lang w:val="en-US" w:eastAsia="en-US"/>
+              </w:rPr>
+              <w:t>Constraint</w:t>
+            </w:r>
+          </w:p>
+        </w:tc>
+        <w:tc>
+          <w:tcPr>
+            <w:tcW w:w="0" w:type="auto"/>
+            <w:hideMark/>
+          </w:tcPr>
+          <w:p>
+            <w:pPr>
+              <w:ind w:left="0" w:firstLine="0"/>
+              <w:rPr>
+                <w:rFonts w:ascii="Calibri" w:hAnsi="Calibri" w:cs="Calibri"/>
+                <w:u w:val="single"/>
+                <w:lang w:val="en-US" w:eastAsia="en-US"/>
+              </w:rPr>
+            </w:pPr>
+            <w:r>
+              <w:rPr>
+                <w:rFonts w:ascii="Calibri" w:hAnsi="Calibri" w:cs="Calibri"/>
+                <w:b/>
+                <w:bCs/>
+                <w:u w:val="single"/>
+                <w:lang w:val="en-US" w:eastAsia="en-US"/>
+              </w:rPr>
+              <w:t>Description</w:t>
+            </w:r>
+          </w:p>
+        </w:tc>
+      </w:tr>
+      <w:tr>
+        <w:tc>
+          <w:tcPr>
+            <w:tcW w:w="0" w:type="auto"/>
+            <w:hideMark/>
+          </w:tcPr>
+          <w:p>
+            <w:pPr>
+              <w:ind w:left="0" w:firstLine="0"/>
+              <w:rPr>
+                <w:rFonts w:ascii="Calibri" w:hAnsi="Calibri" w:cs="Calibri"/>
+                <w:lang w:val="en-US" w:eastAsia="en-US"/>
+              </w:rPr>
+            </w:pPr>
+            <w:r>
+              <w:rPr>
+                <w:rFonts w:ascii="Calibri" w:hAnsi="Calibri" w:cs="Calibri"/>
+                <w:b/>
+                <w:bCs/>
+                <w:lang w:val="en-US" w:eastAsia="en-US"/>
+              </w:rPr>
+              <w:lastRenderedPageBreak/>
+              <w:t>PATIENT</w:t>
+            </w:r>
+          </w:p>
+        </w:tc>
+        <w:tc>
+          <w:tcPr>
+            <w:tcW w:w="0" w:type="auto"/>
+            <w:hideMark/>
+          </w:tcPr>
+          <w:p>
+            <w:pPr>
+              <w:ind w:left="0" w:firstLine="0"/>
+              <w:rPr>
+                <w:rFonts w:ascii="Calibri" w:hAnsi="Calibri" w:cs="Calibri"/>
+                <w:lang w:val="en-US" w:eastAsia="en-US"/>
+              </w:rPr>
+            </w:pPr>
+            <w:proofErr w:type="spellStart"/>
+            <w:r>
+              <w:rPr>
+                <w:rFonts w:ascii="Calibri" w:hAnsi="Calibri" w:cs="Calibri"/>
+                <w:lang w:val="en-US" w:eastAsia="en-US"/>
+              </w:rPr>
+              <w:t>nhs_number</w:t>
+            </w:r>
+            <w:proofErr w:type="spellEnd"/>
+          </w:p>
+        </w:tc>
+        <w:tc>
+          <w:tcPr>
+            <w:tcW w:w="0" w:type="auto"/>
+            <w:hideMark/>
+          </w:tcPr>
+          <w:p>
+            <w:pPr>
+              <w:ind w:left="0" w:firstLine="0"/>
+              <w:rPr>
+                <w:rFonts w:ascii="Calibri" w:hAnsi="Calibri" w:cs="Calibri"/>
+                <w:lang w:val="en-US" w:eastAsia="en-US"/>
+              </w:rPr>
+            </w:pPr>
+            <w:r>
+              <w:rPr>
+                <w:rFonts w:ascii="Calibri" w:hAnsi="Calibri" w:cs="Calibri"/>
+                <w:lang w:val="en-US" w:eastAsia="en-US"/>
+              </w:rPr>
+              <w:t>String (10)</w:t>
+            </w:r>
+          </w:p>
+        </w:tc>
+        <w:tc>
+          <w:tcPr>
+            <w:tcW w:w="0" w:type="auto"/>
+            <w:hideMark/>
+          </w:tcPr>
+          <w:p>
+            <w:pPr>
+              <w:ind w:left="0" w:firstLine="0"/>
+              <w:rPr>
+                <w:rFonts w:ascii="Calibri" w:hAnsi="Calibri" w:cs="Calibri"/>
+                <w:lang w:val="en-US" w:eastAsia="en-US"/>
+              </w:rPr>
+            </w:pPr>
+            <w:r>
+              <w:rPr>
+                <w:rFonts w:ascii="Calibri" w:hAnsi="Calibri" w:cs="Calibri"/>
+                <w:lang w:val="en-US" w:eastAsia="en-US"/>
+              </w:rPr>
+              <w:t>Primary Key, Unique</w:t>
+            </w:r>
+          </w:p>
+        </w:tc>
+        <w:tc>
+          <w:tcPr>
+            <w:tcW w:w="0" w:type="auto"/>
+            <w:hideMark/>
+          </w:tcPr>
+          <w:p>
+            <w:pPr>
+              <w:ind w:left="0" w:firstLine="0"/>
+              <w:rPr>
+                <w:rFonts w:ascii="Calibri" w:hAnsi="Calibri" w:cs="Calibri"/>
+                <w:lang w:val="en-US" w:eastAsia="en-US"/>
+              </w:rPr>
+            </w:pPr>
+            <w:r>
+              <w:rPr>
+                <w:rFonts w:ascii="Calibri" w:hAnsi="Calibri" w:cs="Calibri"/>
+                <w:lang w:val="en-US" w:eastAsia="en-US"/>
+              </w:rPr>
+              <w:t>Standard 10-digit NHS identifier.</w:t>
+            </w:r>
+          </w:p>
+        </w:tc>
+      </w:tr>
+      <w:tr>
+        <w:tc>
+          <w:tcPr>
+            <w:tcW w:w="0" w:type="auto"/>
+            <w:hideMark/>
+          </w:tcPr>
+          <w:p>
+            <w:pPr>
+              <w:ind w:left="0" w:firstLine="0"/>
+              <w:rPr>
+                <w:rFonts w:ascii="Calibri" w:hAnsi="Calibri" w:cs="Calibri"/>
+                <w:lang w:val="en-US" w:eastAsia="en-US"/>
+              </w:rPr>
+            </w:pPr>
+          </w:p>
+        </w:tc>
+        <w:tc>
+          <w:tcPr>
+            <w:tcW w:w="0" w:type="auto"/>
+            <w:hideMark/>
+          </w:tcPr>
+          <w:p>
+            <w:pPr>
+              <w:ind w:left="0" w:firstLine="0"/>
+              <w:rPr>
+                <w:rFonts w:ascii="Calibri" w:hAnsi="Calibri" w:cs="Calibri"/>
+                <w:lang w:val="en-US" w:eastAsia="en-US"/>
+              </w:rPr>
+            </w:pPr>
+            <w:proofErr w:type="spellStart"/>
+            <w:r>
+              <w:rPr>
+                <w:rFonts w:ascii="Calibri" w:hAnsi="Calibri" w:cs="Calibri"/>
+                <w:lang w:val="en-US" w:eastAsia="en-US"/>
+              </w:rPr>
+              <w:t>full_name</w:t>
+            </w:r>
+            <w:proofErr w:type="spellEnd"/>
+          </w:p>
+        </w:tc>
+        <w:tc>
+          <w:tcPr>
+            <w:tcW w:w="0" w:type="auto"/>
+            <w:hideMark/>
+          </w:tcPr>
+          <w:p>
+            <w:pPr>
+              <w:ind w:left="0" w:firstLine="0"/>
+              <w:rPr>
+                <w:rFonts w:ascii="Calibri" w:hAnsi="Calibri" w:cs="Calibri"/>
+                <w:lang w:val="en-US" w:eastAsia="en-US"/>
+              </w:rPr>
+            </w:pPr>
+            <w:r>
+              <w:rPr>
+                <w:rFonts w:ascii="Calibri" w:hAnsi="Calibri" w:cs="Calibri"/>
+                <w:lang w:val="en-US" w:eastAsia="en-US"/>
+              </w:rPr>
+              <w:t>String (100)</w:t>
+            </w:r>
+          </w:p>
+        </w:tc>
+        <w:tc>
+          <w:tcPr>
+            <w:tcW w:w="0" w:type="auto"/>
+            <w:hideMark/>
+          </w:tcPr>
+          <w:p>
+            <w:pPr>
+              <w:ind w:left="0" w:firstLine="0"/>
+              <w:rPr>
+                <w:rFonts w:ascii="Calibri" w:hAnsi="Calibri" w:cs="Calibri"/>
+                <w:lang w:val="en-US" w:eastAsia="en-US"/>
+              </w:rPr>
+            </w:pPr>
+            <w:r>
+              <w:rPr>
+                <w:rFonts w:ascii="Calibri" w:hAnsi="Calibri" w:cs="Calibri"/>
+                <w:lang w:val="en-US" w:eastAsia="en-US"/>
+              </w:rPr>
+              <w:t>Not Null</w:t>
+            </w:r>
+          </w:p>
+        </w:tc>
+        <w:tc>
+          <w:tcPr>
+            <w:tcW w:w="0" w:type="auto"/>
+            <w:hideMark/>
+          </w:tcPr>
+          <w:p>
+            <w:pPr>
+              <w:ind w:left="0" w:firstLine="0"/>
+              <w:rPr>
+                <w:rFonts w:ascii="Calibri" w:hAnsi="Calibri" w:cs="Calibri"/>
+                <w:lang w:val="en-US" w:eastAsia="en-US"/>
+              </w:rPr>
+            </w:pPr>
+            <w:r>
+              <w:rPr>
+                <w:rFonts w:ascii="Calibri" w:hAnsi="Calibri" w:cs="Calibri"/>
+                <w:lang w:val="en-US" w:eastAsia="en-US"/>
+              </w:rPr>
+              <w:t>Legal name of the patient.</w:t>
+            </w:r>
+          </w:p>
+        </w:tc>
+      </w:tr>
+      <w:tr>
+        <w:tc>
+          <w:tcPr>
+            <w:tcW w:w="0" w:type="auto"/>
+            <w:hideMark/>
+          </w:tcPr>
+          <w:p>
+            <w:pPr>
+              <w:ind w:left="0" w:firstLine="0"/>
+              <w:rPr>
+                <w:rFonts w:ascii="Calibri" w:hAnsi="Calibri" w:cs="Calibri"/>
+                <w:lang w:val="en-US" w:eastAsia="en-US"/>
+              </w:rPr>
+            </w:pPr>
+          </w:p>
+        </w:tc>
+        <w:tc>
+          <w:tcPr>
+            <w:tcW w:w="0" w:type="auto"/>
+            <w:hideMark/>
+          </w:tcPr>
+          <w:p>
+            <w:pPr>
+              <w:ind w:left="0" w:firstLine="0"/>
+              <w:rPr>
+                <w:rFonts w:ascii="Calibri" w:hAnsi="Calibri" w:cs="Calibri"/>
+                <w:lang w:val="en-US" w:eastAsia="en-US"/>
+              </w:rPr>
+            </w:pPr>
+            <w:proofErr w:type="spellStart"/>
+            <w:r>
+              <w:rPr>
+                <w:rFonts w:ascii="Calibri" w:hAnsi="Calibri" w:cs="Calibri"/>
+                <w:lang w:val="en-US" w:eastAsia="en-US"/>
+              </w:rPr>
+              <w:t>password_hash</w:t>
+            </w:r>
+            <w:proofErr w:type="spellEnd"/>
+          </w:p>
+        </w:tc>
+        <w:tc>
+          <w:tcPr>
+            <w:tcW w:w="0" w:type="auto"/>
+            <w:hideMark/>
+          </w:tcPr>
+          <w:p>
+            <w:pPr>
+              <w:ind w:left="0" w:firstLine="0"/>
+              <w:rPr>
+                <w:rFonts w:ascii="Calibri" w:hAnsi="Calibri" w:cs="Calibri"/>
+                <w:lang w:val="en-US" w:eastAsia="en-US"/>
+              </w:rPr>
+            </w:pPr>
+            <w:r>
+              <w:rPr>
+                <w:rFonts w:ascii="Calibri" w:hAnsi="Calibri" w:cs="Calibri"/>
+                <w:lang w:val="en-US" w:eastAsia="en-US"/>
+              </w:rPr>
+              <w:t>String (255)</w:t>
+            </w:r>
+          </w:p>
+        </w:tc>
+        <w:tc>
+          <w:tcPr>
+            <w:tcW w:w="0" w:type="auto"/>
+            <w:hideMark/>
+          </w:tcPr>
+          <w:p>
+            <w:pPr>
+              <w:ind w:left="0" w:firstLine="0"/>
+              <w:rPr>
+                <w:rFonts w:ascii="Calibri" w:hAnsi="Calibri" w:cs="Calibri"/>
+                <w:lang w:val="en-US" w:eastAsia="en-US"/>
+              </w:rPr>
+            </w:pPr>
+            <w:r>
+              <w:rPr>
+                <w:rFonts w:ascii="Calibri" w:hAnsi="Calibri" w:cs="Calibri"/>
+                <w:lang w:val="en-US" w:eastAsia="en-US"/>
+              </w:rPr>
+              <w:t>Not Null</w:t>
+            </w:r>
+          </w:p>
+        </w:tc>
+        <w:tc>
+          <w:tcPr>
+            <w:tcW w:w="0" w:type="auto"/>
+            <w:hideMark/>
+          </w:tcPr>
+          <w:p>
+            <w:pPr>
+              <w:ind w:left="0" w:firstLine="0"/>
+              <w:rPr>
+                <w:rFonts w:ascii="Calibri" w:hAnsi="Calibri" w:cs="Calibri"/>
+                <w:lang w:val="en-US" w:eastAsia="en-US"/>
+              </w:rPr>
+            </w:pPr>
+            <w:r>
+              <w:rPr>
+                <w:rFonts w:ascii="Calibri" w:hAnsi="Calibri" w:cs="Calibri"/>
+                <w:lang w:val="en-US" w:eastAsia="en-US"/>
+              </w:rPr>
+              <w:t xml:space="preserve">Bcrypt hashed </w:t>
+            </w:r>
+            <w:proofErr w:type="gramStart"/>
+            <w:r>
+              <w:rPr>
+                <w:rFonts w:ascii="Calibri" w:hAnsi="Calibri" w:cs="Calibri"/>
+                <w:lang w:val="en-US" w:eastAsia="en-US"/>
+              </w:rPr>
+              <w:t>password</w:t>
+            </w:r>
+            <w:proofErr w:type="gramEnd"/>
+            <w:r>
+              <w:rPr>
+                <w:rFonts w:ascii="Calibri" w:hAnsi="Calibri" w:cs="Calibri"/>
+                <w:lang w:val="en-US" w:eastAsia="en-US"/>
+              </w:rPr>
+              <w:t xml:space="preserve"> for secure auth.</w:t>
+            </w:r>
+          </w:p>
+        </w:tc>
+      </w:tr>
+      <w:tr>
+        <w:tc>
+          <w:tcPr>
+            <w:tcW w:w="0" w:type="auto"/>
+            <w:hideMark/>
+          </w:tcPr>
+          <w:p>
+            <w:pPr>
+              <w:ind w:left="0" w:firstLine="0"/>
+              <w:rPr>
+                <w:rFonts w:ascii="Calibri" w:hAnsi="Calibri" w:cs="Calibri"/>
+                <w:lang w:val="en-US" w:eastAsia="en-US"/>
+              </w:rPr>
+            </w:pPr>
+            <w:r>
+              <w:rPr>
+                <w:rFonts w:ascii="Calibri" w:hAnsi="Calibri" w:cs="Calibri"/>
+                <w:b/>
+                <w:bCs/>
+                <w:lang w:val="en-US" w:eastAsia="en-US"/>
+              </w:rPr>
+              <w:t>DOCTOR</w:t>
+            </w:r>
+          </w:p>
+        </w:tc>
+        <w:tc>
+          <w:tcPr>
+            <w:tcW w:w="0" w:type="auto"/>
+            <w:hideMark/>
+          </w:tcPr>
+          <w:p>
+            <w:pPr>
+              <w:ind w:left="0" w:firstLine="0"/>
+              <w:rPr>
+                <w:rFonts w:ascii="Calibri" w:hAnsi="Calibri" w:cs="Calibri"/>
+                <w:lang w:val="en-US" w:eastAsia="en-US"/>
+              </w:rPr>
+            </w:pPr>
+            <w:proofErr w:type="spellStart"/>
+            <w:r>
+              <w:rPr>
+                <w:rFonts w:ascii="Calibri" w:hAnsi="Calibri" w:cs="Calibri"/>
+                <w:lang w:val="en-US" w:eastAsia="en-US"/>
+              </w:rPr>
+              <w:t>doctor_id</w:t>
+            </w:r>
+            <w:proofErr w:type="spellEnd"/>
+          </w:p>
+        </w:tc>
+        <w:tc>
+          <w:tcPr>
+            <w:tcW w:w="0" w:type="auto"/>
+            <w:hideMark/>
+          </w:tcPr>
+          <w:p>
+            <w:pPr>
+              <w:ind w:left="0" w:firstLine="0"/>
+              <w:rPr>
+                <w:rFonts w:ascii="Calibri" w:hAnsi="Calibri" w:cs="Calibri"/>
+                <w:lang w:val="en-US" w:eastAsia="en-US"/>
+              </w:rPr>
+            </w:pPr>
+            <w:r>
+              <w:rPr>
+                <w:rFonts w:ascii="Calibri" w:hAnsi="Calibri" w:cs="Calibri"/>
+                <w:lang w:val="en-US" w:eastAsia="en-US"/>
+              </w:rPr>
+              <w:t>String (10)</w:t>
+            </w:r>
+          </w:p>
+        </w:tc>
+        <w:tc>
+          <w:tcPr>
+            <w:tcW w:w="0" w:type="auto"/>
+            <w:hideMark/>
+          </w:tcPr>
+          <w:p>
+            <w:pPr>
+              <w:ind w:left="0" w:firstLine="0"/>
+              <w:rPr>
+                <w:rFonts w:ascii="Calibri" w:hAnsi="Calibri" w:cs="Calibri"/>
+                <w:lang w:val="en-US" w:eastAsia="en-US"/>
+              </w:rPr>
+            </w:pPr>
+            <w:r>
+              <w:rPr>
+                <w:rFonts w:ascii="Calibri" w:hAnsi="Calibri" w:cs="Calibri"/>
+                <w:lang w:val="en-US" w:eastAsia="en-US"/>
+              </w:rPr>
+              <w:t>Primary Key</w:t>
+            </w:r>
+          </w:p>
+        </w:tc>
+        <w:tc>
+          <w:tcPr>
+            <w:tcW w:w="0" w:type="auto"/>
+            <w:hideMark/>
+          </w:tcPr>
+          <w:p>
+            <w:pPr>
+              <w:ind w:left="0" w:firstLine="0"/>
+              <w:rPr>
+                <w:rFonts w:ascii="Calibri" w:hAnsi="Calibri" w:cs="Calibri"/>
+                <w:lang w:val="en-US" w:eastAsia="en-US"/>
+              </w:rPr>
+            </w:pPr>
+            <w:r>
+              <w:rPr>
+                <w:rFonts w:ascii="Calibri" w:hAnsi="Calibri" w:cs="Calibri"/>
+                <w:lang w:val="en-US" w:eastAsia="en-US"/>
+              </w:rPr>
+              <w:t>Unique staff identifier.</w:t>
+            </w:r>
+          </w:p>
+        </w:tc>
+      </w:tr>
+      <w:tr>
+        <w:tc>
+          <w:tcPr>
+            <w:tcW w:w="0" w:type="auto"/>
+            <w:hideMark/>
+          </w:tcPr>
+          <w:p>
+            <w:pPr>
+              <w:ind w:left="0" w:firstLine="0"/>
+              <w:rPr>
+                <w:rFonts w:ascii="Calibri" w:hAnsi="Calibri" w:cs="Calibri"/>
+                <w:lang w:val="en-US" w:eastAsia="en-US"/>
+              </w:rPr>
+            </w:pPr>
+          </w:p>
+        </w:tc>
+        <w:tc>
+          <w:tcPr>
+            <w:tcW w:w="0" w:type="auto"/>
+            <w:hideMark/>
+          </w:tcPr>
+          <w:p>
+            <w:pPr>
+              <w:ind w:left="0" w:firstLine="0"/>
+              <w:rPr>
+                <w:rFonts w:ascii="Calibri" w:hAnsi="Calibri" w:cs="Calibri"/>
+                <w:lang w:val="en-US" w:eastAsia="en-US"/>
+              </w:rPr>
+            </w:pPr>
+            <w:r>
+              <w:rPr>
+                <w:rFonts w:ascii="Calibri" w:hAnsi="Calibri" w:cs="Calibri"/>
+                <w:lang w:val="en-US" w:eastAsia="en-US"/>
+              </w:rPr>
+              <w:t>specialty</w:t>
+            </w:r>
+          </w:p>
+        </w:tc>
+        <w:tc>
+          <w:tcPr>
+            <w:tcW w:w="0" w:type="auto"/>
+            <w:hideMark/>
+          </w:tcPr>
+          <w:p>
+            <w:pPr>
+              <w:ind w:left="0" w:firstLine="0"/>
+              <w:rPr>
+                <w:rFonts w:ascii="Calibri" w:hAnsi="Calibri" w:cs="Calibri"/>
+                <w:lang w:val="en-US" w:eastAsia="en-US"/>
+              </w:rPr>
+            </w:pPr>
+            <w:r>
+              <w:rPr>
+                <w:rFonts w:ascii="Calibri" w:hAnsi="Calibri" w:cs="Calibri"/>
+                <w:lang w:val="en-US" w:eastAsia="en-US"/>
+              </w:rPr>
+              <w:t>String (50)</w:t>
+            </w:r>
+          </w:p>
+        </w:tc>
+        <w:tc>
+          <w:tcPr>
+            <w:tcW w:w="0" w:type="auto"/>
+            <w:hideMark/>
+          </w:tcPr>
+          <w:p>
+            <w:pPr>
+              <w:ind w:left="0" w:firstLine="0"/>
+              <w:rPr>
+                <w:rFonts w:ascii="Calibri" w:hAnsi="Calibri" w:cs="Calibri"/>
+                <w:lang w:val="en-US" w:eastAsia="en-US"/>
+              </w:rPr>
+            </w:pPr>
+            <w:r>
+              <w:rPr>
+                <w:rFonts w:ascii="Calibri" w:hAnsi="Calibri" w:cs="Calibri"/>
+                <w:lang w:val="en-US" w:eastAsia="en-US"/>
+              </w:rPr>
+              <w:t>Not Null</w:t>
+            </w:r>
+          </w:p>
+        </w:tc>
+        <w:tc>
+          <w:tcPr>
+            <w:tcW w:w="0" w:type="auto"/>
+            <w:hideMark/>
+          </w:tcPr>
+          <w:p>
+            <w:pPr>
+              <w:ind w:left="0" w:firstLine="0"/>
+              <w:rPr>
+                <w:rFonts w:ascii="Calibri" w:hAnsi="Calibri" w:cs="Calibri"/>
+                <w:lang w:val="en-US" w:eastAsia="en-US"/>
+              </w:rPr>
+            </w:pPr>
+            <w:r>
+              <w:rPr>
+                <w:rFonts w:ascii="Calibri" w:hAnsi="Calibri" w:cs="Calibri"/>
+                <w:lang w:val="en-US" w:eastAsia="en-US"/>
+              </w:rPr>
+              <w:t>Clinical department (e.g., Cardiology).</w:t>
+            </w:r>
+          </w:p>
+        </w:tc>
+      </w:tr>
+      <w:tr>
+        <w:tc>
+          <w:tcPr>
+            <w:tcW w:w="0" w:type="auto"/>
+            <w:hideMark/>
+          </w:tcPr>
+          <w:p>
+            <w:pPr>
+              <w:ind w:left="0" w:firstLine="0"/>
+              <w:rPr>
+                <w:rFonts w:ascii="Calibri" w:hAnsi="Calibri" w:cs="Calibri"/>
+                <w:lang w:val="en-US" w:eastAsia="en-US"/>
+              </w:rPr>
+            </w:pPr>
+            <w:r>
+              <w:rPr>
+                <w:rFonts w:ascii="Calibri" w:hAnsi="Calibri" w:cs="Calibri"/>
+                <w:b/>
+                <w:bCs/>
+                <w:lang w:val="en-US" w:eastAsia="en-US"/>
+              </w:rPr>
+              <w:t>APPOINTMENT</w:t>
+            </w:r>
+          </w:p>
+        </w:tc>
+        <w:tc>
+          <w:tcPr>
+            <w:tcW w:w="0" w:type="auto"/>
+            <w:hideMark/>
+          </w:tcPr>
+          <w:p>
+            <w:pPr>
+              <w:ind w:left="0" w:firstLine="0"/>
+              <w:rPr>
+                <w:rFonts w:ascii="Calibri" w:hAnsi="Calibri" w:cs="Calibri"/>
+                <w:lang w:val="en-US" w:eastAsia="en-US"/>
+              </w:rPr>
+            </w:pPr>
+            <w:proofErr w:type="spellStart"/>
+            <w:r>
+              <w:rPr>
+                <w:rFonts w:ascii="Calibri" w:hAnsi="Calibri" w:cs="Calibri"/>
+                <w:lang w:val="en-US" w:eastAsia="en-US"/>
+              </w:rPr>
+              <w:t>appointment_id</w:t>
+            </w:r>
+            <w:proofErr w:type="spellEnd"/>
+          </w:p>
+        </w:tc>
+        <w:tc>
+          <w:tcPr>
+            <w:tcW w:w="0" w:type="auto"/>
+            <w:hideMark/>
+          </w:tcPr>
+          <w:p>
+            <w:pPr>
+              <w:ind w:left="0" w:firstLine="0"/>
+              <w:rPr>
+                <w:rFonts w:ascii="Calibri" w:hAnsi="Calibri" w:cs="Calibri"/>
+                <w:lang w:val="en-US" w:eastAsia="en-US"/>
+              </w:rPr>
+            </w:pPr>
+            <w:r>
+              <w:rPr>
+                <w:rFonts w:ascii="Calibri" w:hAnsi="Calibri" w:cs="Calibri"/>
+                <w:lang w:val="en-US" w:eastAsia="en-US"/>
+              </w:rPr>
+              <w:t>Integer</w:t>
+            </w:r>
+          </w:p>
+        </w:tc>
+        <w:tc>
+          <w:tcPr>
+            <w:tcW w:w="0" w:type="auto"/>
+            <w:hideMark/>
+          </w:tcPr>
+          <w:p>
+            <w:pPr>
+              <w:ind w:left="0" w:firstLine="0"/>
+              <w:rPr>
+                <w:rFonts w:ascii="Calibri" w:hAnsi="Calibri" w:cs="Calibri"/>
+                <w:lang w:val="en-US" w:eastAsia="en-US"/>
+              </w:rPr>
+            </w:pPr>
+            <w:r>
+              <w:rPr>
+                <w:rFonts w:ascii="Calibri" w:hAnsi="Calibri" w:cs="Calibri"/>
+                <w:lang w:val="en-US" w:eastAsia="en-US"/>
+              </w:rPr>
+              <w:t>Primary Key, Auto-</w:t>
+            </w:r>
+            <w:proofErr w:type="spellStart"/>
+            <w:r>
+              <w:rPr>
+                <w:rFonts w:ascii="Calibri" w:hAnsi="Calibri" w:cs="Calibri"/>
+                <w:lang w:val="en-US" w:eastAsia="en-US"/>
+              </w:rPr>
+              <w:t>inc</w:t>
+            </w:r>
+            <w:proofErr w:type="spellEnd"/>
+          </w:p>
+        </w:tc>
+        <w:tc>
+          <w:tcPr>
+            <w:tcW w:w="0" w:type="auto"/>
+            <w:hideMark/>
+          </w:tcPr>
+          <w:p>
+            <w:pPr>
+              <w:ind w:left="0" w:firstLine="0"/>
+              <w:rPr>
+                <w:rFonts w:ascii="Calibri" w:hAnsi="Calibri" w:cs="Calibri"/>
+                <w:lang w:val="en-US" w:eastAsia="en-US"/>
+              </w:rPr>
+            </w:pPr>
+            <w:r>
+              <w:rPr>
+                <w:rFonts w:ascii="Calibri" w:hAnsi="Calibri" w:cs="Calibri"/>
+                <w:lang w:val="en-US" w:eastAsia="en-US"/>
+              </w:rPr>
+              <w:t>Unique booking reference.</w:t>
+            </w:r>
+          </w:p>
+        </w:tc>
+      </w:tr>
+      <w:tr>
+        <w:tc>
+          <w:tcPr>
+            <w:tcW w:w="0" w:type="auto"/>
+            <w:hideMark/>
+          </w:tcPr>
+          <w:p>
+            <w:pPr>
+              <w:ind w:left="0" w:firstLine="0"/>
+              <w:rPr>
+                <w:rFonts w:ascii="Calibri" w:hAnsi="Calibri" w:cs="Calibri"/>
+                <w:lang w:val="en-US" w:eastAsia="en-US"/>
+              </w:rPr>
+            </w:pPr>
+          </w:p>
+        </w:tc>
+        <w:tc>
+          <w:tcPr>
+            <w:tcW w:w="0" w:type="auto"/>
+            <w:hideMark/>
+          </w:tcPr>
+          <w:p>
+            <w:pPr>
+              <w:ind w:left="0" w:firstLine="0"/>
+              <w:rPr>
+                <w:rFonts w:ascii="Calibri" w:hAnsi="Calibri" w:cs="Calibri"/>
+                <w:lang w:val="en-US" w:eastAsia="en-US"/>
+              </w:rPr>
+            </w:pPr>
+            <w:proofErr w:type="spellStart"/>
+            <w:r>
+              <w:rPr>
+                <w:rFonts w:ascii="Calibri" w:hAnsi="Calibri" w:cs="Calibri"/>
+                <w:lang w:val="en-US" w:eastAsia="en-US"/>
+              </w:rPr>
+              <w:t>nhs_number</w:t>
+            </w:r>
+            <w:proofErr w:type="spellEnd"/>
+          </w:p>
+        </w:tc>
+        <w:tc>
+          <w:tcPr>
+            <w:tcW w:w="0" w:type="auto"/>
+            <w:hideMark/>
+          </w:tcPr>
+          <w:p>
+            <w:pPr>
+              <w:ind w:left="0" w:firstLine="0"/>
+              <w:rPr>
+                <w:rFonts w:ascii="Calibri" w:hAnsi="Calibri" w:cs="Calibri"/>
+                <w:lang w:val="en-US" w:eastAsia="en-US"/>
+              </w:rPr>
+            </w:pPr>
+            <w:r>
+              <w:rPr>
+                <w:rFonts w:ascii="Calibri" w:hAnsi="Calibri" w:cs="Calibri"/>
+                <w:lang w:val="en-US" w:eastAsia="en-US"/>
+              </w:rPr>
+              <w:t>String (10)</w:t>
+            </w:r>
+          </w:p>
+        </w:tc>
+        <w:tc>
+          <w:tcPr>
+            <w:tcW w:w="0" w:type="auto"/>
+            <w:hideMark/>
+          </w:tcPr>
+          <w:p>
+            <w:pPr>
+              <w:ind w:left="0" w:firstLine="0"/>
+              <w:rPr>
+                <w:rFonts w:ascii="Calibri" w:hAnsi="Calibri" w:cs="Calibri"/>
+                <w:lang w:val="en-US" w:eastAsia="en-US"/>
+              </w:rPr>
+            </w:pPr>
+            <w:r>
+              <w:rPr>
+                <w:rFonts w:ascii="Calibri" w:hAnsi="Calibri" w:cs="Calibri"/>
+                <w:lang w:val="en-US" w:eastAsia="en-US"/>
+              </w:rPr>
+              <w:t>Foreign Key</w:t>
+            </w:r>
+          </w:p>
+        </w:tc>
+        <w:tc>
+          <w:tcPr>
+            <w:tcW w:w="0" w:type="auto"/>
+            <w:hideMark/>
+          </w:tcPr>
+          <w:p>
+            <w:pPr>
+              <w:ind w:left="0" w:firstLine="0"/>
+              <w:rPr>
+                <w:rFonts w:ascii="Calibri" w:hAnsi="Calibri" w:cs="Calibri"/>
+                <w:lang w:val="en-US" w:eastAsia="en-US"/>
+              </w:rPr>
+            </w:pPr>
+            <w:r>
+              <w:rPr>
+                <w:rFonts w:ascii="Calibri" w:hAnsi="Calibri" w:cs="Calibri"/>
+                <w:lang w:val="en-US" w:eastAsia="en-US"/>
+              </w:rPr>
+              <w:t>Reference to the PATIENT entity.</w:t>
+            </w:r>
+          </w:p>
+        </w:tc>
+      </w:tr>
+      <w:tr>
+        <w:tc>
+          <w:tcPr>
+            <w:tcW w:w="0" w:type="auto"/>
+            <w:hideMark/>
+          </w:tcPr>
+          <w:p>
+            <w:pPr>
+              <w:ind w:left="0" w:firstLine="0"/>
+              <w:rPr>
+                <w:rFonts w:ascii="Calibri" w:hAnsi="Calibri" w:cs="Calibri"/>
+                <w:lang w:val="en-US" w:eastAsia="en-US"/>
+              </w:rPr>
+            </w:pPr>
+          </w:p>
+        </w:tc>
+        <w:tc>
+          <w:tcPr>
+            <w:tcW w:w="0" w:type="auto"/>
+            <w:hideMark/>
+          </w:tcPr>
+          <w:p>
+            <w:pPr>
+              <w:ind w:left="0" w:firstLine="0"/>
+              <w:rPr>
+                <w:rFonts w:ascii="Calibri" w:hAnsi="Calibri" w:cs="Calibri"/>
+                <w:lang w:val="en-US" w:eastAsia="en-US"/>
+              </w:rPr>
+            </w:pPr>
+            <w:proofErr w:type="spellStart"/>
+            <w:r>
+              <w:rPr>
+                <w:rFonts w:ascii="Calibri" w:hAnsi="Calibri" w:cs="Calibri"/>
+                <w:lang w:val="en-US" w:eastAsia="en-US"/>
+              </w:rPr>
+              <w:t>slot_time</w:t>
+            </w:r>
+            <w:proofErr w:type="spellEnd"/>
+          </w:p>
+        </w:tc>
+        <w:tc>
+          <w:tcPr>
+            <w:tcW w:w="0" w:type="auto"/>
+            <w:hideMark/>
+          </w:tcPr>
+          <w:p>
+            <w:pPr>
+              <w:ind w:left="0" w:firstLine="0"/>
+              <w:rPr>
+                <w:rFonts w:ascii="Calibri" w:hAnsi="Calibri" w:cs="Calibri"/>
+                <w:lang w:val="en-US" w:eastAsia="en-US"/>
+              </w:rPr>
+            </w:pPr>
+            <w:proofErr w:type="spellStart"/>
+            <w:r>
+              <w:rPr>
+                <w:rFonts w:ascii="Calibri" w:hAnsi="Calibri" w:cs="Calibri"/>
+                <w:lang w:val="en-US" w:eastAsia="en-US"/>
+              </w:rPr>
+              <w:t>DateTime</w:t>
+            </w:r>
+            <w:proofErr w:type="spellEnd"/>
+          </w:p>
+        </w:tc>
+        <w:tc>
+          <w:tcPr>
+            <w:tcW w:w="0" w:type="auto"/>
+            <w:hideMark/>
+          </w:tcPr>
+          <w:p>
+            <w:pPr>
+              <w:ind w:left="0" w:firstLine="0"/>
+              <w:rPr>
+                <w:rFonts w:ascii="Calibri" w:hAnsi="Calibri" w:cs="Calibri"/>
+                <w:lang w:val="en-US" w:eastAsia="en-US"/>
+              </w:rPr>
+            </w:pPr>
+            <w:r>
+              <w:rPr>
+                <w:rFonts w:ascii="Calibri" w:hAnsi="Calibri" w:cs="Calibri"/>
+                <w:lang w:val="en-US" w:eastAsia="en-US"/>
+              </w:rPr>
+              <w:t>Not Null</w:t>
+            </w:r>
+          </w:p>
+        </w:tc>
+        <w:tc>
+          <w:tcPr>
+            <w:tcW w:w="0" w:type="auto"/>
+            <w:hideMark/>
+          </w:tcPr>
+          <w:p>
+            <w:pPr>
+              <w:ind w:left="0" w:firstLine="0"/>
+              <w:rPr>
+                <w:rFonts w:ascii="Calibri" w:hAnsi="Calibri" w:cs="Calibri"/>
+                <w:lang w:val="en-US" w:eastAsia="en-US"/>
+              </w:rPr>
+            </w:pPr>
+            <w:r>
+              <w:rPr>
+                <w:rFonts w:ascii="Calibri" w:hAnsi="Calibri" w:cs="Calibri"/>
+                <w:lang w:val="en-US" w:eastAsia="en-US"/>
+              </w:rPr>
+              <w:t>Scheduled time; must be in the future.</w:t>
+            </w:r>
+          </w:p>
+        </w:tc>
+      </w:tr>
+      <w:tr>
+        <w:tc>
+          <w:tcPr>
+            <w:tcW w:w="0" w:type="auto"/>
+            <w:hideMark/>
+          </w:tcPr>
+          <w:p>
+            <w:pPr>
+              <w:ind w:left="0" w:firstLine="0"/>
+              <w:rPr>
+                <w:rFonts w:ascii="Calibri" w:hAnsi="Calibri" w:cs="Calibri"/>
+                <w:lang w:val="en-US" w:eastAsia="en-US"/>
+              </w:rPr>
+            </w:pPr>
+            <w:r>
+              <w:rPr>
+                <w:rFonts w:ascii="Calibri" w:hAnsi="Calibri" w:cs="Calibri"/>
+                <w:b/>
+                <w:bCs/>
+                <w:lang w:val="en-US" w:eastAsia="en-US"/>
+              </w:rPr>
+              <w:t>MEDICAL_RECORD</w:t>
+            </w:r>
+          </w:p>
+        </w:tc>
+        <w:tc>
+          <w:tcPr>
+            <w:tcW w:w="0" w:type="auto"/>
+            <w:hideMark/>
+          </w:tcPr>
+          <w:p>
+            <w:pPr>
+              <w:ind w:left="0" w:firstLine="0"/>
+              <w:rPr>
+                <w:rFonts w:ascii="Calibri" w:hAnsi="Calibri" w:cs="Calibri"/>
+                <w:lang w:val="en-US" w:eastAsia="en-US"/>
+              </w:rPr>
+            </w:pPr>
+            <w:proofErr w:type="spellStart"/>
+            <w:r>
+              <w:rPr>
+                <w:rFonts w:ascii="Calibri" w:hAnsi="Calibri" w:cs="Calibri"/>
+                <w:lang w:val="en-US" w:eastAsia="en-US"/>
+              </w:rPr>
+              <w:t>record_id</w:t>
+            </w:r>
+            <w:proofErr w:type="spellEnd"/>
+          </w:p>
+        </w:tc>
+        <w:tc>
+          <w:tcPr>
+            <w:tcW w:w="0" w:type="auto"/>
+            <w:hideMark/>
+          </w:tcPr>
+          <w:p>
+            <w:pPr>
+              <w:ind w:left="0" w:firstLine="0"/>
+              <w:rPr>
+                <w:rFonts w:ascii="Calibri" w:hAnsi="Calibri" w:cs="Calibri"/>
+                <w:lang w:val="en-US" w:eastAsia="en-US"/>
+              </w:rPr>
+            </w:pPr>
+            <w:r>
+              <w:rPr>
+                <w:rFonts w:ascii="Calibri" w:hAnsi="Calibri" w:cs="Calibri"/>
+                <w:lang w:val="en-US" w:eastAsia="en-US"/>
+              </w:rPr>
+              <w:t>Integer</w:t>
+            </w:r>
+          </w:p>
+        </w:tc>
+        <w:tc>
+          <w:tcPr>
+            <w:tcW w:w="0" w:type="auto"/>
+            <w:hideMark/>
+          </w:tcPr>
+          <w:p>
+            <w:pPr>
+              <w:ind w:left="0" w:firstLine="0"/>
+              <w:rPr>
+                <w:rFonts w:ascii="Calibri" w:hAnsi="Calibri" w:cs="Calibri"/>
+                <w:lang w:val="en-US" w:eastAsia="en-US"/>
+              </w:rPr>
+            </w:pPr>
+            <w:r>
+              <w:rPr>
+                <w:rFonts w:ascii="Calibri" w:hAnsi="Calibri" w:cs="Calibri"/>
+                <w:lang w:val="en-US" w:eastAsia="en-US"/>
+              </w:rPr>
+              <w:t>Primary Key</w:t>
+            </w:r>
+          </w:p>
+        </w:tc>
+        <w:tc>
+          <w:tcPr>
+            <w:tcW w:w="0" w:type="auto"/>
+            <w:hideMark/>
+          </w:tcPr>
+          <w:p>
+            <w:pPr>
+              <w:ind w:left="0" w:firstLine="0"/>
+              <w:rPr>
+                <w:rFonts w:ascii="Calibri" w:hAnsi="Calibri" w:cs="Calibri"/>
+                <w:lang w:val="en-US" w:eastAsia="en-US"/>
+              </w:rPr>
+            </w:pPr>
+            <w:r>
+              <w:rPr>
+                <w:rFonts w:ascii="Calibri" w:hAnsi="Calibri" w:cs="Calibri"/>
+                <w:lang w:val="en-US" w:eastAsia="en-US"/>
+              </w:rPr>
+              <w:t>Unique clinical entry reference.</w:t>
+            </w:r>
+          </w:p>
+        </w:tc>
+      </w:tr>
+      <w:tr>
+        <w:tc>
+          <w:tcPr>
+            <w:tcW w:w="0" w:type="auto"/>
+            <w:hideMark/>
+          </w:tcPr>
+          <w:p>
+            <w:pPr>
+              <w:ind w:left="0" w:firstLine="0"/>
+              <w:rPr>
+                <w:rFonts w:ascii="Calibri" w:hAnsi="Calibri" w:cs="Calibri"/>
+                <w:lang w:val="en-US" w:eastAsia="en-US"/>
+              </w:rPr>
+            </w:pPr>
+          </w:p>
+        </w:tc>
+        <w:tc>
+          <w:tcPr>
+            <w:tcW w:w="0" w:type="auto"/>
+            <w:hideMark/>
+          </w:tcPr>
+          <w:p>
+            <w:pPr>
+              <w:ind w:left="0" w:firstLine="0"/>
+              <w:rPr>
+                <w:rFonts w:ascii="Calibri" w:hAnsi="Calibri" w:cs="Calibri"/>
+                <w:lang w:val="en-US" w:eastAsia="en-US"/>
+              </w:rPr>
+            </w:pPr>
+            <w:proofErr w:type="spellStart"/>
+            <w:r>
+              <w:rPr>
+                <w:rFonts w:ascii="Calibri" w:hAnsi="Calibri" w:cs="Calibri"/>
+                <w:lang w:val="en-US" w:eastAsia="en-US"/>
+              </w:rPr>
+              <w:t>doctor_id</w:t>
+            </w:r>
+            <w:proofErr w:type="spellEnd"/>
+          </w:p>
+        </w:tc>
+        <w:tc>
+          <w:tcPr>
+            <w:tcW w:w="0" w:type="auto"/>
+            <w:hideMark/>
+          </w:tcPr>
+          <w:p>
+            <w:pPr>
+              <w:ind w:left="0" w:firstLine="0"/>
+              <w:rPr>
+                <w:rFonts w:ascii="Calibri" w:hAnsi="Calibri" w:cs="Calibri"/>
+                <w:lang w:val="en-US" w:eastAsia="en-US"/>
+              </w:rPr>
+            </w:pPr>
+            <w:r>
+              <w:rPr>
+                <w:rFonts w:ascii="Calibri" w:hAnsi="Calibri" w:cs="Calibri"/>
+                <w:lang w:val="en-US" w:eastAsia="en-US"/>
+              </w:rPr>
+              <w:t>String (10)</w:t>
+            </w:r>
+          </w:p>
+        </w:tc>
+        <w:tc>
+          <w:tcPr>
+            <w:tcW w:w="0" w:type="auto"/>
+            <w:hideMark/>
+          </w:tcPr>
+          <w:p>
+            <w:pPr>
+              <w:ind w:left="0" w:firstLine="0"/>
+              <w:rPr>
+                <w:rFonts w:ascii="Calibri" w:hAnsi="Calibri" w:cs="Calibri"/>
+                <w:lang w:val="en-US" w:eastAsia="en-US"/>
+              </w:rPr>
+            </w:pPr>
+            <w:r>
+              <w:rPr>
+                <w:rFonts w:ascii="Calibri" w:hAnsi="Calibri" w:cs="Calibri"/>
+                <w:lang w:val="en-US" w:eastAsia="en-US"/>
+              </w:rPr>
+              <w:t>Foreign Key</w:t>
+            </w:r>
+          </w:p>
+        </w:tc>
+        <w:tc>
+          <w:tcPr>
+            <w:tcW w:w="0" w:type="auto"/>
+            <w:hideMark/>
+          </w:tcPr>
+          <w:p>
+            <w:pPr>
+              <w:ind w:left="0" w:firstLine="0"/>
+              <w:rPr>
+                <w:rFonts w:ascii="Calibri" w:hAnsi="Calibri" w:cs="Calibri"/>
+                <w:lang w:val="en-US" w:eastAsia="en-US"/>
+              </w:rPr>
+            </w:pPr>
+            <w:r>
+              <w:rPr>
+                <w:rFonts w:ascii="Calibri" w:hAnsi="Calibri" w:cs="Calibri"/>
+                <w:lang w:val="en-US" w:eastAsia="en-US"/>
+              </w:rPr>
+              <w:t>Identifies the authoring clinician.</w:t>
+            </w:r>
+          </w:p>
+        </w:tc>
+      </w:tr>
+    </w:tbl>
+    <w:p>
+      <w:pPr>
+        <w:ind w:left="0" w:firstLine="0"/>
+        <w:rPr>
+          <w:rFonts w:ascii="Calibri" w:hAnsi="Calibri" w:cs="Calibri"/>
+          <w:lang w:eastAsia="en-US"/>
+        </w:rPr>
+      </w:pPr>
+    </w:p>
+    <w:p>
+      <w:pPr>
         <w:pStyle w:val="Heading2"/>
         <w:rPr>
           <w:rFonts w:ascii="Calibri" w:hAnsi="Calibri" w:cs="Calibri"/>
@@ -1836,7 +3154,6 @@
           <w:b/>
           <w:bCs/>
         </w:rPr>
-        <w:lastRenderedPageBreak/>
         <w:t>Developer (Me):</w:t>
       </w:r>
       <w:r>
@@ -1969,6 +3286,7 @@
         <w:rPr>
           <w:rFonts w:ascii="Calibri" w:hAnsi="Calibri" w:cs="Calibri"/>
         </w:rPr>
+        <w:lastRenderedPageBreak/>
         <w:t>Acceptance Criteria</w:t>
       </w:r>
     </w:p>
@@ -2353,7 +3671,6 @@
           <w:rFonts w:ascii="Calibri" w:hAnsi="Calibri" w:cs="Calibri"/>
           <w:lang w:val="en-US"/>
         </w:rPr>
-        <w:lastRenderedPageBreak/>
         <w:t xml:space="preserve">The items in the current Sprint Backlog were prioritized based on their </w:t>
       </w:r>
       <w:r>

</xml_diff>

<commit_message>
docs: refine wireframes docs and information architecture for CarePoint HMS, emphasizing functional traceability and accessibility principles
</commit_message>
<xml_diff>
--- a/docs/Sprint 1.docx
+++ b/docs/Sprint 1.docx
@@ -2009,31 +2009,19 @@
         <w:ind w:left="0" w:firstLine="0"/>
         <w:rPr>
           <w:rFonts w:ascii="Calibri" w:hAnsi="Calibri" w:cs="Calibri"/>
-          <w:lang w:eastAsia="en-US"/>
-        </w:rPr>
-      </w:pPr>
-      <w:r>
-        <w:rPr>
-          <w:rFonts w:ascii="Calibri" w:hAnsi="Calibri" w:cs="Calibri"/>
-          <w:lang w:eastAsia="en-US"/>
-        </w:rPr>
-        <w:t xml:space="preserve">As a solo developer operating under a two-sprint Agile framework, I utilized a </w:t>
-      </w:r>
-      <w:r>
-        <w:rPr>
-          <w:rFonts w:ascii="Calibri" w:hAnsi="Calibri" w:cs="Calibri"/>
           <w:b/>
           <w:bCs/>
-          <w:lang w:eastAsia="en-US"/>
-        </w:rPr>
-        <w:t>Low-Fidelity (Lo-Fi) Wireframing</w:t>
-      </w:r>
-      <w:r>
-        <w:rPr>
-          <w:rFonts w:ascii="Calibri" w:hAnsi="Calibri" w:cs="Calibri"/>
-          <w:lang w:eastAsia="en-US"/>
-        </w:rPr>
-        <w:t xml:space="preserve"> approach for Sprint 1. </w:t>
+          <w:lang w:val="en-US" w:eastAsia="en-US"/>
+        </w:rPr>
+      </w:pPr>
+      <w:r>
+        <w:rPr>
+          <w:rFonts w:ascii="Calibri" w:hAnsi="Calibri" w:cs="Calibri"/>
+          <w:b/>
+          <w:bCs/>
+          <w:lang w:val="en-US" w:eastAsia="en-US"/>
+        </w:rPr>
+        <w:t>1. Methodology &amp; Design Philosophy</w:t>
       </w:r>
     </w:p>
     <w:p>
@@ -2041,47 +2029,83 @@
         <w:ind w:left="0" w:firstLine="0"/>
         <w:rPr>
           <w:rFonts w:ascii="Calibri" w:hAnsi="Calibri" w:cs="Calibri"/>
-          <w:lang w:eastAsia="en-US"/>
-        </w:rPr>
-      </w:pPr>
-      <w:r>
-        <w:rPr>
-          <w:rFonts w:ascii="Calibri" w:hAnsi="Calibri" w:cs="Calibri"/>
-          <w:lang w:eastAsia="en-US"/>
-        </w:rPr>
-        <w:t xml:space="preserve">This decision was made to prioritize </w:t>
+          <w:lang w:val="en-US" w:eastAsia="en-US"/>
+        </w:rPr>
+      </w:pPr>
+      <w:r>
+        <w:rPr>
+          <w:rFonts w:ascii="Calibri" w:hAnsi="Calibri" w:cs="Calibri"/>
+          <w:lang w:val="en-US" w:eastAsia="en-US"/>
+        </w:rPr>
+        <w:t xml:space="preserve">As a solo developer, I utilized a </w:t>
       </w:r>
       <w:r>
         <w:rPr>
           <w:rFonts w:ascii="Calibri" w:hAnsi="Calibri" w:cs="Calibri"/>
           <w:b/>
           <w:bCs/>
-          <w:lang w:eastAsia="en-US"/>
-        </w:rPr>
-        <w:t>Functional Traceability</w:t>
-      </w:r>
-      <w:r>
-        <w:rPr>
-          <w:rFonts w:ascii="Calibri" w:hAnsi="Calibri" w:cs="Calibri"/>
-          <w:lang w:eastAsia="en-US"/>
-        </w:rPr>
-        <w:t xml:space="preserve"> over aesthetic finish, ensuring that the User Interface (UI) precisely maps to the attributes defined in the </w:t>
-      </w:r>
+          <w:lang w:val="en-US" w:eastAsia="en-US"/>
+        </w:rPr>
+        <w:t>"Documentation-as-Code" (</w:t>
+      </w:r>
+      <w:proofErr w:type="spellStart"/>
       <w:r>
         <w:rPr>
           <w:rFonts w:ascii="Calibri" w:hAnsi="Calibri" w:cs="Calibri"/>
           <w:b/>
           <w:bCs/>
-          <w:lang w:eastAsia="en-US"/>
-        </w:rPr>
-        <w:t>Logical Data Model (LDM)</w:t>
-      </w:r>
-      <w:r>
-        <w:rPr>
-          <w:rFonts w:ascii="Calibri" w:hAnsi="Calibri" w:cs="Calibri"/>
-          <w:lang w:eastAsia="en-US"/>
-        </w:rPr>
-        <w:t xml:space="preserve">. </w:t>
+          <w:lang w:val="en-US" w:eastAsia="en-US"/>
+        </w:rPr>
+        <w:t>DaC</w:t>
+      </w:r>
+      <w:proofErr w:type="spellEnd"/>
+      <w:r>
+        <w:rPr>
+          <w:rFonts w:ascii="Calibri" w:hAnsi="Calibri" w:cs="Calibri"/>
+          <w:b/>
+          <w:bCs/>
+          <w:lang w:val="en-US" w:eastAsia="en-US"/>
+        </w:rPr>
+        <w:t>)</w:t>
+      </w:r>
+      <w:r>
+        <w:rPr>
+          <w:rFonts w:ascii="Calibri" w:hAnsi="Calibri" w:cs="Calibri"/>
+          <w:lang w:val="en-US" w:eastAsia="en-US"/>
+        </w:rPr>
+        <w:t xml:space="preserve"> approach to wireframing. To ensure a </w:t>
+      </w:r>
+      <w:r>
+        <w:rPr>
+          <w:rFonts w:ascii="Calibri" w:hAnsi="Calibri" w:cs="Calibri"/>
+          <w:b/>
+          <w:bCs/>
+          <w:lang w:val="en-US" w:eastAsia="en-US"/>
+        </w:rPr>
+        <w:t>100% Functional Traceability Matrix</w:t>
+      </w:r>
+      <w:r>
+        <w:rPr>
+          <w:rFonts w:ascii="Calibri" w:hAnsi="Calibri" w:cs="Calibri"/>
+          <w:lang w:val="en-US" w:eastAsia="en-US"/>
+        </w:rPr>
+        <w:t xml:space="preserve">, the user interface was designed only after </w:t>
+      </w:r>
+      <w:r>
+        <w:rPr>
+          <w:rFonts w:ascii="Calibri" w:hAnsi="Calibri" w:cs="Calibri"/>
+          <w:b/>
+          <w:bCs/>
+          <w:lang w:val="en-US" w:eastAsia="en-US"/>
+        </w:rPr>
+        <w:t>the Logical Data Model (LDM)</w:t>
+      </w:r>
+      <w:r>
+        <w:rPr>
+          <w:rFonts w:ascii="Calibri" w:hAnsi="Calibri" w:cs="Calibri"/>
+          <w:lang w:val="en-US" w:eastAsia="en-US"/>
+        </w:rPr>
+        <w:t xml:space="preserve"> was finalized. By prioritizing skeletal logic over aesthetic finish in Sprint 1, I have established a technical blueprint that guarantees every UI input field maps directly to a verified database attribute.</w:t>
       </w:r>
     </w:p>
     <w:p>
@@ -2089,67 +2113,98 @@
         <w:ind w:left="0" w:firstLine="0"/>
         <w:rPr>
           <w:rFonts w:ascii="Calibri" w:hAnsi="Calibri" w:cs="Calibri"/>
-          <w:lang w:eastAsia="en-US"/>
-        </w:rPr>
-      </w:pPr>
-      <w:r>
-        <w:rPr>
-          <w:rFonts w:ascii="Calibri" w:hAnsi="Calibri" w:cs="Calibri"/>
-          <w:lang w:eastAsia="en-US"/>
-        </w:rPr>
-        <w:t xml:space="preserve">By following the </w:t>
+          <w:lang w:val="en-US" w:eastAsia="en-US"/>
+        </w:rPr>
+      </w:pPr>
+      <w:r>
+        <w:rPr>
+          <w:rFonts w:ascii="Calibri" w:hAnsi="Calibri" w:cs="Calibri"/>
+          <w:lang w:val="en-US" w:eastAsia="en-US"/>
+        </w:rPr>
+        <w:t xml:space="preserve">The interface strictly adheres to the </w:t>
       </w:r>
       <w:r>
         <w:rPr>
           <w:rFonts w:ascii="Calibri" w:hAnsi="Calibri" w:cs="Calibri"/>
           <w:b/>
           <w:bCs/>
-          <w:lang w:eastAsia="en-US"/>
+          <w:lang w:val="en-US" w:eastAsia="en-US"/>
         </w:rPr>
         <w:t>NHS Digital Service Manual</w:t>
       </w:r>
       <w:r>
         <w:rPr>
           <w:rFonts w:ascii="Calibri" w:hAnsi="Calibri" w:cs="Calibri"/>
-          <w:lang w:eastAsia="en-US"/>
-        </w:rPr>
-        <w:t xml:space="preserve">'s focus on accessibility and high contrast, these mock-ups serve as the technical blueprint for the </w:t>
-      </w:r>
-      <w:proofErr w:type="spellStart"/>
-      <w:r>
-        <w:rPr>
-          <w:rFonts w:ascii="Calibri" w:hAnsi="Calibri" w:cs="Calibri"/>
-          <w:lang w:eastAsia="en-US"/>
-        </w:rPr>
-        <w:t>SvelteKit</w:t>
-      </w:r>
-      <w:proofErr w:type="spellEnd"/>
-      <w:r>
-        <w:rPr>
-          <w:rFonts w:ascii="Calibri" w:hAnsi="Calibri" w:cs="Calibri"/>
-          <w:lang w:eastAsia="en-US"/>
-        </w:rPr>
-        <w:t xml:space="preserve"> implementation in Sprint 2.</w:t>
+          <w:lang w:val="en-US" w:eastAsia="en-US"/>
+        </w:rPr>
+        <w:t xml:space="preserve"> principles:</w:t>
       </w:r>
     </w:p>
     <w:p>
       <w:pPr>
-        <w:ind w:left="0" w:firstLine="0"/>
-        <w:rPr>
-          <w:rFonts w:ascii="Calibri" w:hAnsi="Calibri" w:cs="Calibri"/>
-          <w:lang w:eastAsia="en-US"/>
-        </w:rPr>
-      </w:pPr>
+        <w:numPr>
+          <w:ilvl w:val="0"/>
+          <w:numId w:val="23"/>
+        </w:numPr>
+        <w:rPr>
+          <w:rFonts w:ascii="Calibri" w:hAnsi="Calibri" w:cs="Calibri"/>
+          <w:lang w:val="en-US" w:eastAsia="en-US"/>
+        </w:rPr>
+      </w:pPr>
+      <w:r>
+        <w:rPr>
+          <w:rFonts w:ascii="Calibri" w:hAnsi="Calibri" w:cs="Calibri"/>
+          <w:b/>
+          <w:bCs/>
+          <w:lang w:val="en-US" w:eastAsia="en-US"/>
+        </w:rPr>
+        <w:t xml:space="preserve">Accessibility (NFR3): </w:t>
+      </w:r>
+      <w:r>
+        <w:rPr>
+          <w:rFonts w:ascii="Calibri" w:hAnsi="Calibri" w:cs="Calibri"/>
+          <w:lang w:val="en-US" w:eastAsia="en-US"/>
+        </w:rPr>
+        <w:t>High-contrast elements and clear typography to support diverse patient demographics.</w:t>
+      </w:r>
     </w:p>
     <w:p>
       <w:pPr>
-        <w:ind w:left="0" w:firstLine="0"/>
+        <w:numPr>
+          <w:ilvl w:val="0"/>
+          <w:numId w:val="23"/>
+        </w:numPr>
+        <w:rPr>
+          <w:rFonts w:ascii="Calibri" w:hAnsi="Calibri" w:cs="Calibri"/>
+          <w:lang w:val="en-US" w:eastAsia="en-US"/>
+        </w:rPr>
+      </w:pPr>
+      <w:r>
         <w:rPr>
           <w:rFonts w:ascii="Calibri" w:hAnsi="Calibri" w:cs="Calibri"/>
           <w:b/>
           <w:bCs/>
-          <w:u w:val="single"/>
-          <w:lang w:eastAsia="en-US"/>
+          <w:lang w:val="en-US" w:eastAsia="en-US"/>
+        </w:rPr>
+        <w:t xml:space="preserve">Mobile-First (NFR3): </w:t>
+      </w:r>
+      <w:r>
+        <w:rPr>
+          <w:rFonts w:ascii="Calibri" w:hAnsi="Calibri" w:cs="Calibri"/>
+          <w:lang w:val="en-US" w:eastAsia="en-US"/>
+        </w:rPr>
+        <w:t>Simplified, responsive layouts to reduce cognitive load and administrative friction.</w:t>
+      </w:r>
+    </w:p>
+    <w:p>
+      <w:pPr>
+        <w:numPr>
+          <w:ilvl w:val="0"/>
+          <w:numId w:val="23"/>
+        </w:numPr>
+        <w:rPr>
+          <w:rFonts w:ascii="Calibri" w:hAnsi="Calibri" w:cs="Calibri"/>
+          <w:lang w:val="en-US" w:eastAsia="en-US"/>
         </w:rPr>
       </w:pPr>
       <w:r>
@@ -2157,19 +2212,288 @@
           <w:rFonts w:ascii="Calibri" w:hAnsi="Calibri" w:cs="Calibri"/>
           <w:b/>
           <w:bCs/>
-          <w:u w:val="single"/>
-          <w:lang w:eastAsia="en-US"/>
-        </w:rPr>
-        <w:t>Information Architecture</w:t>
+          <w:lang w:val="en-US" w:eastAsia="en-US"/>
+        </w:rPr>
+        <w:t xml:space="preserve">Security (NFR1): </w:t>
+      </w:r>
+      <w:r>
+        <w:rPr>
+          <w:rFonts w:ascii="Calibri" w:hAnsi="Calibri" w:cs="Calibri"/>
+          <w:lang w:val="en-US" w:eastAsia="en-US"/>
+        </w:rPr>
+        <w:t>Use of server-side hooks to ensure "seamless data retrieval" remains protected during patient sessions.</w:t>
       </w:r>
     </w:p>
     <w:p>
       <w:pPr>
+        <w:rPr>
+          <w:rFonts w:ascii="Calibri" w:hAnsi="Calibri" w:cs="Calibri"/>
+          <w:b/>
+          <w:bCs/>
+          <w:lang w:val="en-US" w:eastAsia="en-US"/>
+        </w:rPr>
+      </w:pPr>
+    </w:p>
+    <w:p>
+      <w:pPr>
         <w:ind w:left="0" w:firstLine="0"/>
         <w:rPr>
           <w:rFonts w:ascii="Calibri" w:hAnsi="Calibri" w:cs="Calibri"/>
-          <w:u w:val="single"/>
+          <w:b/>
+          <w:bCs/>
+          <w:lang w:val="en-US" w:eastAsia="en-US"/>
+        </w:rPr>
+      </w:pPr>
+      <w:r>
+        <w:rPr>
+          <w:rFonts w:ascii="Calibri" w:hAnsi="Calibri" w:cs="Calibri"/>
+          <w:b/>
+          <w:bCs/>
+          <w:lang w:val="en-US" w:eastAsia="en-US"/>
+        </w:rPr>
+        <w:t>2. Tool Selection &amp; Version Ownership</w:t>
+      </w:r>
+    </w:p>
+    <w:p>
+      <w:pPr>
+        <w:ind w:left="0" w:firstLine="0"/>
+        <w:rPr>
+          <w:rFonts w:ascii="Calibri" w:hAnsi="Calibri" w:cs="Calibri"/>
+          <w:lang w:val="en-US" w:eastAsia="en-US"/>
+        </w:rPr>
+      </w:pPr>
+      <w:r>
+        <w:rPr>
+          <w:rFonts w:ascii="Calibri" w:hAnsi="Calibri" w:cs="Calibri"/>
+          <w:lang w:val="en-US" w:eastAsia="en-US"/>
+        </w:rPr>
+        <w:t xml:space="preserve">For the implementation of these digital artefacts, </w:t>
+      </w:r>
+      <w:r>
+        <w:rPr>
+          <w:rFonts w:ascii="Calibri" w:hAnsi="Calibri" w:cs="Calibri"/>
+          <w:b/>
+          <w:bCs/>
+          <w:lang w:val="en-US" w:eastAsia="en-US"/>
+        </w:rPr>
+        <w:t>Tailwind CSS and HTML</w:t>
+      </w:r>
+      <w:r>
+        <w:rPr>
+          <w:rFonts w:ascii="Calibri" w:hAnsi="Calibri" w:cs="Calibri"/>
+          <w:lang w:val="en-US" w:eastAsia="en-US"/>
+        </w:rPr>
+        <w:t xml:space="preserve"> were chosen over traditional static mockup tools. This strategy was adopted for three primary reasons:</w:t>
+      </w:r>
+    </w:p>
+    <w:p>
+      <w:pPr>
+        <w:numPr>
+          <w:ilvl w:val="0"/>
+          <w:numId w:val="24"/>
+        </w:numPr>
+        <w:rPr>
+          <w:rFonts w:ascii="Calibri" w:hAnsi="Calibri" w:cs="Calibri"/>
+          <w:lang w:val="en-US" w:eastAsia="en-US"/>
+        </w:rPr>
+      </w:pPr>
+      <w:r>
+        <w:rPr>
+          <w:rFonts w:ascii="Calibri" w:hAnsi="Calibri" w:cs="Calibri"/>
+          <w:b/>
+          <w:bCs/>
+          <w:lang w:val="en-US" w:eastAsia="en-US"/>
+        </w:rPr>
+        <w:t xml:space="preserve">Efficiency: </w:t>
+      </w:r>
+      <w:r>
+        <w:rPr>
+          <w:rFonts w:ascii="Calibri" w:hAnsi="Calibri" w:cs="Calibri"/>
+          <w:lang w:val="en-US" w:eastAsia="en-US"/>
+        </w:rPr>
+        <w:t xml:space="preserve">As a solo developer, using a known utility-first library like Tailwind allows for the most rapid transition from conceptual requirement to a functional </w:t>
+      </w:r>
+      <w:proofErr w:type="spellStart"/>
+      <w:r>
+        <w:rPr>
+          <w:rFonts w:ascii="Calibri" w:hAnsi="Calibri" w:cs="Calibri"/>
+          <w:lang w:val="en-US" w:eastAsia="en-US"/>
+        </w:rPr>
+        <w:t>SvelteKit</w:t>
+      </w:r>
+      <w:proofErr w:type="spellEnd"/>
+      <w:r>
+        <w:rPr>
+          <w:rFonts w:ascii="Calibri" w:hAnsi="Calibri" w:cs="Calibri"/>
+          <w:lang w:val="en-US" w:eastAsia="en-US"/>
+        </w:rPr>
+        <w:t xml:space="preserve"> build.</w:t>
+      </w:r>
+    </w:p>
+    <w:p>
+      <w:pPr>
+        <w:numPr>
+          <w:ilvl w:val="0"/>
+          <w:numId w:val="24"/>
+        </w:numPr>
+        <w:rPr>
+          <w:rFonts w:ascii="Calibri" w:hAnsi="Calibri" w:cs="Calibri"/>
+          <w:lang w:val="en-US" w:eastAsia="en-US"/>
+        </w:rPr>
+      </w:pPr>
+      <w:r>
+        <w:rPr>
+          <w:rFonts w:ascii="Calibri" w:hAnsi="Calibri" w:cs="Calibri"/>
+          <w:b/>
+          <w:bCs/>
+          <w:lang w:val="en-US" w:eastAsia="en-US"/>
+        </w:rPr>
+        <w:t xml:space="preserve">Version Ownership: </w:t>
+      </w:r>
+      <w:r>
+        <w:rPr>
+          <w:rFonts w:ascii="Calibri" w:hAnsi="Calibri" w:cs="Calibri"/>
+          <w:lang w:val="en-US" w:eastAsia="en-US"/>
+        </w:rPr>
+        <w:t>By defining screens in code, the entire design process is integrated directly into the GitHub repository. This provides a transparent audit trail of iterative improvements and proves direct ownership of the technical implementation.</w:t>
+      </w:r>
+    </w:p>
+    <w:p>
+      <w:pPr>
+        <w:numPr>
+          <w:ilvl w:val="0"/>
+          <w:numId w:val="24"/>
+        </w:numPr>
+        <w:rPr>
+          <w:rFonts w:ascii="Calibri" w:hAnsi="Calibri" w:cs="Calibri"/>
+          <w:lang w:val="en-US" w:eastAsia="en-US"/>
+        </w:rPr>
+      </w:pPr>
+      <w:r>
+        <w:rPr>
+          <w:rFonts w:ascii="Calibri" w:hAnsi="Calibri" w:cs="Calibri"/>
+          <w:b/>
+          <w:bCs/>
+          <w:lang w:val="en-US" w:eastAsia="en-US"/>
+        </w:rPr>
+        <w:t xml:space="preserve">Technical Blueprinting: </w:t>
+      </w:r>
+      <w:r>
+        <w:rPr>
+          <w:rFonts w:ascii="Calibri" w:hAnsi="Calibri" w:cs="Calibri"/>
+          <w:lang w:val="en-US" w:eastAsia="en-US"/>
+        </w:rPr>
+        <w:t>These mock-ups serve as the literal technical blueprint for the Sprint 2 implementation, ensuring that the layout is functionally achievable within the target framework.</w:t>
+      </w:r>
+    </w:p>
+    <w:p>
+      <w:pPr>
+        <w:ind w:left="0" w:firstLine="0"/>
+        <w:rPr>
+          <w:rFonts w:ascii="Calibri" w:hAnsi="Calibri" w:cs="Calibri"/>
           <w:lang w:eastAsia="en-US"/>
+        </w:rPr>
+      </w:pPr>
+    </w:p>
+    <w:p>
+      <w:pPr>
+        <w:ind w:left="0" w:firstLine="0"/>
+        <w:rPr>
+          <w:rFonts w:ascii="Calibri" w:hAnsi="Calibri" w:cs="Calibri"/>
+          <w:b/>
+          <w:bCs/>
+          <w:lang w:val="en-US" w:eastAsia="en-US"/>
+        </w:rPr>
+      </w:pPr>
+      <w:r>
+        <w:rPr>
+          <w:rFonts w:ascii="Calibri" w:hAnsi="Calibri" w:cs="Calibri"/>
+          <w:b/>
+          <w:bCs/>
+          <w:lang w:val="en-US" w:eastAsia="en-US"/>
+        </w:rPr>
+        <w:t>3</w:t>
+      </w:r>
+      <w:r>
+        <w:rPr>
+          <w:rFonts w:ascii="Calibri" w:hAnsi="Calibri" w:cs="Calibri"/>
+          <w:b/>
+          <w:bCs/>
+          <w:lang w:val="en-US" w:eastAsia="en-US"/>
+        </w:rPr>
+        <w:t>. Information Architecture (IA)</w:t>
+      </w:r>
+    </w:p>
+    <w:p>
+      <w:pPr>
+        <w:ind w:left="0" w:firstLine="0"/>
+        <w:rPr>
+          <w:rFonts w:ascii="Calibri" w:hAnsi="Calibri" w:cs="Calibri"/>
+          <w:lang w:val="en-US" w:eastAsia="en-US"/>
+        </w:rPr>
+      </w:pPr>
+      <w:r>
+        <w:rPr>
+          <w:rFonts w:ascii="Calibri" w:hAnsi="Calibri" w:cs="Calibri"/>
+          <w:lang w:val="en-US" w:eastAsia="en-US"/>
+        </w:rPr>
+        <w:t xml:space="preserve">The </w:t>
+      </w:r>
+      <w:r>
+        <w:rPr>
+          <w:rFonts w:ascii="Calibri" w:hAnsi="Calibri" w:cs="Calibri"/>
+          <w:b/>
+          <w:bCs/>
+          <w:lang w:val="en-US" w:eastAsia="en-US"/>
+        </w:rPr>
+        <w:t>Information Architecture</w:t>
+      </w:r>
+      <w:r>
+        <w:rPr>
+          <w:rFonts w:ascii="Calibri" w:hAnsi="Calibri" w:cs="Calibri"/>
+          <w:lang w:val="en-US" w:eastAsia="en-US"/>
+        </w:rPr>
+        <w:t xml:space="preserve"> specifies the structural flow and hierarchy of the </w:t>
+      </w:r>
+      <w:r>
+        <w:rPr>
+          <w:rFonts w:ascii="Calibri" w:hAnsi="Calibri" w:cs="Calibri"/>
+          <w:b/>
+          <w:bCs/>
+          <w:lang w:val="en-US" w:eastAsia="en-US"/>
+        </w:rPr>
+        <w:t>CarePoint HMS</w:t>
+      </w:r>
+      <w:r>
+        <w:rPr>
+          <w:rFonts w:ascii="Calibri" w:hAnsi="Calibri" w:cs="Calibri"/>
+          <w:lang w:val="en-US" w:eastAsia="en-US"/>
+        </w:rPr>
+        <w:t xml:space="preserve">. It establishes </w:t>
+      </w:r>
+      <w:proofErr w:type="gramStart"/>
+      <w:r>
+        <w:rPr>
+          <w:rFonts w:ascii="Calibri" w:hAnsi="Calibri" w:cs="Calibri"/>
+          <w:lang w:val="en-US" w:eastAsia="en-US"/>
+        </w:rPr>
+        <w:t>the system</w:t>
+      </w:r>
+      <w:proofErr w:type="gramEnd"/>
+      <w:r>
+        <w:rPr>
+          <w:rFonts w:ascii="Calibri" w:hAnsi="Calibri" w:cs="Calibri"/>
+          <w:lang w:val="en-US" w:eastAsia="en-US"/>
+        </w:rPr>
+        <w:t xml:space="preserve"> boundaries and ensures that the user journey is optimized for the "patient-centric" self-service model.</w:t>
+      </w:r>
+    </w:p>
+    <w:p>
+      <w:pPr>
+        <w:ind w:left="0" w:firstLine="0"/>
+        <w:rPr>
+          <w:rFonts w:ascii="Calibri" w:hAnsi="Calibri" w:cs="Calibri"/>
+          <w:lang w:val="en-US" w:eastAsia="en-US"/>
         </w:rPr>
       </w:pPr>
       <w:r>
@@ -2179,8 +2503,9 @@
           <w:u w:val="single"/>
           <w:lang w:eastAsia="en-US"/>
         </w:rPr>
+        <w:lastRenderedPageBreak/>
         <w:drawing>
-          <wp:inline distT="0" distB="0" distL="0" distR="0" wp14:anchorId="115E2FF1" wp14:editId="7E3F166F">
+          <wp:inline distT="0" distB="0" distL="0" distR="0" wp14:anchorId="24C7FC8A" wp14:editId="272FEE0F">
             <wp:extent cx="5934075" cy="2876550"/>
             <wp:effectExtent l="0" t="0" r="9525" b="0"/>
             <wp:docPr id="1254457929" name="Picture 3"/>
@@ -2234,998 +2559,1756 @@
         <w:ind w:left="0" w:firstLine="0"/>
         <w:rPr>
           <w:rFonts w:ascii="Calibri" w:hAnsi="Calibri" w:cs="Calibri"/>
-          <w:lang w:eastAsia="en-US"/>
-        </w:rPr>
-      </w:pPr>
+          <w:lang w:val="en-US" w:eastAsia="en-US"/>
+        </w:rPr>
+      </w:pPr>
+      <w:r>
+        <w:rPr>
+          <w:rFonts w:ascii="Calibri" w:hAnsi="Calibri" w:cs="Calibri"/>
+          <w:lang w:val="en-US" w:eastAsia="en-US"/>
+        </w:rPr>
+        <w:t xml:space="preserve">The IA maps the primary navigation paths from the </w:t>
+      </w:r>
+      <w:r>
+        <w:rPr>
+          <w:rFonts w:ascii="Calibri" w:hAnsi="Calibri" w:cs="Calibri"/>
+          <w:b/>
+          <w:bCs/>
+          <w:lang w:val="en-US" w:eastAsia="en-US"/>
+        </w:rPr>
+        <w:t>Secure Login</w:t>
+      </w:r>
+      <w:r>
+        <w:rPr>
+          <w:rFonts w:ascii="Calibri" w:hAnsi="Calibri" w:cs="Calibri"/>
+          <w:lang w:val="en-US" w:eastAsia="en-US"/>
+        </w:rPr>
+        <w:t xml:space="preserve"> gatekeeper to the core modules of the system. It ensures that Patient, Doctor, and Admin actors can access their respective functional areas efficiently.</w:t>
+      </w:r>
     </w:p>
     <w:p>
       <w:pPr>
         <w:ind w:left="0" w:firstLine="0"/>
         <w:rPr>
           <w:rFonts w:ascii="Calibri" w:hAnsi="Calibri" w:cs="Calibri"/>
+          <w:lang w:eastAsia="en-US"/>
+        </w:rPr>
+      </w:pPr>
+    </w:p>
+    <w:p>
+      <w:pPr>
+        <w:ind w:left="0" w:firstLine="0"/>
+        <w:rPr>
+          <w:rFonts w:ascii="Calibri" w:hAnsi="Calibri" w:cs="Calibri"/>
+          <w:b/>
+          <w:bCs/>
+          <w:lang w:val="en-US" w:eastAsia="en-US"/>
+        </w:rPr>
+      </w:pPr>
+      <w:r>
+        <w:rPr>
+          <w:rFonts w:ascii="Calibri" w:hAnsi="Calibri" w:cs="Calibri"/>
+          <w:b/>
+          <w:bCs/>
+          <w:lang w:val="en-US" w:eastAsia="en-US"/>
+        </w:rPr>
+        <w:t>3. Technical Screen Specifications</w:t>
+      </w:r>
+    </w:p>
+    <w:p>
+      <w:pPr>
+        <w:ind w:left="0" w:firstLine="0"/>
+        <w:rPr>
+          <w:rFonts w:ascii="Calibri" w:hAnsi="Calibri" w:cs="Calibri"/>
+          <w:lang w:val="en-US" w:eastAsia="en-US"/>
+        </w:rPr>
+      </w:pPr>
+      <w:r>
+        <w:rPr>
+          <w:rFonts w:ascii="Calibri" w:hAnsi="Calibri" w:cs="Calibri"/>
+          <w:lang w:val="en-US" w:eastAsia="en-US"/>
+        </w:rPr>
+        <w:t xml:space="preserve">The following screens follow the </w:t>
+      </w:r>
+      <w:r>
+        <w:rPr>
+          <w:rFonts w:ascii="Calibri" w:hAnsi="Calibri" w:cs="Calibri"/>
+          <w:b/>
+          <w:bCs/>
+          <w:lang w:val="en-US" w:eastAsia="en-US"/>
+        </w:rPr>
+        <w:t>NHS Digital Service Manual</w:t>
+      </w:r>
+      <w:r>
+        <w:rPr>
+          <w:rFonts w:ascii="Calibri" w:hAnsi="Calibri" w:cs="Calibri"/>
+          <w:lang w:val="en-US" w:eastAsia="en-US"/>
+        </w:rPr>
+        <w:t xml:space="preserve"> principles: high contrast, clear typography, and a mobile-first layout to ensure accessibility and usability.</w:t>
+      </w:r>
+    </w:p>
+    <w:p>
+      <w:pPr>
+        <w:ind w:left="0" w:firstLine="0"/>
+        <w:rPr>
+          <w:rFonts w:ascii="Calibri" w:hAnsi="Calibri" w:cs="Calibri"/>
+          <w:b/>
+          <w:bCs/>
+          <w:lang w:val="en-US" w:eastAsia="en-US"/>
+        </w:rPr>
+      </w:pPr>
+    </w:p>
+    <w:p>
+      <w:pPr>
+        <w:ind w:left="0" w:firstLine="0"/>
+        <w:rPr>
+          <w:rFonts w:ascii="Calibri" w:hAnsi="Calibri" w:cs="Calibri"/>
+          <w:b/>
+          <w:bCs/>
+          <w:lang w:val="en-US" w:eastAsia="en-US"/>
+        </w:rPr>
+      </w:pPr>
+      <w:r>
+        <w:rPr>
+          <w:rFonts w:ascii="Calibri" w:hAnsi="Calibri" w:cs="Calibri"/>
+          <w:b/>
+          <w:bCs/>
+          <w:lang w:val="en-US" w:eastAsia="en-US"/>
+        </w:rPr>
+        <w:t>Screen 1: Secure Login (FR1)</w:t>
+      </w:r>
+    </w:p>
+    <w:p>
+      <w:pPr>
+        <w:numPr>
+          <w:ilvl w:val="0"/>
+          <w:numId w:val="18"/>
+        </w:numPr>
+        <w:rPr>
+          <w:rFonts w:ascii="Calibri" w:hAnsi="Calibri" w:cs="Calibri"/>
+          <w:lang w:val="en-US" w:eastAsia="en-US"/>
+        </w:rPr>
+      </w:pPr>
+      <w:r>
+        <w:rPr>
+          <w:rFonts w:ascii="Calibri" w:hAnsi="Calibri" w:cs="Calibri"/>
+          <w:b/>
+          <w:bCs/>
+          <w:lang w:val="en-US" w:eastAsia="en-US"/>
+        </w:rPr>
+        <w:t>Purpose:</w:t>
+      </w:r>
+      <w:r>
+        <w:rPr>
+          <w:rFonts w:ascii="Calibri" w:hAnsi="Calibri" w:cs="Calibri"/>
+          <w:lang w:val="en-US" w:eastAsia="en-US"/>
+        </w:rPr>
+        <w:t xml:space="preserve"> The primary secure gateway to the clinical system.</w:t>
+      </w:r>
+    </w:p>
+    <w:p>
+      <w:pPr>
+        <w:numPr>
+          <w:ilvl w:val="0"/>
+          <w:numId w:val="18"/>
+        </w:numPr>
+        <w:rPr>
+          <w:rFonts w:ascii="Calibri" w:hAnsi="Calibri" w:cs="Calibri"/>
+          <w:lang w:val="en-US" w:eastAsia="en-US"/>
+        </w:rPr>
+      </w:pPr>
+      <w:r>
+        <w:rPr>
+          <w:rFonts w:ascii="Calibri" w:hAnsi="Calibri" w:cs="Calibri"/>
+          <w:b/>
+          <w:bCs/>
+          <w:lang w:val="en-US" w:eastAsia="en-US"/>
+        </w:rPr>
+        <w:t>Key Components:</w:t>
+      </w:r>
+      <w:r>
+        <w:rPr>
+          <w:rFonts w:ascii="Calibri" w:hAnsi="Calibri" w:cs="Calibri"/>
+          <w:lang w:val="en-US" w:eastAsia="en-US"/>
+        </w:rPr>
+        <w:t xml:space="preserve"> NHS branding for trust, secure input fields for credentials, and clear error messaging placeholders.</w:t>
+      </w:r>
+    </w:p>
+    <w:p>
+      <w:pPr>
+        <w:ind w:left="0" w:firstLine="0"/>
+        <w:rPr>
+          <w:rFonts w:ascii="Calibri" w:hAnsi="Calibri" w:cs="Calibri"/>
+          <w:lang w:val="en-US" w:eastAsia="en-US"/>
+        </w:rPr>
+      </w:pPr>
+      <w:r>
+        <w:rPr>
+          <w:rFonts w:ascii="Calibri" w:hAnsi="Calibri" w:cs="Calibri"/>
+          <w:b/>
+          <w:bCs/>
+          <w:lang w:val="en-US" w:eastAsia="en-US"/>
+        </w:rPr>
+        <w:t>[INSERT SCREENSHOT: 1_FR1.html here]</w:t>
+      </w:r>
+    </w:p>
+    <w:tbl>
+      <w:tblPr>
+        <w:tblStyle w:val="TableGrid"/>
+        <w:tblW w:w="0" w:type="auto"/>
+        <w:tblLook w:val="04A0" w:firstRow="1" w:lastRow="0" w:firstColumn="1" w:lastColumn="0" w:noHBand="0" w:noVBand="1"/>
+      </w:tblPr>
+      <w:tblGrid>
+        <w:gridCol w:w="1798"/>
+        <w:gridCol w:w="2167"/>
+        <w:gridCol w:w="5385"/>
+      </w:tblGrid>
+      <w:tr>
+        <w:tc>
+          <w:tcPr>
+            <w:tcW w:w="0" w:type="auto"/>
+            <w:hideMark/>
+          </w:tcPr>
+          <w:p>
+            <w:pPr>
+              <w:ind w:left="0" w:firstLine="0"/>
+              <w:rPr>
+                <w:rFonts w:ascii="Calibri" w:hAnsi="Calibri" w:cs="Calibri"/>
+                <w:lang w:val="en-US" w:eastAsia="en-US"/>
+              </w:rPr>
+            </w:pPr>
+            <w:r>
+              <w:rPr>
+                <w:rFonts w:ascii="Calibri" w:hAnsi="Calibri" w:cs="Calibri"/>
+                <w:b/>
+                <w:bCs/>
+                <w:lang w:val="en-US" w:eastAsia="en-US"/>
+              </w:rPr>
+              <w:t>Component ID</w:t>
+            </w:r>
+          </w:p>
+        </w:tc>
+        <w:tc>
+          <w:tcPr>
+            <w:tcW w:w="0" w:type="auto"/>
+            <w:hideMark/>
+          </w:tcPr>
+          <w:p>
+            <w:pPr>
+              <w:ind w:left="0" w:firstLine="0"/>
+              <w:rPr>
+                <w:rFonts w:ascii="Calibri" w:hAnsi="Calibri" w:cs="Calibri"/>
+                <w:lang w:val="en-US" w:eastAsia="en-US"/>
+              </w:rPr>
+            </w:pPr>
+            <w:r>
+              <w:rPr>
+                <w:rFonts w:ascii="Calibri" w:hAnsi="Calibri" w:cs="Calibri"/>
+                <w:b/>
+                <w:bCs/>
+                <w:lang w:val="en-US" w:eastAsia="en-US"/>
+              </w:rPr>
+              <w:t xml:space="preserve">LDM Mapping </w:t>
+            </w:r>
+          </w:p>
+        </w:tc>
+        <w:tc>
+          <w:tcPr>
+            <w:tcW w:w="0" w:type="auto"/>
+            <w:hideMark/>
+          </w:tcPr>
+          <w:p>
+            <w:pPr>
+              <w:ind w:left="0" w:firstLine="0"/>
+              <w:rPr>
+                <w:rFonts w:ascii="Calibri" w:hAnsi="Calibri" w:cs="Calibri"/>
+                <w:lang w:val="en-US" w:eastAsia="en-US"/>
+              </w:rPr>
+            </w:pPr>
+            <w:r>
+              <w:rPr>
+                <w:rFonts w:ascii="Calibri" w:hAnsi="Calibri" w:cs="Calibri"/>
+                <w:b/>
+                <w:bCs/>
+                <w:lang w:val="en-US" w:eastAsia="en-US"/>
+              </w:rPr>
+              <w:t>Engineering Logic / Traceability</w:t>
+            </w:r>
+          </w:p>
+        </w:tc>
+      </w:tr>
+      <w:tr>
+        <w:tc>
+          <w:tcPr>
+            <w:tcW w:w="0" w:type="auto"/>
+            <w:hideMark/>
+          </w:tcPr>
+          <w:p>
+            <w:pPr>
+              <w:ind w:left="0" w:firstLine="0"/>
+              <w:rPr>
+                <w:rFonts w:ascii="Calibri" w:hAnsi="Calibri" w:cs="Calibri"/>
+                <w:lang w:val="en-US" w:eastAsia="en-US"/>
+              </w:rPr>
+            </w:pPr>
+            <w:r>
+              <w:rPr>
+                <w:rFonts w:ascii="Calibri" w:hAnsi="Calibri" w:cs="Calibri"/>
+                <w:b/>
+                <w:bCs/>
+                <w:lang w:val="en-US" w:eastAsia="en-US"/>
+              </w:rPr>
+              <w:t>Input: NHS_ID</w:t>
+            </w:r>
+          </w:p>
+        </w:tc>
+        <w:tc>
+          <w:tcPr>
+            <w:tcW w:w="0" w:type="auto"/>
+            <w:hideMark/>
+          </w:tcPr>
+          <w:p>
+            <w:pPr>
+              <w:ind w:left="0" w:firstLine="0"/>
+              <w:rPr>
+                <w:rFonts w:ascii="Calibri" w:hAnsi="Calibri" w:cs="Calibri"/>
+                <w:lang w:val="en-US" w:eastAsia="en-US"/>
+              </w:rPr>
+            </w:pPr>
+            <w:proofErr w:type="spellStart"/>
+            <w:r>
+              <w:rPr>
+                <w:rFonts w:ascii="Calibri" w:hAnsi="Calibri" w:cs="Calibri"/>
+                <w:lang w:val="en-US" w:eastAsia="en-US"/>
+              </w:rPr>
+              <w:t>PATIENT.nhs_number</w:t>
+            </w:r>
+            <w:proofErr w:type="spellEnd"/>
+          </w:p>
+        </w:tc>
+        <w:tc>
+          <w:tcPr>
+            <w:tcW w:w="0" w:type="auto"/>
+            <w:hideMark/>
+          </w:tcPr>
+          <w:p>
+            <w:pPr>
+              <w:ind w:left="0" w:firstLine="0"/>
+              <w:rPr>
+                <w:rFonts w:ascii="Calibri" w:hAnsi="Calibri" w:cs="Calibri"/>
+                <w:lang w:val="en-US" w:eastAsia="en-US"/>
+              </w:rPr>
+            </w:pPr>
+            <w:r>
+              <w:rPr>
+                <w:rFonts w:ascii="Calibri" w:hAnsi="Calibri" w:cs="Calibri"/>
+                <w:lang w:val="en-US" w:eastAsia="en-US"/>
+              </w:rPr>
+              <w:t>Validates the 10-digit Primary Key (PK) for patient identification.</w:t>
+            </w:r>
+          </w:p>
+        </w:tc>
+      </w:tr>
+      <w:tr>
+        <w:tc>
+          <w:tcPr>
+            <w:tcW w:w="0" w:type="auto"/>
+            <w:hideMark/>
+          </w:tcPr>
+          <w:p>
+            <w:pPr>
+              <w:ind w:left="0" w:firstLine="0"/>
+              <w:rPr>
+                <w:rFonts w:ascii="Calibri" w:hAnsi="Calibri" w:cs="Calibri"/>
+                <w:lang w:val="en-US" w:eastAsia="en-US"/>
+              </w:rPr>
+            </w:pPr>
+            <w:r>
+              <w:rPr>
+                <w:rFonts w:ascii="Calibri" w:hAnsi="Calibri" w:cs="Calibri"/>
+                <w:b/>
+                <w:bCs/>
+                <w:lang w:val="en-US" w:eastAsia="en-US"/>
+              </w:rPr>
+              <w:t>Input: ACCESS_CRED</w:t>
+            </w:r>
+          </w:p>
+        </w:tc>
+        <w:tc>
+          <w:tcPr>
+            <w:tcW w:w="0" w:type="auto"/>
+            <w:hideMark/>
+          </w:tcPr>
+          <w:p>
+            <w:pPr>
+              <w:ind w:left="0" w:firstLine="0"/>
+              <w:rPr>
+                <w:rFonts w:ascii="Calibri" w:hAnsi="Calibri" w:cs="Calibri"/>
+                <w:lang w:val="en-US" w:eastAsia="en-US"/>
+              </w:rPr>
+            </w:pPr>
+            <w:proofErr w:type="spellStart"/>
+            <w:r>
+              <w:rPr>
+                <w:rFonts w:ascii="Calibri" w:hAnsi="Calibri" w:cs="Calibri"/>
+                <w:lang w:val="en-US" w:eastAsia="en-US"/>
+              </w:rPr>
+              <w:t>PATIENT.password_hash</w:t>
+            </w:r>
+            <w:proofErr w:type="spellEnd"/>
+          </w:p>
+        </w:tc>
+        <w:tc>
+          <w:tcPr>
+            <w:tcW w:w="0" w:type="auto"/>
+            <w:hideMark/>
+          </w:tcPr>
+          <w:p>
+            <w:pPr>
+              <w:ind w:left="0" w:firstLine="0"/>
+              <w:rPr>
+                <w:rFonts w:ascii="Calibri" w:hAnsi="Calibri" w:cs="Calibri"/>
+                <w:lang w:val="en-US" w:eastAsia="en-US"/>
+              </w:rPr>
+            </w:pPr>
+            <w:r>
+              <w:rPr>
+                <w:rFonts w:ascii="Calibri" w:hAnsi="Calibri" w:cs="Calibri"/>
+                <w:lang w:val="en-US" w:eastAsia="en-US"/>
+              </w:rPr>
+              <w:t xml:space="preserve">Maps to secure hashed credentials to satisfy </w:t>
+            </w:r>
+            <w:r>
+              <w:rPr>
+                <w:rFonts w:ascii="Calibri" w:hAnsi="Calibri" w:cs="Calibri"/>
+                <w:b/>
+                <w:bCs/>
+                <w:lang w:val="en-US" w:eastAsia="en-US"/>
+              </w:rPr>
+              <w:t>NFR1</w:t>
+            </w:r>
+            <w:r>
+              <w:rPr>
+                <w:rFonts w:ascii="Calibri" w:hAnsi="Calibri" w:cs="Calibri"/>
+                <w:lang w:val="en-US" w:eastAsia="en-US"/>
+              </w:rPr>
+              <w:t xml:space="preserve"> security standards.</w:t>
+            </w:r>
+          </w:p>
+        </w:tc>
+      </w:tr>
+      <w:tr>
+        <w:tc>
+          <w:tcPr>
+            <w:tcW w:w="0" w:type="auto"/>
+            <w:hideMark/>
+          </w:tcPr>
+          <w:p>
+            <w:pPr>
+              <w:ind w:left="0" w:firstLine="0"/>
+              <w:rPr>
+                <w:rFonts w:ascii="Calibri" w:hAnsi="Calibri" w:cs="Calibri"/>
+                <w:lang w:val="en-US" w:eastAsia="en-US"/>
+              </w:rPr>
+            </w:pPr>
+            <w:r>
+              <w:rPr>
+                <w:rFonts w:ascii="Calibri" w:hAnsi="Calibri" w:cs="Calibri"/>
+                <w:b/>
+                <w:bCs/>
+                <w:lang w:val="en-US" w:eastAsia="en-US"/>
+              </w:rPr>
+              <w:t>Action: LOGIN</w:t>
+            </w:r>
+          </w:p>
+        </w:tc>
+        <w:tc>
+          <w:tcPr>
+            <w:tcW w:w="0" w:type="auto"/>
+            <w:hideMark/>
+          </w:tcPr>
+          <w:p>
+            <w:pPr>
+              <w:ind w:left="0" w:firstLine="0"/>
+              <w:rPr>
+                <w:rFonts w:ascii="Calibri" w:hAnsi="Calibri" w:cs="Calibri"/>
+                <w:lang w:val="en-US" w:eastAsia="en-US"/>
+              </w:rPr>
+            </w:pPr>
+            <w:r>
+              <w:rPr>
+                <w:rFonts w:ascii="Calibri" w:hAnsi="Calibri" w:cs="Calibri"/>
+                <w:lang w:val="en-US" w:eastAsia="en-US"/>
+              </w:rPr>
+              <w:t>N/A</w:t>
+            </w:r>
+          </w:p>
+        </w:tc>
+        <w:tc>
+          <w:tcPr>
+            <w:tcW w:w="0" w:type="auto"/>
+            <w:hideMark/>
+          </w:tcPr>
+          <w:p>
+            <w:pPr>
+              <w:ind w:left="0" w:firstLine="0"/>
+              <w:rPr>
+                <w:rFonts w:ascii="Calibri" w:hAnsi="Calibri" w:cs="Calibri"/>
+                <w:lang w:val="en-US" w:eastAsia="en-US"/>
+              </w:rPr>
+            </w:pPr>
+            <w:r>
+              <w:rPr>
+                <w:rFonts w:ascii="Calibri" w:hAnsi="Calibri" w:cs="Calibri"/>
+                <w:lang w:val="en-US" w:eastAsia="en-US"/>
+              </w:rPr>
+              <w:t>Triggers server-side session validation and redirects to role-based dashboards.</w:t>
+            </w:r>
+          </w:p>
+        </w:tc>
+      </w:tr>
+    </w:tbl>
+    <w:p>
+      <w:pPr>
+        <w:ind w:left="0" w:firstLine="0"/>
+        <w:rPr>
+          <w:rFonts w:ascii="Calibri" w:hAnsi="Calibri" w:cs="Calibri"/>
+          <w:b/>
+          <w:bCs/>
+          <w:lang w:val="en-US" w:eastAsia="en-US"/>
+        </w:rPr>
+      </w:pPr>
+    </w:p>
+    <w:p>
+      <w:pPr>
+        <w:ind w:left="0" w:firstLine="0"/>
+        <w:rPr>
+          <w:rFonts w:ascii="Calibri" w:hAnsi="Calibri" w:cs="Calibri"/>
+          <w:b/>
+          <w:bCs/>
+          <w:lang w:val="en-US" w:eastAsia="en-US"/>
+        </w:rPr>
+      </w:pPr>
+      <w:r>
+        <w:rPr>
+          <w:rFonts w:ascii="Calibri" w:hAnsi="Calibri" w:cs="Calibri"/>
+          <w:b/>
+          <w:bCs/>
+          <w:lang w:val="en-US" w:eastAsia="en-US"/>
+        </w:rPr>
+        <w:t>Screen 2: Patient Dashboard (FR2/FR4 Hub)</w:t>
+      </w:r>
+    </w:p>
+    <w:p>
+      <w:pPr>
+        <w:numPr>
+          <w:ilvl w:val="0"/>
+          <w:numId w:val="19"/>
+        </w:numPr>
+        <w:rPr>
+          <w:rFonts w:ascii="Calibri" w:hAnsi="Calibri" w:cs="Calibri"/>
+          <w:lang w:val="en-US" w:eastAsia="en-US"/>
+        </w:rPr>
+      </w:pPr>
+      <w:r>
+        <w:rPr>
+          <w:rFonts w:ascii="Calibri" w:hAnsi="Calibri" w:cs="Calibri"/>
+          <w:b/>
+          <w:bCs/>
+          <w:lang w:val="en-US" w:eastAsia="en-US"/>
+        </w:rPr>
+        <w:t>Purpose:</w:t>
+      </w:r>
+      <w:r>
+        <w:rPr>
+          <w:rFonts w:ascii="Calibri" w:hAnsi="Calibri" w:cs="Calibri"/>
+          <w:lang w:val="en-US" w:eastAsia="en-US"/>
+        </w:rPr>
+        <w:t xml:space="preserve"> A centralized, high-visibility hub providing immediate access to bookings and medical history.</w:t>
+      </w:r>
+    </w:p>
+    <w:p>
+      <w:pPr>
+        <w:numPr>
+          <w:ilvl w:val="0"/>
+          <w:numId w:val="19"/>
+        </w:numPr>
+        <w:rPr>
+          <w:rFonts w:ascii="Calibri" w:hAnsi="Calibri" w:cs="Calibri"/>
+          <w:lang w:val="en-US" w:eastAsia="en-US"/>
+        </w:rPr>
+      </w:pPr>
+      <w:r>
+        <w:rPr>
+          <w:rFonts w:ascii="Calibri" w:hAnsi="Calibri" w:cs="Calibri"/>
+          <w:b/>
+          <w:bCs/>
+          <w:lang w:val="en-US" w:eastAsia="en-US"/>
+        </w:rPr>
+        <w:t>Key Components:</w:t>
+      </w:r>
+      <w:r>
+        <w:rPr>
+          <w:rFonts w:ascii="Calibri" w:hAnsi="Calibri" w:cs="Calibri"/>
+          <w:lang w:val="en-US" w:eastAsia="en-US"/>
+        </w:rPr>
+        <w:t xml:space="preserve"> Prominent booking actions and a real-time availability indicator.</w:t>
+      </w:r>
+    </w:p>
+    <w:p>
+      <w:pPr>
+        <w:ind w:left="0" w:firstLine="0"/>
+        <w:rPr>
+          <w:rFonts w:ascii="Calibri" w:hAnsi="Calibri" w:cs="Calibri"/>
+          <w:lang w:val="en-US" w:eastAsia="en-US"/>
+        </w:rPr>
+      </w:pPr>
+      <w:r>
+        <w:rPr>
+          <w:rFonts w:ascii="Calibri" w:hAnsi="Calibri" w:cs="Calibri"/>
+          <w:b/>
+          <w:bCs/>
+          <w:lang w:val="en-US" w:eastAsia="en-US"/>
+        </w:rPr>
+        <w:t>[INSERT SCREENSHOT: 2_FR2_FR3_FR4.html here]</w:t>
+      </w:r>
+    </w:p>
+    <w:tbl>
+      <w:tblPr>
+        <w:tblStyle w:val="TableGrid"/>
+        <w:tblW w:w="0" w:type="auto"/>
+        <w:tblLook w:val="04A0" w:firstRow="1" w:lastRow="0" w:firstColumn="1" w:lastColumn="0" w:noHBand="0" w:noVBand="1"/>
+      </w:tblPr>
+      <w:tblGrid>
+        <w:gridCol w:w="1693"/>
+        <w:gridCol w:w="2264"/>
+        <w:gridCol w:w="5393"/>
+      </w:tblGrid>
+      <w:tr>
+        <w:tc>
+          <w:tcPr>
+            <w:tcW w:w="0" w:type="auto"/>
+            <w:hideMark/>
+          </w:tcPr>
+          <w:p>
+            <w:pPr>
+              <w:ind w:left="0" w:firstLine="0"/>
+              <w:rPr>
+                <w:rFonts w:ascii="Calibri" w:hAnsi="Calibri" w:cs="Calibri"/>
+                <w:lang w:val="en-US" w:eastAsia="en-US"/>
+              </w:rPr>
+            </w:pPr>
+            <w:r>
+              <w:rPr>
+                <w:rFonts w:ascii="Calibri" w:hAnsi="Calibri" w:cs="Calibri"/>
+                <w:b/>
+                <w:bCs/>
+                <w:lang w:val="en-US" w:eastAsia="en-US"/>
+              </w:rPr>
+              <w:lastRenderedPageBreak/>
+              <w:t>Component ID</w:t>
+            </w:r>
+          </w:p>
+        </w:tc>
+        <w:tc>
+          <w:tcPr>
+            <w:tcW w:w="0" w:type="auto"/>
+            <w:hideMark/>
+          </w:tcPr>
+          <w:p>
+            <w:pPr>
+              <w:ind w:left="0" w:firstLine="0"/>
+              <w:rPr>
+                <w:rFonts w:ascii="Calibri" w:hAnsi="Calibri" w:cs="Calibri"/>
+                <w:lang w:val="en-US" w:eastAsia="en-US"/>
+              </w:rPr>
+            </w:pPr>
+            <w:r>
+              <w:rPr>
+                <w:rFonts w:ascii="Calibri" w:hAnsi="Calibri" w:cs="Calibri"/>
+                <w:b/>
+                <w:bCs/>
+                <w:lang w:val="en-US" w:eastAsia="en-US"/>
+              </w:rPr>
+              <w:t xml:space="preserve">LDM Mapping </w:t>
+            </w:r>
+          </w:p>
+        </w:tc>
+        <w:tc>
+          <w:tcPr>
+            <w:tcW w:w="0" w:type="auto"/>
+            <w:hideMark/>
+          </w:tcPr>
+          <w:p>
+            <w:pPr>
+              <w:ind w:left="0" w:firstLine="0"/>
+              <w:rPr>
+                <w:rFonts w:ascii="Calibri" w:hAnsi="Calibri" w:cs="Calibri"/>
+                <w:lang w:val="en-US" w:eastAsia="en-US"/>
+              </w:rPr>
+            </w:pPr>
+            <w:r>
+              <w:rPr>
+                <w:rFonts w:ascii="Calibri" w:hAnsi="Calibri" w:cs="Calibri"/>
+                <w:b/>
+                <w:bCs/>
+                <w:lang w:val="en-US" w:eastAsia="en-US"/>
+              </w:rPr>
+              <w:t>Engineering Logic / Traceability</w:t>
+            </w:r>
+          </w:p>
+        </w:tc>
+      </w:tr>
+      <w:tr>
+        <w:tc>
+          <w:tcPr>
+            <w:tcW w:w="0" w:type="auto"/>
+            <w:hideMark/>
+          </w:tcPr>
+          <w:p>
+            <w:pPr>
+              <w:ind w:left="0" w:firstLine="0"/>
+              <w:rPr>
+                <w:rFonts w:ascii="Calibri" w:hAnsi="Calibri" w:cs="Calibri"/>
+                <w:lang w:val="en-US" w:eastAsia="en-US"/>
+              </w:rPr>
+            </w:pPr>
+            <w:r>
+              <w:rPr>
+                <w:rFonts w:ascii="Calibri" w:hAnsi="Calibri" w:cs="Calibri"/>
+                <w:b/>
+                <w:bCs/>
+                <w:lang w:val="en-US" w:eastAsia="en-US"/>
+              </w:rPr>
+              <w:t>Availability Ticker</w:t>
+            </w:r>
+          </w:p>
+        </w:tc>
+        <w:tc>
+          <w:tcPr>
+            <w:tcW w:w="0" w:type="auto"/>
+            <w:hideMark/>
+          </w:tcPr>
+          <w:p>
+            <w:pPr>
+              <w:ind w:left="0" w:firstLine="0"/>
+              <w:rPr>
+                <w:rFonts w:ascii="Calibri" w:hAnsi="Calibri" w:cs="Calibri"/>
+                <w:lang w:val="en-US" w:eastAsia="en-US"/>
+              </w:rPr>
+            </w:pPr>
+            <w:proofErr w:type="spellStart"/>
+            <w:r>
+              <w:rPr>
+                <w:rFonts w:ascii="Calibri" w:hAnsi="Calibri" w:cs="Calibri"/>
+                <w:lang w:val="en-US" w:eastAsia="en-US"/>
+              </w:rPr>
+              <w:t>DOCTOR.availability_json</w:t>
+            </w:r>
+            <w:proofErr w:type="spellEnd"/>
+          </w:p>
+        </w:tc>
+        <w:tc>
+          <w:tcPr>
+            <w:tcW w:w="0" w:type="auto"/>
+            <w:hideMark/>
+          </w:tcPr>
+          <w:p>
+            <w:pPr>
+              <w:ind w:left="0" w:firstLine="0"/>
+              <w:rPr>
+                <w:rFonts w:ascii="Calibri" w:hAnsi="Calibri" w:cs="Calibri"/>
+                <w:lang w:val="en-US" w:eastAsia="en-US"/>
+              </w:rPr>
+            </w:pPr>
+            <w:r>
+              <w:rPr>
+                <w:rFonts w:ascii="Calibri" w:hAnsi="Calibri" w:cs="Calibri"/>
+                <w:lang w:val="en-US" w:eastAsia="en-US"/>
+              </w:rPr>
+              <w:t xml:space="preserve">Provides a reactive view of clinician slots to meet </w:t>
+            </w:r>
+            <w:r>
+              <w:rPr>
+                <w:rFonts w:ascii="Calibri" w:hAnsi="Calibri" w:cs="Calibri"/>
+                <w:b/>
+                <w:bCs/>
+                <w:lang w:val="en-US" w:eastAsia="en-US"/>
+              </w:rPr>
+              <w:t>NFR2</w:t>
+            </w:r>
+            <w:r>
+              <w:rPr>
+                <w:rFonts w:ascii="Calibri" w:hAnsi="Calibri" w:cs="Calibri"/>
+                <w:lang w:val="en-US" w:eastAsia="en-US"/>
+              </w:rPr>
+              <w:t>.</w:t>
+            </w:r>
+          </w:p>
+        </w:tc>
+      </w:tr>
+      <w:tr>
+        <w:tc>
+          <w:tcPr>
+            <w:tcW w:w="0" w:type="auto"/>
+            <w:hideMark/>
+          </w:tcPr>
+          <w:p>
+            <w:pPr>
+              <w:ind w:left="0" w:firstLine="0"/>
+              <w:rPr>
+                <w:rFonts w:ascii="Calibri" w:hAnsi="Calibri" w:cs="Calibri"/>
+                <w:lang w:val="en-US" w:eastAsia="en-US"/>
+              </w:rPr>
+            </w:pPr>
+            <w:r>
+              <w:rPr>
+                <w:rFonts w:ascii="Calibri" w:hAnsi="Calibri" w:cs="Calibri"/>
+                <w:b/>
+                <w:bCs/>
+                <w:lang w:val="en-US" w:eastAsia="en-US"/>
+              </w:rPr>
+              <w:t>Next Appointment</w:t>
+            </w:r>
+          </w:p>
+        </w:tc>
+        <w:tc>
+          <w:tcPr>
+            <w:tcW w:w="0" w:type="auto"/>
+            <w:hideMark/>
+          </w:tcPr>
+          <w:p>
+            <w:pPr>
+              <w:ind w:left="0" w:firstLine="0"/>
+              <w:rPr>
+                <w:rFonts w:ascii="Calibri" w:hAnsi="Calibri" w:cs="Calibri"/>
+                <w:lang w:val="en-US" w:eastAsia="en-US"/>
+              </w:rPr>
+            </w:pPr>
+            <w:proofErr w:type="spellStart"/>
+            <w:r>
+              <w:rPr>
+                <w:rFonts w:ascii="Calibri" w:hAnsi="Calibri" w:cs="Calibri"/>
+                <w:lang w:val="en-US" w:eastAsia="en-US"/>
+              </w:rPr>
+              <w:t>APPOINTMENT.slot_time</w:t>
+            </w:r>
+            <w:proofErr w:type="spellEnd"/>
+          </w:p>
+        </w:tc>
+        <w:tc>
+          <w:tcPr>
+            <w:tcW w:w="0" w:type="auto"/>
+            <w:hideMark/>
+          </w:tcPr>
+          <w:p>
+            <w:pPr>
+              <w:ind w:left="0" w:firstLine="0"/>
+              <w:rPr>
+                <w:rFonts w:ascii="Calibri" w:hAnsi="Calibri" w:cs="Calibri"/>
+                <w:lang w:val="en-US" w:eastAsia="en-US"/>
+              </w:rPr>
+            </w:pPr>
+            <w:r>
+              <w:rPr>
+                <w:rFonts w:ascii="Calibri" w:hAnsi="Calibri" w:cs="Calibri"/>
+                <w:lang w:val="en-US" w:eastAsia="en-US"/>
+              </w:rPr>
+              <w:t>Retrieves upcoming schedule data for immediate patient visibility.</w:t>
+            </w:r>
+          </w:p>
+        </w:tc>
+      </w:tr>
+      <w:tr>
+        <w:tc>
+          <w:tcPr>
+            <w:tcW w:w="0" w:type="auto"/>
+            <w:hideMark/>
+          </w:tcPr>
+          <w:p>
+            <w:pPr>
+              <w:ind w:left="0" w:firstLine="0"/>
+              <w:rPr>
+                <w:rFonts w:ascii="Calibri" w:hAnsi="Calibri" w:cs="Calibri"/>
+                <w:lang w:val="en-US" w:eastAsia="en-US"/>
+              </w:rPr>
+            </w:pPr>
+            <w:r>
+              <w:rPr>
+                <w:rFonts w:ascii="Calibri" w:hAnsi="Calibri" w:cs="Calibri"/>
+                <w:b/>
+                <w:bCs/>
+                <w:lang w:val="en-US" w:eastAsia="en-US"/>
+              </w:rPr>
+              <w:t>Record Fetcher</w:t>
+            </w:r>
+          </w:p>
+        </w:tc>
+        <w:tc>
+          <w:tcPr>
+            <w:tcW w:w="0" w:type="auto"/>
+            <w:hideMark/>
+          </w:tcPr>
+          <w:p>
+            <w:pPr>
+              <w:ind w:left="0" w:firstLine="0"/>
+              <w:rPr>
+                <w:rFonts w:ascii="Calibri" w:hAnsi="Calibri" w:cs="Calibri"/>
+                <w:lang w:val="en-US" w:eastAsia="en-US"/>
+              </w:rPr>
+            </w:pPr>
+            <w:r>
+              <w:rPr>
+                <w:rFonts w:ascii="Calibri" w:hAnsi="Calibri" w:cs="Calibri"/>
+                <w:lang w:val="en-US" w:eastAsia="en-US"/>
+              </w:rPr>
+              <w:t>MEDICAL_RECORD</w:t>
+            </w:r>
+          </w:p>
+        </w:tc>
+        <w:tc>
+          <w:tcPr>
+            <w:tcW w:w="0" w:type="auto"/>
+            <w:hideMark/>
+          </w:tcPr>
+          <w:p>
+            <w:pPr>
+              <w:ind w:left="0" w:firstLine="0"/>
+              <w:rPr>
+                <w:rFonts w:ascii="Calibri" w:hAnsi="Calibri" w:cs="Calibri"/>
+                <w:lang w:val="en-US" w:eastAsia="en-US"/>
+              </w:rPr>
+            </w:pPr>
+            <w:r>
+              <w:rPr>
+                <w:rFonts w:ascii="Calibri" w:hAnsi="Calibri" w:cs="Calibri"/>
+                <w:lang w:val="en-US" w:eastAsia="en-US"/>
+              </w:rPr>
+              <w:t>Secure link to the retrieval module for Story 04 "seamless data retrieval".</w:t>
+            </w:r>
+          </w:p>
+        </w:tc>
+      </w:tr>
+    </w:tbl>
+    <w:p>
+      <w:pPr>
+        <w:ind w:left="0" w:firstLine="0"/>
+        <w:rPr>
+          <w:rFonts w:ascii="Calibri" w:hAnsi="Calibri" w:cs="Calibri"/>
+          <w:b/>
+          <w:bCs/>
+          <w:lang w:val="en-US" w:eastAsia="en-US"/>
+        </w:rPr>
+      </w:pPr>
+    </w:p>
+    <w:p>
+      <w:pPr>
+        <w:ind w:left="0" w:firstLine="0"/>
+        <w:rPr>
+          <w:rFonts w:ascii="Calibri" w:hAnsi="Calibri" w:cs="Calibri"/>
+          <w:b/>
+          <w:bCs/>
+          <w:lang w:val="en-US" w:eastAsia="en-US"/>
+        </w:rPr>
+      </w:pPr>
+      <w:r>
+        <w:rPr>
+          <w:rFonts w:ascii="Calibri" w:hAnsi="Calibri" w:cs="Calibri"/>
+          <w:b/>
+          <w:bCs/>
+          <w:lang w:val="en-US" w:eastAsia="en-US"/>
+        </w:rPr>
+        <w:t>Screen 3: Booking &amp; Calendar (FR2/FR3)</w:t>
+      </w:r>
+    </w:p>
+    <w:p>
+      <w:pPr>
+        <w:numPr>
+          <w:ilvl w:val="0"/>
+          <w:numId w:val="20"/>
+        </w:numPr>
+        <w:rPr>
+          <w:rFonts w:ascii="Calibri" w:hAnsi="Calibri" w:cs="Calibri"/>
+          <w:lang w:val="en-US" w:eastAsia="en-US"/>
+        </w:rPr>
+      </w:pPr>
+      <w:r>
+        <w:rPr>
+          <w:rFonts w:ascii="Calibri" w:hAnsi="Calibri" w:cs="Calibri"/>
+          <w:b/>
+          <w:bCs/>
+          <w:lang w:val="en-US" w:eastAsia="en-US"/>
+        </w:rPr>
+        <w:t>Purpose:</w:t>
+      </w:r>
+      <w:r>
+        <w:rPr>
+          <w:rFonts w:ascii="Calibri" w:hAnsi="Calibri" w:cs="Calibri"/>
+          <w:lang w:val="en-US" w:eastAsia="en-US"/>
+        </w:rPr>
+        <w:t xml:space="preserve"> The core self-service transaction point for appointment scheduling.</w:t>
+      </w:r>
+    </w:p>
+    <w:p>
+      <w:pPr>
+        <w:numPr>
+          <w:ilvl w:val="0"/>
+          <w:numId w:val="20"/>
+        </w:numPr>
+        <w:rPr>
+          <w:rFonts w:ascii="Calibri" w:hAnsi="Calibri" w:cs="Calibri"/>
+          <w:lang w:val="en-US" w:eastAsia="en-US"/>
+        </w:rPr>
+      </w:pPr>
+      <w:r>
+        <w:rPr>
+          <w:rFonts w:ascii="Calibri" w:hAnsi="Calibri" w:cs="Calibri"/>
+          <w:b/>
+          <w:bCs/>
+          <w:lang w:val="en-US" w:eastAsia="en-US"/>
+        </w:rPr>
+        <w:t>Key Components:</w:t>
+      </w:r>
+      <w:r>
+        <w:rPr>
+          <w:rFonts w:ascii="Calibri" w:hAnsi="Calibri" w:cs="Calibri"/>
+          <w:lang w:val="en-US" w:eastAsia="en-US"/>
+        </w:rPr>
+        <w:t xml:space="preserve"> Reactive slot grid with color-coded availability and doctor selection filters.</w:t>
+      </w:r>
+    </w:p>
+    <w:p>
+      <w:pPr>
+        <w:ind w:left="0" w:firstLine="0"/>
+        <w:rPr>
+          <w:rFonts w:ascii="Calibri" w:hAnsi="Calibri" w:cs="Calibri"/>
+          <w:lang w:val="en-US" w:eastAsia="en-US"/>
+        </w:rPr>
+      </w:pPr>
+      <w:r>
+        <w:rPr>
+          <w:rFonts w:ascii="Calibri" w:hAnsi="Calibri" w:cs="Calibri"/>
+          <w:b/>
+          <w:bCs/>
+          <w:lang w:val="en-US" w:eastAsia="en-US"/>
+        </w:rPr>
+        <w:t>[INSERT SCREENSHOT: 3_FR3_FR2.html here]</w:t>
+      </w:r>
+    </w:p>
+    <w:tbl>
+      <w:tblPr>
+        <w:tblStyle w:val="TableGrid"/>
+        <w:tblW w:w="0" w:type="auto"/>
+        <w:tblLook w:val="04A0" w:firstRow="1" w:lastRow="0" w:firstColumn="1" w:lastColumn="0" w:noHBand="0" w:noVBand="1"/>
+      </w:tblPr>
+      <w:tblGrid>
+        <w:gridCol w:w="1373"/>
+        <w:gridCol w:w="2241"/>
+        <w:gridCol w:w="5736"/>
+      </w:tblGrid>
+      <w:tr>
+        <w:tc>
+          <w:tcPr>
+            <w:tcW w:w="0" w:type="auto"/>
+            <w:hideMark/>
+          </w:tcPr>
+          <w:p>
+            <w:pPr>
+              <w:ind w:left="0" w:firstLine="0"/>
+              <w:rPr>
+                <w:rFonts w:ascii="Calibri" w:hAnsi="Calibri" w:cs="Calibri"/>
+                <w:lang w:val="en-US" w:eastAsia="en-US"/>
+              </w:rPr>
+            </w:pPr>
+            <w:r>
+              <w:rPr>
+                <w:rFonts w:ascii="Calibri" w:hAnsi="Calibri" w:cs="Calibri"/>
+                <w:b/>
+                <w:bCs/>
+                <w:lang w:val="en-US" w:eastAsia="en-US"/>
+              </w:rPr>
+              <w:t>Component ID</w:t>
+            </w:r>
+          </w:p>
+        </w:tc>
+        <w:tc>
+          <w:tcPr>
+            <w:tcW w:w="0" w:type="auto"/>
+            <w:hideMark/>
+          </w:tcPr>
+          <w:p>
+            <w:pPr>
+              <w:ind w:left="0" w:firstLine="0"/>
+              <w:rPr>
+                <w:rFonts w:ascii="Calibri" w:hAnsi="Calibri" w:cs="Calibri"/>
+                <w:lang w:val="en-US" w:eastAsia="en-US"/>
+              </w:rPr>
+            </w:pPr>
+            <w:r>
+              <w:rPr>
+                <w:rFonts w:ascii="Calibri" w:hAnsi="Calibri" w:cs="Calibri"/>
+                <w:b/>
+                <w:bCs/>
+                <w:lang w:val="en-US" w:eastAsia="en-US"/>
+              </w:rPr>
+              <w:t xml:space="preserve">LDM Mapping </w:t>
+            </w:r>
+          </w:p>
+        </w:tc>
+        <w:tc>
+          <w:tcPr>
+            <w:tcW w:w="0" w:type="auto"/>
+            <w:hideMark/>
+          </w:tcPr>
+          <w:p>
+            <w:pPr>
+              <w:ind w:left="0" w:firstLine="0"/>
+              <w:rPr>
+                <w:rFonts w:ascii="Calibri" w:hAnsi="Calibri" w:cs="Calibri"/>
+                <w:lang w:val="en-US" w:eastAsia="en-US"/>
+              </w:rPr>
+            </w:pPr>
+            <w:r>
+              <w:rPr>
+                <w:rFonts w:ascii="Calibri" w:hAnsi="Calibri" w:cs="Calibri"/>
+                <w:b/>
+                <w:bCs/>
+                <w:lang w:val="en-US" w:eastAsia="en-US"/>
+              </w:rPr>
+              <w:t>Engineering Logic / Traceability</w:t>
+            </w:r>
+          </w:p>
+        </w:tc>
+      </w:tr>
+      <w:tr>
+        <w:tc>
+          <w:tcPr>
+            <w:tcW w:w="0" w:type="auto"/>
+            <w:hideMark/>
+          </w:tcPr>
+          <w:p>
+            <w:pPr>
+              <w:ind w:left="0" w:firstLine="0"/>
+              <w:rPr>
+                <w:rFonts w:ascii="Calibri" w:hAnsi="Calibri" w:cs="Calibri"/>
+                <w:lang w:val="en-US" w:eastAsia="en-US"/>
+              </w:rPr>
+            </w:pPr>
+            <w:r>
+              <w:rPr>
+                <w:rFonts w:ascii="Calibri" w:hAnsi="Calibri" w:cs="Calibri"/>
+                <w:b/>
+                <w:bCs/>
+                <w:lang w:val="en-US" w:eastAsia="en-US"/>
+              </w:rPr>
+              <w:t>Doctor Filter</w:t>
+            </w:r>
+          </w:p>
+        </w:tc>
+        <w:tc>
+          <w:tcPr>
+            <w:tcW w:w="0" w:type="auto"/>
+            <w:hideMark/>
+          </w:tcPr>
+          <w:p>
+            <w:pPr>
+              <w:ind w:left="0" w:firstLine="0"/>
+              <w:rPr>
+                <w:rFonts w:ascii="Calibri" w:hAnsi="Calibri" w:cs="Calibri"/>
+                <w:lang w:val="en-US" w:eastAsia="en-US"/>
+              </w:rPr>
+            </w:pPr>
+            <w:proofErr w:type="spellStart"/>
+            <w:r>
+              <w:rPr>
+                <w:rFonts w:ascii="Calibri" w:hAnsi="Calibri" w:cs="Calibri"/>
+                <w:lang w:val="en-US" w:eastAsia="en-US"/>
+              </w:rPr>
+              <w:t>DOCTOR.specialty</w:t>
+            </w:r>
+            <w:proofErr w:type="spellEnd"/>
+          </w:p>
+        </w:tc>
+        <w:tc>
+          <w:tcPr>
+            <w:tcW w:w="0" w:type="auto"/>
+            <w:hideMark/>
+          </w:tcPr>
+          <w:p>
+            <w:pPr>
+              <w:ind w:left="0" w:firstLine="0"/>
+              <w:rPr>
+                <w:rFonts w:ascii="Calibri" w:hAnsi="Calibri" w:cs="Calibri"/>
+                <w:lang w:val="en-US" w:eastAsia="en-US"/>
+              </w:rPr>
+            </w:pPr>
+            <w:r>
+              <w:rPr>
+                <w:rFonts w:ascii="Calibri" w:hAnsi="Calibri" w:cs="Calibri"/>
+                <w:lang w:val="en-US" w:eastAsia="en-US"/>
+              </w:rPr>
+              <w:t>Enables continuity of care by filtering specifically for required specialists.</w:t>
+            </w:r>
+          </w:p>
+        </w:tc>
+      </w:tr>
+      <w:tr>
+        <w:tc>
+          <w:tcPr>
+            <w:tcW w:w="0" w:type="auto"/>
+            <w:hideMark/>
+          </w:tcPr>
+          <w:p>
+            <w:pPr>
+              <w:ind w:left="0" w:firstLine="0"/>
+              <w:rPr>
+                <w:rFonts w:ascii="Calibri" w:hAnsi="Calibri" w:cs="Calibri"/>
+                <w:lang w:val="en-US" w:eastAsia="en-US"/>
+              </w:rPr>
+            </w:pPr>
+            <w:r>
+              <w:rPr>
+                <w:rFonts w:ascii="Calibri" w:hAnsi="Calibri" w:cs="Calibri"/>
+                <w:b/>
+                <w:bCs/>
+                <w:lang w:val="en-US" w:eastAsia="en-US"/>
+              </w:rPr>
+              <w:t>Slot Selection</w:t>
+            </w:r>
+          </w:p>
+        </w:tc>
+        <w:tc>
+          <w:tcPr>
+            <w:tcW w:w="0" w:type="auto"/>
+            <w:hideMark/>
+          </w:tcPr>
+          <w:p>
+            <w:pPr>
+              <w:ind w:left="0" w:firstLine="0"/>
+              <w:rPr>
+                <w:rFonts w:ascii="Calibri" w:hAnsi="Calibri" w:cs="Calibri"/>
+                <w:lang w:val="en-US" w:eastAsia="en-US"/>
+              </w:rPr>
+            </w:pPr>
+            <w:proofErr w:type="spellStart"/>
+            <w:r>
+              <w:rPr>
+                <w:rFonts w:ascii="Calibri" w:hAnsi="Calibri" w:cs="Calibri"/>
+                <w:lang w:val="en-US" w:eastAsia="en-US"/>
+              </w:rPr>
+              <w:t>APPOINTMENT.slot_time</w:t>
+            </w:r>
+            <w:proofErr w:type="spellEnd"/>
+          </w:p>
+        </w:tc>
+        <w:tc>
+          <w:tcPr>
+            <w:tcW w:w="0" w:type="auto"/>
+            <w:hideMark/>
+          </w:tcPr>
+          <w:p>
+            <w:pPr>
+              <w:ind w:left="0" w:firstLine="0"/>
+              <w:rPr>
+                <w:rFonts w:ascii="Calibri" w:hAnsi="Calibri" w:cs="Calibri"/>
+                <w:lang w:val="en-US" w:eastAsia="en-US"/>
+              </w:rPr>
+            </w:pPr>
+            <w:r>
+              <w:rPr>
+                <w:rFonts w:ascii="Calibri" w:hAnsi="Calibri" w:cs="Calibri"/>
+                <w:lang w:val="en-US" w:eastAsia="en-US"/>
+              </w:rPr>
+              <w:t>Logic-gate: Enforces the FUTURE_DATE_ONLY constraint in Acceptance Criteria.</w:t>
+            </w:r>
+          </w:p>
+        </w:tc>
+      </w:tr>
+      <w:tr>
+        <w:tc>
+          <w:tcPr>
+            <w:tcW w:w="0" w:type="auto"/>
+            <w:hideMark/>
+          </w:tcPr>
+          <w:p>
+            <w:pPr>
+              <w:ind w:left="0" w:firstLine="0"/>
+              <w:rPr>
+                <w:rFonts w:ascii="Calibri" w:hAnsi="Calibri" w:cs="Calibri"/>
+                <w:lang w:val="en-US" w:eastAsia="en-US"/>
+              </w:rPr>
+            </w:pPr>
+            <w:r>
+              <w:rPr>
+                <w:rFonts w:ascii="Calibri" w:hAnsi="Calibri" w:cs="Calibri"/>
+                <w:b/>
+                <w:bCs/>
+                <w:lang w:val="en-US" w:eastAsia="en-US"/>
+              </w:rPr>
+              <w:t>Reason Area</w:t>
+            </w:r>
+          </w:p>
+        </w:tc>
+        <w:tc>
+          <w:tcPr>
+            <w:tcW w:w="0" w:type="auto"/>
+            <w:hideMark/>
+          </w:tcPr>
+          <w:p>
+            <w:pPr>
+              <w:ind w:left="0" w:firstLine="0"/>
+              <w:rPr>
+                <w:rFonts w:ascii="Calibri" w:hAnsi="Calibri" w:cs="Calibri"/>
+                <w:lang w:val="en-US" w:eastAsia="en-US"/>
+              </w:rPr>
+            </w:pPr>
+            <w:proofErr w:type="spellStart"/>
+            <w:r>
+              <w:rPr>
+                <w:rFonts w:ascii="Calibri" w:hAnsi="Calibri" w:cs="Calibri"/>
+                <w:lang w:val="en-US" w:eastAsia="en-US"/>
+              </w:rPr>
+              <w:t>MEDICAL_RECORD.notes</w:t>
+            </w:r>
+            <w:proofErr w:type="spellEnd"/>
+          </w:p>
+        </w:tc>
+        <w:tc>
+          <w:tcPr>
+            <w:tcW w:w="0" w:type="auto"/>
+            <w:hideMark/>
+          </w:tcPr>
+          <w:p>
+            <w:pPr>
+              <w:ind w:left="0" w:firstLine="0"/>
+              <w:rPr>
+                <w:rFonts w:ascii="Calibri" w:hAnsi="Calibri" w:cs="Calibri"/>
+                <w:lang w:val="en-US" w:eastAsia="en-US"/>
+              </w:rPr>
+            </w:pPr>
+            <w:r>
+              <w:rPr>
+                <w:rFonts w:ascii="Calibri" w:hAnsi="Calibri" w:cs="Calibri"/>
+                <w:lang w:val="en-US" w:eastAsia="en-US"/>
+              </w:rPr>
+              <w:t>Initial entry point for patient-reported clinical observations (Story 03).</w:t>
+            </w:r>
+          </w:p>
+        </w:tc>
+      </w:tr>
+    </w:tbl>
+    <w:p>
+      <w:pPr>
+        <w:ind w:left="0" w:firstLine="0"/>
+        <w:rPr>
+          <w:rFonts w:ascii="Calibri" w:hAnsi="Calibri" w:cs="Calibri"/>
+          <w:b/>
+          <w:bCs/>
+          <w:lang w:val="en-US" w:eastAsia="en-US"/>
+        </w:rPr>
+      </w:pPr>
+    </w:p>
+    <w:p>
+      <w:pPr>
+        <w:ind w:left="0" w:firstLine="0"/>
+        <w:rPr>
+          <w:rFonts w:ascii="Calibri" w:hAnsi="Calibri" w:cs="Calibri"/>
+          <w:b/>
+          <w:bCs/>
+          <w:lang w:val="en-US" w:eastAsia="en-US"/>
+        </w:rPr>
+      </w:pPr>
+      <w:r>
+        <w:rPr>
+          <w:rFonts w:ascii="Calibri" w:hAnsi="Calibri" w:cs="Calibri"/>
+          <w:b/>
+          <w:bCs/>
+          <w:lang w:val="en-US" w:eastAsia="en-US"/>
+        </w:rPr>
+        <w:t>Screen 4: Medical Portal (FR4)</w:t>
+      </w:r>
+    </w:p>
+    <w:p>
+      <w:pPr>
+        <w:numPr>
+          <w:ilvl w:val="0"/>
+          <w:numId w:val="21"/>
+        </w:numPr>
+        <w:rPr>
+          <w:rFonts w:ascii="Calibri" w:hAnsi="Calibri" w:cs="Calibri"/>
+          <w:lang w:val="en-US" w:eastAsia="en-US"/>
+        </w:rPr>
+      </w:pPr>
+      <w:r>
+        <w:rPr>
+          <w:rFonts w:ascii="Calibri" w:hAnsi="Calibri" w:cs="Calibri"/>
+          <w:b/>
+          <w:bCs/>
+          <w:lang w:val="en-US" w:eastAsia="en-US"/>
+        </w:rPr>
+        <w:t>Purpose:</w:t>
+      </w:r>
+      <w:r>
+        <w:rPr>
+          <w:rFonts w:ascii="Calibri" w:hAnsi="Calibri" w:cs="Calibri"/>
+          <w:lang w:val="en-US" w:eastAsia="en-US"/>
+        </w:rPr>
+        <w:t xml:space="preserve"> A secure area for the retrieval and read-only viewing of historical health records.</w:t>
+      </w:r>
+    </w:p>
+    <w:p>
+      <w:pPr>
+        <w:numPr>
+          <w:ilvl w:val="0"/>
+          <w:numId w:val="21"/>
+        </w:numPr>
+        <w:rPr>
+          <w:rFonts w:ascii="Calibri" w:hAnsi="Calibri" w:cs="Calibri"/>
+          <w:lang w:val="en-US" w:eastAsia="en-US"/>
+        </w:rPr>
+      </w:pPr>
+      <w:r>
+        <w:rPr>
+          <w:rFonts w:ascii="Calibri" w:hAnsi="Calibri" w:cs="Calibri"/>
+          <w:b/>
+          <w:bCs/>
+          <w:lang w:val="en-US" w:eastAsia="en-US"/>
+        </w:rPr>
+        <w:t>Key Components:</w:t>
+      </w:r>
+      <w:r>
+        <w:rPr>
+          <w:rFonts w:ascii="Calibri" w:hAnsi="Calibri" w:cs="Calibri"/>
+          <w:lang w:val="en-US" w:eastAsia="en-US"/>
+        </w:rPr>
+        <w:t xml:space="preserve"> Searchable clinical record grid with date and clinician attribution.</w:t>
+      </w:r>
+    </w:p>
+    <w:p>
+      <w:pPr>
+        <w:ind w:left="0" w:firstLine="0"/>
+        <w:rPr>
+          <w:rFonts w:ascii="Calibri" w:hAnsi="Calibri" w:cs="Calibri"/>
+          <w:lang w:val="en-US" w:eastAsia="en-US"/>
+        </w:rPr>
+      </w:pPr>
+      <w:r>
+        <w:rPr>
+          <w:rFonts w:ascii="Calibri" w:hAnsi="Calibri" w:cs="Calibri"/>
+          <w:b/>
+          <w:bCs/>
+          <w:lang w:val="en-US" w:eastAsia="en-US"/>
+        </w:rPr>
+        <w:t>[INSERT SCREENSHOT: 4_FR4.html here]</w:t>
+      </w:r>
+    </w:p>
+    <w:tbl>
+      <w:tblPr>
+        <w:tblStyle w:val="TableGrid"/>
+        <w:tblW w:w="0" w:type="auto"/>
+        <w:tblLook w:val="04A0" w:firstRow="1" w:lastRow="0" w:firstColumn="1" w:lastColumn="0" w:noHBand="0" w:noVBand="1"/>
+      </w:tblPr>
+      <w:tblGrid>
+        <w:gridCol w:w="1379"/>
+        <w:gridCol w:w="2677"/>
+        <w:gridCol w:w="5294"/>
+      </w:tblGrid>
+      <w:tr>
+        <w:tc>
+          <w:tcPr>
+            <w:tcW w:w="0" w:type="auto"/>
+            <w:hideMark/>
+          </w:tcPr>
+          <w:p>
+            <w:pPr>
+              <w:ind w:left="0" w:firstLine="0"/>
+              <w:rPr>
+                <w:rFonts w:ascii="Calibri" w:hAnsi="Calibri" w:cs="Calibri"/>
+                <w:lang w:val="en-US" w:eastAsia="en-US"/>
+              </w:rPr>
+            </w:pPr>
+            <w:r>
+              <w:rPr>
+                <w:rFonts w:ascii="Calibri" w:hAnsi="Calibri" w:cs="Calibri"/>
+                <w:b/>
+                <w:bCs/>
+                <w:lang w:val="en-US" w:eastAsia="en-US"/>
+              </w:rPr>
+              <w:t>Component ID</w:t>
+            </w:r>
+          </w:p>
+        </w:tc>
+        <w:tc>
+          <w:tcPr>
+            <w:tcW w:w="0" w:type="auto"/>
+            <w:hideMark/>
+          </w:tcPr>
+          <w:p>
+            <w:pPr>
+              <w:ind w:left="0" w:firstLine="0"/>
+              <w:rPr>
+                <w:rFonts w:ascii="Calibri" w:hAnsi="Calibri" w:cs="Calibri"/>
+                <w:lang w:val="en-US" w:eastAsia="en-US"/>
+              </w:rPr>
+            </w:pPr>
+            <w:r>
+              <w:rPr>
+                <w:rFonts w:ascii="Calibri" w:hAnsi="Calibri" w:cs="Calibri"/>
+                <w:b/>
+                <w:bCs/>
+                <w:lang w:val="en-US" w:eastAsia="en-US"/>
+              </w:rPr>
+              <w:t xml:space="preserve">LDM Mapping </w:t>
+            </w:r>
+          </w:p>
+        </w:tc>
+        <w:tc>
+          <w:tcPr>
+            <w:tcW w:w="0" w:type="auto"/>
+            <w:hideMark/>
+          </w:tcPr>
+          <w:p>
+            <w:pPr>
+              <w:ind w:left="0" w:firstLine="0"/>
+              <w:rPr>
+                <w:rFonts w:ascii="Calibri" w:hAnsi="Calibri" w:cs="Calibri"/>
+                <w:lang w:val="en-US" w:eastAsia="en-US"/>
+              </w:rPr>
+            </w:pPr>
+            <w:r>
+              <w:rPr>
+                <w:rFonts w:ascii="Calibri" w:hAnsi="Calibri" w:cs="Calibri"/>
+                <w:b/>
+                <w:bCs/>
+                <w:lang w:val="en-US" w:eastAsia="en-US"/>
+              </w:rPr>
+              <w:t>Engineering Logic / Traceability</w:t>
+            </w:r>
+          </w:p>
+        </w:tc>
+      </w:tr>
+      <w:tr>
+        <w:tc>
+          <w:tcPr>
+            <w:tcW w:w="0" w:type="auto"/>
+            <w:hideMark/>
+          </w:tcPr>
+          <w:p>
+            <w:pPr>
+              <w:ind w:left="0" w:firstLine="0"/>
+              <w:rPr>
+                <w:rFonts w:ascii="Calibri" w:hAnsi="Calibri" w:cs="Calibri"/>
+                <w:lang w:val="en-US" w:eastAsia="en-US"/>
+              </w:rPr>
+            </w:pPr>
+            <w:r>
+              <w:rPr>
+                <w:rFonts w:ascii="Calibri" w:hAnsi="Calibri" w:cs="Calibri"/>
+                <w:b/>
+                <w:bCs/>
+                <w:lang w:val="en-US" w:eastAsia="en-US"/>
+              </w:rPr>
+              <w:t>History Grid</w:t>
+            </w:r>
+          </w:p>
+        </w:tc>
+        <w:tc>
+          <w:tcPr>
+            <w:tcW w:w="0" w:type="auto"/>
+            <w:hideMark/>
+          </w:tcPr>
+          <w:p>
+            <w:pPr>
+              <w:ind w:left="0" w:firstLine="0"/>
+              <w:rPr>
+                <w:rFonts w:ascii="Calibri" w:hAnsi="Calibri" w:cs="Calibri"/>
+                <w:lang w:val="en-US" w:eastAsia="en-US"/>
+              </w:rPr>
+            </w:pPr>
+            <w:proofErr w:type="spellStart"/>
+            <w:r>
+              <w:rPr>
+                <w:rFonts w:ascii="Calibri" w:hAnsi="Calibri" w:cs="Calibri"/>
+                <w:lang w:val="en-US" w:eastAsia="en-US"/>
+              </w:rPr>
+              <w:t>MEDICAL_RECORD.entry_date</w:t>
+            </w:r>
+            <w:proofErr w:type="spellEnd"/>
+          </w:p>
+        </w:tc>
+        <w:tc>
+          <w:tcPr>
+            <w:tcW w:w="0" w:type="auto"/>
+            <w:hideMark/>
+          </w:tcPr>
+          <w:p>
+            <w:pPr>
+              <w:ind w:left="0" w:firstLine="0"/>
+              <w:rPr>
+                <w:rFonts w:ascii="Calibri" w:hAnsi="Calibri" w:cs="Calibri"/>
+                <w:lang w:val="en-US" w:eastAsia="en-US"/>
+              </w:rPr>
+            </w:pPr>
+            <w:r>
+              <w:rPr>
+                <w:rFonts w:ascii="Calibri" w:hAnsi="Calibri" w:cs="Calibri"/>
+                <w:lang w:val="en-US" w:eastAsia="en-US"/>
+              </w:rPr>
+              <w:t>Chronological record retrieval based on the clinical entry date.</w:t>
+            </w:r>
+          </w:p>
+        </w:tc>
+      </w:tr>
+      <w:tr>
+        <w:tc>
+          <w:tcPr>
+            <w:tcW w:w="0" w:type="auto"/>
+            <w:hideMark/>
+          </w:tcPr>
+          <w:p>
+            <w:pPr>
+              <w:ind w:left="0" w:firstLine="0"/>
+              <w:rPr>
+                <w:rFonts w:ascii="Calibri" w:hAnsi="Calibri" w:cs="Calibri"/>
+                <w:lang w:val="en-US" w:eastAsia="en-US"/>
+              </w:rPr>
+            </w:pPr>
+            <w:r>
+              <w:rPr>
+                <w:rFonts w:ascii="Calibri" w:hAnsi="Calibri" w:cs="Calibri"/>
+                <w:b/>
+                <w:bCs/>
+                <w:lang w:val="en-US" w:eastAsia="en-US"/>
+              </w:rPr>
+              <w:t>Clinician ID</w:t>
+            </w:r>
+          </w:p>
+        </w:tc>
+        <w:tc>
+          <w:tcPr>
+            <w:tcW w:w="0" w:type="auto"/>
+            <w:hideMark/>
+          </w:tcPr>
+          <w:p>
+            <w:pPr>
+              <w:ind w:left="0" w:firstLine="0"/>
+              <w:rPr>
+                <w:rFonts w:ascii="Calibri" w:hAnsi="Calibri" w:cs="Calibri"/>
+                <w:lang w:val="en-US" w:eastAsia="en-US"/>
+              </w:rPr>
+            </w:pPr>
+            <w:r>
+              <w:rPr>
+                <w:rFonts w:ascii="Calibri" w:hAnsi="Calibri" w:cs="Calibri"/>
+                <w:lang w:val="en-US" w:eastAsia="en-US"/>
+              </w:rPr>
+              <w:t>DOCTOR.name (FK)</w:t>
+            </w:r>
+          </w:p>
+        </w:tc>
+        <w:tc>
+          <w:tcPr>
+            <w:tcW w:w="0" w:type="auto"/>
+            <w:hideMark/>
+          </w:tcPr>
+          <w:p>
+            <w:pPr>
+              <w:ind w:left="0" w:firstLine="0"/>
+              <w:rPr>
+                <w:rFonts w:ascii="Calibri" w:hAnsi="Calibri" w:cs="Calibri"/>
+                <w:lang w:val="en-US" w:eastAsia="en-US"/>
+              </w:rPr>
+            </w:pPr>
+            <w:r>
+              <w:rPr>
+                <w:rFonts w:ascii="Calibri" w:hAnsi="Calibri" w:cs="Calibri"/>
+                <w:lang w:val="en-US" w:eastAsia="en-US"/>
+              </w:rPr>
+              <w:t>Displays authoring doctor for clinical accountability (Story 04).</w:t>
+            </w:r>
+          </w:p>
+        </w:tc>
+      </w:tr>
+      <w:tr>
+        <w:tc>
+          <w:tcPr>
+            <w:tcW w:w="0" w:type="auto"/>
+            <w:hideMark/>
+          </w:tcPr>
+          <w:p>
+            <w:pPr>
+              <w:ind w:left="0" w:firstLine="0"/>
+              <w:rPr>
+                <w:rFonts w:ascii="Calibri" w:hAnsi="Calibri" w:cs="Calibri"/>
+                <w:lang w:val="en-US" w:eastAsia="en-US"/>
+              </w:rPr>
+            </w:pPr>
+            <w:r>
+              <w:rPr>
+                <w:rFonts w:ascii="Calibri" w:hAnsi="Calibri" w:cs="Calibri"/>
+                <w:b/>
+                <w:bCs/>
+                <w:lang w:val="en-US" w:eastAsia="en-US"/>
+              </w:rPr>
+              <w:t>Read-Only Tag</w:t>
+            </w:r>
+          </w:p>
+        </w:tc>
+        <w:tc>
+          <w:tcPr>
+            <w:tcW w:w="0" w:type="auto"/>
+            <w:hideMark/>
+          </w:tcPr>
+          <w:p>
+            <w:pPr>
+              <w:ind w:left="0" w:firstLine="0"/>
+              <w:rPr>
+                <w:rFonts w:ascii="Calibri" w:hAnsi="Calibri" w:cs="Calibri"/>
+                <w:lang w:val="en-US" w:eastAsia="en-US"/>
+              </w:rPr>
+            </w:pPr>
+            <w:r>
+              <w:rPr>
+                <w:rFonts w:ascii="Calibri" w:hAnsi="Calibri" w:cs="Calibri"/>
+                <w:lang w:val="en-US" w:eastAsia="en-US"/>
+              </w:rPr>
+              <w:t>N/A</w:t>
+            </w:r>
+          </w:p>
+        </w:tc>
+        <w:tc>
+          <w:tcPr>
+            <w:tcW w:w="0" w:type="auto"/>
+            <w:hideMark/>
+          </w:tcPr>
+          <w:p>
+            <w:pPr>
+              <w:ind w:left="0" w:firstLine="0"/>
+              <w:rPr>
+                <w:rFonts w:ascii="Calibri" w:hAnsi="Calibri" w:cs="Calibri"/>
+                <w:lang w:val="en-US" w:eastAsia="en-US"/>
+              </w:rPr>
+            </w:pPr>
+            <w:r>
+              <w:rPr>
+                <w:rFonts w:ascii="Calibri" w:hAnsi="Calibri" w:cs="Calibri"/>
+                <w:lang w:val="en-US" w:eastAsia="en-US"/>
+              </w:rPr>
+              <w:t>Strict UI constraint to preserve data integrity as per Acceptance Criteria.</w:t>
+            </w:r>
+          </w:p>
+        </w:tc>
+      </w:tr>
+    </w:tbl>
+    <w:p>
+      <w:pPr>
+        <w:ind w:left="0" w:firstLine="0"/>
+        <w:rPr>
+          <w:rFonts w:ascii="Calibri" w:hAnsi="Calibri" w:cs="Calibri"/>
           <w:u w:val="single"/>
           <w:lang w:eastAsia="en-US"/>
         </w:rPr>
       </w:pPr>
-      <w:r>
-        <w:rPr>
-          <w:rFonts w:ascii="Calibri" w:hAnsi="Calibri" w:cs="Calibri"/>
-          <w:b/>
-          <w:bCs/>
-          <w:u w:val="single"/>
-          <w:lang w:eastAsia="en-US"/>
-        </w:rPr>
-        <w:t>UI Design Logic</w:t>
-      </w:r>
-    </w:p>
-    <w:p>
-      <w:pPr>
-        <w:ind w:left="0" w:firstLine="0"/>
-        <w:rPr>
-          <w:rFonts w:ascii="Calibri" w:hAnsi="Calibri" w:cs="Calibri"/>
-          <w:i/>
-          <w:iCs/>
-          <w:lang w:eastAsia="en-US"/>
-        </w:rPr>
-      </w:pPr>
-      <w:r>
-        <w:rPr>
-          <w:rFonts w:ascii="Calibri" w:hAnsi="Calibri" w:cs="Calibri"/>
-          <w:i/>
-          <w:iCs/>
-          <w:lang w:eastAsia="en-US"/>
-        </w:rPr>
-        <w:t xml:space="preserve">The interface follows the </w:t>
-      </w:r>
-      <w:r>
-        <w:rPr>
-          <w:rFonts w:ascii="Calibri" w:hAnsi="Calibri" w:cs="Calibri"/>
-          <w:b/>
-          <w:bCs/>
-          <w:i/>
-          <w:iCs/>
-          <w:lang w:eastAsia="en-US"/>
-        </w:rPr>
-        <w:t>NHS Digital Service Manual</w:t>
-      </w:r>
-      <w:r>
-        <w:rPr>
-          <w:rFonts w:ascii="Calibri" w:hAnsi="Calibri" w:cs="Calibri"/>
-          <w:i/>
-          <w:iCs/>
-          <w:lang w:eastAsia="en-US"/>
-        </w:rPr>
-        <w:t xml:space="preserve"> principles: high contrast, clear typography, and a "mobile-first" layout. </w:t>
-      </w:r>
-    </w:p>
-    <w:p>
-      <w:pPr>
-        <w:ind w:left="0" w:firstLine="0"/>
-        <w:rPr>
-          <w:rFonts w:ascii="Calibri" w:hAnsi="Calibri" w:cs="Calibri"/>
-          <w:lang w:eastAsia="en-US"/>
-        </w:rPr>
-      </w:pPr>
-      <w:r>
-        <w:rPr>
-          <w:rFonts w:ascii="Calibri" w:hAnsi="Calibri" w:cs="Calibri"/>
-          <w:lang w:eastAsia="en-US"/>
-        </w:rPr>
-        <w:t xml:space="preserve">* </w:t>
-      </w:r>
-      <w:r>
-        <w:rPr>
-          <w:rFonts w:ascii="Calibri" w:hAnsi="Calibri" w:cs="Calibri"/>
-          <w:b/>
-          <w:bCs/>
-          <w:lang w:eastAsia="en-US"/>
-        </w:rPr>
-        <w:t>Dashboard:</w:t>
-      </w:r>
-      <w:r>
-        <w:rPr>
-          <w:rFonts w:ascii="Calibri" w:hAnsi="Calibri" w:cs="Calibri"/>
-          <w:lang w:eastAsia="en-US"/>
-        </w:rPr>
-        <w:t xml:space="preserve"> Features a prominent "Book Appointment" button and a real-time "Availability Ticker". </w:t>
-      </w:r>
-    </w:p>
-    <w:p>
-      <w:pPr>
-        <w:ind w:left="0" w:firstLine="0"/>
-        <w:rPr>
-          <w:rFonts w:ascii="Calibri" w:hAnsi="Calibri" w:cs="Calibri"/>
-          <w:lang w:eastAsia="en-US"/>
-        </w:rPr>
-      </w:pPr>
-      <w:r>
-        <w:rPr>
-          <w:rFonts w:ascii="Calibri" w:hAnsi="Calibri" w:cs="Calibri"/>
-          <w:lang w:eastAsia="en-US"/>
-        </w:rPr>
-        <w:t xml:space="preserve">* </w:t>
-      </w:r>
-      <w:r>
-        <w:rPr>
-          <w:rFonts w:ascii="Calibri" w:hAnsi="Calibri" w:cs="Calibri"/>
-          <w:b/>
-          <w:bCs/>
-          <w:lang w:eastAsia="en-US"/>
-        </w:rPr>
-        <w:t>Portal:</w:t>
-      </w:r>
-      <w:r>
-        <w:rPr>
-          <w:rFonts w:ascii="Calibri" w:hAnsi="Calibri" w:cs="Calibri"/>
-          <w:lang w:eastAsia="en-US"/>
-        </w:rPr>
-        <w:t xml:space="preserve"> A secure, read-only grid displaying Entry Date and Clinical Notes directly from the LDM schema.</w:t>
-      </w:r>
-    </w:p>
-    <w:p>
-      <w:pPr>
-        <w:ind w:left="0" w:firstLine="0"/>
-        <w:rPr>
-          <w:rFonts w:ascii="Calibri" w:hAnsi="Calibri" w:cs="Calibri"/>
-          <w:b/>
-          <w:bCs/>
-          <w:lang w:val="en-US" w:eastAsia="en-US"/>
-        </w:rPr>
-      </w:pPr>
-    </w:p>
-    <w:p>
-      <w:pPr>
-        <w:ind w:left="0" w:firstLine="0"/>
-        <w:rPr>
-          <w:rFonts w:ascii="Calibri" w:hAnsi="Calibri" w:cs="Calibri"/>
-          <w:b/>
-          <w:bCs/>
-          <w:u w:val="single"/>
-          <w:lang w:val="en-US" w:eastAsia="en-US"/>
-        </w:rPr>
-      </w:pPr>
-      <w:r>
-        <w:rPr>
-          <w:rFonts w:ascii="Calibri" w:hAnsi="Calibri" w:cs="Calibri"/>
-          <w:b/>
-          <w:bCs/>
-          <w:u w:val="single"/>
-          <w:lang w:val="en-US" w:eastAsia="en-US"/>
-        </w:rPr>
-        <w:t>Wireframes</w:t>
-      </w:r>
-    </w:p>
-    <w:p>
-      <w:pPr>
-        <w:ind w:left="0" w:firstLine="0"/>
-        <w:rPr>
-          <w:rFonts w:ascii="Calibri" w:hAnsi="Calibri" w:cs="Calibri"/>
-          <w:b/>
-          <w:bCs/>
-          <w:lang w:val="en-US" w:eastAsia="en-US"/>
-        </w:rPr>
-      </w:pPr>
-      <w:r>
-        <w:rPr>
-          <w:rFonts w:ascii="Calibri" w:hAnsi="Calibri" w:cs="Calibri"/>
-          <w:b/>
-          <w:bCs/>
-          <w:lang w:val="en-US" w:eastAsia="en-US"/>
-        </w:rPr>
-        <w:t>Screen 1: Secure Login (FR1)</w:t>
-      </w:r>
-    </w:p>
-    <w:p>
-      <w:pPr>
-        <w:numPr>
-          <w:ilvl w:val="0"/>
-          <w:numId w:val="12"/>
-        </w:numPr>
-        <w:rPr>
-          <w:rFonts w:ascii="Calibri" w:hAnsi="Calibri" w:cs="Calibri"/>
-          <w:lang w:val="en-US" w:eastAsia="en-US"/>
-        </w:rPr>
-      </w:pPr>
-      <w:r>
-        <w:rPr>
-          <w:rFonts w:ascii="Calibri" w:hAnsi="Calibri" w:cs="Calibri"/>
-          <w:b/>
-          <w:bCs/>
-          <w:lang w:val="en-US" w:eastAsia="en-US"/>
-        </w:rPr>
-        <w:t>Purpose:</w:t>
-      </w:r>
-      <w:r>
-        <w:rPr>
-          <w:rFonts w:ascii="Calibri" w:hAnsi="Calibri" w:cs="Calibri"/>
-          <w:lang w:val="en-US" w:eastAsia="en-US"/>
-        </w:rPr>
-        <w:t xml:space="preserve"> The gateway to the system.</w:t>
-      </w:r>
-    </w:p>
-    <w:p>
-      <w:pPr>
-        <w:numPr>
-          <w:ilvl w:val="0"/>
-          <w:numId w:val="12"/>
-        </w:numPr>
-        <w:rPr>
-          <w:rFonts w:ascii="Calibri" w:hAnsi="Calibri" w:cs="Calibri"/>
-          <w:lang w:val="en-US" w:eastAsia="en-US"/>
-        </w:rPr>
-      </w:pPr>
-      <w:r>
-        <w:rPr>
-          <w:rFonts w:ascii="Calibri" w:hAnsi="Calibri" w:cs="Calibri"/>
-          <w:b/>
-          <w:bCs/>
-          <w:lang w:val="en-US" w:eastAsia="en-US"/>
-        </w:rPr>
-        <w:t>Key Components:</w:t>
-      </w:r>
-      <w:r>
-        <w:rPr>
-          <w:rFonts w:ascii="Calibri" w:hAnsi="Calibri" w:cs="Calibri"/>
-          <w:lang w:val="en-US" w:eastAsia="en-US"/>
-        </w:rPr>
-        <w:t xml:space="preserve"> * </w:t>
-      </w:r>
-      <w:r>
-        <w:rPr>
-          <w:rFonts w:ascii="Calibri" w:hAnsi="Calibri" w:cs="Calibri"/>
-          <w:b/>
-          <w:bCs/>
-          <w:lang w:val="en-US" w:eastAsia="en-US"/>
-        </w:rPr>
-        <w:t>NHS Logo/Branding:</w:t>
-      </w:r>
-      <w:r>
-        <w:rPr>
-          <w:rFonts w:ascii="Calibri" w:hAnsi="Calibri" w:cs="Calibri"/>
-          <w:lang w:val="en-US" w:eastAsia="en-US"/>
-        </w:rPr>
-        <w:t xml:space="preserve"> To satisfy "Patient-Centric" trust.</w:t>
-      </w:r>
-    </w:p>
-    <w:p>
-      <w:pPr>
-        <w:numPr>
-          <w:ilvl w:val="1"/>
-          <w:numId w:val="12"/>
-        </w:numPr>
-        <w:rPr>
-          <w:rFonts w:ascii="Calibri" w:hAnsi="Calibri" w:cs="Calibri"/>
-          <w:lang w:val="en-US" w:eastAsia="en-US"/>
-        </w:rPr>
-      </w:pPr>
-      <w:r>
-        <w:rPr>
-          <w:rFonts w:ascii="Calibri" w:hAnsi="Calibri" w:cs="Calibri"/>
-          <w:b/>
-          <w:bCs/>
-          <w:lang w:val="en-US" w:eastAsia="en-US"/>
-        </w:rPr>
-        <w:t>Input (NHS Number):</w:t>
-      </w:r>
-      <w:r>
-        <w:rPr>
-          <w:rFonts w:ascii="Calibri" w:hAnsi="Calibri" w:cs="Calibri"/>
-          <w:lang w:val="en-US" w:eastAsia="en-US"/>
-        </w:rPr>
-        <w:t xml:space="preserve"> Linked to </w:t>
-      </w:r>
-      <w:proofErr w:type="spellStart"/>
-      <w:r>
-        <w:rPr>
-          <w:rFonts w:ascii="Calibri" w:hAnsi="Calibri" w:cs="Calibri"/>
-          <w:lang w:val="en-US" w:eastAsia="en-US"/>
-        </w:rPr>
-        <w:t>PATIENT.nhs_number</w:t>
-      </w:r>
-      <w:proofErr w:type="spellEnd"/>
-      <w:r>
-        <w:rPr>
-          <w:rFonts w:ascii="Calibri" w:hAnsi="Calibri" w:cs="Calibri"/>
-          <w:lang w:val="en-US" w:eastAsia="en-US"/>
-        </w:rPr>
-        <w:t xml:space="preserve"> in your LDM.</w:t>
-      </w:r>
-    </w:p>
-    <w:p>
-      <w:pPr>
-        <w:numPr>
-          <w:ilvl w:val="1"/>
-          <w:numId w:val="12"/>
-        </w:numPr>
-        <w:rPr>
-          <w:rFonts w:ascii="Calibri" w:hAnsi="Calibri" w:cs="Calibri"/>
-          <w:lang w:val="en-US" w:eastAsia="en-US"/>
-        </w:rPr>
-      </w:pPr>
-      <w:r>
-        <w:rPr>
-          <w:rFonts w:ascii="Calibri" w:hAnsi="Calibri" w:cs="Calibri"/>
-          <w:b/>
-          <w:bCs/>
-          <w:lang w:val="en-US" w:eastAsia="en-US"/>
-        </w:rPr>
-        <w:t>Input (Password):</w:t>
-      </w:r>
-      <w:r>
-        <w:rPr>
-          <w:rFonts w:ascii="Calibri" w:hAnsi="Calibri" w:cs="Calibri"/>
-          <w:lang w:val="en-US" w:eastAsia="en-US"/>
-        </w:rPr>
-        <w:t xml:space="preserve"> Secure field for </w:t>
-      </w:r>
-      <w:proofErr w:type="spellStart"/>
-      <w:r>
-        <w:rPr>
-          <w:rFonts w:ascii="Calibri" w:hAnsi="Calibri" w:cs="Calibri"/>
-          <w:lang w:val="en-US" w:eastAsia="en-US"/>
-        </w:rPr>
-        <w:t>PATIENT.password_hash</w:t>
-      </w:r>
-      <w:proofErr w:type="spellEnd"/>
-      <w:r>
-        <w:rPr>
-          <w:rFonts w:ascii="Calibri" w:hAnsi="Calibri" w:cs="Calibri"/>
-          <w:lang w:val="en-US" w:eastAsia="en-US"/>
-        </w:rPr>
-        <w:t xml:space="preserve"> validation.</w:t>
-      </w:r>
-    </w:p>
-    <w:p>
-      <w:pPr>
-        <w:numPr>
-          <w:ilvl w:val="1"/>
-          <w:numId w:val="12"/>
-        </w:numPr>
-        <w:rPr>
-          <w:rFonts w:ascii="Calibri" w:hAnsi="Calibri" w:cs="Calibri"/>
-          <w:lang w:val="en-US" w:eastAsia="en-US"/>
-        </w:rPr>
-      </w:pPr>
-      <w:r>
-        <w:rPr>
-          <w:rFonts w:ascii="Calibri" w:hAnsi="Calibri" w:cs="Calibri"/>
-          <w:b/>
-          <w:bCs/>
-          <w:lang w:val="en-US" w:eastAsia="en-US"/>
-        </w:rPr>
-        <w:lastRenderedPageBreak/>
-        <w:t>Role Selection (Optional):</w:t>
-      </w:r>
-      <w:r>
-        <w:rPr>
-          <w:rFonts w:ascii="Calibri" w:hAnsi="Calibri" w:cs="Calibri"/>
-          <w:lang w:val="en-US" w:eastAsia="en-US"/>
-        </w:rPr>
-        <w:t xml:space="preserve"> Or separate login paths for Patient, Doctor, and Admin.</w:t>
-      </w:r>
-    </w:p>
-    <w:p>
-      <w:pPr>
-        <w:numPr>
-          <w:ilvl w:val="1"/>
-          <w:numId w:val="12"/>
-        </w:numPr>
-        <w:rPr>
-          <w:rFonts w:ascii="Calibri" w:hAnsi="Calibri" w:cs="Calibri"/>
-          <w:lang w:val="en-US" w:eastAsia="en-US"/>
-        </w:rPr>
-      </w:pPr>
-      <w:r>
-        <w:rPr>
-          <w:rFonts w:ascii="Calibri" w:hAnsi="Calibri" w:cs="Calibri"/>
-          <w:b/>
-          <w:bCs/>
-          <w:lang w:val="en-US" w:eastAsia="en-US"/>
-        </w:rPr>
-        <w:t>Error Messaging:</w:t>
-      </w:r>
-      <w:r>
-        <w:rPr>
-          <w:rFonts w:ascii="Calibri" w:hAnsi="Calibri" w:cs="Calibri"/>
-          <w:lang w:val="en-US" w:eastAsia="en-US"/>
-        </w:rPr>
-        <w:t xml:space="preserve"> A placeholder for "Incorrect Credentials" to meet Acceptance Criteria.</w:t>
-      </w:r>
-    </w:p>
-    <w:p>
-      <w:pPr>
-        <w:ind w:left="0" w:firstLine="0"/>
-        <w:rPr>
-          <w:rFonts w:ascii="Calibri" w:hAnsi="Calibri" w:cs="Calibri"/>
-          <w:b/>
-          <w:bCs/>
-          <w:lang w:val="en-US" w:eastAsia="en-US"/>
-        </w:rPr>
-      </w:pPr>
-      <w:r>
-        <w:rPr>
-          <w:rFonts w:ascii="Calibri" w:hAnsi="Calibri" w:cs="Calibri"/>
-          <w:b/>
-          <w:bCs/>
-          <w:lang w:val="en-US" w:eastAsia="en-US"/>
-        </w:rPr>
-        <w:t>Screen 2: Real-time Calendar (FR2)</w:t>
-      </w:r>
-    </w:p>
-    <w:p>
-      <w:pPr>
-        <w:numPr>
-          <w:ilvl w:val="0"/>
-          <w:numId w:val="13"/>
-        </w:numPr>
-        <w:rPr>
-          <w:rFonts w:ascii="Calibri" w:hAnsi="Calibri" w:cs="Calibri"/>
-          <w:lang w:val="en-US" w:eastAsia="en-US"/>
-        </w:rPr>
-      </w:pPr>
-      <w:r>
-        <w:rPr>
-          <w:rFonts w:ascii="Calibri" w:hAnsi="Calibri" w:cs="Calibri"/>
-          <w:b/>
-          <w:bCs/>
-          <w:lang w:val="en-US" w:eastAsia="en-US"/>
-        </w:rPr>
-        <w:t>Purpose:</w:t>
-      </w:r>
-      <w:r>
-        <w:rPr>
-          <w:rFonts w:ascii="Calibri" w:hAnsi="Calibri" w:cs="Calibri"/>
-          <w:lang w:val="en-US" w:eastAsia="en-US"/>
-        </w:rPr>
-        <w:t xml:space="preserve"> High-visibility view of availability.</w:t>
-      </w:r>
-    </w:p>
-    <w:p>
-      <w:pPr>
-        <w:numPr>
-          <w:ilvl w:val="0"/>
-          <w:numId w:val="13"/>
-        </w:numPr>
-        <w:rPr>
-          <w:rFonts w:ascii="Calibri" w:hAnsi="Calibri" w:cs="Calibri"/>
-          <w:lang w:val="en-US" w:eastAsia="en-US"/>
-        </w:rPr>
-      </w:pPr>
-      <w:r>
-        <w:rPr>
-          <w:rFonts w:ascii="Calibri" w:hAnsi="Calibri" w:cs="Calibri"/>
-          <w:b/>
-          <w:bCs/>
-          <w:lang w:val="en-US" w:eastAsia="en-US"/>
-        </w:rPr>
-        <w:t>Key Components:</w:t>
-      </w:r>
-    </w:p>
-    <w:p>
-      <w:pPr>
-        <w:numPr>
-          <w:ilvl w:val="1"/>
-          <w:numId w:val="13"/>
-        </w:numPr>
-        <w:rPr>
-          <w:rFonts w:ascii="Calibri" w:hAnsi="Calibri" w:cs="Calibri"/>
-          <w:lang w:val="en-US" w:eastAsia="en-US"/>
-        </w:rPr>
-      </w:pPr>
-      <w:r>
-        <w:rPr>
-          <w:rFonts w:ascii="Calibri" w:hAnsi="Calibri" w:cs="Calibri"/>
-          <w:b/>
-          <w:bCs/>
-          <w:lang w:val="en-US" w:eastAsia="en-US"/>
-        </w:rPr>
-        <w:t>Date Picker/Strip:</w:t>
-      </w:r>
-      <w:r>
-        <w:rPr>
-          <w:rFonts w:ascii="Calibri" w:hAnsi="Calibri" w:cs="Calibri"/>
-          <w:lang w:val="en-US" w:eastAsia="en-US"/>
-        </w:rPr>
-        <w:t xml:space="preserve"> Only showing "Future" dates.</w:t>
-      </w:r>
-    </w:p>
-    <w:p>
-      <w:pPr>
-        <w:numPr>
-          <w:ilvl w:val="1"/>
-          <w:numId w:val="13"/>
-        </w:numPr>
-        <w:rPr>
-          <w:rFonts w:ascii="Calibri" w:hAnsi="Calibri" w:cs="Calibri"/>
-          <w:lang w:val="en-US" w:eastAsia="en-US"/>
-        </w:rPr>
-      </w:pPr>
-      <w:r>
-        <w:rPr>
-          <w:rFonts w:ascii="Calibri" w:hAnsi="Calibri" w:cs="Calibri"/>
-          <w:b/>
-          <w:bCs/>
-          <w:lang w:val="en-US" w:eastAsia="en-US"/>
-        </w:rPr>
-        <w:t>Doctor Filter:</w:t>
-      </w:r>
-      <w:r>
-        <w:rPr>
-          <w:rFonts w:ascii="Calibri" w:hAnsi="Calibri" w:cs="Calibri"/>
-          <w:lang w:val="en-US" w:eastAsia="en-US"/>
-        </w:rPr>
-        <w:t xml:space="preserve"> Dropdown linking to </w:t>
-      </w:r>
-      <w:proofErr w:type="spellStart"/>
-      <w:r>
-        <w:rPr>
-          <w:rFonts w:ascii="Calibri" w:hAnsi="Calibri" w:cs="Calibri"/>
-          <w:lang w:val="en-US" w:eastAsia="en-US"/>
-        </w:rPr>
-        <w:t>DOCTOR.specialty</w:t>
-      </w:r>
-      <w:proofErr w:type="spellEnd"/>
-      <w:r>
-        <w:rPr>
-          <w:rFonts w:ascii="Calibri" w:hAnsi="Calibri" w:cs="Calibri"/>
-          <w:lang w:val="en-US" w:eastAsia="en-US"/>
-        </w:rPr>
-        <w:t xml:space="preserve"> or DOCTOR.name.</w:t>
-      </w:r>
-    </w:p>
-    <w:p>
-      <w:pPr>
-        <w:numPr>
-          <w:ilvl w:val="1"/>
-          <w:numId w:val="13"/>
-        </w:numPr>
-        <w:rPr>
-          <w:rFonts w:ascii="Calibri" w:hAnsi="Calibri" w:cs="Calibri"/>
-          <w:lang w:val="en-US" w:eastAsia="en-US"/>
-        </w:rPr>
-      </w:pPr>
-      <w:r>
-        <w:rPr>
-          <w:rFonts w:ascii="Calibri" w:hAnsi="Calibri" w:cs="Calibri"/>
-          <w:b/>
-          <w:bCs/>
-          <w:lang w:val="en-US" w:eastAsia="en-US"/>
-        </w:rPr>
-        <w:t>Time Slot Grid:</w:t>
-      </w:r>
-      <w:r>
-        <w:rPr>
-          <w:rFonts w:ascii="Calibri" w:hAnsi="Calibri" w:cs="Calibri"/>
-          <w:lang w:val="en-US" w:eastAsia="en-US"/>
-        </w:rPr>
-        <w:t xml:space="preserve"> Color-coded blocks (e.g., Green for Available, Grey for Booked).</w:t>
-      </w:r>
-    </w:p>
-    <w:p>
-      <w:pPr>
-        <w:numPr>
-          <w:ilvl w:val="1"/>
-          <w:numId w:val="13"/>
-        </w:numPr>
-        <w:rPr>
-          <w:rFonts w:ascii="Calibri" w:hAnsi="Calibri" w:cs="Calibri"/>
-          <w:lang w:val="en-US" w:eastAsia="en-US"/>
-        </w:rPr>
-      </w:pPr>
-      <w:r>
-        <w:rPr>
-          <w:rFonts w:ascii="Calibri" w:hAnsi="Calibri" w:cs="Calibri"/>
-          <w:b/>
-          <w:bCs/>
-          <w:lang w:val="en-US" w:eastAsia="en-US"/>
-        </w:rPr>
-        <w:t>Real-time Indicator:</w:t>
-      </w:r>
-      <w:r>
-        <w:rPr>
-          <w:rFonts w:ascii="Calibri" w:hAnsi="Calibri" w:cs="Calibri"/>
-          <w:lang w:val="en-US" w:eastAsia="en-US"/>
-        </w:rPr>
-        <w:t xml:space="preserve"> A "Live" badge to satisfy NFR2 (Availability).</w:t>
-      </w:r>
-    </w:p>
-    <w:p>
-      <w:pPr>
-        <w:ind w:left="0" w:firstLine="0"/>
-        <w:rPr>
-          <w:rFonts w:ascii="Calibri" w:hAnsi="Calibri" w:cs="Calibri"/>
-          <w:b/>
-          <w:bCs/>
-          <w:lang w:val="en-US" w:eastAsia="en-US"/>
-        </w:rPr>
-      </w:pPr>
-      <w:r>
-        <w:rPr>
-          <w:rFonts w:ascii="Calibri" w:hAnsi="Calibri" w:cs="Calibri"/>
-          <w:b/>
-          <w:bCs/>
-          <w:lang w:val="en-US" w:eastAsia="en-US"/>
-        </w:rPr>
-        <w:t>Screen 3: Booking Interface (FR3)</w:t>
-      </w:r>
-    </w:p>
-    <w:p>
-      <w:pPr>
-        <w:numPr>
-          <w:ilvl w:val="0"/>
-          <w:numId w:val="14"/>
-        </w:numPr>
-        <w:rPr>
-          <w:rFonts w:ascii="Calibri" w:hAnsi="Calibri" w:cs="Calibri"/>
-          <w:lang w:val="en-US" w:eastAsia="en-US"/>
-        </w:rPr>
-      </w:pPr>
-      <w:r>
-        <w:rPr>
-          <w:rFonts w:ascii="Calibri" w:hAnsi="Calibri" w:cs="Calibri"/>
-          <w:b/>
-          <w:bCs/>
-          <w:lang w:val="en-US" w:eastAsia="en-US"/>
-        </w:rPr>
-        <w:t>Purpose:</w:t>
-      </w:r>
-      <w:r>
-        <w:rPr>
-          <w:rFonts w:ascii="Calibri" w:hAnsi="Calibri" w:cs="Calibri"/>
-          <w:lang w:val="en-US" w:eastAsia="en-US"/>
-        </w:rPr>
-        <w:t xml:space="preserve"> The "Self-Service" transaction point.</w:t>
-      </w:r>
-    </w:p>
-    <w:p>
-      <w:pPr>
-        <w:numPr>
-          <w:ilvl w:val="0"/>
-          <w:numId w:val="14"/>
-        </w:numPr>
-        <w:rPr>
-          <w:rFonts w:ascii="Calibri" w:hAnsi="Calibri" w:cs="Calibri"/>
-          <w:lang w:val="en-US" w:eastAsia="en-US"/>
-        </w:rPr>
-      </w:pPr>
-      <w:r>
-        <w:rPr>
-          <w:rFonts w:ascii="Calibri" w:hAnsi="Calibri" w:cs="Calibri"/>
-          <w:b/>
-          <w:bCs/>
-          <w:lang w:val="en-US" w:eastAsia="en-US"/>
-        </w:rPr>
-        <w:t>Key Components:</w:t>
-      </w:r>
-    </w:p>
-    <w:p>
-      <w:pPr>
-        <w:numPr>
-          <w:ilvl w:val="1"/>
-          <w:numId w:val="14"/>
-        </w:numPr>
-        <w:rPr>
-          <w:rFonts w:ascii="Calibri" w:hAnsi="Calibri" w:cs="Calibri"/>
-          <w:lang w:val="en-US" w:eastAsia="en-US"/>
-        </w:rPr>
-      </w:pPr>
-      <w:r>
-        <w:rPr>
-          <w:rFonts w:ascii="Calibri" w:hAnsi="Calibri" w:cs="Calibri"/>
-          <w:b/>
-          <w:bCs/>
-          <w:lang w:val="en-US" w:eastAsia="en-US"/>
-        </w:rPr>
-        <w:t>Selected Slot Summary:</w:t>
-      </w:r>
-      <w:r>
-        <w:rPr>
-          <w:rFonts w:ascii="Calibri" w:hAnsi="Calibri" w:cs="Calibri"/>
-          <w:lang w:val="en-US" w:eastAsia="en-US"/>
-        </w:rPr>
-        <w:t xml:space="preserve"> Showing time and DOCTOR.name.</w:t>
-      </w:r>
-    </w:p>
-    <w:p>
-      <w:pPr>
-        <w:numPr>
-          <w:ilvl w:val="1"/>
-          <w:numId w:val="14"/>
-        </w:numPr>
-        <w:rPr>
-          <w:rFonts w:ascii="Calibri" w:hAnsi="Calibri" w:cs="Calibri"/>
-          <w:lang w:val="en-US" w:eastAsia="en-US"/>
-        </w:rPr>
-      </w:pPr>
-      <w:r>
-        <w:rPr>
-          <w:rFonts w:ascii="Calibri" w:hAnsi="Calibri" w:cs="Calibri"/>
-          <w:b/>
-          <w:bCs/>
-          <w:lang w:val="en-US" w:eastAsia="en-US"/>
-        </w:rPr>
-        <w:t>Confirmation Form:</w:t>
-      </w:r>
-      <w:r>
-        <w:rPr>
-          <w:rFonts w:ascii="Calibri" w:hAnsi="Calibri" w:cs="Calibri"/>
-          <w:lang w:val="en-US" w:eastAsia="en-US"/>
-        </w:rPr>
-        <w:t xml:space="preserve"> Mandatory fields for Name, Address, and DOB (validating against PATIENT table).</w:t>
-      </w:r>
-    </w:p>
-    <w:p>
-      <w:pPr>
-        <w:numPr>
-          <w:ilvl w:val="1"/>
-          <w:numId w:val="14"/>
-        </w:numPr>
-        <w:rPr>
-          <w:rFonts w:ascii="Calibri" w:hAnsi="Calibri" w:cs="Calibri"/>
-          <w:lang w:val="en-US" w:eastAsia="en-US"/>
-        </w:rPr>
-      </w:pPr>
-      <w:r>
-        <w:rPr>
-          <w:rFonts w:ascii="Calibri" w:hAnsi="Calibri" w:cs="Calibri"/>
-          <w:b/>
-          <w:bCs/>
-          <w:lang w:val="en-US" w:eastAsia="en-US"/>
-        </w:rPr>
-        <w:t>Reason for Visit:</w:t>
-      </w:r>
-      <w:r>
-        <w:rPr>
-          <w:rFonts w:ascii="Calibri" w:hAnsi="Calibri" w:cs="Calibri"/>
-          <w:lang w:val="en-US" w:eastAsia="en-US"/>
-        </w:rPr>
-        <w:t xml:space="preserve"> A text area mapping to </w:t>
-      </w:r>
-      <w:proofErr w:type="spellStart"/>
-      <w:r>
-        <w:rPr>
-          <w:rFonts w:ascii="Calibri" w:hAnsi="Calibri" w:cs="Calibri"/>
-          <w:lang w:val="en-US" w:eastAsia="en-US"/>
-        </w:rPr>
-        <w:t>MEDICAL_RECORD.notes</w:t>
-      </w:r>
-      <w:proofErr w:type="spellEnd"/>
-      <w:r>
-        <w:rPr>
-          <w:rFonts w:ascii="Calibri" w:hAnsi="Calibri" w:cs="Calibri"/>
-          <w:lang w:val="en-US" w:eastAsia="en-US"/>
-        </w:rPr>
-        <w:t xml:space="preserve"> placeholder.</w:t>
-      </w:r>
-    </w:p>
-    <w:p>
-      <w:pPr>
-        <w:numPr>
-          <w:ilvl w:val="1"/>
-          <w:numId w:val="14"/>
-        </w:numPr>
-        <w:rPr>
-          <w:rFonts w:ascii="Calibri" w:hAnsi="Calibri" w:cs="Calibri"/>
-          <w:lang w:val="en-US" w:eastAsia="en-US"/>
-        </w:rPr>
-      </w:pPr>
-      <w:r>
-        <w:rPr>
-          <w:rFonts w:ascii="Calibri" w:hAnsi="Calibri" w:cs="Calibri"/>
-          <w:b/>
-          <w:bCs/>
-          <w:lang w:val="en-US" w:eastAsia="en-US"/>
-        </w:rPr>
-        <w:t>"Book Now" Button:</w:t>
-      </w:r>
-      <w:r>
-        <w:rPr>
-          <w:rFonts w:ascii="Calibri" w:hAnsi="Calibri" w:cs="Calibri"/>
-          <w:lang w:val="en-US" w:eastAsia="en-US"/>
-        </w:rPr>
-        <w:t xml:space="preserve"> Primary action to trigger the include Trigger Notification logic in your UML.</w:t>
-      </w:r>
-    </w:p>
-    <w:p>
-      <w:pPr>
-        <w:ind w:left="0" w:firstLine="0"/>
-        <w:rPr>
-          <w:rFonts w:ascii="Calibri" w:hAnsi="Calibri" w:cs="Calibri"/>
-          <w:b/>
-          <w:bCs/>
-          <w:lang w:val="en-US" w:eastAsia="en-US"/>
-        </w:rPr>
-      </w:pPr>
-      <w:r>
-        <w:rPr>
-          <w:rFonts w:ascii="Calibri" w:hAnsi="Calibri" w:cs="Calibri"/>
-          <w:b/>
-          <w:bCs/>
-          <w:lang w:val="en-US" w:eastAsia="en-US"/>
-        </w:rPr>
-        <w:t>Screen 4: Patient Medical Portal (FR4)</w:t>
-      </w:r>
-    </w:p>
-    <w:p>
-      <w:pPr>
-        <w:numPr>
-          <w:ilvl w:val="0"/>
-          <w:numId w:val="15"/>
-        </w:numPr>
-        <w:rPr>
-          <w:rFonts w:ascii="Calibri" w:hAnsi="Calibri" w:cs="Calibri"/>
-          <w:lang w:val="en-US" w:eastAsia="en-US"/>
-        </w:rPr>
-      </w:pPr>
-      <w:r>
-        <w:rPr>
-          <w:rFonts w:ascii="Calibri" w:hAnsi="Calibri" w:cs="Calibri"/>
-          <w:b/>
-          <w:bCs/>
-          <w:lang w:val="en-US" w:eastAsia="en-US"/>
-        </w:rPr>
-        <w:t>Purpose:</w:t>
-      </w:r>
-      <w:r>
-        <w:rPr>
-          <w:rFonts w:ascii="Calibri" w:hAnsi="Calibri" w:cs="Calibri"/>
-          <w:lang w:val="en-US" w:eastAsia="en-US"/>
-        </w:rPr>
-        <w:t xml:space="preserve"> Secure read-only data retrieval.</w:t>
-      </w:r>
-    </w:p>
-    <w:p>
-      <w:pPr>
-        <w:numPr>
-          <w:ilvl w:val="0"/>
-          <w:numId w:val="15"/>
-        </w:numPr>
-        <w:rPr>
-          <w:rFonts w:ascii="Calibri" w:hAnsi="Calibri" w:cs="Calibri"/>
-          <w:lang w:val="en-US" w:eastAsia="en-US"/>
-        </w:rPr>
-      </w:pPr>
-      <w:r>
-        <w:rPr>
-          <w:rFonts w:ascii="Calibri" w:hAnsi="Calibri" w:cs="Calibri"/>
-          <w:b/>
-          <w:bCs/>
-          <w:lang w:val="en-US" w:eastAsia="en-US"/>
-        </w:rPr>
-        <w:t>Key Components:</w:t>
-      </w:r>
-    </w:p>
-    <w:p>
-      <w:pPr>
-        <w:numPr>
-          <w:ilvl w:val="1"/>
-          <w:numId w:val="15"/>
-        </w:numPr>
-        <w:rPr>
-          <w:rFonts w:ascii="Calibri" w:hAnsi="Calibri" w:cs="Calibri"/>
-          <w:lang w:val="en-US" w:eastAsia="en-US"/>
-        </w:rPr>
-      </w:pPr>
-      <w:r>
-        <w:rPr>
-          <w:rFonts w:ascii="Calibri" w:hAnsi="Calibri" w:cs="Calibri"/>
-          <w:b/>
-          <w:bCs/>
-          <w:lang w:val="en-US" w:eastAsia="en-US"/>
-        </w:rPr>
-        <w:t>Records Table:</w:t>
-      </w:r>
-      <w:r>
-        <w:rPr>
-          <w:rFonts w:ascii="Calibri" w:hAnsi="Calibri" w:cs="Calibri"/>
-          <w:lang w:val="en-US" w:eastAsia="en-US"/>
-        </w:rPr>
-        <w:t xml:space="preserve"> Columns for </w:t>
-      </w:r>
-      <w:proofErr w:type="spellStart"/>
-      <w:r>
-        <w:rPr>
-          <w:rFonts w:ascii="Calibri" w:hAnsi="Calibri" w:cs="Calibri"/>
-          <w:lang w:val="en-US" w:eastAsia="en-US"/>
-        </w:rPr>
-        <w:t>entry_date</w:t>
-      </w:r>
-      <w:proofErr w:type="spellEnd"/>
-      <w:r>
-        <w:rPr>
-          <w:rFonts w:ascii="Calibri" w:hAnsi="Calibri" w:cs="Calibri"/>
-          <w:lang w:val="en-US" w:eastAsia="en-US"/>
-        </w:rPr>
-        <w:t xml:space="preserve">, notes, and </w:t>
-      </w:r>
-      <w:proofErr w:type="spellStart"/>
-      <w:r>
-        <w:rPr>
-          <w:rFonts w:ascii="Calibri" w:hAnsi="Calibri" w:cs="Calibri"/>
-          <w:lang w:val="en-US" w:eastAsia="en-US"/>
-        </w:rPr>
-        <w:t>doctor_id</w:t>
-      </w:r>
-      <w:proofErr w:type="spellEnd"/>
-      <w:r>
-        <w:rPr>
-          <w:rFonts w:ascii="Calibri" w:hAnsi="Calibri" w:cs="Calibri"/>
-          <w:lang w:val="en-US" w:eastAsia="en-US"/>
-        </w:rPr>
-        <w:t xml:space="preserve"> (Authored By).</w:t>
-      </w:r>
-    </w:p>
-    <w:p>
-      <w:pPr>
-        <w:numPr>
-          <w:ilvl w:val="1"/>
-          <w:numId w:val="15"/>
-        </w:numPr>
-        <w:rPr>
-          <w:rFonts w:ascii="Calibri" w:hAnsi="Calibri" w:cs="Calibri"/>
-          <w:lang w:val="en-US" w:eastAsia="en-US"/>
-        </w:rPr>
-      </w:pPr>
-      <w:r>
-        <w:rPr>
-          <w:rFonts w:ascii="Calibri" w:hAnsi="Calibri" w:cs="Calibri"/>
-          <w:b/>
-          <w:bCs/>
-          <w:lang w:val="en-US" w:eastAsia="en-US"/>
-        </w:rPr>
-        <w:t>Search/Filter Bar:</w:t>
-      </w:r>
-      <w:r>
-        <w:rPr>
-          <w:rFonts w:ascii="Calibri" w:hAnsi="Calibri" w:cs="Calibri"/>
-          <w:lang w:val="en-US" w:eastAsia="en-US"/>
-        </w:rPr>
-        <w:t xml:space="preserve"> To satisfy the "Could Have" </w:t>
-      </w:r>
-      <w:proofErr w:type="spellStart"/>
-      <w:r>
-        <w:rPr>
-          <w:rFonts w:ascii="Calibri" w:hAnsi="Calibri" w:cs="Calibri"/>
-          <w:lang w:val="en-US" w:eastAsia="en-US"/>
-        </w:rPr>
-        <w:t>MoSCoW</w:t>
-      </w:r>
-      <w:proofErr w:type="spellEnd"/>
-      <w:r>
-        <w:rPr>
-          <w:rFonts w:ascii="Calibri" w:hAnsi="Calibri" w:cs="Calibri"/>
-          <w:lang w:val="en-US" w:eastAsia="en-US"/>
-        </w:rPr>
-        <w:t xml:space="preserve"> requirement.</w:t>
-      </w:r>
-    </w:p>
-    <w:p>
-      <w:pPr>
-        <w:numPr>
-          <w:ilvl w:val="1"/>
-          <w:numId w:val="15"/>
-        </w:numPr>
-        <w:rPr>
-          <w:rFonts w:ascii="Calibri" w:hAnsi="Calibri" w:cs="Calibri"/>
-          <w:lang w:val="en-US" w:eastAsia="en-US"/>
-        </w:rPr>
-      </w:pPr>
-      <w:r>
-        <w:rPr>
-          <w:rFonts w:ascii="Calibri" w:hAnsi="Calibri" w:cs="Calibri"/>
-          <w:b/>
-          <w:bCs/>
-          <w:lang w:val="en-US" w:eastAsia="en-US"/>
-        </w:rPr>
-        <w:t>Export/Print Button:</w:t>
-      </w:r>
-      <w:r>
-        <w:rPr>
-          <w:rFonts w:ascii="Calibri" w:hAnsi="Calibri" w:cs="Calibri"/>
-          <w:lang w:val="en-US" w:eastAsia="en-US"/>
-        </w:rPr>
-        <w:t xml:space="preserve"> Typical for portal usability.</w:t>
-      </w:r>
     </w:p>
     <w:p>
       <w:pPr>
@@ -9172,7 +10255,7 @@
               <w:rPr>
                 <w:rFonts w:ascii="Calibri" w:hAnsi="Calibri" w:cs="Calibri"/>
               </w:rPr>
-              <w:t>In Progress</w:t>
+              <w:t>Complete</w:t>
             </w:r>
           </w:p>
         </w:tc>
@@ -9274,7 +10357,7 @@
               <w:rPr>
                 <w:rFonts w:ascii="Calibri" w:hAnsi="Calibri" w:cs="Calibri"/>
               </w:rPr>
-              <w:t>Ready</w:t>
+              <w:t>In Progress</w:t>
             </w:r>
           </w:p>
         </w:tc>
@@ -9625,6 +10708,155 @@
     </w:lvl>
   </w:abstractNum>
   <w:abstractNum w:abstractNumId="2" w15:restartNumberingAfterBreak="0">
+    <w:nsid w:val="0CEC7AA4"/>
+    <w:multiLevelType w:val="multilevel"/>
+    <w:tmpl w:val="E086F058"/>
+    <w:lvl w:ilvl="0">
+      <w:start w:val="1"/>
+      <w:numFmt w:val="bullet"/>
+      <w:lvlText w:val=""/>
+      <w:lvlJc w:val="left"/>
+      <w:pPr>
+        <w:tabs>
+          <w:tab w:val="num" w:pos="720"/>
+        </w:tabs>
+        <w:ind w:left="720" w:hanging="360"/>
+      </w:pPr>
+      <w:rPr>
+        <w:rFonts w:ascii="Symbol" w:hAnsi="Symbol" w:hint="default"/>
+        <w:sz w:val="20"/>
+      </w:rPr>
+    </w:lvl>
+    <w:lvl w:ilvl="1" w:tentative="1">
+      <w:start w:val="1"/>
+      <w:numFmt w:val="bullet"/>
+      <w:lvlText w:val="o"/>
+      <w:lvlJc w:val="left"/>
+      <w:pPr>
+        <w:tabs>
+          <w:tab w:val="num" w:pos="1440"/>
+        </w:tabs>
+        <w:ind w:left="1440" w:hanging="360"/>
+      </w:pPr>
+      <w:rPr>
+        <w:rFonts w:ascii="Courier New" w:hAnsi="Courier New" w:hint="default"/>
+        <w:sz w:val="20"/>
+      </w:rPr>
+    </w:lvl>
+    <w:lvl w:ilvl="2" w:tentative="1">
+      <w:start w:val="1"/>
+      <w:numFmt w:val="bullet"/>
+      <w:lvlText w:val=""/>
+      <w:lvlJc w:val="left"/>
+      <w:pPr>
+        <w:tabs>
+          <w:tab w:val="num" w:pos="2160"/>
+        </w:tabs>
+        <w:ind w:left="2160" w:hanging="360"/>
+      </w:pPr>
+      <w:rPr>
+        <w:rFonts w:ascii="Wingdings" w:hAnsi="Wingdings" w:hint="default"/>
+        <w:sz w:val="20"/>
+      </w:rPr>
+    </w:lvl>
+    <w:lvl w:ilvl="3" w:tentative="1">
+      <w:start w:val="1"/>
+      <w:numFmt w:val="bullet"/>
+      <w:lvlText w:val=""/>
+      <w:lvlJc w:val="left"/>
+      <w:pPr>
+        <w:tabs>
+          <w:tab w:val="num" w:pos="2880"/>
+        </w:tabs>
+        <w:ind w:left="2880" w:hanging="360"/>
+      </w:pPr>
+      <w:rPr>
+        <w:rFonts w:ascii="Wingdings" w:hAnsi="Wingdings" w:hint="default"/>
+        <w:sz w:val="20"/>
+      </w:rPr>
+    </w:lvl>
+    <w:lvl w:ilvl="4" w:tentative="1">
+      <w:start w:val="1"/>
+      <w:numFmt w:val="bullet"/>
+      <w:lvlText w:val=""/>
+      <w:lvlJc w:val="left"/>
+      <w:pPr>
+        <w:tabs>
+          <w:tab w:val="num" w:pos="3600"/>
+        </w:tabs>
+        <w:ind w:left="3600" w:hanging="360"/>
+      </w:pPr>
+      <w:rPr>
+        <w:rFonts w:ascii="Wingdings" w:hAnsi="Wingdings" w:hint="default"/>
+        <w:sz w:val="20"/>
+      </w:rPr>
+    </w:lvl>
+    <w:lvl w:ilvl="5" w:tentative="1">
+      <w:start w:val="1"/>
+      <w:numFmt w:val="bullet"/>
+      <w:lvlText w:val=""/>
+      <w:lvlJc w:val="left"/>
+      <w:pPr>
+        <w:tabs>
+          <w:tab w:val="num" w:pos="4320"/>
+        </w:tabs>
+        <w:ind w:left="4320" w:hanging="360"/>
+      </w:pPr>
+      <w:rPr>
+        <w:rFonts w:ascii="Wingdings" w:hAnsi="Wingdings" w:hint="default"/>
+        <w:sz w:val="20"/>
+      </w:rPr>
+    </w:lvl>
+    <w:lvl w:ilvl="6" w:tentative="1">
+      <w:start w:val="1"/>
+      <w:numFmt w:val="bullet"/>
+      <w:lvlText w:val=""/>
+      <w:lvlJc w:val="left"/>
+      <w:pPr>
+        <w:tabs>
+          <w:tab w:val="num" w:pos="5040"/>
+        </w:tabs>
+        <w:ind w:left="5040" w:hanging="360"/>
+      </w:pPr>
+      <w:rPr>
+        <w:rFonts w:ascii="Wingdings" w:hAnsi="Wingdings" w:hint="default"/>
+        <w:sz w:val="20"/>
+      </w:rPr>
+    </w:lvl>
+    <w:lvl w:ilvl="7" w:tentative="1">
+      <w:start w:val="1"/>
+      <w:numFmt w:val="bullet"/>
+      <w:lvlText w:val=""/>
+      <w:lvlJc w:val="left"/>
+      <w:pPr>
+        <w:tabs>
+          <w:tab w:val="num" w:pos="5760"/>
+        </w:tabs>
+        <w:ind w:left="5760" w:hanging="360"/>
+      </w:pPr>
+      <w:rPr>
+        <w:rFonts w:ascii="Wingdings" w:hAnsi="Wingdings" w:hint="default"/>
+        <w:sz w:val="20"/>
+      </w:rPr>
+    </w:lvl>
+    <w:lvl w:ilvl="8" w:tentative="1">
+      <w:start w:val="1"/>
+      <w:numFmt w:val="bullet"/>
+      <w:lvlText w:val=""/>
+      <w:lvlJc w:val="left"/>
+      <w:pPr>
+        <w:tabs>
+          <w:tab w:val="num" w:pos="6480"/>
+        </w:tabs>
+        <w:ind w:left="6480" w:hanging="360"/>
+      </w:pPr>
+      <w:rPr>
+        <w:rFonts w:ascii="Wingdings" w:hAnsi="Wingdings" w:hint="default"/>
+        <w:sz w:val="20"/>
+      </w:rPr>
+    </w:lvl>
+  </w:abstractNum>
+  <w:abstractNum w:abstractNumId="3" w15:restartNumberingAfterBreak="0">
     <w:nsid w:val="128B15F8"/>
     <w:multiLevelType w:val="hybridMultilevel"/>
     <w:tmpl w:val="1DD60F18"/>
@@ -9710,7 +10942,156 @@
       </w:pPr>
     </w:lvl>
   </w:abstractNum>
-  <w:abstractNum w:abstractNumId="3" w15:restartNumberingAfterBreak="0">
+  <w:abstractNum w:abstractNumId="4" w15:restartNumberingAfterBreak="0">
+    <w:nsid w:val="1ADF2240"/>
+    <w:multiLevelType w:val="multilevel"/>
+    <w:tmpl w:val="E086F058"/>
+    <w:lvl w:ilvl="0">
+      <w:start w:val="1"/>
+      <w:numFmt w:val="bullet"/>
+      <w:lvlText w:val=""/>
+      <w:lvlJc w:val="left"/>
+      <w:pPr>
+        <w:tabs>
+          <w:tab w:val="num" w:pos="720"/>
+        </w:tabs>
+        <w:ind w:left="720" w:hanging="360"/>
+      </w:pPr>
+      <w:rPr>
+        <w:rFonts w:ascii="Symbol" w:hAnsi="Symbol" w:hint="default"/>
+        <w:sz w:val="20"/>
+      </w:rPr>
+    </w:lvl>
+    <w:lvl w:ilvl="1" w:tentative="1">
+      <w:start w:val="1"/>
+      <w:numFmt w:val="bullet"/>
+      <w:lvlText w:val="o"/>
+      <w:lvlJc w:val="left"/>
+      <w:pPr>
+        <w:tabs>
+          <w:tab w:val="num" w:pos="1440"/>
+        </w:tabs>
+        <w:ind w:left="1440" w:hanging="360"/>
+      </w:pPr>
+      <w:rPr>
+        <w:rFonts w:ascii="Courier New" w:hAnsi="Courier New" w:hint="default"/>
+        <w:sz w:val="20"/>
+      </w:rPr>
+    </w:lvl>
+    <w:lvl w:ilvl="2" w:tentative="1">
+      <w:start w:val="1"/>
+      <w:numFmt w:val="bullet"/>
+      <w:lvlText w:val=""/>
+      <w:lvlJc w:val="left"/>
+      <w:pPr>
+        <w:tabs>
+          <w:tab w:val="num" w:pos="2160"/>
+        </w:tabs>
+        <w:ind w:left="2160" w:hanging="360"/>
+      </w:pPr>
+      <w:rPr>
+        <w:rFonts w:ascii="Wingdings" w:hAnsi="Wingdings" w:hint="default"/>
+        <w:sz w:val="20"/>
+      </w:rPr>
+    </w:lvl>
+    <w:lvl w:ilvl="3" w:tentative="1">
+      <w:start w:val="1"/>
+      <w:numFmt w:val="bullet"/>
+      <w:lvlText w:val=""/>
+      <w:lvlJc w:val="left"/>
+      <w:pPr>
+        <w:tabs>
+          <w:tab w:val="num" w:pos="2880"/>
+        </w:tabs>
+        <w:ind w:left="2880" w:hanging="360"/>
+      </w:pPr>
+      <w:rPr>
+        <w:rFonts w:ascii="Wingdings" w:hAnsi="Wingdings" w:hint="default"/>
+        <w:sz w:val="20"/>
+      </w:rPr>
+    </w:lvl>
+    <w:lvl w:ilvl="4" w:tentative="1">
+      <w:start w:val="1"/>
+      <w:numFmt w:val="bullet"/>
+      <w:lvlText w:val=""/>
+      <w:lvlJc w:val="left"/>
+      <w:pPr>
+        <w:tabs>
+          <w:tab w:val="num" w:pos="3600"/>
+        </w:tabs>
+        <w:ind w:left="3600" w:hanging="360"/>
+      </w:pPr>
+      <w:rPr>
+        <w:rFonts w:ascii="Wingdings" w:hAnsi="Wingdings" w:hint="default"/>
+        <w:sz w:val="20"/>
+      </w:rPr>
+    </w:lvl>
+    <w:lvl w:ilvl="5" w:tentative="1">
+      <w:start w:val="1"/>
+      <w:numFmt w:val="bullet"/>
+      <w:lvlText w:val=""/>
+      <w:lvlJc w:val="left"/>
+      <w:pPr>
+        <w:tabs>
+          <w:tab w:val="num" w:pos="4320"/>
+        </w:tabs>
+        <w:ind w:left="4320" w:hanging="360"/>
+      </w:pPr>
+      <w:rPr>
+        <w:rFonts w:ascii="Wingdings" w:hAnsi="Wingdings" w:hint="default"/>
+        <w:sz w:val="20"/>
+      </w:rPr>
+    </w:lvl>
+    <w:lvl w:ilvl="6" w:tentative="1">
+      <w:start w:val="1"/>
+      <w:numFmt w:val="bullet"/>
+      <w:lvlText w:val=""/>
+      <w:lvlJc w:val="left"/>
+      <w:pPr>
+        <w:tabs>
+          <w:tab w:val="num" w:pos="5040"/>
+        </w:tabs>
+        <w:ind w:left="5040" w:hanging="360"/>
+      </w:pPr>
+      <w:rPr>
+        <w:rFonts w:ascii="Wingdings" w:hAnsi="Wingdings" w:hint="default"/>
+        <w:sz w:val="20"/>
+      </w:rPr>
+    </w:lvl>
+    <w:lvl w:ilvl="7" w:tentative="1">
+      <w:start w:val="1"/>
+      <w:numFmt w:val="bullet"/>
+      <w:lvlText w:val=""/>
+      <w:lvlJc w:val="left"/>
+      <w:pPr>
+        <w:tabs>
+          <w:tab w:val="num" w:pos="5760"/>
+        </w:tabs>
+        <w:ind w:left="5760" w:hanging="360"/>
+      </w:pPr>
+      <w:rPr>
+        <w:rFonts w:ascii="Wingdings" w:hAnsi="Wingdings" w:hint="default"/>
+        <w:sz w:val="20"/>
+      </w:rPr>
+    </w:lvl>
+    <w:lvl w:ilvl="8" w:tentative="1">
+      <w:start w:val="1"/>
+      <w:numFmt w:val="bullet"/>
+      <w:lvlText w:val=""/>
+      <w:lvlJc w:val="left"/>
+      <w:pPr>
+        <w:tabs>
+          <w:tab w:val="num" w:pos="6480"/>
+        </w:tabs>
+        <w:ind w:left="6480" w:hanging="360"/>
+      </w:pPr>
+      <w:rPr>
+        <w:rFonts w:ascii="Wingdings" w:hAnsi="Wingdings" w:hint="default"/>
+        <w:sz w:val="20"/>
+      </w:rPr>
+    </w:lvl>
+  </w:abstractNum>
+  <w:abstractNum w:abstractNumId="5" w15:restartNumberingAfterBreak="0">
     <w:nsid w:val="1F900C03"/>
     <w:multiLevelType w:val="multilevel"/>
     <w:tmpl w:val="E086F058"/>
@@ -9859,7 +11240,7 @@
       </w:rPr>
     </w:lvl>
   </w:abstractNum>
-  <w:abstractNum w:abstractNumId="4" w15:restartNumberingAfterBreak="0">
+  <w:abstractNum w:abstractNumId="6" w15:restartNumberingAfterBreak="0">
     <w:nsid w:val="24A040BF"/>
     <w:multiLevelType w:val="multilevel"/>
     <w:tmpl w:val="E086F058"/>
@@ -10008,7 +11389,156 @@
       </w:rPr>
     </w:lvl>
   </w:abstractNum>
-  <w:abstractNum w:abstractNumId="5" w15:restartNumberingAfterBreak="0">
+  <w:abstractNum w:abstractNumId="7" w15:restartNumberingAfterBreak="0">
+    <w:nsid w:val="24FC22CF"/>
+    <w:multiLevelType w:val="multilevel"/>
+    <w:tmpl w:val="E086F058"/>
+    <w:lvl w:ilvl="0">
+      <w:start w:val="1"/>
+      <w:numFmt w:val="bullet"/>
+      <w:lvlText w:val=""/>
+      <w:lvlJc w:val="left"/>
+      <w:pPr>
+        <w:tabs>
+          <w:tab w:val="num" w:pos="720"/>
+        </w:tabs>
+        <w:ind w:left="720" w:hanging="360"/>
+      </w:pPr>
+      <w:rPr>
+        <w:rFonts w:ascii="Symbol" w:hAnsi="Symbol" w:hint="default"/>
+        <w:sz w:val="20"/>
+      </w:rPr>
+    </w:lvl>
+    <w:lvl w:ilvl="1" w:tentative="1">
+      <w:start w:val="1"/>
+      <w:numFmt w:val="bullet"/>
+      <w:lvlText w:val="o"/>
+      <w:lvlJc w:val="left"/>
+      <w:pPr>
+        <w:tabs>
+          <w:tab w:val="num" w:pos="1440"/>
+        </w:tabs>
+        <w:ind w:left="1440" w:hanging="360"/>
+      </w:pPr>
+      <w:rPr>
+        <w:rFonts w:ascii="Courier New" w:hAnsi="Courier New" w:hint="default"/>
+        <w:sz w:val="20"/>
+      </w:rPr>
+    </w:lvl>
+    <w:lvl w:ilvl="2" w:tentative="1">
+      <w:start w:val="1"/>
+      <w:numFmt w:val="bullet"/>
+      <w:lvlText w:val=""/>
+      <w:lvlJc w:val="left"/>
+      <w:pPr>
+        <w:tabs>
+          <w:tab w:val="num" w:pos="2160"/>
+        </w:tabs>
+        <w:ind w:left="2160" w:hanging="360"/>
+      </w:pPr>
+      <w:rPr>
+        <w:rFonts w:ascii="Wingdings" w:hAnsi="Wingdings" w:hint="default"/>
+        <w:sz w:val="20"/>
+      </w:rPr>
+    </w:lvl>
+    <w:lvl w:ilvl="3" w:tentative="1">
+      <w:start w:val="1"/>
+      <w:numFmt w:val="bullet"/>
+      <w:lvlText w:val=""/>
+      <w:lvlJc w:val="left"/>
+      <w:pPr>
+        <w:tabs>
+          <w:tab w:val="num" w:pos="2880"/>
+        </w:tabs>
+        <w:ind w:left="2880" w:hanging="360"/>
+      </w:pPr>
+      <w:rPr>
+        <w:rFonts w:ascii="Wingdings" w:hAnsi="Wingdings" w:hint="default"/>
+        <w:sz w:val="20"/>
+      </w:rPr>
+    </w:lvl>
+    <w:lvl w:ilvl="4" w:tentative="1">
+      <w:start w:val="1"/>
+      <w:numFmt w:val="bullet"/>
+      <w:lvlText w:val=""/>
+      <w:lvlJc w:val="left"/>
+      <w:pPr>
+        <w:tabs>
+          <w:tab w:val="num" w:pos="3600"/>
+        </w:tabs>
+        <w:ind w:left="3600" w:hanging="360"/>
+      </w:pPr>
+      <w:rPr>
+        <w:rFonts w:ascii="Wingdings" w:hAnsi="Wingdings" w:hint="default"/>
+        <w:sz w:val="20"/>
+      </w:rPr>
+    </w:lvl>
+    <w:lvl w:ilvl="5" w:tentative="1">
+      <w:start w:val="1"/>
+      <w:numFmt w:val="bullet"/>
+      <w:lvlText w:val=""/>
+      <w:lvlJc w:val="left"/>
+      <w:pPr>
+        <w:tabs>
+          <w:tab w:val="num" w:pos="4320"/>
+        </w:tabs>
+        <w:ind w:left="4320" w:hanging="360"/>
+      </w:pPr>
+      <w:rPr>
+        <w:rFonts w:ascii="Wingdings" w:hAnsi="Wingdings" w:hint="default"/>
+        <w:sz w:val="20"/>
+      </w:rPr>
+    </w:lvl>
+    <w:lvl w:ilvl="6" w:tentative="1">
+      <w:start w:val="1"/>
+      <w:numFmt w:val="bullet"/>
+      <w:lvlText w:val=""/>
+      <w:lvlJc w:val="left"/>
+      <w:pPr>
+        <w:tabs>
+          <w:tab w:val="num" w:pos="5040"/>
+        </w:tabs>
+        <w:ind w:left="5040" w:hanging="360"/>
+      </w:pPr>
+      <w:rPr>
+        <w:rFonts w:ascii="Wingdings" w:hAnsi="Wingdings" w:hint="default"/>
+        <w:sz w:val="20"/>
+      </w:rPr>
+    </w:lvl>
+    <w:lvl w:ilvl="7" w:tentative="1">
+      <w:start w:val="1"/>
+      <w:numFmt w:val="bullet"/>
+      <w:lvlText w:val=""/>
+      <w:lvlJc w:val="left"/>
+      <w:pPr>
+        <w:tabs>
+          <w:tab w:val="num" w:pos="5760"/>
+        </w:tabs>
+        <w:ind w:left="5760" w:hanging="360"/>
+      </w:pPr>
+      <w:rPr>
+        <w:rFonts w:ascii="Wingdings" w:hAnsi="Wingdings" w:hint="default"/>
+        <w:sz w:val="20"/>
+      </w:rPr>
+    </w:lvl>
+    <w:lvl w:ilvl="8" w:tentative="1">
+      <w:start w:val="1"/>
+      <w:numFmt w:val="bullet"/>
+      <w:lvlText w:val=""/>
+      <w:lvlJc w:val="left"/>
+      <w:pPr>
+        <w:tabs>
+          <w:tab w:val="num" w:pos="6480"/>
+        </w:tabs>
+        <w:ind w:left="6480" w:hanging="360"/>
+      </w:pPr>
+      <w:rPr>
+        <w:rFonts w:ascii="Wingdings" w:hAnsi="Wingdings" w:hint="default"/>
+        <w:sz w:val="20"/>
+      </w:rPr>
+    </w:lvl>
+  </w:abstractNum>
+  <w:abstractNum w:abstractNumId="8" w15:restartNumberingAfterBreak="0">
     <w:nsid w:val="283373EB"/>
     <w:multiLevelType w:val="hybridMultilevel"/>
     <w:tmpl w:val="D834C6F8"/>
@@ -10098,7 +11628,156 @@
       </w:pPr>
     </w:lvl>
   </w:abstractNum>
-  <w:abstractNum w:abstractNumId="6" w15:restartNumberingAfterBreak="0">
+  <w:abstractNum w:abstractNumId="9" w15:restartNumberingAfterBreak="0">
+    <w:nsid w:val="28480FCD"/>
+    <w:multiLevelType w:val="multilevel"/>
+    <w:tmpl w:val="E086F058"/>
+    <w:lvl w:ilvl="0">
+      <w:start w:val="1"/>
+      <w:numFmt w:val="bullet"/>
+      <w:lvlText w:val=""/>
+      <w:lvlJc w:val="left"/>
+      <w:pPr>
+        <w:tabs>
+          <w:tab w:val="num" w:pos="720"/>
+        </w:tabs>
+        <w:ind w:left="720" w:hanging="360"/>
+      </w:pPr>
+      <w:rPr>
+        <w:rFonts w:ascii="Symbol" w:hAnsi="Symbol" w:hint="default"/>
+        <w:sz w:val="20"/>
+      </w:rPr>
+    </w:lvl>
+    <w:lvl w:ilvl="1" w:tentative="1">
+      <w:start w:val="1"/>
+      <w:numFmt w:val="bullet"/>
+      <w:lvlText w:val="o"/>
+      <w:lvlJc w:val="left"/>
+      <w:pPr>
+        <w:tabs>
+          <w:tab w:val="num" w:pos="1440"/>
+        </w:tabs>
+        <w:ind w:left="1440" w:hanging="360"/>
+      </w:pPr>
+      <w:rPr>
+        <w:rFonts w:ascii="Courier New" w:hAnsi="Courier New" w:hint="default"/>
+        <w:sz w:val="20"/>
+      </w:rPr>
+    </w:lvl>
+    <w:lvl w:ilvl="2" w:tentative="1">
+      <w:start w:val="1"/>
+      <w:numFmt w:val="bullet"/>
+      <w:lvlText w:val=""/>
+      <w:lvlJc w:val="left"/>
+      <w:pPr>
+        <w:tabs>
+          <w:tab w:val="num" w:pos="2160"/>
+        </w:tabs>
+        <w:ind w:left="2160" w:hanging="360"/>
+      </w:pPr>
+      <w:rPr>
+        <w:rFonts w:ascii="Wingdings" w:hAnsi="Wingdings" w:hint="default"/>
+        <w:sz w:val="20"/>
+      </w:rPr>
+    </w:lvl>
+    <w:lvl w:ilvl="3" w:tentative="1">
+      <w:start w:val="1"/>
+      <w:numFmt w:val="bullet"/>
+      <w:lvlText w:val=""/>
+      <w:lvlJc w:val="left"/>
+      <w:pPr>
+        <w:tabs>
+          <w:tab w:val="num" w:pos="2880"/>
+        </w:tabs>
+        <w:ind w:left="2880" w:hanging="360"/>
+      </w:pPr>
+      <w:rPr>
+        <w:rFonts w:ascii="Wingdings" w:hAnsi="Wingdings" w:hint="default"/>
+        <w:sz w:val="20"/>
+      </w:rPr>
+    </w:lvl>
+    <w:lvl w:ilvl="4" w:tentative="1">
+      <w:start w:val="1"/>
+      <w:numFmt w:val="bullet"/>
+      <w:lvlText w:val=""/>
+      <w:lvlJc w:val="left"/>
+      <w:pPr>
+        <w:tabs>
+          <w:tab w:val="num" w:pos="3600"/>
+        </w:tabs>
+        <w:ind w:left="3600" w:hanging="360"/>
+      </w:pPr>
+      <w:rPr>
+        <w:rFonts w:ascii="Wingdings" w:hAnsi="Wingdings" w:hint="default"/>
+        <w:sz w:val="20"/>
+      </w:rPr>
+    </w:lvl>
+    <w:lvl w:ilvl="5" w:tentative="1">
+      <w:start w:val="1"/>
+      <w:numFmt w:val="bullet"/>
+      <w:lvlText w:val=""/>
+      <w:lvlJc w:val="left"/>
+      <w:pPr>
+        <w:tabs>
+          <w:tab w:val="num" w:pos="4320"/>
+        </w:tabs>
+        <w:ind w:left="4320" w:hanging="360"/>
+      </w:pPr>
+      <w:rPr>
+        <w:rFonts w:ascii="Wingdings" w:hAnsi="Wingdings" w:hint="default"/>
+        <w:sz w:val="20"/>
+      </w:rPr>
+    </w:lvl>
+    <w:lvl w:ilvl="6" w:tentative="1">
+      <w:start w:val="1"/>
+      <w:numFmt w:val="bullet"/>
+      <w:lvlText w:val=""/>
+      <w:lvlJc w:val="left"/>
+      <w:pPr>
+        <w:tabs>
+          <w:tab w:val="num" w:pos="5040"/>
+        </w:tabs>
+        <w:ind w:left="5040" w:hanging="360"/>
+      </w:pPr>
+      <w:rPr>
+        <w:rFonts w:ascii="Wingdings" w:hAnsi="Wingdings" w:hint="default"/>
+        <w:sz w:val="20"/>
+      </w:rPr>
+    </w:lvl>
+    <w:lvl w:ilvl="7" w:tentative="1">
+      <w:start w:val="1"/>
+      <w:numFmt w:val="bullet"/>
+      <w:lvlText w:val=""/>
+      <w:lvlJc w:val="left"/>
+      <w:pPr>
+        <w:tabs>
+          <w:tab w:val="num" w:pos="5760"/>
+        </w:tabs>
+        <w:ind w:left="5760" w:hanging="360"/>
+      </w:pPr>
+      <w:rPr>
+        <w:rFonts w:ascii="Wingdings" w:hAnsi="Wingdings" w:hint="default"/>
+        <w:sz w:val="20"/>
+      </w:rPr>
+    </w:lvl>
+    <w:lvl w:ilvl="8" w:tentative="1">
+      <w:start w:val="1"/>
+      <w:numFmt w:val="bullet"/>
+      <w:lvlText w:val=""/>
+      <w:lvlJc w:val="left"/>
+      <w:pPr>
+        <w:tabs>
+          <w:tab w:val="num" w:pos="6480"/>
+        </w:tabs>
+        <w:ind w:left="6480" w:hanging="360"/>
+      </w:pPr>
+      <w:rPr>
+        <w:rFonts w:ascii="Wingdings" w:hAnsi="Wingdings" w:hint="default"/>
+        <w:sz w:val="20"/>
+      </w:rPr>
+    </w:lvl>
+  </w:abstractNum>
+  <w:abstractNum w:abstractNumId="10" w15:restartNumberingAfterBreak="0">
     <w:nsid w:val="295F5C75"/>
     <w:multiLevelType w:val="multilevel"/>
     <w:tmpl w:val="E086F058"/>
@@ -10247,7 +11926,7 @@
       </w:rPr>
     </w:lvl>
   </w:abstractNum>
-  <w:abstractNum w:abstractNumId="7" w15:restartNumberingAfterBreak="0">
+  <w:abstractNum w:abstractNumId="11" w15:restartNumberingAfterBreak="0">
     <w:nsid w:val="321D3A3A"/>
     <w:multiLevelType w:val="hybridMultilevel"/>
     <w:tmpl w:val="E2DA8AE0"/>
@@ -10333,7 +12012,305 @@
       </w:pPr>
     </w:lvl>
   </w:abstractNum>
-  <w:abstractNum w:abstractNumId="8" w15:restartNumberingAfterBreak="0">
+  <w:abstractNum w:abstractNumId="12" w15:restartNumberingAfterBreak="0">
+    <w:nsid w:val="4FEE2EB4"/>
+    <w:multiLevelType w:val="multilevel"/>
+    <w:tmpl w:val="E086F058"/>
+    <w:lvl w:ilvl="0">
+      <w:start w:val="1"/>
+      <w:numFmt w:val="bullet"/>
+      <w:lvlText w:val=""/>
+      <w:lvlJc w:val="left"/>
+      <w:pPr>
+        <w:tabs>
+          <w:tab w:val="num" w:pos="720"/>
+        </w:tabs>
+        <w:ind w:left="720" w:hanging="360"/>
+      </w:pPr>
+      <w:rPr>
+        <w:rFonts w:ascii="Symbol" w:hAnsi="Symbol" w:hint="default"/>
+        <w:sz w:val="20"/>
+      </w:rPr>
+    </w:lvl>
+    <w:lvl w:ilvl="1" w:tentative="1">
+      <w:start w:val="1"/>
+      <w:numFmt w:val="bullet"/>
+      <w:lvlText w:val="o"/>
+      <w:lvlJc w:val="left"/>
+      <w:pPr>
+        <w:tabs>
+          <w:tab w:val="num" w:pos="1440"/>
+        </w:tabs>
+        <w:ind w:left="1440" w:hanging="360"/>
+      </w:pPr>
+      <w:rPr>
+        <w:rFonts w:ascii="Courier New" w:hAnsi="Courier New" w:hint="default"/>
+        <w:sz w:val="20"/>
+      </w:rPr>
+    </w:lvl>
+    <w:lvl w:ilvl="2" w:tentative="1">
+      <w:start w:val="1"/>
+      <w:numFmt w:val="bullet"/>
+      <w:lvlText w:val=""/>
+      <w:lvlJc w:val="left"/>
+      <w:pPr>
+        <w:tabs>
+          <w:tab w:val="num" w:pos="2160"/>
+        </w:tabs>
+        <w:ind w:left="2160" w:hanging="360"/>
+      </w:pPr>
+      <w:rPr>
+        <w:rFonts w:ascii="Wingdings" w:hAnsi="Wingdings" w:hint="default"/>
+        <w:sz w:val="20"/>
+      </w:rPr>
+    </w:lvl>
+    <w:lvl w:ilvl="3" w:tentative="1">
+      <w:start w:val="1"/>
+      <w:numFmt w:val="bullet"/>
+      <w:lvlText w:val=""/>
+      <w:lvlJc w:val="left"/>
+      <w:pPr>
+        <w:tabs>
+          <w:tab w:val="num" w:pos="2880"/>
+        </w:tabs>
+        <w:ind w:left="2880" w:hanging="360"/>
+      </w:pPr>
+      <w:rPr>
+        <w:rFonts w:ascii="Wingdings" w:hAnsi="Wingdings" w:hint="default"/>
+        <w:sz w:val="20"/>
+      </w:rPr>
+    </w:lvl>
+    <w:lvl w:ilvl="4" w:tentative="1">
+      <w:start w:val="1"/>
+      <w:numFmt w:val="bullet"/>
+      <w:lvlText w:val=""/>
+      <w:lvlJc w:val="left"/>
+      <w:pPr>
+        <w:tabs>
+          <w:tab w:val="num" w:pos="3600"/>
+        </w:tabs>
+        <w:ind w:left="3600" w:hanging="360"/>
+      </w:pPr>
+      <w:rPr>
+        <w:rFonts w:ascii="Wingdings" w:hAnsi="Wingdings" w:hint="default"/>
+        <w:sz w:val="20"/>
+      </w:rPr>
+    </w:lvl>
+    <w:lvl w:ilvl="5" w:tentative="1">
+      <w:start w:val="1"/>
+      <w:numFmt w:val="bullet"/>
+      <w:lvlText w:val=""/>
+      <w:lvlJc w:val="left"/>
+      <w:pPr>
+        <w:tabs>
+          <w:tab w:val="num" w:pos="4320"/>
+        </w:tabs>
+        <w:ind w:left="4320" w:hanging="360"/>
+      </w:pPr>
+      <w:rPr>
+        <w:rFonts w:ascii="Wingdings" w:hAnsi="Wingdings" w:hint="default"/>
+        <w:sz w:val="20"/>
+      </w:rPr>
+    </w:lvl>
+    <w:lvl w:ilvl="6" w:tentative="1">
+      <w:start w:val="1"/>
+      <w:numFmt w:val="bullet"/>
+      <w:lvlText w:val=""/>
+      <w:lvlJc w:val="left"/>
+      <w:pPr>
+        <w:tabs>
+          <w:tab w:val="num" w:pos="5040"/>
+        </w:tabs>
+        <w:ind w:left="5040" w:hanging="360"/>
+      </w:pPr>
+      <w:rPr>
+        <w:rFonts w:ascii="Wingdings" w:hAnsi="Wingdings" w:hint="default"/>
+        <w:sz w:val="20"/>
+      </w:rPr>
+    </w:lvl>
+    <w:lvl w:ilvl="7" w:tentative="1">
+      <w:start w:val="1"/>
+      <w:numFmt w:val="bullet"/>
+      <w:lvlText w:val=""/>
+      <w:lvlJc w:val="left"/>
+      <w:pPr>
+        <w:tabs>
+          <w:tab w:val="num" w:pos="5760"/>
+        </w:tabs>
+        <w:ind w:left="5760" w:hanging="360"/>
+      </w:pPr>
+      <w:rPr>
+        <w:rFonts w:ascii="Wingdings" w:hAnsi="Wingdings" w:hint="default"/>
+        <w:sz w:val="20"/>
+      </w:rPr>
+    </w:lvl>
+    <w:lvl w:ilvl="8" w:tentative="1">
+      <w:start w:val="1"/>
+      <w:numFmt w:val="bullet"/>
+      <w:lvlText w:val=""/>
+      <w:lvlJc w:val="left"/>
+      <w:pPr>
+        <w:tabs>
+          <w:tab w:val="num" w:pos="6480"/>
+        </w:tabs>
+        <w:ind w:left="6480" w:hanging="360"/>
+      </w:pPr>
+      <w:rPr>
+        <w:rFonts w:ascii="Wingdings" w:hAnsi="Wingdings" w:hint="default"/>
+        <w:sz w:val="20"/>
+      </w:rPr>
+    </w:lvl>
+  </w:abstractNum>
+  <w:abstractNum w:abstractNumId="13" w15:restartNumberingAfterBreak="0">
+    <w:nsid w:val="50DD7D7B"/>
+    <w:multiLevelType w:val="multilevel"/>
+    <w:tmpl w:val="E086F058"/>
+    <w:lvl w:ilvl="0">
+      <w:start w:val="1"/>
+      <w:numFmt w:val="bullet"/>
+      <w:lvlText w:val=""/>
+      <w:lvlJc w:val="left"/>
+      <w:pPr>
+        <w:tabs>
+          <w:tab w:val="num" w:pos="720"/>
+        </w:tabs>
+        <w:ind w:left="720" w:hanging="360"/>
+      </w:pPr>
+      <w:rPr>
+        <w:rFonts w:ascii="Symbol" w:hAnsi="Symbol" w:hint="default"/>
+        <w:sz w:val="20"/>
+      </w:rPr>
+    </w:lvl>
+    <w:lvl w:ilvl="1" w:tentative="1">
+      <w:start w:val="1"/>
+      <w:numFmt w:val="bullet"/>
+      <w:lvlText w:val="o"/>
+      <w:lvlJc w:val="left"/>
+      <w:pPr>
+        <w:tabs>
+          <w:tab w:val="num" w:pos="1440"/>
+        </w:tabs>
+        <w:ind w:left="1440" w:hanging="360"/>
+      </w:pPr>
+      <w:rPr>
+        <w:rFonts w:ascii="Courier New" w:hAnsi="Courier New" w:hint="default"/>
+        <w:sz w:val="20"/>
+      </w:rPr>
+    </w:lvl>
+    <w:lvl w:ilvl="2" w:tentative="1">
+      <w:start w:val="1"/>
+      <w:numFmt w:val="bullet"/>
+      <w:lvlText w:val=""/>
+      <w:lvlJc w:val="left"/>
+      <w:pPr>
+        <w:tabs>
+          <w:tab w:val="num" w:pos="2160"/>
+        </w:tabs>
+        <w:ind w:left="2160" w:hanging="360"/>
+      </w:pPr>
+      <w:rPr>
+        <w:rFonts w:ascii="Wingdings" w:hAnsi="Wingdings" w:hint="default"/>
+        <w:sz w:val="20"/>
+      </w:rPr>
+    </w:lvl>
+    <w:lvl w:ilvl="3" w:tentative="1">
+      <w:start w:val="1"/>
+      <w:numFmt w:val="bullet"/>
+      <w:lvlText w:val=""/>
+      <w:lvlJc w:val="left"/>
+      <w:pPr>
+        <w:tabs>
+          <w:tab w:val="num" w:pos="2880"/>
+        </w:tabs>
+        <w:ind w:left="2880" w:hanging="360"/>
+      </w:pPr>
+      <w:rPr>
+        <w:rFonts w:ascii="Wingdings" w:hAnsi="Wingdings" w:hint="default"/>
+        <w:sz w:val="20"/>
+      </w:rPr>
+    </w:lvl>
+    <w:lvl w:ilvl="4" w:tentative="1">
+      <w:start w:val="1"/>
+      <w:numFmt w:val="bullet"/>
+      <w:lvlText w:val=""/>
+      <w:lvlJc w:val="left"/>
+      <w:pPr>
+        <w:tabs>
+          <w:tab w:val="num" w:pos="3600"/>
+        </w:tabs>
+        <w:ind w:left="3600" w:hanging="360"/>
+      </w:pPr>
+      <w:rPr>
+        <w:rFonts w:ascii="Wingdings" w:hAnsi="Wingdings" w:hint="default"/>
+        <w:sz w:val="20"/>
+      </w:rPr>
+    </w:lvl>
+    <w:lvl w:ilvl="5" w:tentative="1">
+      <w:start w:val="1"/>
+      <w:numFmt w:val="bullet"/>
+      <w:lvlText w:val=""/>
+      <w:lvlJc w:val="left"/>
+      <w:pPr>
+        <w:tabs>
+          <w:tab w:val="num" w:pos="4320"/>
+        </w:tabs>
+        <w:ind w:left="4320" w:hanging="360"/>
+      </w:pPr>
+      <w:rPr>
+        <w:rFonts w:ascii="Wingdings" w:hAnsi="Wingdings" w:hint="default"/>
+        <w:sz w:val="20"/>
+      </w:rPr>
+    </w:lvl>
+    <w:lvl w:ilvl="6" w:tentative="1">
+      <w:start w:val="1"/>
+      <w:numFmt w:val="bullet"/>
+      <w:lvlText w:val=""/>
+      <w:lvlJc w:val="left"/>
+      <w:pPr>
+        <w:tabs>
+          <w:tab w:val="num" w:pos="5040"/>
+        </w:tabs>
+        <w:ind w:left="5040" w:hanging="360"/>
+      </w:pPr>
+      <w:rPr>
+        <w:rFonts w:ascii="Wingdings" w:hAnsi="Wingdings" w:hint="default"/>
+        <w:sz w:val="20"/>
+      </w:rPr>
+    </w:lvl>
+    <w:lvl w:ilvl="7" w:tentative="1">
+      <w:start w:val="1"/>
+      <w:numFmt w:val="bullet"/>
+      <w:lvlText w:val=""/>
+      <w:lvlJc w:val="left"/>
+      <w:pPr>
+        <w:tabs>
+          <w:tab w:val="num" w:pos="5760"/>
+        </w:tabs>
+        <w:ind w:left="5760" w:hanging="360"/>
+      </w:pPr>
+      <w:rPr>
+        <w:rFonts w:ascii="Wingdings" w:hAnsi="Wingdings" w:hint="default"/>
+        <w:sz w:val="20"/>
+      </w:rPr>
+    </w:lvl>
+    <w:lvl w:ilvl="8" w:tentative="1">
+      <w:start w:val="1"/>
+      <w:numFmt w:val="bullet"/>
+      <w:lvlText w:val=""/>
+      <w:lvlJc w:val="left"/>
+      <w:pPr>
+        <w:tabs>
+          <w:tab w:val="num" w:pos="6480"/>
+        </w:tabs>
+        <w:ind w:left="6480" w:hanging="360"/>
+      </w:pPr>
+      <w:rPr>
+        <w:rFonts w:ascii="Wingdings" w:hAnsi="Wingdings" w:hint="default"/>
+        <w:sz w:val="20"/>
+      </w:rPr>
+    </w:lvl>
+  </w:abstractNum>
+  <w:abstractNum w:abstractNumId="14" w15:restartNumberingAfterBreak="0">
     <w:nsid w:val="52FE12EF"/>
     <w:multiLevelType w:val="multilevel"/>
     <w:tmpl w:val="A74232C0"/>
@@ -10484,7 +12461,7 @@
       </w:rPr>
     </w:lvl>
   </w:abstractNum>
-  <w:abstractNum w:abstractNumId="9" w15:restartNumberingAfterBreak="0">
+  <w:abstractNum w:abstractNumId="15" w15:restartNumberingAfterBreak="0">
     <w:nsid w:val="54A32E67"/>
     <w:multiLevelType w:val="multilevel"/>
     <w:tmpl w:val="D6E0EB9E"/>
@@ -10633,7 +12610,7 @@
       </w:rPr>
     </w:lvl>
   </w:abstractNum>
-  <w:abstractNum w:abstractNumId="10" w15:restartNumberingAfterBreak="0">
+  <w:abstractNum w:abstractNumId="16" w15:restartNumberingAfterBreak="0">
     <w:nsid w:val="5CC81DD8"/>
     <w:multiLevelType w:val="hybridMultilevel"/>
     <w:tmpl w:val="035C2C6E"/>
@@ -10723,7 +12700,7 @@
       </w:pPr>
     </w:lvl>
   </w:abstractNum>
-  <w:abstractNum w:abstractNumId="11" w15:restartNumberingAfterBreak="0">
+  <w:abstractNum w:abstractNumId="17" w15:restartNumberingAfterBreak="0">
     <w:nsid w:val="5D3B65D9"/>
     <w:multiLevelType w:val="multilevel"/>
     <w:tmpl w:val="E086F058"/>
@@ -10872,7 +12849,7 @@
       </w:rPr>
     </w:lvl>
   </w:abstractNum>
-  <w:abstractNum w:abstractNumId="12" w15:restartNumberingAfterBreak="0">
+  <w:abstractNum w:abstractNumId="18" w15:restartNumberingAfterBreak="0">
     <w:nsid w:val="5E2632CE"/>
     <w:multiLevelType w:val="multilevel"/>
     <w:tmpl w:val="E086F058"/>
@@ -11021,7 +12998,7 @@
       </w:rPr>
     </w:lvl>
   </w:abstractNum>
-  <w:abstractNum w:abstractNumId="13" w15:restartNumberingAfterBreak="0">
+  <w:abstractNum w:abstractNumId="19" w15:restartNumberingAfterBreak="0">
     <w:nsid w:val="5E5663C9"/>
     <w:multiLevelType w:val="multilevel"/>
     <w:tmpl w:val="E086F058"/>
@@ -11170,7 +13147,7 @@
       </w:rPr>
     </w:lvl>
   </w:abstractNum>
-  <w:abstractNum w:abstractNumId="14" w15:restartNumberingAfterBreak="0">
+  <w:abstractNum w:abstractNumId="20" w15:restartNumberingAfterBreak="0">
     <w:nsid w:val="5E8A1386"/>
     <w:multiLevelType w:val="multilevel"/>
     <w:tmpl w:val="790ACF6A"/>
@@ -11319,7 +13296,305 @@
       </w:rPr>
     </w:lvl>
   </w:abstractNum>
-  <w:abstractNum w:abstractNumId="15" w15:restartNumberingAfterBreak="0">
+  <w:abstractNum w:abstractNumId="21" w15:restartNumberingAfterBreak="0">
+    <w:nsid w:val="669D7071"/>
+    <w:multiLevelType w:val="multilevel"/>
+    <w:tmpl w:val="E086F058"/>
+    <w:lvl w:ilvl="0">
+      <w:start w:val="1"/>
+      <w:numFmt w:val="bullet"/>
+      <w:lvlText w:val=""/>
+      <w:lvlJc w:val="left"/>
+      <w:pPr>
+        <w:tabs>
+          <w:tab w:val="num" w:pos="720"/>
+        </w:tabs>
+        <w:ind w:left="720" w:hanging="360"/>
+      </w:pPr>
+      <w:rPr>
+        <w:rFonts w:ascii="Symbol" w:hAnsi="Symbol" w:hint="default"/>
+        <w:sz w:val="20"/>
+      </w:rPr>
+    </w:lvl>
+    <w:lvl w:ilvl="1" w:tentative="1">
+      <w:start w:val="1"/>
+      <w:numFmt w:val="bullet"/>
+      <w:lvlText w:val="o"/>
+      <w:lvlJc w:val="left"/>
+      <w:pPr>
+        <w:tabs>
+          <w:tab w:val="num" w:pos="1440"/>
+        </w:tabs>
+        <w:ind w:left="1440" w:hanging="360"/>
+      </w:pPr>
+      <w:rPr>
+        <w:rFonts w:ascii="Courier New" w:hAnsi="Courier New" w:hint="default"/>
+        <w:sz w:val="20"/>
+      </w:rPr>
+    </w:lvl>
+    <w:lvl w:ilvl="2" w:tentative="1">
+      <w:start w:val="1"/>
+      <w:numFmt w:val="bullet"/>
+      <w:lvlText w:val=""/>
+      <w:lvlJc w:val="left"/>
+      <w:pPr>
+        <w:tabs>
+          <w:tab w:val="num" w:pos="2160"/>
+        </w:tabs>
+        <w:ind w:left="2160" w:hanging="360"/>
+      </w:pPr>
+      <w:rPr>
+        <w:rFonts w:ascii="Wingdings" w:hAnsi="Wingdings" w:hint="default"/>
+        <w:sz w:val="20"/>
+      </w:rPr>
+    </w:lvl>
+    <w:lvl w:ilvl="3" w:tentative="1">
+      <w:start w:val="1"/>
+      <w:numFmt w:val="bullet"/>
+      <w:lvlText w:val=""/>
+      <w:lvlJc w:val="left"/>
+      <w:pPr>
+        <w:tabs>
+          <w:tab w:val="num" w:pos="2880"/>
+        </w:tabs>
+        <w:ind w:left="2880" w:hanging="360"/>
+      </w:pPr>
+      <w:rPr>
+        <w:rFonts w:ascii="Wingdings" w:hAnsi="Wingdings" w:hint="default"/>
+        <w:sz w:val="20"/>
+      </w:rPr>
+    </w:lvl>
+    <w:lvl w:ilvl="4" w:tentative="1">
+      <w:start w:val="1"/>
+      <w:numFmt w:val="bullet"/>
+      <w:lvlText w:val=""/>
+      <w:lvlJc w:val="left"/>
+      <w:pPr>
+        <w:tabs>
+          <w:tab w:val="num" w:pos="3600"/>
+        </w:tabs>
+        <w:ind w:left="3600" w:hanging="360"/>
+      </w:pPr>
+      <w:rPr>
+        <w:rFonts w:ascii="Wingdings" w:hAnsi="Wingdings" w:hint="default"/>
+        <w:sz w:val="20"/>
+      </w:rPr>
+    </w:lvl>
+    <w:lvl w:ilvl="5" w:tentative="1">
+      <w:start w:val="1"/>
+      <w:numFmt w:val="bullet"/>
+      <w:lvlText w:val=""/>
+      <w:lvlJc w:val="left"/>
+      <w:pPr>
+        <w:tabs>
+          <w:tab w:val="num" w:pos="4320"/>
+        </w:tabs>
+        <w:ind w:left="4320" w:hanging="360"/>
+      </w:pPr>
+      <w:rPr>
+        <w:rFonts w:ascii="Wingdings" w:hAnsi="Wingdings" w:hint="default"/>
+        <w:sz w:val="20"/>
+      </w:rPr>
+    </w:lvl>
+    <w:lvl w:ilvl="6" w:tentative="1">
+      <w:start w:val="1"/>
+      <w:numFmt w:val="bullet"/>
+      <w:lvlText w:val=""/>
+      <w:lvlJc w:val="left"/>
+      <w:pPr>
+        <w:tabs>
+          <w:tab w:val="num" w:pos="5040"/>
+        </w:tabs>
+        <w:ind w:left="5040" w:hanging="360"/>
+      </w:pPr>
+      <w:rPr>
+        <w:rFonts w:ascii="Wingdings" w:hAnsi="Wingdings" w:hint="default"/>
+        <w:sz w:val="20"/>
+      </w:rPr>
+    </w:lvl>
+    <w:lvl w:ilvl="7" w:tentative="1">
+      <w:start w:val="1"/>
+      <w:numFmt w:val="bullet"/>
+      <w:lvlText w:val=""/>
+      <w:lvlJc w:val="left"/>
+      <w:pPr>
+        <w:tabs>
+          <w:tab w:val="num" w:pos="5760"/>
+        </w:tabs>
+        <w:ind w:left="5760" w:hanging="360"/>
+      </w:pPr>
+      <w:rPr>
+        <w:rFonts w:ascii="Wingdings" w:hAnsi="Wingdings" w:hint="default"/>
+        <w:sz w:val="20"/>
+      </w:rPr>
+    </w:lvl>
+    <w:lvl w:ilvl="8" w:tentative="1">
+      <w:start w:val="1"/>
+      <w:numFmt w:val="bullet"/>
+      <w:lvlText w:val=""/>
+      <w:lvlJc w:val="left"/>
+      <w:pPr>
+        <w:tabs>
+          <w:tab w:val="num" w:pos="6480"/>
+        </w:tabs>
+        <w:ind w:left="6480" w:hanging="360"/>
+      </w:pPr>
+      <w:rPr>
+        <w:rFonts w:ascii="Wingdings" w:hAnsi="Wingdings" w:hint="default"/>
+        <w:sz w:val="20"/>
+      </w:rPr>
+    </w:lvl>
+  </w:abstractNum>
+  <w:abstractNum w:abstractNumId="22" w15:restartNumberingAfterBreak="0">
+    <w:nsid w:val="6B2D60A0"/>
+    <w:multiLevelType w:val="multilevel"/>
+    <w:tmpl w:val="E086F058"/>
+    <w:lvl w:ilvl="0">
+      <w:start w:val="1"/>
+      <w:numFmt w:val="bullet"/>
+      <w:lvlText w:val=""/>
+      <w:lvlJc w:val="left"/>
+      <w:pPr>
+        <w:tabs>
+          <w:tab w:val="num" w:pos="720"/>
+        </w:tabs>
+        <w:ind w:left="720" w:hanging="360"/>
+      </w:pPr>
+      <w:rPr>
+        <w:rFonts w:ascii="Symbol" w:hAnsi="Symbol" w:hint="default"/>
+        <w:sz w:val="20"/>
+      </w:rPr>
+    </w:lvl>
+    <w:lvl w:ilvl="1" w:tentative="1">
+      <w:start w:val="1"/>
+      <w:numFmt w:val="bullet"/>
+      <w:lvlText w:val="o"/>
+      <w:lvlJc w:val="left"/>
+      <w:pPr>
+        <w:tabs>
+          <w:tab w:val="num" w:pos="1440"/>
+        </w:tabs>
+        <w:ind w:left="1440" w:hanging="360"/>
+      </w:pPr>
+      <w:rPr>
+        <w:rFonts w:ascii="Courier New" w:hAnsi="Courier New" w:hint="default"/>
+        <w:sz w:val="20"/>
+      </w:rPr>
+    </w:lvl>
+    <w:lvl w:ilvl="2" w:tentative="1">
+      <w:start w:val="1"/>
+      <w:numFmt w:val="bullet"/>
+      <w:lvlText w:val=""/>
+      <w:lvlJc w:val="left"/>
+      <w:pPr>
+        <w:tabs>
+          <w:tab w:val="num" w:pos="2160"/>
+        </w:tabs>
+        <w:ind w:left="2160" w:hanging="360"/>
+      </w:pPr>
+      <w:rPr>
+        <w:rFonts w:ascii="Wingdings" w:hAnsi="Wingdings" w:hint="default"/>
+        <w:sz w:val="20"/>
+      </w:rPr>
+    </w:lvl>
+    <w:lvl w:ilvl="3" w:tentative="1">
+      <w:start w:val="1"/>
+      <w:numFmt w:val="bullet"/>
+      <w:lvlText w:val=""/>
+      <w:lvlJc w:val="left"/>
+      <w:pPr>
+        <w:tabs>
+          <w:tab w:val="num" w:pos="2880"/>
+        </w:tabs>
+        <w:ind w:left="2880" w:hanging="360"/>
+      </w:pPr>
+      <w:rPr>
+        <w:rFonts w:ascii="Wingdings" w:hAnsi="Wingdings" w:hint="default"/>
+        <w:sz w:val="20"/>
+      </w:rPr>
+    </w:lvl>
+    <w:lvl w:ilvl="4" w:tentative="1">
+      <w:start w:val="1"/>
+      <w:numFmt w:val="bullet"/>
+      <w:lvlText w:val=""/>
+      <w:lvlJc w:val="left"/>
+      <w:pPr>
+        <w:tabs>
+          <w:tab w:val="num" w:pos="3600"/>
+        </w:tabs>
+        <w:ind w:left="3600" w:hanging="360"/>
+      </w:pPr>
+      <w:rPr>
+        <w:rFonts w:ascii="Wingdings" w:hAnsi="Wingdings" w:hint="default"/>
+        <w:sz w:val="20"/>
+      </w:rPr>
+    </w:lvl>
+    <w:lvl w:ilvl="5" w:tentative="1">
+      <w:start w:val="1"/>
+      <w:numFmt w:val="bullet"/>
+      <w:lvlText w:val=""/>
+      <w:lvlJc w:val="left"/>
+      <w:pPr>
+        <w:tabs>
+          <w:tab w:val="num" w:pos="4320"/>
+        </w:tabs>
+        <w:ind w:left="4320" w:hanging="360"/>
+      </w:pPr>
+      <w:rPr>
+        <w:rFonts w:ascii="Wingdings" w:hAnsi="Wingdings" w:hint="default"/>
+        <w:sz w:val="20"/>
+      </w:rPr>
+    </w:lvl>
+    <w:lvl w:ilvl="6" w:tentative="1">
+      <w:start w:val="1"/>
+      <w:numFmt w:val="bullet"/>
+      <w:lvlText w:val=""/>
+      <w:lvlJc w:val="left"/>
+      <w:pPr>
+        <w:tabs>
+          <w:tab w:val="num" w:pos="5040"/>
+        </w:tabs>
+        <w:ind w:left="5040" w:hanging="360"/>
+      </w:pPr>
+      <w:rPr>
+        <w:rFonts w:ascii="Wingdings" w:hAnsi="Wingdings" w:hint="default"/>
+        <w:sz w:val="20"/>
+      </w:rPr>
+    </w:lvl>
+    <w:lvl w:ilvl="7" w:tentative="1">
+      <w:start w:val="1"/>
+      <w:numFmt w:val="bullet"/>
+      <w:lvlText w:val=""/>
+      <w:lvlJc w:val="left"/>
+      <w:pPr>
+        <w:tabs>
+          <w:tab w:val="num" w:pos="5760"/>
+        </w:tabs>
+        <w:ind w:left="5760" w:hanging="360"/>
+      </w:pPr>
+      <w:rPr>
+        <w:rFonts w:ascii="Wingdings" w:hAnsi="Wingdings" w:hint="default"/>
+        <w:sz w:val="20"/>
+      </w:rPr>
+    </w:lvl>
+    <w:lvl w:ilvl="8" w:tentative="1">
+      <w:start w:val="1"/>
+      <w:numFmt w:val="bullet"/>
+      <w:lvlText w:val=""/>
+      <w:lvlJc w:val="left"/>
+      <w:pPr>
+        <w:tabs>
+          <w:tab w:val="num" w:pos="6480"/>
+        </w:tabs>
+        <w:ind w:left="6480" w:hanging="360"/>
+      </w:pPr>
+      <w:rPr>
+        <w:rFonts w:ascii="Wingdings" w:hAnsi="Wingdings" w:hint="default"/>
+        <w:sz w:val="20"/>
+      </w:rPr>
+    </w:lvl>
+  </w:abstractNum>
+  <w:abstractNum w:abstractNumId="23" w15:restartNumberingAfterBreak="0">
     <w:nsid w:val="7F7860E5"/>
     <w:multiLevelType w:val="multilevel"/>
     <w:tmpl w:val="D4CE6238"/>
@@ -11469,52 +13744,76 @@
     </w:lvl>
   </w:abstractNum>
   <w:num w:numId="1" w16cid:durableId="2145349621">
-    <w:abstractNumId w:val="11"/>
+    <w:abstractNumId w:val="17"/>
   </w:num>
   <w:num w:numId="2" w16cid:durableId="419520449">
-    <w:abstractNumId w:val="5"/>
+    <w:abstractNumId w:val="8"/>
   </w:num>
   <w:num w:numId="3" w16cid:durableId="441152855">
-    <w:abstractNumId w:val="10"/>
+    <w:abstractNumId w:val="16"/>
   </w:num>
   <w:num w:numId="4" w16cid:durableId="1685745848">
-    <w:abstractNumId w:val="14"/>
+    <w:abstractNumId w:val="20"/>
   </w:num>
   <w:num w:numId="5" w16cid:durableId="1229606327">
     <w:abstractNumId w:val="0"/>
   </w:num>
   <w:num w:numId="6" w16cid:durableId="1352535655">
-    <w:abstractNumId w:val="7"/>
+    <w:abstractNumId w:val="11"/>
   </w:num>
   <w:num w:numId="7" w16cid:durableId="2098599637">
-    <w:abstractNumId w:val="2"/>
+    <w:abstractNumId w:val="3"/>
   </w:num>
   <w:num w:numId="8" w16cid:durableId="796795107">
+    <w:abstractNumId w:val="23"/>
+  </w:num>
+  <w:num w:numId="9" w16cid:durableId="1598171581">
     <w:abstractNumId w:val="15"/>
   </w:num>
-  <w:num w:numId="9" w16cid:durableId="1598171581">
-    <w:abstractNumId w:val="9"/>
-  </w:num>
   <w:num w:numId="10" w16cid:durableId="193078031">
-    <w:abstractNumId w:val="3"/>
+    <w:abstractNumId w:val="5"/>
   </w:num>
   <w:num w:numId="11" w16cid:durableId="540433548">
-    <w:abstractNumId w:val="4"/>
+    <w:abstractNumId w:val="6"/>
   </w:num>
   <w:num w:numId="12" w16cid:durableId="1752124141">
     <w:abstractNumId w:val="1"/>
   </w:num>
   <w:num w:numId="13" w16cid:durableId="971446125">
-    <w:abstractNumId w:val="6"/>
+    <w:abstractNumId w:val="10"/>
   </w:num>
   <w:num w:numId="14" w16cid:durableId="873544399">
+    <w:abstractNumId w:val="18"/>
+  </w:num>
+  <w:num w:numId="15" w16cid:durableId="1899900156">
+    <w:abstractNumId w:val="19"/>
+  </w:num>
+  <w:num w:numId="16" w16cid:durableId="2128043472">
+    <w:abstractNumId w:val="14"/>
+  </w:num>
+  <w:num w:numId="17" w16cid:durableId="934828381">
+    <w:abstractNumId w:val="2"/>
+  </w:num>
+  <w:num w:numId="18" w16cid:durableId="2006546263">
     <w:abstractNumId w:val="12"/>
   </w:num>
-  <w:num w:numId="15" w16cid:durableId="1899900156">
+  <w:num w:numId="19" w16cid:durableId="270673330">
+    <w:abstractNumId w:val="7"/>
+  </w:num>
+  <w:num w:numId="20" w16cid:durableId="888422645">
+    <w:abstractNumId w:val="4"/>
+  </w:num>
+  <w:num w:numId="21" w16cid:durableId="1928878976">
+    <w:abstractNumId w:val="21"/>
+  </w:num>
+  <w:num w:numId="22" w16cid:durableId="784617696">
     <w:abstractNumId w:val="13"/>
   </w:num>
-  <w:num w:numId="16" w16cid:durableId="2128043472">
-    <w:abstractNumId w:val="8"/>
+  <w:num w:numId="23" w16cid:durableId="1537306840">
+    <w:abstractNumId w:val="9"/>
+  </w:num>
+  <w:num w:numId="24" w16cid:durableId="718865498">
+    <w:abstractNumId w:val="22"/>
   </w:num>
 </w:numbering>
 </file>
@@ -12165,7 +14464,6 @@
   <w:style w:type="character" w:default="1" w:styleId="DefaultParagraphFont">
     <w:name w:val="Default Paragraph Font"/>
     <w:uiPriority w:val="1"/>
-    <w:semiHidden/>
     <w:unhideWhenUsed/>
   </w:style>
   <w:style w:type="table" w:default="1" w:styleId="TableNormal">

</xml_diff>